<commit_message>
feat: start the model comparison chapter
</commit_message>
<xml_diff>
--- a/docs/thesis/magistrsko-delo-jasa-zupancic.docx
+++ b/docs/thesis/magistrsko-delo-jasa-zupancic.docx
@@ -2564,22 +2564,107 @@
         <w:t>za zaznavanje drže</w:t>
       </w:r>
       <w:r>
-        <w:t>, ki so primerni za delovanje na robnih napravah</w:t>
+        <w:t xml:space="preserve">, ki so primerni za delovanje na robnih napravah </w:t>
+      </w:r>
+      <w:r>
+        <w:t xml:space="preserve">in na podlagi njihove primerjave </w:t>
+      </w:r>
+      <w:r>
+        <w:t xml:space="preserve">določiti </w:t>
+      </w:r>
+      <w:r>
+        <w:t>najbolj ustreznega za implementacijo realno-časovne zaznave drže za spremljanje in analizo vadbe</w:t>
+      </w:r>
+      <w:r>
+        <w:t xml:space="preserve"> v okolju brskalnika</w:t>
+      </w:r>
+      <w:r>
+        <w:t>.</w:t>
+      </w:r>
+    </w:p>
+    <w:p/>
+    <w:p>
+      <w:r>
+        <w:t>Primerjava modelov temelji na njihovi hitrosti in učinkovitosti delovanja. Omejitev na robne naprave</w:t>
+      </w:r>
+      <w:r>
+        <w:t xml:space="preserve"> nabor modelov dokaj zmanjša, saj gre za naprave, ki nimajo velike procesorske moči. Primeri robnih naprav so osebni telefoni, računalniške tablice</w:t>
+      </w:r>
+      <w:r>
+        <w:t xml:space="preserve"> ter </w:t>
+      </w:r>
+      <w:r>
+        <w:lastRenderedPageBreak/>
+        <w:t>razni tipi samostoječih naprav, ki vsebujejo kamero in</w:t>
       </w:r>
       <w:r>
         <w:t xml:space="preserve"> </w:t>
       </w:r>
       <w:r>
-        <w:t xml:space="preserve">in na podlagi njihove primerjave </w:t>
-      </w:r>
-      <w:r>
-        <w:t xml:space="preserve">določiti </w:t>
-      </w:r>
-      <w:r>
-        <w:t>najbolj ustreznega za implementacijo realno-časovne zaznave drže za spremljanje in analizo vadbe</w:t>
-      </w:r>
-      <w:r>
-        <w:t xml:space="preserve"> v okolju brskalnika</w:t>
+        <w:t>omogočajo</w:t>
+      </w:r>
+      <w:r>
+        <w:t xml:space="preserve"> dostop do brskalnika. </w:t>
+      </w:r>
+      <w:r>
+        <w:t>Delovanje mora biti tudi neodvisno od izbire brskalnika.</w:t>
+      </w:r>
+    </w:p>
+    <w:p/>
+    <w:p>
+      <w:r>
+        <w:t>Glede na dokaj omejeno okolje, v katerem bodo modeli primerjani med seboj, j</w:t>
+      </w:r>
+      <w:r>
+        <w:t xml:space="preserve">e </w:t>
+      </w:r>
+      <w:r>
+        <w:t>pričakovana tudi sama optimizacija modelov. Sem spada uporaba različnih verzij modelov, prilagajanje okolja v brskalniku glede na potrebe modelov, …</w:t>
+      </w:r>
+    </w:p>
+    <w:p/>
+    <w:p>
+      <w:r>
+        <w:t xml:space="preserve">Eden izmed ciljev je tudi </w:t>
+      </w:r>
+      <w:r>
+        <w:t>ustvariti</w:t>
+      </w:r>
+      <w:r>
+        <w:t xml:space="preserve"> lastno učno množico med uporabo samega orodja za realno-časovno analizo vadbe. </w:t>
+      </w:r>
+      <w:r>
+        <w:t>Sem spada zajem</w:t>
+      </w:r>
+      <w:r>
+        <w:t xml:space="preserve"> in </w:t>
+      </w:r>
+      <w:r>
+        <w:t>filtriranje</w:t>
+      </w:r>
+      <w:r>
+        <w:t xml:space="preserve"> videov ter slik, kot tudi označevanje učne množice.</w:t>
+      </w:r>
+    </w:p>
+    <w:p/>
+    <w:p>
+      <w:r>
+        <w:t xml:space="preserve">Z lastno </w:t>
+      </w:r>
+      <w:r>
+        <w:t>ustvarjeno</w:t>
+      </w:r>
+      <w:r>
+        <w:t xml:space="preserve"> učno množico bo opravljeno tudi učenje </w:t>
+      </w:r>
+      <w:r>
+        <w:t xml:space="preserve">ustrezno </w:t>
+      </w:r>
+      <w:r>
+        <w:t>izbranega modela ter primerjava rezultatov pred in po učenj</w:t>
+      </w:r>
+      <w:r>
+        <w:t>u</w:t>
       </w:r>
       <w:r>
         <w:t>.</w:t>
@@ -2588,90 +2673,12 @@
     <w:p/>
     <w:p>
       <w:r>
-        <w:t>Primerjava modelov temelji na njihovi hitrosti in učinkovitosti delovanja. Omejitev na robne naprave</w:t>
-      </w:r>
-      <w:r>
-        <w:t xml:space="preserve"> nabor modelov dokaj zmanjša, saj gre za naprave, ki nimajo velike procesorske moči. Primeri robnih naprav so osebni telefoni, računalniške tablice</w:t>
-      </w:r>
-      <w:r>
-        <w:t xml:space="preserve"> ter </w:t>
-      </w:r>
-      <w:r>
-        <w:lastRenderedPageBreak/>
-        <w:t xml:space="preserve">razni tipi samostoječih naprav, ki vsebujejo kamero in dostop do brskalnika. </w:t>
-      </w:r>
-      <w:r>
-        <w:t>Delovanje mora biti tudi neodvisno od izbire brskalnika.</w:t>
-      </w:r>
-    </w:p>
-    <w:p/>
-    <w:p>
-      <w:r>
-        <w:t>Glede na dokaj omejeno okolje, v katerem bodo modeli primerjani med seboj, j</w:t>
-      </w:r>
-      <w:r>
-        <w:t xml:space="preserve">e </w:t>
-      </w:r>
-      <w:r>
-        <w:t>pričakovana tudi sama optimizacija modelov. Sem spada uporaba različnih verzij modelov, prilagajanje okolja v brskalniku glede na potrebe modelov, …</w:t>
-      </w:r>
-    </w:p>
-    <w:p/>
-    <w:p>
-      <w:r>
-        <w:t xml:space="preserve">Eden izmed ciljev je tudi </w:t>
-      </w:r>
-      <w:r>
-        <w:t>ustvariti</w:t>
-      </w:r>
-      <w:r>
-        <w:t xml:space="preserve"> lastno učno množico med uporabo samega orodja za realno-časovno analizo vadbe. </w:t>
-      </w:r>
-      <w:r>
-        <w:t>Sem spada zajem</w:t>
-      </w:r>
-      <w:r>
-        <w:t xml:space="preserve"> in </w:t>
-      </w:r>
-      <w:r>
-        <w:t>filtriranje</w:t>
-      </w:r>
-      <w:r>
-        <w:t xml:space="preserve"> videov ter slik, kot tudi označevanje učne množice.</w:t>
-      </w:r>
-    </w:p>
-    <w:p/>
-    <w:p>
-      <w:r>
-        <w:t xml:space="preserve">Z lastno </w:t>
-      </w:r>
-      <w:r>
-        <w:t>ustvarjeno</w:t>
-      </w:r>
-      <w:r>
-        <w:t xml:space="preserve"> učno množico bo opravljeno tudi učenje </w:t>
-      </w:r>
-      <w:r>
-        <w:t xml:space="preserve">ustrezno </w:t>
-      </w:r>
-      <w:r>
-        <w:t>izbranega modela ter primerjava rezultatov pred in po učenj</w:t>
-      </w:r>
-      <w:r>
-        <w:t>u</w:t>
-      </w:r>
-      <w:r>
-        <w:t>.</w:t>
-      </w:r>
-    </w:p>
-    <w:p/>
-    <w:p>
-      <w:r>
         <w:t>Glavni cilj in namen naloge je z ustrezno izbranim modelom ustvariti kvalitetno in robustno orodje za realno-časovno zaznavanje drže za spremljanje in analizo vadbe. Namen je izboljšati uporabnikovo pravilnost izvajanja vadbe, kot tudi meriti ter analizirati podatke, ki jih je brez posebnih pripomočkov za vadbo težko izmeriti.</w:t>
       </w:r>
     </w:p>
     <w:p>
       <w:pPr>
+        <w:spacing w:line="240" w:lineRule="auto"/>
         <w:jc w:val="left"/>
         <w:rPr>
           <w:rFonts w:cs="Times New Roman"/>
@@ -2683,6 +2690,7 @@
           <w:szCs w:val="36"/>
         </w:rPr>
       </w:pPr>
+      <w:bookmarkStart w:id="12" w:name="_Toc221980686"/>
       <w:r>
         <w:rPr>
           <w:b/>
@@ -2703,7 +2711,6 @@
           <w:lang w:val="sl-SI"/>
         </w:rPr>
       </w:pPr>
-      <w:bookmarkStart w:id="12" w:name="_Toc221980686"/>
       <w:r>
         <w:rPr>
           <w:b/>
@@ -2712,6 +2719,471 @@
           <w:lang w:val="sl-SI"/>
         </w:rPr>
         <w:lastRenderedPageBreak/>
+        <w:t>RAZVOJ IN OTIMIZACIJA MODELOV</w:t>
+      </w:r>
+    </w:p>
+    <w:p>
+      <w:r>
+        <w:t>Izbira ustreznega modela za zaznavo drže je eden izmed ključnih korakov naloge, saj je celoten sistem za analizo vadbe odvisen od stabilnost in natančnost sklepnih točk, ki so glavni izhod rezultatov modelov za zaznavo drže.</w:t>
+      </w:r>
+      <w:r>
+        <w:t xml:space="preserve"> Med modeli je potrebno primerjavi več metrik, in sicer je treba najti model z najboljšim kompromisom med hitrostjo, zakasnitvijo, porabo virov ter kakovostjo </w:t>
+      </w:r>
+      <w:r>
+        <w:t xml:space="preserve">zaznave </w:t>
+      </w:r>
+      <w:r>
+        <w:t>sklepnih točk.</w:t>
+      </w:r>
+    </w:p>
+    <w:p/>
+    <w:p>
+      <w:pPr>
+        <w:pStyle w:val="Heading2"/>
+      </w:pPr>
+      <w:r>
+        <w:t>Razlike med modeli</w:t>
+      </w:r>
+    </w:p>
+    <w:p>
+      <w:r>
+        <w:t>Modeli za zaznavo drže se med seboj lahko razlikujejo v mnogih pogledih.</w:t>
+      </w:r>
+    </w:p>
+    <w:p>
+      <w:pPr>
+        <w:pStyle w:val="Heading3"/>
+      </w:pPr>
+      <w:r>
+        <w:t>2D in 3D pozicija zaznanih sklepnih točk</w:t>
+      </w:r>
+    </w:p>
+    <w:p>
+      <w:r>
+        <w:t xml:space="preserve">Nekateri modeli so sposobni </w:t>
+      </w:r>
+      <w:r>
+        <w:t xml:space="preserve">ob 2D napovedi </w:t>
+      </w:r>
+      <w:r>
+        <w:t>koordinat</w:t>
+      </w:r>
+      <w:r>
+        <w:t xml:space="preserve"> sklepnih točk napovedati tudi </w:t>
+      </w:r>
+      <w:r>
+        <w:t>z</w:t>
+      </w:r>
+      <w:r>
+        <w:t>-</w:t>
+      </w:r>
+      <w:r>
+        <w:t>koordinat</w:t>
+      </w:r>
+      <w:r>
+        <w:t>o</w:t>
+      </w:r>
+      <w:r>
+        <w:t xml:space="preserve">, ki </w:t>
+      </w:r>
+      <w:r>
+        <w:t xml:space="preserve">nosi informacijo o tem, </w:t>
+      </w:r>
+      <w:r>
+        <w:t>kako daleč v globino je določena točka glede na izhodišče</w:t>
+      </w:r>
+      <w:r>
+        <w:t xml:space="preserve">. </w:t>
+      </w:r>
+      <w:r>
+        <w:t xml:space="preserve">Zaznava vrednosti </w:t>
+      </w:r>
+      <w:r>
+        <w:t xml:space="preserve">pozicije </w:t>
+      </w:r>
+      <w:r>
+        <w:t>z</w:t>
+      </w:r>
+      <w:r>
+        <w:t>-</w:t>
+      </w:r>
+      <w:r>
+        <w:t>koordinate</w:t>
+      </w:r>
+      <w:r>
+        <w:t xml:space="preserve"> </w:t>
+      </w:r>
+      <w:r>
+        <w:t xml:space="preserve">sklepnih točk se razlikuje od zaznave </w:t>
+      </w:r>
+      <w:r>
+        <w:t xml:space="preserve">x in y </w:t>
+      </w:r>
+      <w:r>
+        <w:t xml:space="preserve">koordinat </w:t>
+      </w:r>
+      <w:r>
+        <w:t>sklepnih točk</w:t>
+      </w:r>
+      <w:r>
+        <w:t xml:space="preserve">, saj se </w:t>
+      </w:r>
+      <w:r>
+        <w:t xml:space="preserve">koordinati </w:t>
+      </w:r>
+      <w:r>
+        <w:t>x in y določita neposredno iz slike, ki je oblike</w:t>
+      </w:r>
+      <w:r>
+        <w:t xml:space="preserve"> 2D</w:t>
+      </w:r>
+      <w:r>
+        <w:t xml:space="preserve">, kar pomeni, da se vrednosti </w:t>
+      </w:r>
+      <w:r>
+        <w:t>z</w:t>
+      </w:r>
+      <w:r>
+        <w:t>-</w:t>
+      </w:r>
+      <w:r>
+        <w:t>koordinate</w:t>
+      </w:r>
+      <w:r>
+        <w:t xml:space="preserve"> v sistemu, ki </w:t>
+      </w:r>
+      <w:r>
+        <w:t>kot</w:t>
+      </w:r>
+      <w:r>
+        <w:t xml:space="preserve"> vhod </w:t>
+      </w:r>
+      <w:r>
+        <w:t>v</w:t>
+      </w:r>
+      <w:r>
+        <w:t xml:space="preserve"> </w:t>
+      </w:r>
+      <w:r>
+        <w:t xml:space="preserve">model uporablja </w:t>
+      </w:r>
+      <w:r>
+        <w:t>zajeme</w:t>
+      </w:r>
+      <w:r>
+        <w:t xml:space="preserve"> </w:t>
+      </w:r>
+      <w:r>
+        <w:t>navadn</w:t>
+      </w:r>
+      <w:r>
+        <w:t>e</w:t>
+      </w:r>
+      <w:r>
+        <w:t xml:space="preserve"> RGB kamer</w:t>
+      </w:r>
+      <w:r>
+        <w:t>e</w:t>
+      </w:r>
+      <w:r>
+        <w:t>,</w:t>
+      </w:r>
+      <w:r>
+        <w:t xml:space="preserve"> morajo določiti na drugačen način.</w:t>
+      </w:r>
+    </w:p>
+    <w:p/>
+    <w:p>
+      <w:r>
+        <w:t>Pri interpretaciji 3D izhoda je pomembno poudariti, da z</w:t>
+      </w:r>
+      <w:r>
+        <w:t>-</w:t>
+      </w:r>
+      <w:r>
+        <w:t>koordinata</w:t>
+      </w:r>
+      <w:r>
+        <w:t xml:space="preserve"> pri večini </w:t>
+      </w:r>
+      <w:r>
+        <w:t>modelov za zaznavo drže</w:t>
+      </w:r>
+      <w:r>
+        <w:t>, ki delujejo na osnovi ene same RGB kamere, ne predstavljajo neposredno izmerjene absolutne globine v metrih. Gre za napovedano globinsko komponento, ki je pogosto podana relativno glede na izhodiščno točko (npr. medenico) ali pa je normalizirana glede na velikost osebe v sliki oziroma velikost vhodnega okna. Posledično se lahko numerične vrednosti z-koordinate med različnimi modeli razlikujejo tako po skali kot po definiciji ničelne točke, kar oteži neposredno primerjavo med modeli</w:t>
+      </w:r>
+      <w:r>
+        <w:t>.</w:t>
+      </w:r>
+    </w:p>
+    <w:p/>
+    <w:p>
+      <w:r>
+        <w:t>Z</w:t>
+      </w:r>
+      <w:r>
+        <w:t>-</w:t>
+      </w:r>
+      <w:r>
+        <w:t xml:space="preserve">komponenta </w:t>
+      </w:r>
+      <w:r>
+        <w:t xml:space="preserve">je </w:t>
+      </w:r>
+      <w:r>
+        <w:t>praviloma manj stabilna in bolj občutljiva na spremembe kota kamere, delne zakritosti ter netočne 2D napovedi. V praksi se to lahko odrazi kot večji šum v z</w:t>
+      </w:r>
+      <w:r>
+        <w:t>-</w:t>
+      </w:r>
+      <w:r>
+        <w:lastRenderedPageBreak/>
+        <w:t>k</w:t>
+      </w:r>
+      <w:r>
+        <w:t>oordinati, kar je pri realno-časovni analizi vadbe problematično, saj lahko povzroča lažne spremembe hitrosti ali obsega giba.</w:t>
+      </w:r>
+    </w:p>
+    <w:p/>
+    <w:p>
+      <w:r>
+        <w:t>Za bolj “pravo” 3D rekonstrukcijo se pogosto uporabljajo pristopi z več kamerami</w:t>
+      </w:r>
+      <w:r>
+        <w:t xml:space="preserve">, pristopi </w:t>
+      </w:r>
+      <w:r>
+        <w:t>z uporabo označevalcev</w:t>
+      </w:r>
+      <w:r>
+        <w:t xml:space="preserve"> ali</w:t>
+      </w:r>
+      <w:r>
+        <w:t xml:space="preserve"> pristopi</w:t>
+      </w:r>
+      <w:r>
+        <w:t xml:space="preserve"> z namensko strojno opremo (npr. globinske kamere), kjer je globina izmerjena neposredno. V kontekstu te naloge pa je cilj delovanje v brskalniku na robnih napravah z običajno RGB kamero, zato je uporaba kompleksnejših metod omejena. Posledično je v takem okolju običajno bolj smiselno temeljenje analize vadbe na 2D koordinatah in iz njih izpeljanih kotih ter relativnih razdaljah, pri čemer je mogoče z komponento (če je na voljo) uporabiti le kot dodatno podporno informacijo, ne pa kot primarni vir za metrike, ki zahtevajo absolutno natančnost.</w:t>
+      </w:r>
+    </w:p>
+    <w:p>
+      <w:pPr>
+        <w:pStyle w:val="Heading3"/>
+      </w:pPr>
+      <w:r>
+        <w:t>Oblika</w:t>
+      </w:r>
+      <w:r>
+        <w:t xml:space="preserve"> zaznanih sklepnih točk</w:t>
+      </w:r>
+    </w:p>
+    <w:p>
+      <w:r>
+        <w:t xml:space="preserve">Ena glavnih razlik </w:t>
+      </w:r>
+      <w:r>
+        <w:t xml:space="preserve">med </w:t>
+      </w:r>
+      <w:r>
+        <w:t xml:space="preserve">modeli </w:t>
+      </w:r>
+      <w:r>
+        <w:t>je privzeto število sklepnih točk, ki jih modeli napovejo</w:t>
+      </w:r>
+      <w:r>
+        <w:t xml:space="preserve">. </w:t>
+      </w:r>
+      <w:r>
+        <w:t>Število točk je neposredno povezano s tem, kako podrobno je mogoče opisati držo in gibanje posameznika, kar vpliva na natančnost izračuna kotov, relativnih razdalj in drugih metrik, ki se uporabljajo pri analizi vadbe.</w:t>
+      </w:r>
+      <w:r>
+        <w:t xml:space="preserve"> Modeli z manjšim številom napovedanih sklepnih točk običajno ponujajo osnovni skelet, medtem ko modeli z večjim številom točk dodatno vključujejo bolj fine referenčne točke telesa, kot so prsti, obrazne točke ali dodatne točke na trupu. Večje število točk po navadi prinese tudi večjo računsko zahtevnost ter večjo občutljivost na šum. Za analizo vadbe ni potrebe po večjem številu skeletnih točk, dovolj so osnovne.</w:t>
+      </w:r>
+    </w:p>
+    <w:p/>
+    <w:p>
+      <w:r>
+        <w:t>Poleg samega števila točk se modeli razlikujejo tudi v tem, katere točke sploh napovedujejo in kako je skelet definiran. Različni modeli lahko uporabljajo drugačne definicije sklepov (</w:t>
+      </w:r>
+      <w:r>
+        <w:t>najpogosteje je to</w:t>
+      </w:r>
+      <w:r>
+        <w:t xml:space="preserve"> “kolk” kot točka na medenici ali kot projekcija sklepa noge), drugačne indekse in poimenovanj</w:t>
+      </w:r>
+      <w:r>
+        <w:t>a</w:t>
+      </w:r>
+      <w:r>
+        <w:t>. Zaradi tega neposredna primerjava rezultatov med modeli ni trivialna, saj je za nadaljnjo obdelavo potrebno vzpostaviti enoten interni format ključnih točk (npr. standardiziran nabor imen sklepov) in po potrebi izračunati manjkajoče točke z aproksimacijo (npr. sredina med levo in desno točko kolka za oceno medenice).</w:t>
+      </w:r>
+    </w:p>
+    <w:p>
+      <w:r>
+        <w:lastRenderedPageBreak/>
+        <w:t>OPIŠI ŠE VISIBILITY OZ CONFIDENCE!</w:t>
+      </w:r>
+    </w:p>
+    <w:p>
+      <w:pPr>
+        <w:pStyle w:val="Heading2"/>
+      </w:pPr>
+      <w:r>
+        <w:t>Izbrani modeli in njihov</w:t>
+      </w:r>
+      <w:r>
+        <w:t>e razlike</w:t>
+      </w:r>
+    </w:p>
+    <w:p>
+      <w:r>
+        <w:t xml:space="preserve">Izbira modelov </w:t>
+      </w:r>
+      <w:r>
+        <w:t xml:space="preserve">za zaznavanje drže </w:t>
+      </w:r>
+      <w:r>
+        <w:t xml:space="preserve">je </w:t>
+      </w:r>
+      <w:r>
+        <w:t xml:space="preserve">v tej nalogi </w:t>
+      </w:r>
+      <w:r>
+        <w:t xml:space="preserve">omejena </w:t>
+      </w:r>
+      <w:r>
+        <w:t xml:space="preserve">s </w:t>
+      </w:r>
+      <w:r>
+        <w:t>pogoj</w:t>
+      </w:r>
+      <w:r>
+        <w:t>i</w:t>
+      </w:r>
+      <w:r>
+        <w:t xml:space="preserve"> izvajanja v okolju brskalnika. </w:t>
+      </w:r>
+      <w:r>
+        <w:t xml:space="preserve">Cilj je realno-časovna analiza drže na robnih napravah, zato so bili v primerjavo vključeni predvsem </w:t>
+      </w:r>
+      <w:r>
+        <w:t>“</w:t>
+      </w:r>
+      <w:r>
+        <w:t>lažji</w:t>
+      </w:r>
+      <w:r>
+        <w:t>“</w:t>
+      </w:r>
+      <w:r>
+        <w:t xml:space="preserve"> modeli, oziroma lažje različice modelov, ki omogočajo izvajanje brez večjih zakasnite</w:t>
+      </w:r>
+      <w:r>
+        <w:t>v, upočasnitev ali kakršnega koli negativnega vpliva na uporabniško izkušnjo</w:t>
+      </w:r>
+      <w:r>
+        <w:t>.</w:t>
+      </w:r>
+    </w:p>
+    <w:p/>
+    <w:p>
+      <w:r>
+        <w:t>Dodatna omejitev izbire modelov predstavlja tudi prenosljivost modelov, saj mora njihova implementacija delovati v različnih brskalnikih na različnih napravah, za kar je potrebno, da je model možno izvajati v okolju za splet, v tej nalogi specifično</w:t>
+      </w:r>
+      <w:r>
+        <w:t xml:space="preserve"> v okolju</w:t>
+      </w:r>
+      <w:r>
+        <w:t xml:space="preserve"> Next.js. </w:t>
+      </w:r>
+    </w:p>
+    <w:p/>
+    <w:p>
+      <w:r>
+        <w:t>Pri opisu posameznega modela so obravnavani naslednji vidiki:</w:t>
+      </w:r>
+    </w:p>
+    <w:p>
+      <w:pPr>
+        <w:pStyle w:val="ListParagraph"/>
+        <w:numPr>
+          <w:ilvl w:val="0"/>
+          <w:numId w:val="48"/>
+        </w:numPr>
+      </w:pPr>
+      <w:r>
+        <w:t>Izvajalno okolje in podprta zaledja delovanja</w:t>
+      </w:r>
+    </w:p>
+    <w:p>
+      <w:pPr>
+        <w:pStyle w:val="ListParagraph"/>
+        <w:numPr>
+          <w:ilvl w:val="0"/>
+          <w:numId w:val="48"/>
+        </w:numPr>
+      </w:pPr>
+      <w:r>
+        <w:t>Vhodne zahteve</w:t>
+      </w:r>
+    </w:p>
+    <w:p>
+      <w:pPr>
+        <w:pStyle w:val="ListParagraph"/>
+        <w:numPr>
+          <w:ilvl w:val="0"/>
+          <w:numId w:val="48"/>
+        </w:numPr>
+      </w:pPr>
+      <w:r>
+        <w:t>Izhod</w:t>
+      </w:r>
+    </w:p>
+    <w:p>
+      <w:pPr>
+        <w:pStyle w:val="ListParagraph"/>
+        <w:numPr>
+          <w:ilvl w:val="0"/>
+          <w:numId w:val="48"/>
+        </w:numPr>
+      </w:pPr>
+      <w:r>
+        <w:t>Hitrost delovanja</w:t>
+      </w:r>
+    </w:p>
+    <w:p>
+      <w:pPr>
+        <w:pStyle w:val="ListParagraph"/>
+        <w:numPr>
+          <w:ilvl w:val="0"/>
+          <w:numId w:val="48"/>
+        </w:numPr>
+      </w:pPr>
+      <w:r>
+        <w:t>Praktične prednosti in slabosti za analizo vad</w:t>
+      </w:r>
+      <w:r>
+        <w:t>be</w:t>
+      </w:r>
+    </w:p>
+    <w:p/>
+    <w:p>
+      <w:pPr>
+        <w:pStyle w:val="Heading1"/>
+        <w:spacing w:line="360" w:lineRule="auto"/>
+        <w:rPr>
+          <w:b/>
+          <w:sz w:val="36"/>
+          <w:szCs w:val="36"/>
+          <w:lang w:val="sl-SI"/>
+        </w:rPr>
+      </w:pPr>
+      <w:r>
+        <w:rPr>
+          <w:b/>
+          <w:sz w:val="36"/>
+          <w:szCs w:val="36"/>
+          <w:lang w:val="sl-SI"/>
+        </w:rPr>
         <w:t>SPREMLJANJE IN ANALI</w:t>
       </w:r>
       <w:r>
@@ -2966,7 +3438,6 @@
       </w:pPr>
       <w:bookmarkStart w:id="14" w:name="_Toc221980688"/>
       <w:r>
-        <w:lastRenderedPageBreak/>
         <w:t>Stanje NI_V_KADRU</w:t>
       </w:r>
       <w:bookmarkEnd w:id="14"/>
@@ -3019,6 +3490,7 @@
       </w:pPr>
       <w:bookmarkStart w:id="15" w:name="_Toc221980689"/>
       <w:r>
+        <w:lastRenderedPageBreak/>
         <w:t>Stanje NI_OBRNJEN_PROTI_KAMERI</w:t>
       </w:r>
       <w:bookmarkEnd w:id="15"/>
@@ -3195,11 +3667,7 @@
         <w:t xml:space="preserve">, </w:t>
       </w:r>
       <w:r>
-        <w:t xml:space="preserve">specificirati </w:t>
-      </w:r>
-      <w:r>
-        <w:lastRenderedPageBreak/>
-        <w:t>pravila, za zaznavo napačne začetne drže. Pravilo preverja eno izmed naslednjih pogojev:</w:t>
+        <w:t>specificirati pravila, za zaznavo napačne začetne drže. Pravilo preverja eno izmed naslednjih pogojev:</w:t>
       </w:r>
     </w:p>
     <w:p>
@@ -3267,6 +3735,7 @@
           <w:sz w:val="44"/>
           <w:szCs w:val="44"/>
         </w:rPr>
+        <w:lastRenderedPageBreak/>
         <w:t xml:space="preserve">SLIKA PRED HALF SQUAT </w:t>
       </w:r>
       <w:r>
@@ -3393,7 +3862,6 @@
           <w:sz w:val="44"/>
           <w:szCs w:val="44"/>
         </w:rPr>
-        <w:lastRenderedPageBreak/>
         <w:t>SLIKA</w:t>
       </w:r>
       <w:r>
@@ -3430,6 +3898,7 @@
       </w:pPr>
       <w:bookmarkStart w:id="20" w:name="_Toc221980694"/>
       <w:r>
+        <w:lastRenderedPageBreak/>
         <w:t>Predpisi vaj</w:t>
       </w:r>
       <w:bookmarkEnd w:id="20"/>
@@ -3613,7 +4082,6 @@
       </w:pPr>
       <w:bookmarkStart w:id="21" w:name="_Toc221980695"/>
       <w:r>
-        <w:lastRenderedPageBreak/>
         <w:t>Zajemanje ponovitev</w:t>
       </w:r>
       <w:bookmarkEnd w:id="21"/>
@@ -3676,6 +4144,7 @@
         <w:spacing w:line="360" w:lineRule="auto"/>
       </w:pPr>
       <w:r>
+        <w:lastRenderedPageBreak/>
         <w:t xml:space="preserve">Trend gibanja izbrane sklepne točke je izpolnil pogoje za </w:t>
       </w:r>
       <w:r>
@@ -3833,28 +4302,28 @@
       </w:pPr>
       <w:bookmarkStart w:id="23" w:name="_Toc221980697"/>
       <w:r>
+        <w:t>Čas ekscentrične faze</w:t>
+      </w:r>
+      <w:bookmarkEnd w:id="23"/>
+    </w:p>
+    <w:p>
+      <w:r>
+        <w:t>Ekscentrična faza je nasprotje koncentrični, saj se v njej glavna mišica podaljšuje, uporabnik pa gibanje kontrolirano zavira, kar predstavlja manjšo breme kot med koncentrično fazo.</w:t>
+      </w:r>
+      <w:r>
+        <w:t xml:space="preserve"> Pri vaji upogib bicepsa je to druga faza, ki se začne v časovnem trenutku, ko se zapestje z utežjo začne iz najvišje točke spuščati navzdol, praviloma pa se konča, ko zapestje preide v začetno pozicijo.</w:t>
+      </w:r>
+      <w:r>
+        <w:t xml:space="preserve"> Pri vaji počep, pa je ekscentrična faza nastopi prva, torej ko se uporabnik iz začetne pozicije začne spuščati proti najnižji poziciji ponovitve.</w:t>
+      </w:r>
+    </w:p>
+    <w:p>
+      <w:pPr>
+        <w:pStyle w:val="Heading3"/>
+      </w:pPr>
+      <w:bookmarkStart w:id="24" w:name="_Toc221980698"/>
+      <w:r>
         <w:lastRenderedPageBreak/>
-        <w:t>Čas ekscentrične faze</w:t>
-      </w:r>
-      <w:bookmarkEnd w:id="23"/>
-    </w:p>
-    <w:p>
-      <w:r>
-        <w:t>Ekscentrična faza je nasprotje koncentrični, saj se v njej glavna mišica podaljšuje, uporabnik pa gibanje kontrolirano zavira, kar predstavlja manjšo breme kot med koncentrično fazo.</w:t>
-      </w:r>
-      <w:r>
-        <w:t xml:space="preserve"> Pri vaji upogib bicepsa je to druga faza, ki se začne v časovnem trenutku, ko se zapestje z utežjo začne iz najvišje točke spuščati navzdol, praviloma pa se konča, ko zapestje preide v začetno pozicijo.</w:t>
-      </w:r>
-      <w:r>
-        <w:t xml:space="preserve"> Pri vaji počep, pa je ekscentrična faza nastopi prva, torej ko se uporabnik iz začetne pozicije začne spuščati proti najnižji poziciji ponovitve.</w:t>
-      </w:r>
-    </w:p>
-    <w:p>
-      <w:pPr>
-        <w:pStyle w:val="Heading3"/>
-      </w:pPr>
-      <w:bookmarkStart w:id="24" w:name="_Toc221980698"/>
-      <w:r>
         <w:t>Čas izometrične faze</w:t>
       </w:r>
       <w:bookmarkEnd w:id="24"/>
@@ -3995,48 +4464,48 @@
     <w:p/>
     <w:p>
       <w:r>
+        <w:t>Časovni graf prikaže vsako ponovitev kot stolpec, ki vsebuje tri informacije. Rumen</w:t>
+      </w:r>
+      <w:r>
+        <w:t xml:space="preserve"> in svetlo zelen</w:t>
+      </w:r>
+      <w:r>
+        <w:t xml:space="preserve"> del </w:t>
+      </w:r>
+      <w:r>
+        <w:t>predstavljata</w:t>
+      </w:r>
+      <w:r>
+        <w:t xml:space="preserve"> čas koncentrične faze, oranžen</w:t>
+      </w:r>
+      <w:r>
+        <w:t xml:space="preserve"> in temno zelen</w:t>
+      </w:r>
+      <w:r>
+        <w:t xml:space="preserve"> del čas ekscentrične faze</w:t>
+      </w:r>
+      <w:r>
+        <w:t xml:space="preserve">, </w:t>
+      </w:r>
+      <w:r>
+        <w:t xml:space="preserve">črna črta na sredini stolpca </w:t>
+      </w:r>
+      <w:r>
+        <w:t xml:space="preserve">pa </w:t>
+      </w:r>
+      <w:r>
+        <w:t>čas izometrične faze.</w:t>
+      </w:r>
+    </w:p>
+    <w:p>
+      <w:pPr>
+        <w:pStyle w:val="Images"/>
+      </w:pPr>
+      <w:r>
+        <w:rPr>
+          <w:noProof/>
+        </w:rPr>
         <w:lastRenderedPageBreak/>
-        <w:t>Časovni graf prikaže vsako ponovitev kot stolpec, ki vsebuje tri informacije. Rumen</w:t>
-      </w:r>
-      <w:r>
-        <w:t xml:space="preserve"> in svetlo zelen</w:t>
-      </w:r>
-      <w:r>
-        <w:t xml:space="preserve"> del </w:t>
-      </w:r>
-      <w:r>
-        <w:t>predstavljata</w:t>
-      </w:r>
-      <w:r>
-        <w:t xml:space="preserve"> čas koncentrične faze, oranžen</w:t>
-      </w:r>
-      <w:r>
-        <w:t xml:space="preserve"> in temno zelen</w:t>
-      </w:r>
-      <w:r>
-        <w:t xml:space="preserve"> del čas ekscentrične faze</w:t>
-      </w:r>
-      <w:r>
-        <w:t xml:space="preserve">, </w:t>
-      </w:r>
-      <w:r>
-        <w:t xml:space="preserve">črna črta na sredini stolpca </w:t>
-      </w:r>
-      <w:r>
-        <w:t xml:space="preserve">pa </w:t>
-      </w:r>
-      <w:r>
-        <w:t>čas izometrične faze.</w:t>
-      </w:r>
-    </w:p>
-    <w:p>
-      <w:pPr>
-        <w:pStyle w:val="Images"/>
-      </w:pPr>
-      <w:r>
-        <w:rPr>
-          <w:noProof/>
-        </w:rPr>
         <w:drawing>
           <wp:inline distT="0" distB="0" distL="0" distR="0" wp14:anchorId="1E28F347" wp14:editId="4BB88319">
             <wp:extent cx="4933950" cy="3071499"/>
@@ -4083,25 +4552,51 @@
       <w:r>
         <w:t xml:space="preserve">Slika </w:t>
       </w:r>
-      <w:fldSimple w:instr=" STYLEREF 1 \s ">
-        <w:r>
-          <w:rPr>
-            <w:noProof/>
-          </w:rPr>
-          <w:t>2</w:t>
-        </w:r>
-      </w:fldSimple>
+      <w:r>
+        <w:fldChar w:fldCharType="begin"/>
+      </w:r>
+      <w:r>
+        <w:instrText xml:space="preserve"> STYLEREF 1 \s </w:instrText>
+      </w:r>
+      <w:r>
+        <w:fldChar w:fldCharType="separate"/>
+      </w:r>
+      <w:r>
+        <w:rPr>
+          <w:noProof/>
+        </w:rPr>
+        <w:t>2</w:t>
+      </w:r>
+      <w:r>
+        <w:rPr>
+          <w:noProof/>
+        </w:rPr>
+        <w:fldChar w:fldCharType="end"/>
+      </w:r>
       <w:r>
         <w:t>.</w:t>
       </w:r>
-      <w:fldSimple w:instr=" SEQ Slika \* ARABIC \s 1 ">
-        <w:r>
-          <w:rPr>
-            <w:noProof/>
-          </w:rPr>
-          <w:t>1</w:t>
-        </w:r>
-      </w:fldSimple>
+      <w:r>
+        <w:fldChar w:fldCharType="begin"/>
+      </w:r>
+      <w:r>
+        <w:instrText xml:space="preserve"> SEQ Slika \* ARABIC \s 1 </w:instrText>
+      </w:r>
+      <w:r>
+        <w:fldChar w:fldCharType="separate"/>
+      </w:r>
+      <w:r>
+        <w:rPr>
+          <w:noProof/>
+        </w:rPr>
+        <w:t>1</w:t>
+      </w:r>
+      <w:r>
+        <w:rPr>
+          <w:noProof/>
+        </w:rPr>
+        <w:fldChar w:fldCharType="end"/>
+      </w:r>
       <w:r>
         <w:t>: Časovni graf</w:t>
       </w:r>
@@ -4134,7 +4629,6 @@
         <w:rPr>
           <w:noProof/>
         </w:rPr>
-        <w:lastRenderedPageBreak/>
         <w:drawing>
           <wp:inline distT="0" distB="0" distL="0" distR="0" wp14:anchorId="26B7BC38" wp14:editId="448F4768">
             <wp:extent cx="4895918" cy="3124200"/>
@@ -4181,25 +4675,51 @@
       <w:r>
         <w:t xml:space="preserve">Slika </w:t>
       </w:r>
-      <w:fldSimple w:instr=" STYLEREF 1 \s ">
-        <w:r>
-          <w:rPr>
-            <w:noProof/>
-          </w:rPr>
-          <w:t>2</w:t>
-        </w:r>
-      </w:fldSimple>
+      <w:r>
+        <w:fldChar w:fldCharType="begin"/>
+      </w:r>
+      <w:r>
+        <w:instrText xml:space="preserve"> STYLEREF 1 \s </w:instrText>
+      </w:r>
+      <w:r>
+        <w:fldChar w:fldCharType="separate"/>
+      </w:r>
+      <w:r>
+        <w:rPr>
+          <w:noProof/>
+        </w:rPr>
+        <w:t>2</w:t>
+      </w:r>
+      <w:r>
+        <w:rPr>
+          <w:noProof/>
+        </w:rPr>
+        <w:fldChar w:fldCharType="end"/>
+      </w:r>
       <w:r>
         <w:t>.</w:t>
       </w:r>
-      <w:fldSimple w:instr=" SEQ Slika \* ARABIC \s 1 ">
-        <w:r>
-          <w:rPr>
-            <w:noProof/>
-          </w:rPr>
-          <w:t>2</w:t>
-        </w:r>
-      </w:fldSimple>
+      <w:r>
+        <w:fldChar w:fldCharType="begin"/>
+      </w:r>
+      <w:r>
+        <w:instrText xml:space="preserve"> SEQ Slika \* ARABIC \s 1 </w:instrText>
+      </w:r>
+      <w:r>
+        <w:fldChar w:fldCharType="separate"/>
+      </w:r>
+      <w:r>
+        <w:rPr>
+          <w:noProof/>
+        </w:rPr>
+        <w:t>2</w:t>
+      </w:r>
+      <w:r>
+        <w:rPr>
+          <w:noProof/>
+        </w:rPr>
+        <w:fldChar w:fldCharType="end"/>
+      </w:r>
       <w:r>
         <w:t xml:space="preserve">: Graf prepotovane </w:t>
       </w:r>
@@ -4212,6 +4732,7 @@
     <w:p/>
     <w:p>
       <w:r>
+        <w:lastRenderedPageBreak/>
         <w:t xml:space="preserve">Graf hitrosti je enak grafu prepotovane distance, le da se </w:t>
       </w:r>
       <w:r>
@@ -4274,25 +4795,51 @@
       <w:r>
         <w:t xml:space="preserve">Slika </w:t>
       </w:r>
-      <w:fldSimple w:instr=" STYLEREF 1 \s ">
-        <w:r>
-          <w:rPr>
-            <w:noProof/>
-          </w:rPr>
-          <w:t>2</w:t>
-        </w:r>
-      </w:fldSimple>
+      <w:r>
+        <w:fldChar w:fldCharType="begin"/>
+      </w:r>
+      <w:r>
+        <w:instrText xml:space="preserve"> STYLEREF 1 \s </w:instrText>
+      </w:r>
+      <w:r>
+        <w:fldChar w:fldCharType="separate"/>
+      </w:r>
+      <w:r>
+        <w:rPr>
+          <w:noProof/>
+        </w:rPr>
+        <w:t>2</w:t>
+      </w:r>
+      <w:r>
+        <w:rPr>
+          <w:noProof/>
+        </w:rPr>
+        <w:fldChar w:fldCharType="end"/>
+      </w:r>
       <w:r>
         <w:t>.</w:t>
       </w:r>
-      <w:fldSimple w:instr=" SEQ Slika \* ARABIC \s 1 ">
-        <w:r>
-          <w:rPr>
-            <w:noProof/>
-          </w:rPr>
-          <w:t>3</w:t>
-        </w:r>
-      </w:fldSimple>
+      <w:r>
+        <w:fldChar w:fldCharType="begin"/>
+      </w:r>
+      <w:r>
+        <w:instrText xml:space="preserve"> SEQ Slika \* ARABIC \s 1 </w:instrText>
+      </w:r>
+      <w:r>
+        <w:fldChar w:fldCharType="separate"/>
+      </w:r>
+      <w:r>
+        <w:rPr>
+          <w:noProof/>
+        </w:rPr>
+        <w:t>3</w:t>
+      </w:r>
+      <w:r>
+        <w:rPr>
+          <w:noProof/>
+        </w:rPr>
+        <w:fldChar w:fldCharType="end"/>
+      </w:r>
       <w:r>
         <w:t>: Graf hitrosti</w:t>
       </w:r>
@@ -4310,7 +4857,6 @@
       </w:pPr>
       <w:bookmarkStart w:id="35" w:name="_Toc221980701"/>
       <w:r>
-        <w:lastRenderedPageBreak/>
         <w:t>Informacije o nepravilni drži telesa</w:t>
       </w:r>
       <w:bookmarkEnd w:id="35"/>
@@ -4374,66 +4920,59 @@
           <w:sz w:val="44"/>
           <w:szCs w:val="44"/>
         </w:rPr>
-        <w:t xml:space="preserve"> </w:t>
-      </w:r>
-      <w:r>
+        <w:t xml:space="preserve"> MUMMY PLANK RED DOT ERRORJA</w:t>
+      </w:r>
+    </w:p>
+    <w:p>
+      <w:pPr>
+        <w:pStyle w:val="Heading2"/>
+      </w:pPr>
+      <w:bookmarkStart w:id="36" w:name="_Toc221980702"/>
+      <w:r>
+        <w:t>Kalibracija uporabnika</w:t>
+      </w:r>
+      <w:bookmarkEnd w:id="36"/>
+    </w:p>
+    <w:p>
+      <w:r>
+        <w:t xml:space="preserve">Pogoj za uporabo realno-časovne analize vadbe je vnos uporabnikove višine. </w:t>
+      </w:r>
+      <w:r>
+        <w:t xml:space="preserve">Ko uporabnik vnese višino, lahko izvede postopek kalibracije. Postopek od uporabnika zahteva, </w:t>
+      </w:r>
+      <w:r>
+        <w:t xml:space="preserve">da za pred kamero za določen čas stoji zravnano. </w:t>
+      </w:r>
+      <w:r>
+        <w:t xml:space="preserve">Rezultat kalibracije so izmerjene dolžine med vsemi sosednjimi sklepnimi točkami uporabnika v metrih. Preračunajo se tako, da </w:t>
+      </w:r>
+      <w:r>
+        <w:t>se iz vnesene uporabnikove višine preračuna pretvorba piksel-meter, ki se uporabi za pretvorbo vseh dolžin med vsemi sosednjimi sklepnimi točkami iz enote pikslov v enoto metrov.</w:t>
+      </w:r>
+    </w:p>
+    <w:p>
+      <w:pPr>
         <w:rPr>
           <w:color w:val="EE0000"/>
           <w:sz w:val="44"/>
           <w:szCs w:val="44"/>
         </w:rPr>
-        <w:t>MUMMY PLANK RED DOT ERRORJA</w:t>
-      </w:r>
-    </w:p>
-    <w:p>
-      <w:pPr>
-        <w:pStyle w:val="Heading2"/>
-      </w:pPr>
-      <w:bookmarkStart w:id="36" w:name="_Toc221980702"/>
-      <w:r>
-        <w:t>Kalibracija uporabnika</w:t>
-      </w:r>
-      <w:bookmarkEnd w:id="36"/>
-    </w:p>
-    <w:p>
-      <w:r>
-        <w:t xml:space="preserve">Pogoj za uporabo realno-časovne analize vadbe je vnos uporabnikove višine. </w:t>
-      </w:r>
-      <w:r>
-        <w:t xml:space="preserve">Ko uporabnik vnese višino, lahko izvede postopek kalibracije. Postopek od uporabnika zahteva, </w:t>
-      </w:r>
-      <w:r>
-        <w:t xml:space="preserve">da za pred kamero za določen čas stoji zravnano. </w:t>
-      </w:r>
-      <w:r>
-        <w:t xml:space="preserve">Rezultat kalibracije so izmerjene dolžine med vsemi sosednjimi sklepnimi točkami uporabnika v metrih. Preračunajo se tako, da </w:t>
-      </w:r>
-      <w:r>
-        <w:t>se iz vnesene uporabnikove višine preračuna pretvorba piksel-meter, ki se uporabi za pretvorbo vseh dolžin med vsemi sosednjimi sklepnimi točkami iz enote pikslov v enoto metrov.</w:t>
-      </w:r>
-    </w:p>
-    <w:p>
-      <w:pPr>
+      </w:pPr>
+      <w:r>
         <w:rPr>
           <w:color w:val="EE0000"/>
           <w:sz w:val="44"/>
           <w:szCs w:val="44"/>
         </w:rPr>
-      </w:pPr>
+        <w:lastRenderedPageBreak/>
+        <w:t>SLIKA</w:t>
+      </w:r>
       <w:r>
         <w:rPr>
           <w:color w:val="EE0000"/>
           <w:sz w:val="44"/>
           <w:szCs w:val="44"/>
         </w:rPr>
-        <w:t>SLIKA</w:t>
-      </w:r>
-      <w:r>
-        <w:rPr>
-          <w:color w:val="EE0000"/>
-          <w:sz w:val="44"/>
-          <w:szCs w:val="44"/>
-        </w:rPr>
         <w:t xml:space="preserve"> KALIBRACIJE</w:t>
       </w:r>
     </w:p>
@@ -4506,427 +5045,414 @@
       </w:pPr>
       <w:bookmarkStart w:id="38" w:name="_Toc221980704"/>
       <w:r>
+        <w:t xml:space="preserve">Primerjava ponovitev znotraj </w:t>
+      </w:r>
+      <w:r>
+        <w:t xml:space="preserve">iste </w:t>
+      </w:r>
+      <w:r>
+        <w:t>serije</w:t>
+      </w:r>
+      <w:bookmarkEnd w:id="38"/>
+    </w:p>
+    <w:p>
+      <w:r>
+        <w:t xml:space="preserve">Osredotočimo se na </w:t>
+      </w:r>
+      <w:r>
+        <w:t>grafe</w:t>
+      </w:r>
+      <w:r>
+        <w:t xml:space="preserve"> </w:t>
+      </w:r>
+      <w:r>
+        <w:fldChar w:fldCharType="begin"/>
+      </w:r>
+      <w:r>
+        <w:instrText xml:space="preserve"> REF _Ref221966222 \h </w:instrText>
+      </w:r>
+      <w:r>
+        <w:instrText xml:space="preserve"> \* MERGEFORMAT </w:instrText>
+      </w:r>
+      <w:r>
+        <w:fldChar w:fldCharType="separate"/>
+      </w:r>
+      <w:r>
+        <w:t xml:space="preserve">Slika </w:t>
+      </w:r>
+      <w:r>
+        <w:rPr>
+          <w:noProof/>
+        </w:rPr>
+        <w:t>2</w:t>
+      </w:r>
+      <w:r>
+        <w:t>.</w:t>
+      </w:r>
+      <w:r>
+        <w:rPr>
+          <w:noProof/>
+        </w:rPr>
+        <w:t>1</w:t>
+      </w:r>
+      <w:r>
+        <w:t>: Časovni graf</w:t>
+      </w:r>
+      <w:r>
+        <w:fldChar w:fldCharType="end"/>
+      </w:r>
+      <w:r>
+        <w:t xml:space="preserve">, </w:t>
+      </w:r>
+      <w:r>
+        <w:fldChar w:fldCharType="begin"/>
+      </w:r>
+      <w:r>
+        <w:instrText xml:space="preserve"> REF _Ref221966255 \h </w:instrText>
+      </w:r>
+      <w:r>
+        <w:instrText xml:space="preserve"> \* MERGEFORMAT </w:instrText>
+      </w:r>
+      <w:r>
+        <w:fldChar w:fldCharType="separate"/>
+      </w:r>
+      <w:r>
+        <w:t xml:space="preserve">Slika </w:t>
+      </w:r>
+      <w:r>
+        <w:rPr>
+          <w:noProof/>
+        </w:rPr>
+        <w:t>2</w:t>
+      </w:r>
+      <w:r>
+        <w:t>.</w:t>
+      </w:r>
+      <w:r>
+        <w:rPr>
+          <w:noProof/>
+        </w:rPr>
+        <w:t>2</w:t>
+      </w:r>
+      <w:r>
+        <w:t xml:space="preserve">: Graf prepotovane </w:t>
+      </w:r>
+      <w:r>
+        <w:t>razdalje</w:t>
+      </w:r>
+      <w:r>
+        <w:fldChar w:fldCharType="end"/>
+      </w:r>
+      <w:r>
+        <w:t xml:space="preserve">, </w:t>
+      </w:r>
+      <w:r>
+        <w:fldChar w:fldCharType="begin"/>
+      </w:r>
+      <w:r>
+        <w:instrText xml:space="preserve"> REF _Ref221968150 \h </w:instrText>
+      </w:r>
+      <w:r>
+        <w:instrText xml:space="preserve"> \* MERGEFORMAT </w:instrText>
+      </w:r>
+      <w:r>
+        <w:fldChar w:fldCharType="separate"/>
+      </w:r>
+      <w:r>
+        <w:t xml:space="preserve">Slika </w:t>
+      </w:r>
+      <w:r>
+        <w:rPr>
+          <w:noProof/>
+        </w:rPr>
+        <w:t>2</w:t>
+      </w:r>
+      <w:r>
+        <w:t>.</w:t>
+      </w:r>
+      <w:r>
+        <w:rPr>
+          <w:noProof/>
+        </w:rPr>
+        <w:t>3</w:t>
+      </w:r>
+      <w:r>
+        <w:t>: Graf hitrosti v koncentrični fazi</w:t>
+      </w:r>
+      <w:r>
+        <w:fldChar w:fldCharType="end"/>
+      </w:r>
+      <w:r>
+        <w:t>.</w:t>
+      </w:r>
+    </w:p>
+    <w:p/>
+    <w:p>
+      <w:r>
+        <w:t xml:space="preserve">Na časovnem grafu je trend naraščanja časa koncentrične faze med ponovitvami zelo očiten. Po tem lahko slepo sklepamo, da je proti koncu serije uporabnik potreboval več napora, da je opravil ponovitev. To je le sklep, kajti uporabnik bi lahko proti koncu serije premagoval večjo razdaljo in bi zato lahko bili časi ponovitev daljši. </w:t>
+      </w:r>
+    </w:p>
+    <w:p>
+      <w:r>
+        <w:t>Iz samega g</w:t>
+      </w:r>
+      <w:r>
+        <w:t>raf</w:t>
+      </w:r>
+      <w:r>
+        <w:t>a</w:t>
+      </w:r>
+      <w:r>
+        <w:t xml:space="preserve"> prepotovane </w:t>
+      </w:r>
+      <w:r>
+        <w:t>razdalje je težko kaj sklepati, kajti med ponovitvami ni večjega odstopanja vrednosti. Lahko potrdimo le, da je uporabnik v tem pogledu pravilno opravil serijo.</w:t>
+      </w:r>
+    </w:p>
+    <w:p/>
+    <w:p>
+      <w:r>
+        <w:t xml:space="preserve">Iz grafa hitrosti v koncentrični fazi je možno narediti večje analize, saj graf hitrosti </w:t>
+      </w:r>
+      <w:r>
+        <w:t xml:space="preserve">združi rezultate </w:t>
+      </w:r>
+      <w:r>
+        <w:t>časovn</w:t>
+      </w:r>
+      <w:r>
+        <w:t xml:space="preserve">ega </w:t>
+      </w:r>
+      <w:r>
+        <w:t>graf</w:t>
+      </w:r>
+      <w:r>
+        <w:t>a</w:t>
+      </w:r>
+      <w:r>
+        <w:t xml:space="preserve"> in graf</w:t>
+      </w:r>
+      <w:r>
+        <w:t>a</w:t>
+      </w:r>
+      <w:r>
+        <w:t xml:space="preserve"> prepotovane razdalje. </w:t>
+      </w:r>
+      <w:r>
+        <w:t xml:space="preserve">Ob grafu hitrosti v koncentrični fazi je mogoče izpeljati ugotovitve enega najbolj priznanih predpisov treninga, ki temelji na podlagi hitrosti. </w:t>
+      </w:r>
+    </w:p>
+    <w:p>
+      <w:pPr>
+        <w:pStyle w:val="Heading3"/>
+      </w:pPr>
+      <w:bookmarkStart w:id="39" w:name="_Toc221980705"/>
+      <w:r>
         <w:lastRenderedPageBreak/>
-        <w:t xml:space="preserve">Primerjava ponovitev znotraj </w:t>
-      </w:r>
-      <w:r>
-        <w:t xml:space="preserve">iste </w:t>
-      </w:r>
-      <w:r>
-        <w:t>serije</w:t>
-      </w:r>
-      <w:bookmarkEnd w:id="38"/>
-    </w:p>
-    <w:p>
-      <w:r>
-        <w:t xml:space="preserve">Osredotočimo se na </w:t>
-      </w:r>
-      <w:r>
-        <w:t>grafe</w:t>
+        <w:t>Trening na podlagi hitrosti</w:t>
+      </w:r>
+      <w:bookmarkEnd w:id="39"/>
+    </w:p>
+    <w:p>
+      <w:r>
+        <w:t xml:space="preserve">Na grafu </w:t>
+      </w:r>
+      <w:r>
+        <w:fldChar w:fldCharType="begin"/>
+      </w:r>
+      <w:r>
+        <w:instrText xml:space="preserve"> REF _Ref221967533 \h </w:instrText>
+      </w:r>
+      <w:r>
+        <w:instrText xml:space="preserve"> \* MERGEFORMAT </w:instrText>
+      </w:r>
+      <w:r>
+        <w:fldChar w:fldCharType="separate"/>
+      </w:r>
+      <w:r>
+        <w:t xml:space="preserve">Slika </w:t>
+      </w:r>
+      <w:r>
+        <w:rPr>
+          <w:noProof/>
+        </w:rPr>
+        <w:t>2</w:t>
+      </w:r>
+      <w:r>
+        <w:t>.</w:t>
+      </w:r>
+      <w:r>
+        <w:rPr>
+          <w:noProof/>
+        </w:rPr>
+        <w:t>3</w:t>
+      </w:r>
+      <w:r>
+        <w:t>: Graf hitrosti v koncentrični fazi</w:t>
+      </w:r>
+      <w:r>
+        <w:fldChar w:fldCharType="end"/>
+      </w:r>
+      <w:r>
+        <w:t xml:space="preserve"> je v</w:t>
+      </w:r>
+      <w:r>
+        <w:t xml:space="preserve">eč kot očiten </w:t>
+      </w:r>
+      <w:r>
+        <w:t xml:space="preserve">trend padanja hitrosti </w:t>
+      </w:r>
+      <w:r>
+        <w:t xml:space="preserve">čez ponovitve, iz česar se sklepa, da je uporabnik vajo opravljal pod </w:t>
+      </w:r>
+      <w:r>
+        <w:t xml:space="preserve">njemu </w:t>
+      </w:r>
+      <w:r>
+        <w:t xml:space="preserve">veliko obremenitvijo in </w:t>
+      </w:r>
+      <w:r>
+        <w:t xml:space="preserve">da je </w:t>
+      </w:r>
+      <w:r>
+        <w:t xml:space="preserve">opravil serijo, ki je značilna za </w:t>
+      </w:r>
+      <w:r>
+        <w:t>trening</w:t>
       </w:r>
       <w:r>
         <w:t xml:space="preserve"> </w:t>
       </w:r>
       <w:r>
-        <w:fldChar w:fldCharType="begin"/>
-      </w:r>
-      <w:r>
-        <w:instrText xml:space="preserve"> REF _Ref221966222 \h </w:instrText>
-      </w:r>
-      <w:r>
-        <w:instrText xml:space="preserve"> \* MERGEFORMAT </w:instrText>
-      </w:r>
-      <w:r>
-        <w:fldChar w:fldCharType="separate"/>
-      </w:r>
-      <w:r>
-        <w:t xml:space="preserve">Slika </w:t>
-      </w:r>
-      <w:r>
-        <w:rPr>
-          <w:noProof/>
-        </w:rPr>
-        <w:t>2</w:t>
+        <w:t>napredovanj</w:t>
+      </w:r>
+      <w:r>
+        <w:t>a</w:t>
+      </w:r>
+      <w:r>
+        <w:t xml:space="preserve"> v moči.</w:t>
+      </w:r>
+      <w:r>
+        <w:t xml:space="preserve"> </w:t>
+      </w:r>
+      <w:r>
+        <w:t>Če padajoči trend čez ponovitve ni prisoten in je cilj treninga napredovanje v moči, potem se uporabnika obvesti, da si naj za naslednjo serijo poveča obremenitev</w:t>
+      </w:r>
+      <w:r>
+        <w:t xml:space="preserve">, kajti tak trend </w:t>
+      </w:r>
+      <w:r>
+        <w:t xml:space="preserve">konstantne hitrosti čez ponovitve </w:t>
+      </w:r>
+      <w:r>
+        <w:t xml:space="preserve">je značilen za </w:t>
+      </w:r>
+      <w:r>
+        <w:t>trening ohranjanja moči</w:t>
       </w:r>
       <w:r>
         <w:t>.</w:t>
       </w:r>
       <w:r>
-        <w:rPr>
-          <w:noProof/>
-        </w:rPr>
-        <w:t>1</w:t>
-      </w:r>
-      <w:r>
-        <w:t>: Časovni graf</w:t>
-      </w:r>
-      <w:r>
-        <w:fldChar w:fldCharType="end"/>
-      </w:r>
-      <w:r>
-        <w:t xml:space="preserve">, </w:t>
-      </w:r>
-      <w:r>
-        <w:fldChar w:fldCharType="begin"/>
-      </w:r>
-      <w:r>
-        <w:instrText xml:space="preserve"> REF _Ref221966255 \h </w:instrText>
-      </w:r>
-      <w:r>
-        <w:instrText xml:space="preserve"> \* MERGEFORMAT </w:instrText>
-      </w:r>
-      <w:r>
-        <w:fldChar w:fldCharType="separate"/>
-      </w:r>
-      <w:r>
-        <w:t xml:space="preserve">Slika </w:t>
-      </w:r>
-      <w:r>
-        <w:rPr>
-          <w:noProof/>
-        </w:rPr>
-        <w:t>2</w:t>
+        <w:t xml:space="preserve"> </w:t>
+      </w:r>
+    </w:p>
+    <w:p/>
+    <w:p>
+      <w:r>
+        <w:t xml:space="preserve">Preko grafa hitrosti v koncentrični </w:t>
+      </w:r>
+      <w:r>
+        <w:t xml:space="preserve">je možno </w:t>
+      </w:r>
+      <w:r>
+        <w:t>napove</w:t>
+      </w:r>
+      <w:r>
+        <w:t>dati</w:t>
+      </w:r>
+      <w:r>
+        <w:t xml:space="preserve"> tip treninga na podlagi trenda hitrosti čez ponovitve. Edina predpostavka, ki mora biti izpolnjena za </w:t>
+      </w:r>
+      <w:r>
+        <w:t xml:space="preserve">potrditev </w:t>
+      </w:r>
+      <w:r>
+        <w:t>omenjen</w:t>
+      </w:r>
+      <w:r>
+        <w:t>ih</w:t>
+      </w:r>
+      <w:r>
+        <w:t xml:space="preserve"> ugotovit</w:t>
+      </w:r>
+      <w:r>
+        <w:t>ev</w:t>
+      </w:r>
+      <w:r>
+        <w:t>,</w:t>
+      </w:r>
+      <w:r>
+        <w:t xml:space="preserve"> je ta, da mora uporabnik med ponovit</w:t>
+      </w:r>
+      <w:r>
+        <w:t>vami</w:t>
+      </w:r>
+      <w:r>
+        <w:t xml:space="preserve"> dati vse od sebe.</w:t>
+      </w:r>
+    </w:p>
+    <w:p>
+      <w:pPr>
+        <w:pStyle w:val="Heading3"/>
+      </w:pPr>
+      <w:r>
+        <w:t xml:space="preserve"> </w:t>
+      </w:r>
+      <w:bookmarkStart w:id="40" w:name="_Toc221980706"/>
+      <w:r>
+        <w:t>Primerjava med treningi</w:t>
+      </w:r>
+      <w:r>
+        <w:t xml:space="preserve"> skozi čas</w:t>
+      </w:r>
+      <w:bookmarkEnd w:id="40"/>
+    </w:p>
+    <w:p>
+      <w:r>
+        <w:t xml:space="preserve">Zaporedne treninge, ki </w:t>
+      </w:r>
+      <w:r>
+        <w:t xml:space="preserve">se jim </w:t>
+      </w:r>
+      <w:r>
+        <w:t>preko napovedi klasifikacije tipa treninga s pomočjo sklepov na podlagi hitrosti v koncentrični fazi</w:t>
+      </w:r>
+      <w:r>
+        <w:t xml:space="preserve"> določi tip</w:t>
+      </w:r>
+      <w:r>
+        <w:t xml:space="preserve">, je možno združiti v </w:t>
+      </w:r>
+      <w:r>
+        <w:t xml:space="preserve">časovne </w:t>
+      </w:r>
+      <w:r>
+        <w:t>cikle z istim tipom treninga</w:t>
+      </w:r>
+      <w:r>
+        <w:t xml:space="preserve">, kar omogoča grobe primerjave med </w:t>
+      </w:r>
+      <w:r>
+        <w:t xml:space="preserve">pričakovanimi in izmerjenimi </w:t>
+      </w:r>
+      <w:r>
+        <w:t>cilji časovnih ciklov</w:t>
       </w:r>
       <w:r>
         <w:t>.</w:t>
       </w:r>
-      <w:r>
-        <w:rPr>
-          <w:noProof/>
-        </w:rPr>
-        <w:t>2</w:t>
-      </w:r>
-      <w:r>
-        <w:t xml:space="preserve">: Graf prepotovane </w:t>
-      </w:r>
-      <w:r>
-        <w:t>razdalje</w:t>
-      </w:r>
-      <w:r>
-        <w:fldChar w:fldCharType="end"/>
-      </w:r>
-      <w:r>
-        <w:t xml:space="preserve">, </w:t>
-      </w:r>
-      <w:r>
-        <w:fldChar w:fldCharType="begin"/>
-      </w:r>
-      <w:r>
-        <w:instrText xml:space="preserve"> REF _Ref221968150 \h </w:instrText>
-      </w:r>
-      <w:r>
-        <w:instrText xml:space="preserve"> \* MERGEFORMAT </w:instrText>
-      </w:r>
-      <w:r>
-        <w:fldChar w:fldCharType="separate"/>
-      </w:r>
-      <w:r>
-        <w:t xml:space="preserve">Slika </w:t>
-      </w:r>
-      <w:r>
-        <w:rPr>
-          <w:noProof/>
-        </w:rPr>
-        <w:t>2</w:t>
-      </w:r>
-      <w:r>
-        <w:t>.</w:t>
-      </w:r>
-      <w:r>
-        <w:rPr>
-          <w:noProof/>
-        </w:rPr>
-        <w:t>3</w:t>
-      </w:r>
-      <w:r>
-        <w:t>: Graf hitrosti v koncentrični fazi</w:t>
-      </w:r>
-      <w:r>
-        <w:fldChar w:fldCharType="end"/>
-      </w:r>
-      <w:r>
-        <w:t>.</w:t>
-      </w:r>
-    </w:p>
-    <w:p/>
-    <w:p>
-      <w:r>
-        <w:t xml:space="preserve">Na časovnem grafu je trend naraščanja časa koncentrične faze med ponovitvami zelo očiten. Po tem lahko slepo sklepamo, da je proti koncu serije uporabnik potreboval več napora, da je opravil ponovitev. To je le sklep, kajti uporabnik bi lahko proti koncu serije premagoval večjo razdaljo in bi zato lahko bili časi ponovitev daljši. </w:t>
-      </w:r>
-    </w:p>
-    <w:p>
-      <w:r>
-        <w:t>Iz samega g</w:t>
-      </w:r>
-      <w:r>
-        <w:t>raf</w:t>
-      </w:r>
-      <w:r>
-        <w:t>a</w:t>
-      </w:r>
-      <w:r>
-        <w:t xml:space="preserve"> prepotovane </w:t>
-      </w:r>
-      <w:r>
-        <w:t>razdalje je težko kaj sklepati, kajti med ponovitvami ni večjega odstopanja vrednosti. Lahko potrdimo le, da je uporabnik v tem pogledu pravilno opravil serijo.</w:t>
-      </w:r>
-    </w:p>
-    <w:p/>
-    <w:p>
-      <w:r>
-        <w:t xml:space="preserve">Iz grafa hitrosti v koncentrični fazi je možno narediti večje analize, saj graf hitrosti </w:t>
-      </w:r>
-      <w:r>
-        <w:t xml:space="preserve">združi rezultate </w:t>
-      </w:r>
-      <w:r>
-        <w:t>časovn</w:t>
-      </w:r>
-      <w:r>
-        <w:t xml:space="preserve">ega </w:t>
-      </w:r>
-      <w:r>
-        <w:t>graf</w:t>
-      </w:r>
-      <w:r>
-        <w:t>a</w:t>
-      </w:r>
-      <w:r>
-        <w:t xml:space="preserve"> in graf</w:t>
-      </w:r>
-      <w:r>
-        <w:t>a</w:t>
-      </w:r>
-      <w:r>
-        <w:t xml:space="preserve"> prepotovane razdalje. </w:t>
-      </w:r>
-      <w:r>
-        <w:t xml:space="preserve">Ob grafu hitrosti v koncentrični fazi je mogoče izpeljati ugotovitve enega najbolj priznanih predpisov treninga, ki temelji na podlagi hitrosti. </w:t>
-      </w:r>
-    </w:p>
-    <w:p>
-      <w:pPr>
-        <w:pStyle w:val="Heading3"/>
-      </w:pPr>
-      <w:bookmarkStart w:id="39" w:name="_Toc221980705"/>
-      <w:r>
-        <w:t>Trening na podlagi hitrosti</w:t>
-      </w:r>
-      <w:bookmarkEnd w:id="39"/>
-    </w:p>
-    <w:p>
-      <w:r>
-        <w:t xml:space="preserve">Na grafu </w:t>
-      </w:r>
-      <w:r>
-        <w:fldChar w:fldCharType="begin"/>
-      </w:r>
-      <w:r>
-        <w:instrText xml:space="preserve"> REF _Ref221967533 \h </w:instrText>
-      </w:r>
-      <w:r>
-        <w:instrText xml:space="preserve"> \* MERGEFORMAT </w:instrText>
-      </w:r>
-      <w:r>
-        <w:fldChar w:fldCharType="separate"/>
-      </w:r>
-      <w:r>
-        <w:t xml:space="preserve">Slika </w:t>
-      </w:r>
-      <w:r>
-        <w:rPr>
-          <w:noProof/>
-        </w:rPr>
-        <w:t>2</w:t>
-      </w:r>
-      <w:r>
-        <w:t>.</w:t>
-      </w:r>
-      <w:r>
-        <w:rPr>
-          <w:noProof/>
-        </w:rPr>
-        <w:t>3</w:t>
-      </w:r>
-      <w:r>
-        <w:t>: Graf hitrosti v koncentrični fazi</w:t>
-      </w:r>
-      <w:r>
-        <w:fldChar w:fldCharType="end"/>
-      </w:r>
-      <w:r>
-        <w:t xml:space="preserve"> je v</w:t>
-      </w:r>
-      <w:r>
-        <w:t xml:space="preserve">eč kot očiten </w:t>
-      </w:r>
-      <w:r>
-        <w:t xml:space="preserve">trend padanja hitrosti </w:t>
-      </w:r>
-      <w:r>
-        <w:t xml:space="preserve">čez ponovitve, iz česar se sklepa, da je uporabnik vajo opravljal pod </w:t>
-      </w:r>
-      <w:r>
-        <w:t xml:space="preserve">njemu </w:t>
-      </w:r>
-      <w:r>
-        <w:t xml:space="preserve">veliko obremenitvijo in </w:t>
-      </w:r>
-      <w:r>
-        <w:t xml:space="preserve">da je </w:t>
-      </w:r>
-      <w:r>
-        <w:t xml:space="preserve">opravil serijo, ki je značilna za </w:t>
-      </w:r>
-      <w:r>
-        <w:t>trening</w:t>
-      </w:r>
-      <w:r>
-        <w:t xml:space="preserve"> </w:t>
-      </w:r>
-      <w:r>
-        <w:t>napredovanj</w:t>
-      </w:r>
-      <w:r>
-        <w:t>a</w:t>
-      </w:r>
-      <w:r>
-        <w:t xml:space="preserve"> v moči.</w:t>
-      </w:r>
-      <w:r>
-        <w:t xml:space="preserve"> </w:t>
-      </w:r>
-      <w:r>
-        <w:t>Če padajoči trend čez ponovitve ni prisoten in je cilj treninga napredovanje v moči, potem se uporabnika obvesti, da si naj za naslednjo serijo poveča obremenitev</w:t>
-      </w:r>
-      <w:r>
-        <w:t xml:space="preserve">, kajti tak trend </w:t>
-      </w:r>
-      <w:r>
-        <w:t xml:space="preserve">konstantne hitrosti čez ponovitve </w:t>
-      </w:r>
-      <w:r>
-        <w:t xml:space="preserve">je značilen za </w:t>
-      </w:r>
-      <w:r>
-        <w:t>trening ohranjanja moči</w:t>
-      </w:r>
-      <w:r>
-        <w:t>.</w:t>
-      </w:r>
-      <w:r>
-        <w:t xml:space="preserve"> </w:t>
-      </w:r>
-    </w:p>
-    <w:p/>
-    <w:p>
-      <w:r>
-        <w:t xml:space="preserve">Preko grafa hitrosti v koncentrični </w:t>
-      </w:r>
-      <w:r>
-        <w:t xml:space="preserve">je možno </w:t>
-      </w:r>
-      <w:r>
-        <w:t>napove</w:t>
-      </w:r>
-      <w:r>
-        <w:t>dati</w:t>
-      </w:r>
-      <w:r>
-        <w:t xml:space="preserve"> tip treninga na podlagi trenda hitrosti čez ponovitve. Edina predpostavka, ki mora biti izpolnjena za </w:t>
-      </w:r>
-      <w:r>
-        <w:t xml:space="preserve">potrditev </w:t>
-      </w:r>
-      <w:r>
-        <w:t>omenjen</w:t>
-      </w:r>
-      <w:r>
-        <w:t>ih</w:t>
-      </w:r>
-      <w:r>
-        <w:t xml:space="preserve"> ugotovit</w:t>
-      </w:r>
-      <w:r>
-        <w:t>ev</w:t>
-      </w:r>
-      <w:r>
-        <w:t>,</w:t>
-      </w:r>
-      <w:r>
-        <w:t xml:space="preserve"> je ta, da mora uporabnik med ponovit</w:t>
-      </w:r>
-      <w:r>
-        <w:t>vami</w:t>
-      </w:r>
-      <w:r>
-        <w:t xml:space="preserve"> dati vse od sebe.</w:t>
-      </w:r>
-    </w:p>
-    <w:p>
-      <w:pPr>
-        <w:pStyle w:val="Heading3"/>
-      </w:pPr>
-      <w:r>
-        <w:lastRenderedPageBreak/>
-        <w:t xml:space="preserve"> </w:t>
-      </w:r>
-      <w:bookmarkStart w:id="40" w:name="_Toc221980706"/>
-      <w:r>
-        <w:t>Primerjava med treningi</w:t>
-      </w:r>
-      <w:r>
-        <w:t xml:space="preserve"> skozi čas</w:t>
-      </w:r>
-      <w:bookmarkEnd w:id="40"/>
-    </w:p>
-    <w:p>
-      <w:r>
-        <w:t xml:space="preserve">Zaporedne treninge, ki </w:t>
-      </w:r>
-      <w:r>
-        <w:t xml:space="preserve">se jim </w:t>
-      </w:r>
-      <w:r>
-        <w:t>preko napovedi klasifikacije tipa treninga s pomočjo sklepov na podlagi hitrosti v koncentrični fazi</w:t>
-      </w:r>
-      <w:r>
-        <w:t xml:space="preserve"> določi tip</w:t>
-      </w:r>
-      <w:r>
-        <w:t xml:space="preserve">, je možno združiti v </w:t>
-      </w:r>
-      <w:r>
-        <w:t xml:space="preserve">časovne </w:t>
-      </w:r>
-      <w:r>
-        <w:t>cikle z istim tipom treninga</w:t>
-      </w:r>
-      <w:r>
-        <w:t xml:space="preserve">, kar omogoča grobe primerjave med </w:t>
-      </w:r>
-      <w:r>
-        <w:t xml:space="preserve">pričakovanimi in izmerjenimi </w:t>
-      </w:r>
-      <w:r>
-        <w:t>cilji časovnih ciklov</w:t>
-      </w:r>
-      <w:r>
-        <w:t>.</w:t>
-      </w:r>
-    </w:p>
-    <w:p/>
-    <w:p>
-      <w:pPr>
-        <w:pStyle w:val="Heading2"/>
-      </w:pPr>
-      <w:bookmarkStart w:id="41" w:name="_Toc221980707"/>
-      <w:r>
-        <w:t>Uporabnost orodja za realno-časovno analizo vadbe</w:t>
-      </w:r>
-      <w:bookmarkEnd w:id="41"/>
-    </w:p>
-    <w:p/>
+    </w:p>
     <w:p/>
     <w:sectPr>
       <w:headerReference w:type="default" r:id="rId17"/>
@@ -5051,71 +5577,18 @@
     <w:pPr>
       <w:pStyle w:val="Header"/>
     </w:pPr>
-    <w:proofErr w:type="spellStart"/>
     <w:r>
-      <w:t>Navodila</w:t>
+      <w:t xml:space="preserve">Navodila za izdelavo diplomskih </w:t>
     </w:r>
-    <w:proofErr w:type="spellEnd"/>
-    <w:r>
-      <w:t xml:space="preserve"> za </w:t>
-    </w:r>
-    <w:proofErr w:type="spellStart"/>
-    <w:r>
-      <w:t>izdelavo</w:t>
-    </w:r>
-    <w:proofErr w:type="spellEnd"/>
-    <w:r>
-      <w:t xml:space="preserve"> </w:t>
-    </w:r>
-    <w:proofErr w:type="spellStart"/>
-    <w:r>
-      <w:t>diplomskih</w:t>
-    </w:r>
-    <w:proofErr w:type="spellEnd"/>
-    <w:r>
-      <w:t xml:space="preserve"> </w:t>
-    </w:r>
-    <w:smartTag w:uri="urn:schemas-microsoft-com:office:smarttags" w:element="State">
-      <w:smartTag w:uri="urn:schemas-microsoft-com:office:smarttags" w:element="place">
+    <w:smartTag w:uri="urn:schemas-microsoft-com:office:smarttags" w:element="place">
+      <w:smartTag w:uri="urn:schemas-microsoft-com:office:smarttags" w:element="State">
         <w:r>
           <w:t>del</w:t>
         </w:r>
       </w:smartTag>
     </w:smartTag>
     <w:r>
-      <w:t xml:space="preserve"> </w:t>
-    </w:r>
-    <w:proofErr w:type="spellStart"/>
-    <w:r>
-      <w:t>na</w:t>
-    </w:r>
-    <w:proofErr w:type="spellEnd"/>
-    <w:r>
-      <w:t xml:space="preserve"> </w:t>
-    </w:r>
-    <w:proofErr w:type="spellStart"/>
-    <w:r>
-      <w:t>dodiplomskih</w:t>
-    </w:r>
-    <w:proofErr w:type="spellEnd"/>
-    <w:r>
-      <w:t xml:space="preserve"> </w:t>
-    </w:r>
-    <w:proofErr w:type="spellStart"/>
-    <w:r>
-      <w:t>študijskih</w:t>
-    </w:r>
-    <w:proofErr w:type="spellEnd"/>
-    <w:r>
-      <w:t xml:space="preserve"> </w:t>
-    </w:r>
-    <w:proofErr w:type="spellStart"/>
-    <w:r>
-      <w:t>programih</w:t>
-    </w:r>
-    <w:proofErr w:type="spellEnd"/>
-    <w:r>
-      <w:t xml:space="preserve"> UM FERI</w:t>
+      <w:t xml:space="preserve"> na dodiplomskih študijskih programih UM FERI</w:t>
     </w:r>
     <w:r>
       <w:rPr>
@@ -5227,6 +5700,119 @@
 <file path=word/numbering.xml><?xml version="1.0" encoding="utf-8"?>
 <w:numbering xmlns:wpc="http://schemas.microsoft.com/office/word/2010/wordprocessingCanvas" xmlns:cx="http://schemas.microsoft.com/office/drawing/2014/chartex" xmlns:cx1="http://schemas.microsoft.com/office/drawing/2015/9/8/chartex" xmlns:cx2="http://schemas.microsoft.com/office/drawing/2015/10/21/chartex" xmlns:cx3="http://schemas.microsoft.com/office/drawing/2016/5/9/chartex" xmlns:cx4="http://schemas.microsoft.com/office/drawing/2016/5/10/chartex" xmlns:cx5="http://schemas.microsoft.com/office/drawing/2016/5/11/chartex" xmlns:cx6="http://schemas.microsoft.com/office/drawing/2016/5/12/chartex" xmlns:cx7="http://schemas.microsoft.com/office/drawing/2016/5/13/chartex" xmlns:cx8="http://schemas.microsoft.com/office/drawing/2016/5/14/chartex" xmlns:mc="http://schemas.openxmlformats.org/markup-compatibility/2006" xmlns:aink="http://schemas.microsoft.com/office/drawing/2016/ink" xmlns:am3d="http://schemas.microsoft.com/office/drawing/2017/model3d" xmlns:o="urn:schemas-microsoft-com:office:office" xmlns:oel="http://schemas.microsoft.com/office/2019/extlst" xmlns:r="http://schemas.openxmlformats.org/officeDocument/2006/relationships" xmlns:m="http://schemas.openxmlformats.org/officeDocument/2006/math" xmlns:v="urn:schemas-microsoft-com:vml" xmlns:wp14="http://schemas.microsoft.com/office/word/2010/wordprocessingDrawing" xmlns:wp="http://schemas.openxmlformats.org/drawingml/2006/wordprocessingDrawing" xmlns:w10="urn:schemas-microsoft-com:office:word" xmlns:w="http://schemas.openxmlformats.org/wordprocessingml/2006/main" xmlns:w14="http://schemas.microsoft.com/office/word/2010/wordml" xmlns:w15="http://schemas.microsoft.com/office/word/2012/wordml" xmlns:w16cex="http://schemas.microsoft.com/office/word/2018/wordml/cex" xmlns:w16cid="http://schemas.microsoft.com/office/word/2016/wordml/cid" xmlns:w16="http://schemas.microsoft.com/office/word/2018/wordml" xmlns:w16du="http://schemas.microsoft.com/office/word/2023/wordml/word16du" xmlns:w16sdtdh="http://schemas.microsoft.com/office/word/2020/wordml/sdtdatahash" xmlns:w16sdtfl="http://schemas.microsoft.com/office/word/2024/wordml/sdtformatlock" xmlns:w16se="http://schemas.microsoft.com/office/word/2015/wordml/symex" xmlns:wpg="http://schemas.microsoft.com/office/word/2010/wordprocessingGroup" xmlns:wpi="http://schemas.microsoft.com/office/word/2010/wordprocessingInk" xmlns:wne="http://schemas.microsoft.com/office/word/2006/wordml" xmlns:wps="http://schemas.microsoft.com/office/word/2010/wordprocessingShape" mc:Ignorable="w14 w15 w16se w16cid w16 w16cex w16sdtdh w16sdtfl w16du wp14">
   <w:abstractNum w:abstractNumId="0" w15:restartNumberingAfterBreak="0">
+    <w:nsid w:val="006966B0"/>
+    <w:multiLevelType w:val="hybridMultilevel"/>
+    <w:tmpl w:val="996C4878"/>
+    <w:lvl w:ilvl="0" w:tplc="20000001">
+      <w:start w:val="1"/>
+      <w:numFmt w:val="bullet"/>
+      <w:lvlText w:val=""/>
+      <w:lvlJc w:val="left"/>
+      <w:pPr>
+        <w:ind w:left="720" w:hanging="360"/>
+      </w:pPr>
+      <w:rPr>
+        <w:rFonts w:ascii="Symbol" w:hAnsi="Symbol" w:hint="default"/>
+      </w:rPr>
+    </w:lvl>
+    <w:lvl w:ilvl="1" w:tplc="20000003" w:tentative="1">
+      <w:start w:val="1"/>
+      <w:numFmt w:val="bullet"/>
+      <w:lvlText w:val="o"/>
+      <w:lvlJc w:val="left"/>
+      <w:pPr>
+        <w:ind w:left="1440" w:hanging="360"/>
+      </w:pPr>
+      <w:rPr>
+        <w:rFonts w:ascii="Courier New" w:hAnsi="Courier New" w:cs="Courier New" w:hint="default"/>
+      </w:rPr>
+    </w:lvl>
+    <w:lvl w:ilvl="2" w:tplc="20000005" w:tentative="1">
+      <w:start w:val="1"/>
+      <w:numFmt w:val="bullet"/>
+      <w:lvlText w:val=""/>
+      <w:lvlJc w:val="left"/>
+      <w:pPr>
+        <w:ind w:left="2160" w:hanging="360"/>
+      </w:pPr>
+      <w:rPr>
+        <w:rFonts w:ascii="Wingdings" w:hAnsi="Wingdings" w:hint="default"/>
+      </w:rPr>
+    </w:lvl>
+    <w:lvl w:ilvl="3" w:tplc="20000001" w:tentative="1">
+      <w:start w:val="1"/>
+      <w:numFmt w:val="bullet"/>
+      <w:lvlText w:val=""/>
+      <w:lvlJc w:val="left"/>
+      <w:pPr>
+        <w:ind w:left="2880" w:hanging="360"/>
+      </w:pPr>
+      <w:rPr>
+        <w:rFonts w:ascii="Symbol" w:hAnsi="Symbol" w:hint="default"/>
+      </w:rPr>
+    </w:lvl>
+    <w:lvl w:ilvl="4" w:tplc="20000003" w:tentative="1">
+      <w:start w:val="1"/>
+      <w:numFmt w:val="bullet"/>
+      <w:lvlText w:val="o"/>
+      <w:lvlJc w:val="left"/>
+      <w:pPr>
+        <w:ind w:left="3600" w:hanging="360"/>
+      </w:pPr>
+      <w:rPr>
+        <w:rFonts w:ascii="Courier New" w:hAnsi="Courier New" w:cs="Courier New" w:hint="default"/>
+      </w:rPr>
+    </w:lvl>
+    <w:lvl w:ilvl="5" w:tplc="20000005" w:tentative="1">
+      <w:start w:val="1"/>
+      <w:numFmt w:val="bullet"/>
+      <w:lvlText w:val=""/>
+      <w:lvlJc w:val="left"/>
+      <w:pPr>
+        <w:ind w:left="4320" w:hanging="360"/>
+      </w:pPr>
+      <w:rPr>
+        <w:rFonts w:ascii="Wingdings" w:hAnsi="Wingdings" w:hint="default"/>
+      </w:rPr>
+    </w:lvl>
+    <w:lvl w:ilvl="6" w:tplc="20000001" w:tentative="1">
+      <w:start w:val="1"/>
+      <w:numFmt w:val="bullet"/>
+      <w:lvlText w:val=""/>
+      <w:lvlJc w:val="left"/>
+      <w:pPr>
+        <w:ind w:left="5040" w:hanging="360"/>
+      </w:pPr>
+      <w:rPr>
+        <w:rFonts w:ascii="Symbol" w:hAnsi="Symbol" w:hint="default"/>
+      </w:rPr>
+    </w:lvl>
+    <w:lvl w:ilvl="7" w:tplc="20000003" w:tentative="1">
+      <w:start w:val="1"/>
+      <w:numFmt w:val="bullet"/>
+      <w:lvlText w:val="o"/>
+      <w:lvlJc w:val="left"/>
+      <w:pPr>
+        <w:ind w:left="5760" w:hanging="360"/>
+      </w:pPr>
+      <w:rPr>
+        <w:rFonts w:ascii="Courier New" w:hAnsi="Courier New" w:cs="Courier New" w:hint="default"/>
+      </w:rPr>
+    </w:lvl>
+    <w:lvl w:ilvl="8" w:tplc="20000005" w:tentative="1">
+      <w:start w:val="1"/>
+      <w:numFmt w:val="bullet"/>
+      <w:lvlText w:val=""/>
+      <w:lvlJc w:val="left"/>
+      <w:pPr>
+        <w:ind w:left="6480" w:hanging="360"/>
+      </w:pPr>
+      <w:rPr>
+        <w:rFonts w:ascii="Wingdings" w:hAnsi="Wingdings" w:hint="default"/>
+      </w:rPr>
+    </w:lvl>
+  </w:abstractNum>
+  <w:abstractNum w:abstractNumId="1" w15:restartNumberingAfterBreak="0">
     <w:nsid w:val="010C5B30"/>
     <w:multiLevelType w:val="hybridMultilevel"/>
     <w:tmpl w:val="BAF02E52"/>
@@ -5338,7 +5924,7 @@
       </w:rPr>
     </w:lvl>
   </w:abstractNum>
-  <w:abstractNum w:abstractNumId="1" w15:restartNumberingAfterBreak="0">
+  <w:abstractNum w:abstractNumId="2" w15:restartNumberingAfterBreak="0">
     <w:nsid w:val="028F4FCE"/>
     <w:multiLevelType w:val="hybridMultilevel"/>
     <w:tmpl w:val="AB4C2932"/>
@@ -5451,7 +6037,7 @@
       </w:rPr>
     </w:lvl>
   </w:abstractNum>
-  <w:abstractNum w:abstractNumId="2" w15:restartNumberingAfterBreak="0">
+  <w:abstractNum w:abstractNumId="3" w15:restartNumberingAfterBreak="0">
     <w:nsid w:val="06CF75D7"/>
     <w:multiLevelType w:val="hybridMultilevel"/>
     <w:tmpl w:val="113A63F8"/>
@@ -5537,7 +6123,7 @@
       </w:pPr>
     </w:lvl>
   </w:abstractNum>
-  <w:abstractNum w:abstractNumId="3" w15:restartNumberingAfterBreak="0">
+  <w:abstractNum w:abstractNumId="4" w15:restartNumberingAfterBreak="0">
     <w:nsid w:val="07295AFB"/>
     <w:multiLevelType w:val="hybridMultilevel"/>
     <w:tmpl w:val="92543DC0"/>
@@ -5650,7 +6236,7 @@
       </w:rPr>
     </w:lvl>
   </w:abstractNum>
-  <w:abstractNum w:abstractNumId="4" w15:restartNumberingAfterBreak="0">
+  <w:abstractNum w:abstractNumId="5" w15:restartNumberingAfterBreak="0">
     <w:nsid w:val="08E2024D"/>
     <w:multiLevelType w:val="hybridMultilevel"/>
     <w:tmpl w:val="1772D1F4"/>
@@ -5763,7 +6349,7 @@
       </w:rPr>
     </w:lvl>
   </w:abstractNum>
-  <w:abstractNum w:abstractNumId="5" w15:restartNumberingAfterBreak="0">
+  <w:abstractNum w:abstractNumId="6" w15:restartNumberingAfterBreak="0">
     <w:nsid w:val="12BB3466"/>
     <w:multiLevelType w:val="hybridMultilevel"/>
     <w:tmpl w:val="A9BE7BD8"/>
@@ -5876,7 +6462,7 @@
       </w:rPr>
     </w:lvl>
   </w:abstractNum>
-  <w:abstractNum w:abstractNumId="6" w15:restartNumberingAfterBreak="0">
+  <w:abstractNum w:abstractNumId="7" w15:restartNumberingAfterBreak="0">
     <w:nsid w:val="15E64213"/>
     <w:multiLevelType w:val="hybridMultilevel"/>
     <w:tmpl w:val="373412B0"/>
@@ -6016,7 +6602,7 @@
       </w:rPr>
     </w:lvl>
   </w:abstractNum>
-  <w:abstractNum w:abstractNumId="7" w15:restartNumberingAfterBreak="0">
+  <w:abstractNum w:abstractNumId="8" w15:restartNumberingAfterBreak="0">
     <w:nsid w:val="15F62775"/>
     <w:multiLevelType w:val="hybridMultilevel"/>
     <w:tmpl w:val="45808BD4"/>
@@ -6129,7 +6715,7 @@
       </w:rPr>
     </w:lvl>
   </w:abstractNum>
-  <w:abstractNum w:abstractNumId="8" w15:restartNumberingAfterBreak="0">
+  <w:abstractNum w:abstractNumId="9" w15:restartNumberingAfterBreak="0">
     <w:nsid w:val="1D3240EF"/>
     <w:multiLevelType w:val="hybridMultilevel"/>
     <w:tmpl w:val="C45EC7D6"/>
@@ -6242,7 +6828,7 @@
       </w:rPr>
     </w:lvl>
   </w:abstractNum>
-  <w:abstractNum w:abstractNumId="9" w15:restartNumberingAfterBreak="0">
+  <w:abstractNum w:abstractNumId="10" w15:restartNumberingAfterBreak="0">
     <w:nsid w:val="230F33CC"/>
     <w:multiLevelType w:val="hybridMultilevel"/>
     <w:tmpl w:val="B338FCA8"/>
@@ -6382,7 +6968,7 @@
       </w:rPr>
     </w:lvl>
   </w:abstractNum>
-  <w:abstractNum w:abstractNumId="10" w15:restartNumberingAfterBreak="0">
+  <w:abstractNum w:abstractNumId="11" w15:restartNumberingAfterBreak="0">
     <w:nsid w:val="24132489"/>
     <w:multiLevelType w:val="hybridMultilevel"/>
     <w:tmpl w:val="074AEF96"/>
@@ -6495,7 +7081,7 @@
       </w:rPr>
     </w:lvl>
   </w:abstractNum>
-  <w:abstractNum w:abstractNumId="11" w15:restartNumberingAfterBreak="0">
+  <w:abstractNum w:abstractNumId="12" w15:restartNumberingAfterBreak="0">
     <w:nsid w:val="2A2506EB"/>
     <w:multiLevelType w:val="hybridMultilevel"/>
     <w:tmpl w:val="31C47450"/>
@@ -6612,7 +7198,7 @@
       </w:rPr>
     </w:lvl>
   </w:abstractNum>
-  <w:abstractNum w:abstractNumId="12" w15:restartNumberingAfterBreak="0">
+  <w:abstractNum w:abstractNumId="13" w15:restartNumberingAfterBreak="0">
     <w:nsid w:val="33BE4792"/>
     <w:multiLevelType w:val="hybridMultilevel"/>
     <w:tmpl w:val="0368EF64"/>
@@ -6752,7 +7338,7 @@
       </w:rPr>
     </w:lvl>
   </w:abstractNum>
-  <w:abstractNum w:abstractNumId="13" w15:restartNumberingAfterBreak="0">
+  <w:abstractNum w:abstractNumId="14" w15:restartNumberingAfterBreak="0">
     <w:nsid w:val="367C600F"/>
     <w:multiLevelType w:val="multilevel"/>
     <w:tmpl w:val="66F66ADC"/>
@@ -6903,7 +7489,7 @@
       </w:rPr>
     </w:lvl>
   </w:abstractNum>
-  <w:abstractNum w:abstractNumId="14" w15:restartNumberingAfterBreak="0">
+  <w:abstractNum w:abstractNumId="15" w15:restartNumberingAfterBreak="0">
     <w:nsid w:val="3D081AB8"/>
     <w:multiLevelType w:val="hybridMultilevel"/>
     <w:tmpl w:val="12163E56"/>
@@ -7016,7 +7602,7 @@
       </w:rPr>
     </w:lvl>
   </w:abstractNum>
-  <w:abstractNum w:abstractNumId="15" w15:restartNumberingAfterBreak="0">
+  <w:abstractNum w:abstractNumId="16" w15:restartNumberingAfterBreak="0">
     <w:nsid w:val="40117AB4"/>
     <w:multiLevelType w:val="singleLevel"/>
     <w:tmpl w:val="0424000F"/>
@@ -7036,7 +7622,7 @@
       </w:rPr>
     </w:lvl>
   </w:abstractNum>
-  <w:abstractNum w:abstractNumId="16" w15:restartNumberingAfterBreak="0">
+  <w:abstractNum w:abstractNumId="17" w15:restartNumberingAfterBreak="0">
     <w:nsid w:val="45F04156"/>
     <w:multiLevelType w:val="hybridMultilevel"/>
     <w:tmpl w:val="8648D69E"/>
@@ -7149,7 +7735,7 @@
       </w:rPr>
     </w:lvl>
   </w:abstractNum>
-  <w:abstractNum w:abstractNumId="17" w15:restartNumberingAfterBreak="0">
+  <w:abstractNum w:abstractNumId="18" w15:restartNumberingAfterBreak="0">
     <w:nsid w:val="4D737F36"/>
     <w:multiLevelType w:val="hybridMultilevel"/>
     <w:tmpl w:val="2FCADFCC"/>
@@ -7262,7 +7848,7 @@
       </w:rPr>
     </w:lvl>
   </w:abstractNum>
-  <w:abstractNum w:abstractNumId="18" w15:restartNumberingAfterBreak="0">
+  <w:abstractNum w:abstractNumId="19" w15:restartNumberingAfterBreak="0">
     <w:nsid w:val="56210033"/>
     <w:multiLevelType w:val="hybridMultilevel"/>
     <w:tmpl w:val="B834133E"/>
@@ -7375,7 +7961,7 @@
       </w:rPr>
     </w:lvl>
   </w:abstractNum>
-  <w:abstractNum w:abstractNumId="19" w15:restartNumberingAfterBreak="0">
+  <w:abstractNum w:abstractNumId="20" w15:restartNumberingAfterBreak="0">
     <w:nsid w:val="566D6DDD"/>
     <w:multiLevelType w:val="hybridMultilevel"/>
     <w:tmpl w:val="E55A3D24"/>
@@ -7515,7 +8101,7 @@
       </w:rPr>
     </w:lvl>
   </w:abstractNum>
-  <w:abstractNum w:abstractNumId="20" w15:restartNumberingAfterBreak="0">
+  <w:abstractNum w:abstractNumId="21" w15:restartNumberingAfterBreak="0">
     <w:nsid w:val="58DE7EFA"/>
     <w:multiLevelType w:val="hybridMultilevel"/>
     <w:tmpl w:val="131EA528"/>
@@ -7610,7 +8196,7 @@
       </w:pPr>
     </w:lvl>
   </w:abstractNum>
-  <w:abstractNum w:abstractNumId="21" w15:restartNumberingAfterBreak="0">
+  <w:abstractNum w:abstractNumId="22" w15:restartNumberingAfterBreak="0">
     <w:nsid w:val="5AC4619C"/>
     <w:multiLevelType w:val="hybridMultilevel"/>
     <w:tmpl w:val="DFB60A26"/>
@@ -7722,7 +8308,7 @@
       </w:rPr>
     </w:lvl>
   </w:abstractNum>
-  <w:abstractNum w:abstractNumId="22" w15:restartNumberingAfterBreak="0">
+  <w:abstractNum w:abstractNumId="23" w15:restartNumberingAfterBreak="0">
     <w:nsid w:val="5D4B3E35"/>
     <w:multiLevelType w:val="hybridMultilevel"/>
     <w:tmpl w:val="63006618"/>
@@ -7835,7 +8421,7 @@
       </w:rPr>
     </w:lvl>
   </w:abstractNum>
-  <w:abstractNum w:abstractNumId="23" w15:restartNumberingAfterBreak="0">
+  <w:abstractNum w:abstractNumId="24" w15:restartNumberingAfterBreak="0">
     <w:nsid w:val="5E1C298F"/>
     <w:multiLevelType w:val="hybridMultilevel"/>
     <w:tmpl w:val="7642668E"/>
@@ -7948,7 +8534,7 @@
       </w:rPr>
     </w:lvl>
   </w:abstractNum>
-  <w:abstractNum w:abstractNumId="24" w15:restartNumberingAfterBreak="0">
+  <w:abstractNum w:abstractNumId="25" w15:restartNumberingAfterBreak="0">
     <w:nsid w:val="613216BC"/>
     <w:multiLevelType w:val="hybridMultilevel"/>
     <w:tmpl w:val="DCD43D76"/>
@@ -8061,7 +8647,7 @@
       </w:rPr>
     </w:lvl>
   </w:abstractNum>
-  <w:abstractNum w:abstractNumId="25" w15:restartNumberingAfterBreak="0">
+  <w:abstractNum w:abstractNumId="26" w15:restartNumberingAfterBreak="0">
     <w:nsid w:val="62CA2A8F"/>
     <w:multiLevelType w:val="hybridMultilevel"/>
     <w:tmpl w:val="9E62B7C8"/>
@@ -8174,7 +8760,7 @@
       </w:rPr>
     </w:lvl>
   </w:abstractNum>
-  <w:abstractNum w:abstractNumId="26" w15:restartNumberingAfterBreak="0">
+  <w:abstractNum w:abstractNumId="27" w15:restartNumberingAfterBreak="0">
     <w:nsid w:val="642B0707"/>
     <w:multiLevelType w:val="hybridMultilevel"/>
     <w:tmpl w:val="6F824434"/>
@@ -8287,7 +8873,7 @@
       </w:rPr>
     </w:lvl>
   </w:abstractNum>
-  <w:abstractNum w:abstractNumId="27" w15:restartNumberingAfterBreak="0">
+  <w:abstractNum w:abstractNumId="28" w15:restartNumberingAfterBreak="0">
     <w:nsid w:val="657C167B"/>
     <w:multiLevelType w:val="hybridMultilevel"/>
     <w:tmpl w:val="253E1E4A"/>
@@ -8400,7 +8986,7 @@
       </w:rPr>
     </w:lvl>
   </w:abstractNum>
-  <w:abstractNum w:abstractNumId="28" w15:restartNumberingAfterBreak="0">
+  <w:abstractNum w:abstractNumId="29" w15:restartNumberingAfterBreak="0">
     <w:nsid w:val="6F112B8F"/>
     <w:multiLevelType w:val="hybridMultilevel"/>
     <w:tmpl w:val="DD189394"/>
@@ -8513,7 +9099,7 @@
       </w:rPr>
     </w:lvl>
   </w:abstractNum>
-  <w:abstractNum w:abstractNumId="29" w15:restartNumberingAfterBreak="0">
+  <w:abstractNum w:abstractNumId="30" w15:restartNumberingAfterBreak="0">
     <w:nsid w:val="70624018"/>
     <w:multiLevelType w:val="hybridMultilevel"/>
     <w:tmpl w:val="225C64B6"/>
@@ -8653,7 +9239,7 @@
       </w:rPr>
     </w:lvl>
   </w:abstractNum>
-  <w:abstractNum w:abstractNumId="30" w15:restartNumberingAfterBreak="0">
+  <w:abstractNum w:abstractNumId="31" w15:restartNumberingAfterBreak="0">
     <w:nsid w:val="74967D99"/>
     <w:multiLevelType w:val="multilevel"/>
     <w:tmpl w:val="6F1612AC"/>
@@ -8793,7 +9379,7 @@
       </w:rPr>
     </w:lvl>
   </w:abstractNum>
-  <w:abstractNum w:abstractNumId="31" w15:restartNumberingAfterBreak="0">
+  <w:abstractNum w:abstractNumId="32" w15:restartNumberingAfterBreak="0">
     <w:nsid w:val="780E0E44"/>
     <w:multiLevelType w:val="hybridMultilevel"/>
     <w:tmpl w:val="10468E06"/>
@@ -8907,16 +9493,16 @@
     </w:lvl>
   </w:abstractNum>
   <w:num w:numId="1" w16cid:durableId="1616982145">
+    <w:abstractNumId w:val="14"/>
+  </w:num>
+  <w:num w:numId="2" w16cid:durableId="1563980195">
+    <w:abstractNumId w:val="10"/>
+  </w:num>
+  <w:num w:numId="3" w16cid:durableId="574165386">
     <w:abstractNumId w:val="13"/>
   </w:num>
-  <w:num w:numId="2" w16cid:durableId="1563980195">
-    <w:abstractNumId w:val="9"/>
-  </w:num>
-  <w:num w:numId="3" w16cid:durableId="574165386">
-    <w:abstractNumId w:val="12"/>
-  </w:num>
   <w:num w:numId="4" w16cid:durableId="1982886481">
-    <w:abstractNumId w:val="19"/>
+    <w:abstractNumId w:val="20"/>
     <w:lvlOverride w:ilvl="0"/>
     <w:lvlOverride w:ilvl="1">
       <w:startOverride w:val="1"/>
@@ -8944,43 +9530,43 @@
     </w:lvlOverride>
   </w:num>
   <w:num w:numId="5" w16cid:durableId="1343313269">
-    <w:abstractNumId w:val="6"/>
+    <w:abstractNumId w:val="7"/>
   </w:num>
   <w:num w:numId="6" w16cid:durableId="413548033">
+    <w:abstractNumId w:val="30"/>
+  </w:num>
+  <w:num w:numId="7" w16cid:durableId="2517385">
     <w:abstractNumId w:val="29"/>
   </w:num>
-  <w:num w:numId="7" w16cid:durableId="2517385">
-    <w:abstractNumId w:val="28"/>
-  </w:num>
   <w:num w:numId="8" w16cid:durableId="1673027270">
-    <w:abstractNumId w:val="10"/>
+    <w:abstractNumId w:val="11"/>
   </w:num>
   <w:num w:numId="9" w16cid:durableId="310713017">
-    <w:abstractNumId w:val="4"/>
+    <w:abstractNumId w:val="5"/>
   </w:num>
   <w:num w:numId="10" w16cid:durableId="642394832">
-    <w:abstractNumId w:val="18"/>
+    <w:abstractNumId w:val="19"/>
   </w:num>
   <w:num w:numId="11" w16cid:durableId="879364368">
+    <w:abstractNumId w:val="9"/>
+  </w:num>
+  <w:num w:numId="12" w16cid:durableId="1154762435">
+    <w:abstractNumId w:val="24"/>
+  </w:num>
+  <w:num w:numId="13" w16cid:durableId="1050419267">
+    <w:abstractNumId w:val="26"/>
+  </w:num>
+  <w:num w:numId="14" w16cid:durableId="1990405806">
     <w:abstractNumId w:val="8"/>
   </w:num>
-  <w:num w:numId="12" w16cid:durableId="1154762435">
-    <w:abstractNumId w:val="23"/>
-  </w:num>
-  <w:num w:numId="13" w16cid:durableId="1050419267">
-    <w:abstractNumId w:val="25"/>
-  </w:num>
-  <w:num w:numId="14" w16cid:durableId="1990405806">
-    <w:abstractNumId w:val="7"/>
-  </w:num>
   <w:num w:numId="15" w16cid:durableId="1546913352">
-    <w:abstractNumId w:val="26"/>
+    <w:abstractNumId w:val="27"/>
   </w:num>
   <w:num w:numId="16" w16cid:durableId="1318874548">
-    <w:abstractNumId w:val="30"/>
+    <w:abstractNumId w:val="31"/>
   </w:num>
   <w:num w:numId="17" w16cid:durableId="722215861">
-    <w:abstractNumId w:val="30"/>
+    <w:abstractNumId w:val="31"/>
     <w:lvlOverride w:ilvl="0">
       <w:startOverride w:val="1"/>
     </w:lvlOverride>
@@ -9010,7 +9596,7 @@
     </w:lvlOverride>
   </w:num>
   <w:num w:numId="18" w16cid:durableId="415446333">
-    <w:abstractNumId w:val="30"/>
+    <w:abstractNumId w:val="31"/>
     <w:lvlOverride w:ilvl="0">
       <w:startOverride w:val="1"/>
     </w:lvlOverride>
@@ -9040,7 +9626,7 @@
     </w:lvlOverride>
   </w:num>
   <w:num w:numId="19" w16cid:durableId="1966346266">
-    <w:abstractNumId w:val="30"/>
+    <w:abstractNumId w:val="31"/>
     <w:lvlOverride w:ilvl="0">
       <w:startOverride w:val="1"/>
     </w:lvlOverride>
@@ -9070,7 +9656,7 @@
     </w:lvlOverride>
   </w:num>
   <w:num w:numId="20" w16cid:durableId="985356155">
-    <w:abstractNumId w:val="30"/>
+    <w:abstractNumId w:val="31"/>
     <w:lvlOverride w:ilvl="0">
       <w:startOverride w:val="1"/>
     </w:lvlOverride>
@@ -9100,7 +9686,7 @@
     </w:lvlOverride>
   </w:num>
   <w:num w:numId="21" w16cid:durableId="971326932">
-    <w:abstractNumId w:val="30"/>
+    <w:abstractNumId w:val="31"/>
     <w:lvlOverride w:ilvl="0">
       <w:startOverride w:val="1"/>
     </w:lvlOverride>
@@ -9130,7 +9716,7 @@
     </w:lvlOverride>
   </w:num>
   <w:num w:numId="22" w16cid:durableId="874578897">
-    <w:abstractNumId w:val="30"/>
+    <w:abstractNumId w:val="31"/>
     <w:lvlOverride w:ilvl="0">
       <w:startOverride w:val="1"/>
     </w:lvlOverride>
@@ -9160,7 +9746,7 @@
     </w:lvlOverride>
   </w:num>
   <w:num w:numId="23" w16cid:durableId="184097708">
-    <w:abstractNumId w:val="30"/>
+    <w:abstractNumId w:val="31"/>
     <w:lvlOverride w:ilvl="0">
       <w:startOverride w:val="1"/>
     </w:lvlOverride>
@@ -9190,7 +9776,7 @@
     </w:lvlOverride>
   </w:num>
   <w:num w:numId="24" w16cid:durableId="1147547601">
-    <w:abstractNumId w:val="30"/>
+    <w:abstractNumId w:val="31"/>
     <w:lvlOverride w:ilvl="0">
       <w:startOverride w:val="1"/>
     </w:lvlOverride>
@@ -9220,7 +9806,7 @@
     </w:lvlOverride>
   </w:num>
   <w:num w:numId="25" w16cid:durableId="697269251">
-    <w:abstractNumId w:val="30"/>
+    <w:abstractNumId w:val="31"/>
     <w:lvlOverride w:ilvl="0">
       <w:startOverride w:val="1"/>
     </w:lvlOverride>
@@ -9250,7 +9836,7 @@
     </w:lvlOverride>
   </w:num>
   <w:num w:numId="26" w16cid:durableId="623387041">
-    <w:abstractNumId w:val="30"/>
+    <w:abstractNumId w:val="31"/>
     <w:lvlOverride w:ilvl="0">
       <w:startOverride w:val="1"/>
     </w:lvlOverride>
@@ -9280,7 +9866,7 @@
     </w:lvlOverride>
   </w:num>
   <w:num w:numId="27" w16cid:durableId="571545525">
-    <w:abstractNumId w:val="30"/>
+    <w:abstractNumId w:val="31"/>
     <w:lvlOverride w:ilvl="0">
       <w:startOverride w:val="1"/>
     </w:lvlOverride>
@@ -9310,22 +9896,22 @@
     </w:lvlOverride>
   </w:num>
   <w:num w:numId="28" w16cid:durableId="718475815">
-    <w:abstractNumId w:val="1"/>
+    <w:abstractNumId w:val="2"/>
   </w:num>
   <w:num w:numId="29" w16cid:durableId="1318532482">
-    <w:abstractNumId w:val="24"/>
+    <w:abstractNumId w:val="25"/>
   </w:num>
   <w:num w:numId="30" w16cid:durableId="2085495198">
-    <w:abstractNumId w:val="2"/>
+    <w:abstractNumId w:val="3"/>
   </w:num>
   <w:num w:numId="31" w16cid:durableId="1159468039">
-    <w:abstractNumId w:val="18"/>
+    <w:abstractNumId w:val="19"/>
   </w:num>
   <w:num w:numId="32" w16cid:durableId="2134787325">
-    <w:abstractNumId w:val="15"/>
+    <w:abstractNumId w:val="16"/>
   </w:num>
   <w:num w:numId="33" w16cid:durableId="690107431">
-    <w:abstractNumId w:val="19"/>
+    <w:abstractNumId w:val="20"/>
     <w:lvlOverride w:ilvl="0"/>
     <w:lvlOverride w:ilvl="1">
       <w:startOverride w:val="1"/>
@@ -9353,46 +9939,49 @@
     </w:lvlOverride>
   </w:num>
   <w:num w:numId="34" w16cid:durableId="1695031192">
-    <w:abstractNumId w:val="19"/>
+    <w:abstractNumId w:val="20"/>
   </w:num>
   <w:num w:numId="35" w16cid:durableId="1474131380">
-    <w:abstractNumId w:val="19"/>
+    <w:abstractNumId w:val="20"/>
   </w:num>
   <w:num w:numId="36" w16cid:durableId="385646365">
-    <w:abstractNumId w:val="11"/>
+    <w:abstractNumId w:val="12"/>
   </w:num>
   <w:num w:numId="37" w16cid:durableId="774322130">
-    <w:abstractNumId w:val="5"/>
+    <w:abstractNumId w:val="6"/>
   </w:num>
   <w:num w:numId="38" w16cid:durableId="1273244240">
-    <w:abstractNumId w:val="20"/>
+    <w:abstractNumId w:val="21"/>
   </w:num>
   <w:num w:numId="39" w16cid:durableId="1302419245">
-    <w:abstractNumId w:val="27"/>
+    <w:abstractNumId w:val="28"/>
   </w:num>
   <w:num w:numId="40" w16cid:durableId="671757144">
-    <w:abstractNumId w:val="3"/>
+    <w:abstractNumId w:val="4"/>
   </w:num>
   <w:num w:numId="41" w16cid:durableId="1609465245">
-    <w:abstractNumId w:val="16"/>
+    <w:abstractNumId w:val="17"/>
   </w:num>
   <w:num w:numId="42" w16cid:durableId="1924870052">
+    <w:abstractNumId w:val="23"/>
+  </w:num>
+  <w:num w:numId="43" w16cid:durableId="1546983496">
+    <w:abstractNumId w:val="1"/>
+  </w:num>
+  <w:num w:numId="44" w16cid:durableId="1243755491">
+    <w:abstractNumId w:val="15"/>
+  </w:num>
+  <w:num w:numId="45" w16cid:durableId="2112815720">
     <w:abstractNumId w:val="22"/>
   </w:num>
-  <w:num w:numId="43" w16cid:durableId="1546983496">
-    <w:abstractNumId w:val="0"/>
-  </w:num>
-  <w:num w:numId="44" w16cid:durableId="1243755491">
-    <w:abstractNumId w:val="14"/>
-  </w:num>
-  <w:num w:numId="45" w16cid:durableId="2112815720">
-    <w:abstractNumId w:val="21"/>
-  </w:num>
   <w:num w:numId="46" w16cid:durableId="495389479">
-    <w:abstractNumId w:val="31"/>
+    <w:abstractNumId w:val="32"/>
   </w:num>
   <w:num w:numId="47" w16cid:durableId="1000545877">
-    <w:abstractNumId w:val="17"/>
+    <w:abstractNumId w:val="18"/>
+  </w:num>
+  <w:num w:numId="48" w16cid:durableId="853347394">
+    <w:abstractNumId w:val="0"/>
   </w:num>
   <w:numIdMacAtCleanup w:val="15"/>
 </w:numbering>

</xml_diff>

<commit_message>
feat: implement pose landmarker description
</commit_message>
<xml_diff>
--- a/docs/thesis/magistrsko-delo-jasa-zupancic.docx
+++ b/docs/thesis/magistrsko-delo-jasa-zupancic.docx
@@ -2901,16 +2901,7 @@
         <w:t>-</w:t>
       </w:r>
       <w:r>
-        <w:t>koordinata</w:t>
-      </w:r>
-      <w:r>
-        <w:t xml:space="preserve"> pri večini </w:t>
-      </w:r>
-      <w:r>
-        <w:t>modelov za zaznavo drže</w:t>
-      </w:r>
-      <w:r>
-        <w:t>, ki delujejo na osnovi ene same RGB kamere, ne predstavljajo neposredno izmerjene absolutne globine v metrih. Gre za napovedano globinsko komponento, ki je pogosto podana relativno glede na izhodiščno točko (npr. medenico) ali pa je normalizirana glede na velikost osebe v sliki oziroma velikost vhodnega okna. Posledično se lahko numerične vrednosti z-koordinate med različnimi modeli razlikujejo tako po skali kot po definiciji ničelne točke, kar oteži neposredno primerjavo med modeli</w:t>
+        <w:t>koordinata pri večini modelov za zaznavo drže, ki delujejo na osnovi ene same RGB kamere, ne predstavljajo neposredno izmerjene absolutne globine v metrih. Gre za napovedano globinsko komponento, ki je pogosto podana relativno glede na izhodiščno točko (npr. medenico) ali pa je normalizirana glede na velikost osebe v sliki oziroma velikost vhodnega okna. Posledično se lahko numerične vrednosti z-koordinate med različnimi modeli razlikujejo tako po skali kot po definiciji ničelne točke, kar oteži neposredno primerjavo med modeli</w:t>
       </w:r>
       <w:r>
         <w:t>.</w:t>
@@ -2950,10 +2941,7 @@
         <w:t>Za bolj “pravo” 3D rekonstrukcijo se pogosto uporabljajo pristopi z več kamerami</w:t>
       </w:r>
       <w:r>
-        <w:t xml:space="preserve">, pristopi </w:t>
-      </w:r>
-      <w:r>
-        <w:t>z uporabo označevalcev</w:t>
+        <w:t>, pristopi z uporabo označevalcev</w:t>
       </w:r>
       <w:r>
         <w:t xml:space="preserve"> ali</w:t>
@@ -3063,19 +3051,7 @@
         <w:t xml:space="preserve"> izvajanja v okolju brskalnika. </w:t>
       </w:r>
       <w:r>
-        <w:t xml:space="preserve">Cilj je realno-časovna analiza drže na robnih napravah, zato so bili v primerjavo vključeni predvsem </w:t>
-      </w:r>
-      <w:r>
-        <w:t>“</w:t>
-      </w:r>
-      <w:r>
-        <w:t>lažji</w:t>
-      </w:r>
-      <w:r>
-        <w:t>“</w:t>
-      </w:r>
-      <w:r>
-        <w:t xml:space="preserve"> modeli, oziroma lažje različice modelov, ki omogočajo izvajanje brez večjih zakasnite</w:t>
+        <w:t>Cilj je realno-časovna analiza drže na robnih napravah, zato so bili v primerjavo vključeni predvsem “lažji“ modeli, oziroma lažje različice modelov, ki omogočajo izvajanje brez večjih zakasnite</w:t>
       </w:r>
       <w:r>
         <w:t>v, upočasnitev ali kakršnega koli negativnega vpliva na uporabniško izkušnjo</w:t>
@@ -3168,6 +3144,807 @@
     <w:p/>
     <w:p>
       <w:pPr>
+        <w:pStyle w:val="Heading3"/>
+      </w:pPr>
+      <w:r>
+        <w:t xml:space="preserve">Pose </w:t>
+      </w:r>
+      <w:proofErr w:type="spellStart"/>
+      <w:r>
+        <w:t>Landmarker</w:t>
+      </w:r>
+      <w:proofErr w:type="spellEnd"/>
+      <w:r>
+        <w:t xml:space="preserve"> </w:t>
+      </w:r>
+      <w:r>
+        <w:t>–</w:t>
+      </w:r>
+      <w:r>
+        <w:t xml:space="preserve"> </w:t>
+      </w:r>
+      <w:proofErr w:type="spellStart"/>
+      <w:r>
+        <w:t>Mediapipe</w:t>
+      </w:r>
+      <w:proofErr w:type="spellEnd"/>
+    </w:p>
+    <w:p>
+      <w:r>
+        <w:t xml:space="preserve">Pose </w:t>
+      </w:r>
+      <w:proofErr w:type="spellStart"/>
+      <w:r>
+        <w:t>Landmarker</w:t>
+      </w:r>
+      <w:proofErr w:type="spellEnd"/>
+      <w:r>
+        <w:t xml:space="preserve"> je </w:t>
+      </w:r>
+      <w:proofErr w:type="spellStart"/>
+      <w:r>
+        <w:t>Mediapipe-ova</w:t>
+      </w:r>
+      <w:proofErr w:type="spellEnd"/>
+      <w:r>
+        <w:t xml:space="preserve"> rešitev za zaznavanje telesne drže, katere delovanje je namenjeno robnim napravam</w:t>
+      </w:r>
+      <w:r>
+        <w:t>, v realnem času.</w:t>
+      </w:r>
+      <w:r>
+        <w:t xml:space="preserve"> Namen rešitve je 3D zaznava </w:t>
+      </w:r>
+      <w:r>
+        <w:t xml:space="preserve"> </w:t>
+      </w:r>
+      <w:r>
+        <w:t>celotnega telesa, optimizirana za delovanje na robnih napravah</w:t>
+      </w:r>
+      <w:r>
+        <w:t xml:space="preserve"> in </w:t>
+      </w:r>
+      <w:r>
+        <w:t xml:space="preserve">v </w:t>
+      </w:r>
+      <w:r>
+        <w:t>re</w:t>
+      </w:r>
+      <w:r>
+        <w:t>a</w:t>
+      </w:r>
+      <w:r>
+        <w:t xml:space="preserve">lno-časovnih </w:t>
+      </w:r>
+      <w:r>
+        <w:t xml:space="preserve">fitnes </w:t>
+      </w:r>
+      <w:r>
+        <w:t>aplikacijah</w:t>
+      </w:r>
+      <w:r>
+        <w:t xml:space="preserve">. </w:t>
+      </w:r>
+      <w:r>
+        <w:t>Zaznava deluje tako na posameznih slikah kot tudi na video zaporedju oziroma živemu video toku kamere. Rezultat modela je 33 sklepnih točk na telesu</w:t>
+      </w:r>
+      <w:r>
+        <w:t xml:space="preserve">, model pa je sposoben </w:t>
+      </w:r>
+      <w:r>
+        <w:t xml:space="preserve">sklepne točke telesa zaznavati tako na enem kot na </w:t>
+      </w:r>
+      <w:r>
+        <w:t>mnogih</w:t>
+      </w:r>
+      <w:r>
+        <w:t xml:space="preserve"> telesih hkrati.</w:t>
+      </w:r>
+    </w:p>
+    <w:p>
+      <w:pPr>
+        <w:pStyle w:val="Images"/>
+      </w:pPr>
+      <w:r>
+        <w:rPr>
+          <w:noProof/>
+        </w:rPr>
+        <w:lastRenderedPageBreak/>
+        <w:drawing>
+          <wp:inline distT="0" distB="0" distL="0" distR="0" wp14:anchorId="3462EF08" wp14:editId="4C70FD7C">
+            <wp:extent cx="4308626" cy="5103628"/>
+            <wp:effectExtent l="0" t="0" r="0" b="1905"/>
+            <wp:docPr id="1895924879" name="Picture 2"/>
+            <wp:cNvGraphicFramePr>
+              <a:graphicFrameLocks xmlns:a="http://schemas.openxmlformats.org/drawingml/2006/main" noChangeAspect="1"/>
+            </wp:cNvGraphicFramePr>
+            <a:graphic xmlns:a="http://schemas.openxmlformats.org/drawingml/2006/main">
+              <a:graphicData uri="http://schemas.openxmlformats.org/drawingml/2006/picture">
+                <pic:pic xmlns:pic="http://schemas.openxmlformats.org/drawingml/2006/picture">
+                  <pic:nvPicPr>
+                    <pic:cNvPr id="0" name="Picture 1"/>
+                    <pic:cNvPicPr>
+                      <a:picLocks noChangeAspect="1" noChangeArrowheads="1"/>
+                    </pic:cNvPicPr>
+                  </pic:nvPicPr>
+                  <pic:blipFill>
+                    <a:blip r:embed="rId14" cstate="print">
+                      <a:extLst>
+                        <a:ext uri="{28A0092B-C50C-407E-A947-70E740481C1C}">
+                          <a14:useLocalDpi xmlns:a14="http://schemas.microsoft.com/office/drawing/2010/main" val="0"/>
+                        </a:ext>
+                      </a:extLst>
+                    </a:blip>
+                    <a:srcRect/>
+                    <a:stretch>
+                      <a:fillRect/>
+                    </a:stretch>
+                  </pic:blipFill>
+                  <pic:spPr bwMode="auto">
+                    <a:xfrm>
+                      <a:off x="0" y="0"/>
+                      <a:ext cx="4310353" cy="5105674"/>
+                    </a:xfrm>
+                    <a:prstGeom prst="rect">
+                      <a:avLst/>
+                    </a:prstGeom>
+                    <a:noFill/>
+                    <a:ln>
+                      <a:noFill/>
+                    </a:ln>
+                  </pic:spPr>
+                </pic:pic>
+              </a:graphicData>
+            </a:graphic>
+          </wp:inline>
+        </w:drawing>
+      </w:r>
+    </w:p>
+    <w:p>
+      <w:pPr>
+        <w:pStyle w:val="Caption"/>
+      </w:pPr>
+      <w:r>
+        <w:t xml:space="preserve">Slika </w:t>
+      </w:r>
+      <w:r>
+        <w:fldChar w:fldCharType="begin"/>
+      </w:r>
+      <w:r>
+        <w:instrText xml:space="preserve"> STYLEREF 1 \s </w:instrText>
+      </w:r>
+      <w:r>
+        <w:fldChar w:fldCharType="separate"/>
+      </w:r>
+      <w:r>
+        <w:rPr>
+          <w:noProof/>
+        </w:rPr>
+        <w:t>2</w:t>
+      </w:r>
+      <w:r>
+        <w:rPr>
+          <w:noProof/>
+        </w:rPr>
+        <w:fldChar w:fldCharType="end"/>
+      </w:r>
+      <w:r>
+        <w:t>.</w:t>
+      </w:r>
+      <w:r>
+        <w:fldChar w:fldCharType="begin"/>
+      </w:r>
+      <w:r>
+        <w:instrText xml:space="preserve"> SEQ Slika \* ARABIC \s 1 </w:instrText>
+      </w:r>
+      <w:r>
+        <w:fldChar w:fldCharType="separate"/>
+      </w:r>
+      <w:r>
+        <w:rPr>
+          <w:noProof/>
+        </w:rPr>
+        <w:t>1</w:t>
+      </w:r>
+      <w:r>
+        <w:rPr>
+          <w:noProof/>
+        </w:rPr>
+        <w:fldChar w:fldCharType="end"/>
+      </w:r>
+      <w:r>
+        <w:t xml:space="preserve">: Shema sklepnih točk modela </w:t>
+      </w:r>
+      <w:proofErr w:type="spellStart"/>
+      <w:r>
+        <w:t>MediaPipe</w:t>
+      </w:r>
+      <w:proofErr w:type="spellEnd"/>
+      <w:r>
+        <w:t xml:space="preserve"> Pose </w:t>
+      </w:r>
+      <w:proofErr w:type="spellStart"/>
+      <w:r>
+        <w:t>Landmarker</w:t>
+      </w:r>
+      <w:proofErr w:type="spellEnd"/>
+      <w:r>
+        <w:t xml:space="preserve"> (33 točk)</w:t>
+      </w:r>
+    </w:p>
+    <w:p/>
+    <w:p>
+      <w:r>
+        <w:t xml:space="preserve">Vsaka sklepna točka je opisana v normaliziranih koordinatah slike ter dodatno tudi v 3D koordinatah sveta. Koordinate so </w:t>
+      </w:r>
+      <w:r>
+        <w:t>podane v metrih, pri čemer so vrednosti relativne glede na izhodiščno točko, določeno kot sredina med obema kolkoma.</w:t>
+      </w:r>
+      <w:r>
+        <w:t xml:space="preserve"> Vsaka sklepna točka vsebuje</w:t>
+      </w:r>
+      <w:r>
+        <w:t xml:space="preserve"> tudi </w:t>
+      </w:r>
+      <w:r>
+        <w:t>numeričn</w:t>
+      </w:r>
+      <w:r>
+        <w:t>i</w:t>
+      </w:r>
+      <w:r>
+        <w:t xml:space="preserve"> </w:t>
+      </w:r>
+      <w:r>
+        <w:t>ocen</w:t>
+      </w:r>
+      <w:r>
+        <w:t>i</w:t>
+      </w:r>
+      <w:r>
+        <w:t xml:space="preserve"> njene vidljivosti</w:t>
+      </w:r>
+      <w:r>
+        <w:t xml:space="preserve"> in prisotnosti</w:t>
+      </w:r>
+      <w:r>
+        <w:t>.</w:t>
+      </w:r>
+      <w:r>
+        <w:t xml:space="preserve"> </w:t>
+      </w:r>
+      <w:r>
+        <w:t>V</w:t>
+      </w:r>
+      <w:r>
+        <w:t xml:space="preserve">rednost </w:t>
+      </w:r>
+      <w:r>
+        <w:t xml:space="preserve">vidljivosti </w:t>
+      </w:r>
+      <w:r>
+        <w:t xml:space="preserve">je </w:t>
+      </w:r>
+      <w:r>
+        <w:t xml:space="preserve">v intervalu od </w:t>
+      </w:r>
+      <w:r>
+        <w:t xml:space="preserve">0 </w:t>
+      </w:r>
+      <w:r>
+        <w:t>do</w:t>
+      </w:r>
+      <w:r>
+        <w:t xml:space="preserve"> 1, kjer 0 pomeni, da sklepna točka </w:t>
+      </w:r>
+      <w:r>
+        <w:t xml:space="preserve">po oceni modela ni vidna oziroma </w:t>
+      </w:r>
+      <w:r>
+        <w:t>je zakrita</w:t>
+      </w:r>
+      <w:r>
+        <w:t xml:space="preserve">, </w:t>
+      </w:r>
+      <w:r>
+        <w:t xml:space="preserve">vrednost </w:t>
+      </w:r>
+      <w:r>
+        <w:t xml:space="preserve">1 </w:t>
+      </w:r>
+      <w:r>
+        <w:t>pa označuje</w:t>
+      </w:r>
+      <w:r>
+        <w:t xml:space="preserve"> visoko </w:t>
+      </w:r>
+      <w:r>
+        <w:t xml:space="preserve">oceno </w:t>
+      </w:r>
+      <w:r>
+        <w:t xml:space="preserve">modela, da je sklepna točka v kadru prisotna in </w:t>
+      </w:r>
+      <w:r>
+        <w:t>ni zakrita</w:t>
+      </w:r>
+      <w:r>
+        <w:t>.</w:t>
+      </w:r>
+      <w:r>
+        <w:t xml:space="preserve"> </w:t>
+      </w:r>
+      <w:r>
+        <w:t>Ocena v</w:t>
+      </w:r>
+      <w:r>
+        <w:t>rednost</w:t>
+      </w:r>
+      <w:r>
+        <w:t>i</w:t>
+      </w:r>
+      <w:r>
+        <w:t xml:space="preserve"> prisotnosti </w:t>
+      </w:r>
+      <w:r>
+        <w:t xml:space="preserve">sklepne točke </w:t>
+      </w:r>
+      <w:r>
+        <w:t>je manj stroga</w:t>
+      </w:r>
+      <w:r>
+        <w:t>, saj predstavlja verjetnost, da je sklepna točka znotraj kadra, ne glede na to, ali je delno zakrita.</w:t>
+      </w:r>
+    </w:p>
+    <w:p>
+      <w:r>
+        <w:lastRenderedPageBreak/>
+        <w:t xml:space="preserve">Pose </w:t>
+      </w:r>
+      <w:proofErr w:type="spellStart"/>
+      <w:r>
+        <w:t>Landmarker</w:t>
+      </w:r>
+      <w:proofErr w:type="spellEnd"/>
+      <w:r>
+        <w:t xml:space="preserve"> je v okolju brskalnika na voljo preko knjižnice </w:t>
+      </w:r>
+      <w:proofErr w:type="spellStart"/>
+      <w:r>
+        <w:t>npm</w:t>
+      </w:r>
+      <w:proofErr w:type="spellEnd"/>
+      <w:r>
+        <w:t xml:space="preserve"> </w:t>
+      </w:r>
+      <w:r>
+        <w:t>“</w:t>
+      </w:r>
+      <w:r>
+        <w:t>@</w:t>
+      </w:r>
+      <w:proofErr w:type="spellStart"/>
+      <w:r>
+        <w:t>mediapipe</w:t>
+      </w:r>
+      <w:proofErr w:type="spellEnd"/>
+      <w:r>
+        <w:t>/</w:t>
+      </w:r>
+      <w:proofErr w:type="spellStart"/>
+      <w:r>
+        <w:t>tasks-vision</w:t>
+      </w:r>
+      <w:proofErr w:type="spellEnd"/>
+      <w:r>
+        <w:t>“</w:t>
+      </w:r>
+      <w:r>
+        <w:t>, ki je primerna za integracijo v Next.js</w:t>
+      </w:r>
+      <w:r>
+        <w:t>.</w:t>
+      </w:r>
+      <w:r>
+        <w:t xml:space="preserve"> </w:t>
+      </w:r>
+      <w:r>
+        <w:t>Na voljo so 3 različice modela: Lite</w:t>
+      </w:r>
+      <w:r>
+        <w:t xml:space="preserve"> (</w:t>
+      </w:r>
+      <w:proofErr w:type="spellStart"/>
+      <w:r>
+        <w:t>vleikost</w:t>
+      </w:r>
+      <w:proofErr w:type="spellEnd"/>
+      <w:r>
+        <w:t xml:space="preserve"> 3MB)</w:t>
+      </w:r>
+      <w:r>
+        <w:t xml:space="preserve">, </w:t>
+      </w:r>
+      <w:proofErr w:type="spellStart"/>
+      <w:r>
+        <w:t>Full</w:t>
+      </w:r>
+      <w:proofErr w:type="spellEnd"/>
+      <w:r>
+        <w:t xml:space="preserve"> (velikost 6MB)</w:t>
+      </w:r>
+      <w:r>
+        <w:t xml:space="preserve"> in </w:t>
+      </w:r>
+      <w:proofErr w:type="spellStart"/>
+      <w:r>
+        <w:t>Heavy</w:t>
+      </w:r>
+      <w:proofErr w:type="spellEnd"/>
+      <w:r>
+        <w:t xml:space="preserve"> (velikost 26MB)</w:t>
+      </w:r>
+      <w:r>
+        <w:t xml:space="preserve">. </w:t>
+      </w:r>
+      <w:r>
+        <w:t xml:space="preserve">Lite model je </w:t>
+      </w:r>
+      <w:r>
+        <w:t>“</w:t>
+      </w:r>
+      <w:r>
+        <w:t>najlažji</w:t>
+      </w:r>
+      <w:r>
+        <w:t>“</w:t>
+      </w:r>
+      <w:r>
+        <w:t xml:space="preserve"> in </w:t>
+      </w:r>
+      <w:r>
+        <w:t>je namenjen za delovanje na strojno najslabših robnih napravah</w:t>
+      </w:r>
+      <w:r>
+        <w:t xml:space="preserve">, vendar je kvaliteta </w:t>
+      </w:r>
+      <w:r>
+        <w:t>zaznave</w:t>
+      </w:r>
+      <w:r>
+        <w:t xml:space="preserve"> sklepnih točk slabša od ostalih dveh različic. Različica </w:t>
+      </w:r>
+      <w:proofErr w:type="spellStart"/>
+      <w:r>
+        <w:t>Full</w:t>
+      </w:r>
+      <w:proofErr w:type="spellEnd"/>
+      <w:r>
+        <w:t xml:space="preserve"> </w:t>
+      </w:r>
+      <w:r>
+        <w:t xml:space="preserve">je po hitrosti delovanja kot tudi po kakovosti </w:t>
+      </w:r>
+      <w:r>
+        <w:t>zaznave</w:t>
+      </w:r>
+      <w:r>
+        <w:t xml:space="preserve"> sklepnih točk zlata sredina med Lite in </w:t>
+      </w:r>
+      <w:proofErr w:type="spellStart"/>
+      <w:r>
+        <w:t>Heavy</w:t>
+      </w:r>
+      <w:proofErr w:type="spellEnd"/>
+      <w:r>
+        <w:t xml:space="preserve"> različico. </w:t>
+      </w:r>
+      <w:proofErr w:type="spellStart"/>
+      <w:r>
+        <w:t>Heavy</w:t>
+      </w:r>
+      <w:proofErr w:type="spellEnd"/>
+      <w:r>
+        <w:t xml:space="preserve"> različica </w:t>
+      </w:r>
+      <w:r>
+        <w:t xml:space="preserve">je namenjena za modernejše robne naprave, kajti na strojno slabših napravah je detekcija </w:t>
+      </w:r>
+      <w:r>
+        <w:t xml:space="preserve">z omenjeno različico </w:t>
+      </w:r>
+      <w:r>
+        <w:t xml:space="preserve">zelo </w:t>
+      </w:r>
+      <w:r>
+        <w:t xml:space="preserve">počasna. </w:t>
+      </w:r>
+      <w:r>
+        <w:t>Nudi pa najkvalitetnejšo zaznavo sklepnih</w:t>
+      </w:r>
+      <w:r>
+        <w:t xml:space="preserve"> točk.</w:t>
+      </w:r>
+    </w:p>
+    <w:p/>
+    <w:p>
+      <w:r>
+        <w:t>Posebnost rešitve je ta, da je sestavljena iz paketa modelov. Prvi zazna prisotnost teles, imenovan tudi detektor, drugi pa izvede določitev sklepnih točk. Detektor uporablja vhodno obliko velikosti 224x224x3, model za določitev sklepnih točk na telesu pa 256x256x3</w:t>
+      </w:r>
+      <w:r>
+        <w:t>. Pri vseh treh različicah</w:t>
+      </w:r>
+      <w:r>
+        <w:t xml:space="preserve"> (Lite, </w:t>
+      </w:r>
+      <w:proofErr w:type="spellStart"/>
+      <w:r>
+        <w:t>Full</w:t>
+      </w:r>
+      <w:proofErr w:type="spellEnd"/>
+      <w:r>
+        <w:t xml:space="preserve"> in </w:t>
+      </w:r>
+      <w:proofErr w:type="spellStart"/>
+      <w:r>
+        <w:t>Heavy</w:t>
+      </w:r>
+      <w:proofErr w:type="spellEnd"/>
+      <w:r>
+        <w:t xml:space="preserve">) </w:t>
+      </w:r>
+      <w:r>
+        <w:t>so vhodne oblike enake.</w:t>
+      </w:r>
+    </w:p>
+    <w:p/>
+    <w:p>
+      <w:r>
+        <w:t xml:space="preserve">Model </w:t>
+      </w:r>
+      <w:r>
+        <w:t xml:space="preserve">poleg sklepnih točk izračuni </w:t>
+      </w:r>
+      <w:r>
+        <w:t xml:space="preserve">tudi določene numerične vrednosti zaupanja, ki </w:t>
+      </w:r>
+      <w:r>
+        <w:t xml:space="preserve">podajo </w:t>
+      </w:r>
+      <w:r>
+        <w:t xml:space="preserve">informacijo o kakovosti zaznave </w:t>
+      </w:r>
+      <w:r>
+        <w:t>poze</w:t>
+      </w:r>
+      <w:r>
+        <w:t xml:space="preserve"> v fazi detekcije in sledenja. Vrednosti so podane v intervalu od 0 do 1, in sicer:</w:t>
+      </w:r>
+    </w:p>
+    <w:p>
+      <w:pPr>
+        <w:pStyle w:val="ListParagraph"/>
+        <w:numPr>
+          <w:ilvl w:val="0"/>
+          <w:numId w:val="51"/>
+        </w:numPr>
+      </w:pPr>
+      <w:r>
+        <w:t>Ocena zaupanja</w:t>
+      </w:r>
+      <w:r>
+        <w:t xml:space="preserve">, da </w:t>
+      </w:r>
+      <w:r>
+        <w:t xml:space="preserve">je </w:t>
+      </w:r>
+      <w:r>
+        <w:t xml:space="preserve">poza </w:t>
+      </w:r>
+      <w:r>
+        <w:t xml:space="preserve">uspešno </w:t>
+      </w:r>
+      <w:r>
+        <w:t>zaznana</w:t>
+      </w:r>
+    </w:p>
+    <w:p>
+      <w:pPr>
+        <w:pStyle w:val="ListParagraph"/>
+        <w:numPr>
+          <w:ilvl w:val="0"/>
+          <w:numId w:val="51"/>
+        </w:numPr>
+      </w:pPr>
+      <w:r>
+        <w:t xml:space="preserve">Ocena </w:t>
+      </w:r>
+      <w:r>
+        <w:t xml:space="preserve">zaupanja, da je </w:t>
+      </w:r>
+      <w:r>
+        <w:t xml:space="preserve">poza v </w:t>
+      </w:r>
+      <w:r>
+        <w:t xml:space="preserve">vhodnem </w:t>
+      </w:r>
+      <w:r>
+        <w:t>kadru prisotna</w:t>
+      </w:r>
+    </w:p>
+    <w:p>
+      <w:pPr>
+        <w:pStyle w:val="ListParagraph"/>
+        <w:numPr>
+          <w:ilvl w:val="0"/>
+          <w:numId w:val="51"/>
+        </w:numPr>
+      </w:pPr>
+      <w:r>
+        <w:t>Ocena</w:t>
+      </w:r>
+      <w:r>
+        <w:t xml:space="preserve"> zaupanja, da </w:t>
+      </w:r>
+      <w:r>
+        <w:t xml:space="preserve">je </w:t>
+      </w:r>
+      <w:r>
+        <w:t>sledenje poze med zaporednimi okvirji uspešno</w:t>
+      </w:r>
+    </w:p>
+    <w:p/>
+    <w:p>
+      <w:r>
+        <w:t>Inicializacija modela poteka preko konfiguracije, kjer je možno nastaviti slednje:</w:t>
+      </w:r>
+    </w:p>
+    <w:p>
+      <w:pPr>
+        <w:pStyle w:val="ListParagraph"/>
+        <w:numPr>
+          <w:ilvl w:val="0"/>
+          <w:numId w:val="50"/>
+        </w:numPr>
+      </w:pPr>
+      <w:r>
+        <w:t xml:space="preserve">Različica modela (Lite, </w:t>
+      </w:r>
+      <w:proofErr w:type="spellStart"/>
+      <w:r>
+        <w:t>Full</w:t>
+      </w:r>
+      <w:proofErr w:type="spellEnd"/>
+      <w:r>
+        <w:t xml:space="preserve"> ali </w:t>
+      </w:r>
+      <w:proofErr w:type="spellStart"/>
+      <w:r>
+        <w:t>Heavy</w:t>
+      </w:r>
+      <w:proofErr w:type="spellEnd"/>
+      <w:r>
+        <w:t>)</w:t>
+      </w:r>
+    </w:p>
+    <w:p>
+      <w:pPr>
+        <w:pStyle w:val="ListParagraph"/>
+        <w:numPr>
+          <w:ilvl w:val="0"/>
+          <w:numId w:val="50"/>
+        </w:numPr>
+      </w:pPr>
+      <w:r>
+        <w:t>Način delovanja (slika ali video tok)</w:t>
+      </w:r>
+    </w:p>
+    <w:p>
+      <w:pPr>
+        <w:pStyle w:val="ListParagraph"/>
+        <w:numPr>
+          <w:ilvl w:val="0"/>
+          <w:numId w:val="50"/>
+        </w:numPr>
+      </w:pPr>
+      <w:r>
+        <w:t xml:space="preserve">Število </w:t>
+      </w:r>
+      <w:r>
+        <w:t>teles, ki jih naj model zaznava</w:t>
+      </w:r>
+    </w:p>
+    <w:p>
+      <w:pPr>
+        <w:pStyle w:val="ListParagraph"/>
+        <w:numPr>
+          <w:ilvl w:val="0"/>
+          <w:numId w:val="50"/>
+        </w:numPr>
+      </w:pPr>
+      <w:r>
+        <w:t xml:space="preserve">Spodnji prag </w:t>
+      </w:r>
+      <w:r>
+        <w:t xml:space="preserve">ocene </w:t>
+      </w:r>
+      <w:r>
+        <w:t xml:space="preserve">zaupanja, da je </w:t>
+      </w:r>
+      <w:r>
+        <w:t xml:space="preserve">poza </w:t>
+      </w:r>
+      <w:r>
+        <w:t>kvalitetno zaznana</w:t>
+      </w:r>
+    </w:p>
+    <w:p>
+      <w:pPr>
+        <w:pStyle w:val="ListParagraph"/>
+        <w:numPr>
+          <w:ilvl w:val="0"/>
+          <w:numId w:val="50"/>
+        </w:numPr>
+      </w:pPr>
+      <w:r>
+        <w:t xml:space="preserve">Spodnji prag </w:t>
+      </w:r>
+      <w:r>
+        <w:t xml:space="preserve">ocene </w:t>
+      </w:r>
+      <w:r>
+        <w:t xml:space="preserve">zaupanja, da je </w:t>
+      </w:r>
+      <w:r>
+        <w:t xml:space="preserve">poza </w:t>
+      </w:r>
+      <w:r>
+        <w:t>v</w:t>
+      </w:r>
+      <w:r>
+        <w:t xml:space="preserve"> </w:t>
+      </w:r>
+      <w:r>
+        <w:t>vhodnem kadru</w:t>
+      </w:r>
+      <w:r>
+        <w:t xml:space="preserve"> prisotna</w:t>
+      </w:r>
+    </w:p>
+    <w:p>
+      <w:pPr>
+        <w:pStyle w:val="ListParagraph"/>
+        <w:numPr>
+          <w:ilvl w:val="0"/>
+          <w:numId w:val="50"/>
+        </w:numPr>
+      </w:pPr>
+      <w:r>
+        <w:t xml:space="preserve">Spodnji prag </w:t>
+      </w:r>
+      <w:r>
+        <w:t xml:space="preserve">ocene </w:t>
+      </w:r>
+      <w:r>
+        <w:t xml:space="preserve">zaupanja, </w:t>
+      </w:r>
+      <w:r>
+        <w:t xml:space="preserve">da je sledenje poze med zaporednimi okvirji </w:t>
+      </w:r>
+      <w:r>
+        <w:t xml:space="preserve">ocenjeno </w:t>
+      </w:r>
+      <w:r>
+        <w:t xml:space="preserve">za </w:t>
+      </w:r>
+      <w:r>
+        <w:t>uspešn</w:t>
+      </w:r>
+      <w:r>
+        <w:t>o</w:t>
+      </w:r>
+    </w:p>
+    <w:p>
+      <w:pPr>
         <w:pStyle w:val="Heading1"/>
         <w:spacing w:line="360" w:lineRule="auto"/>
         <w:rPr>
@@ -3208,6 +3985,7 @@
     </w:p>
     <w:p>
       <w:r>
+        <w:lastRenderedPageBreak/>
         <w:t xml:space="preserve">Ključni prispevek tega magistrskega dela je realno-časovno spremljanje in analiziranje vadbe posameznika. </w:t>
       </w:r>
       <w:r>
@@ -3438,6 +4216,7 @@
       </w:pPr>
       <w:bookmarkStart w:id="14" w:name="_Toc221980688"/>
       <w:r>
+        <w:lastRenderedPageBreak/>
         <w:t>Stanje NI_V_KADRU</w:t>
       </w:r>
       <w:bookmarkEnd w:id="14"/>
@@ -3490,7 +4269,6 @@
       </w:pPr>
       <w:bookmarkStart w:id="15" w:name="_Toc221980689"/>
       <w:r>
-        <w:lastRenderedPageBreak/>
         <w:t>Stanje NI_OBRNJEN_PROTI_KAMERI</w:t>
       </w:r>
       <w:bookmarkEnd w:id="15"/>
@@ -3667,7 +4445,11 @@
         <w:t xml:space="preserve">, </w:t>
       </w:r>
       <w:r>
-        <w:t>specificirati pravila, za zaznavo napačne začetne drže. Pravilo preverja eno izmed naslednjih pogojev:</w:t>
+        <w:t xml:space="preserve">specificirati </w:t>
+      </w:r>
+      <w:r>
+        <w:lastRenderedPageBreak/>
+        <w:t>pravila, za zaznavo napačne začetne drže. Pravilo preverja eno izmed naslednjih pogojev:</w:t>
       </w:r>
     </w:p>
     <w:p>
@@ -3735,7 +4517,6 @@
           <w:sz w:val="44"/>
           <w:szCs w:val="44"/>
         </w:rPr>
-        <w:lastRenderedPageBreak/>
         <w:t xml:space="preserve">SLIKA PRED HALF SQUAT </w:t>
       </w:r>
       <w:r>
@@ -3862,6 +4643,7 @@
           <w:sz w:val="44"/>
           <w:szCs w:val="44"/>
         </w:rPr>
+        <w:lastRenderedPageBreak/>
         <w:t>SLIKA</w:t>
       </w:r>
       <w:r>
@@ -3898,7 +4680,6 @@
       </w:pPr>
       <w:bookmarkStart w:id="20" w:name="_Toc221980694"/>
       <w:r>
-        <w:lastRenderedPageBreak/>
         <w:t>Predpisi vaj</w:t>
       </w:r>
       <w:bookmarkEnd w:id="20"/>
@@ -4082,6 +4863,7 @@
       </w:pPr>
       <w:bookmarkStart w:id="21" w:name="_Toc221980695"/>
       <w:r>
+        <w:lastRenderedPageBreak/>
         <w:t>Zajemanje ponovitev</w:t>
       </w:r>
       <w:bookmarkEnd w:id="21"/>
@@ -4144,7 +4926,6 @@
         <w:spacing w:line="360" w:lineRule="auto"/>
       </w:pPr>
       <w:r>
-        <w:lastRenderedPageBreak/>
         <w:t xml:space="preserve">Trend gibanja izbrane sklepne točke je izpolnil pogoje za </w:t>
       </w:r>
       <w:r>
@@ -4302,6 +5083,7 @@
       </w:pPr>
       <w:bookmarkStart w:id="23" w:name="_Toc221980697"/>
       <w:r>
+        <w:lastRenderedPageBreak/>
         <w:t>Čas ekscentrične faze</w:t>
       </w:r>
       <w:bookmarkEnd w:id="23"/>
@@ -4323,7 +5105,6 @@
       </w:pPr>
       <w:bookmarkStart w:id="24" w:name="_Toc221980698"/>
       <w:r>
-        <w:lastRenderedPageBreak/>
         <w:t>Čas izometrične faze</w:t>
       </w:r>
       <w:bookmarkEnd w:id="24"/>
@@ -4464,6 +5245,7 @@
     <w:p/>
     <w:p>
       <w:r>
+        <w:lastRenderedPageBreak/>
         <w:t>Časovni graf prikaže vsako ponovitev kot stolpec, ki vsebuje tri informacije. Rumen</w:t>
       </w:r>
       <w:r>
@@ -4505,7 +5287,6 @@
         <w:rPr>
           <w:noProof/>
         </w:rPr>
-        <w:lastRenderedPageBreak/>
         <w:drawing>
           <wp:inline distT="0" distB="0" distL="0" distR="0" wp14:anchorId="1E28F347" wp14:editId="4BB88319">
             <wp:extent cx="4933950" cy="3071499"/>
@@ -4522,7 +5303,7 @@
                     <pic:cNvPicPr/>
                   </pic:nvPicPr>
                   <pic:blipFill>
-                    <a:blip r:embed="rId14"/>
+                    <a:blip r:embed="rId15"/>
                     <a:stretch>
                       <a:fillRect/>
                     </a:stretch>
@@ -4565,7 +5346,7 @@
         <w:rPr>
           <w:noProof/>
         </w:rPr>
-        <w:t>2</w:t>
+        <w:t>3</w:t>
       </w:r>
       <w:r>
         <w:rPr>
@@ -4629,6 +5410,7 @@
         <w:rPr>
           <w:noProof/>
         </w:rPr>
+        <w:lastRenderedPageBreak/>
         <w:drawing>
           <wp:inline distT="0" distB="0" distL="0" distR="0" wp14:anchorId="26B7BC38" wp14:editId="448F4768">
             <wp:extent cx="4895918" cy="3124200"/>
@@ -4645,7 +5427,7 @@
                     <pic:cNvPicPr/>
                   </pic:nvPicPr>
                   <pic:blipFill>
-                    <a:blip r:embed="rId15"/>
+                    <a:blip r:embed="rId16"/>
                     <a:stretch>
                       <a:fillRect/>
                     </a:stretch>
@@ -4688,6 +5470,30 @@
         <w:rPr>
           <w:noProof/>
         </w:rPr>
+        <w:t>3</w:t>
+      </w:r>
+      <w:r>
+        <w:rPr>
+          <w:noProof/>
+        </w:rPr>
+        <w:fldChar w:fldCharType="end"/>
+      </w:r>
+      <w:r>
+        <w:t>.</w:t>
+      </w:r>
+      <w:r>
+        <w:fldChar w:fldCharType="begin"/>
+      </w:r>
+      <w:r>
+        <w:instrText xml:space="preserve"> SEQ Slika \* ARABIC \s 1 </w:instrText>
+      </w:r>
+      <w:r>
+        <w:fldChar w:fldCharType="separate"/>
+      </w:r>
+      <w:r>
+        <w:rPr>
+          <w:noProof/>
+        </w:rPr>
         <w:t>2</w:t>
       </w:r>
       <w:r>
@@ -4697,30 +5503,6 @@
         <w:fldChar w:fldCharType="end"/>
       </w:r>
       <w:r>
-        <w:t>.</w:t>
-      </w:r>
-      <w:r>
-        <w:fldChar w:fldCharType="begin"/>
-      </w:r>
-      <w:r>
-        <w:instrText xml:space="preserve"> SEQ Slika \* ARABIC \s 1 </w:instrText>
-      </w:r>
-      <w:r>
-        <w:fldChar w:fldCharType="separate"/>
-      </w:r>
-      <w:r>
-        <w:rPr>
-          <w:noProof/>
-        </w:rPr>
-        <w:t>2</w:t>
-      </w:r>
-      <w:r>
-        <w:rPr>
-          <w:noProof/>
-        </w:rPr>
-        <w:fldChar w:fldCharType="end"/>
-      </w:r>
-      <w:r>
         <w:t xml:space="preserve">: Graf prepotovane </w:t>
       </w:r>
       <w:bookmarkEnd w:id="29"/>
@@ -4732,7 +5514,6 @@
     <w:p/>
     <w:p>
       <w:r>
-        <w:lastRenderedPageBreak/>
         <w:t xml:space="preserve">Graf hitrosti je enak grafu prepotovane distance, le da se </w:t>
       </w:r>
       <w:r>
@@ -4763,7 +5544,7 @@
                     <pic:cNvPicPr/>
                   </pic:nvPicPr>
                   <pic:blipFill>
-                    <a:blip r:embed="rId16"/>
+                    <a:blip r:embed="rId17"/>
                     <a:stretch>
                       <a:fillRect/>
                     </a:stretch>
@@ -4808,7 +5589,7 @@
         <w:rPr>
           <w:noProof/>
         </w:rPr>
-        <w:t>2</w:t>
+        <w:t>3</w:t>
       </w:r>
       <w:r>
         <w:rPr>
@@ -4857,6 +5638,7 @@
       </w:pPr>
       <w:bookmarkStart w:id="35" w:name="_Toc221980701"/>
       <w:r>
+        <w:lastRenderedPageBreak/>
         <w:t>Informacije o nepravilni drži telesa</w:t>
       </w:r>
       <w:bookmarkEnd w:id="35"/>
@@ -4964,7 +5746,6 @@
           <w:sz w:val="44"/>
           <w:szCs w:val="44"/>
         </w:rPr>
-        <w:lastRenderedPageBreak/>
         <w:t>SLIKA</w:t>
       </w:r>
       <w:r>
@@ -5045,6 +5826,7 @@
       </w:pPr>
       <w:bookmarkStart w:id="38" w:name="_Toc221980704"/>
       <w:r>
+        <w:lastRenderedPageBreak/>
         <w:t xml:space="preserve">Primerjava ponovitev znotraj </w:t>
       </w:r>
       <w:r>
@@ -5248,214 +6030,532 @@
       </w:pPr>
       <w:bookmarkStart w:id="39" w:name="_Toc221980705"/>
       <w:r>
+        <w:t>Trening na podlagi hitrosti</w:t>
+      </w:r>
+      <w:bookmarkEnd w:id="39"/>
+    </w:p>
+    <w:p>
+      <w:r>
+        <w:t xml:space="preserve">Na grafu </w:t>
+      </w:r>
+      <w:r>
+        <w:fldChar w:fldCharType="begin"/>
+      </w:r>
+      <w:r>
+        <w:instrText xml:space="preserve"> REF _Ref221967533 \h </w:instrText>
+      </w:r>
+      <w:r>
+        <w:instrText xml:space="preserve"> \* MERGEFORMAT </w:instrText>
+      </w:r>
+      <w:r>
+        <w:fldChar w:fldCharType="separate"/>
+      </w:r>
+      <w:r>
+        <w:t xml:space="preserve">Slika </w:t>
+      </w:r>
+      <w:r>
+        <w:rPr>
+          <w:noProof/>
+        </w:rPr>
+        <w:t>2</w:t>
+      </w:r>
+      <w:r>
+        <w:t>.</w:t>
+      </w:r>
+      <w:r>
+        <w:rPr>
+          <w:noProof/>
+        </w:rPr>
+        <w:t>3</w:t>
+      </w:r>
+      <w:r>
+        <w:t>: Graf hitrosti v koncentrični fazi</w:t>
+      </w:r>
+      <w:r>
+        <w:fldChar w:fldCharType="end"/>
+      </w:r>
+      <w:r>
+        <w:t xml:space="preserve"> je v</w:t>
+      </w:r>
+      <w:r>
+        <w:t xml:space="preserve">eč kot očiten </w:t>
+      </w:r>
+      <w:r>
+        <w:t xml:space="preserve">trend padanja hitrosti </w:t>
+      </w:r>
+      <w:r>
+        <w:t xml:space="preserve">čez ponovitve, iz česar se sklepa, da je uporabnik vajo opravljal pod </w:t>
+      </w:r>
+      <w:r>
+        <w:t xml:space="preserve">njemu </w:t>
+      </w:r>
+      <w:r>
+        <w:t xml:space="preserve">veliko obremenitvijo in </w:t>
+      </w:r>
+      <w:r>
+        <w:t xml:space="preserve">da je </w:t>
+      </w:r>
+      <w:r>
+        <w:t xml:space="preserve">opravil serijo, ki je značilna za </w:t>
+      </w:r>
+      <w:r>
+        <w:t>trening</w:t>
+      </w:r>
+      <w:r>
+        <w:t xml:space="preserve"> </w:t>
+      </w:r>
+      <w:r>
+        <w:t>napredovanj</w:t>
+      </w:r>
+      <w:r>
+        <w:t>a</w:t>
+      </w:r>
+      <w:r>
+        <w:t xml:space="preserve"> v moči.</w:t>
+      </w:r>
+      <w:r>
+        <w:t xml:space="preserve"> </w:t>
+      </w:r>
+      <w:r>
+        <w:t>Če padajoči trend čez ponovitve ni prisoten in je cilj treninga napredovanje v moči, potem se uporabnika obvesti, da si naj za naslednjo serijo poveča obremenitev</w:t>
+      </w:r>
+      <w:r>
+        <w:t xml:space="preserve">, kajti tak trend </w:t>
+      </w:r>
+      <w:r>
+        <w:t xml:space="preserve">konstantne hitrosti čez ponovitve </w:t>
+      </w:r>
+      <w:r>
+        <w:t xml:space="preserve">je značilen za </w:t>
+      </w:r>
+      <w:r>
+        <w:t>trening ohranjanja moči</w:t>
+      </w:r>
+      <w:r>
+        <w:t>.</w:t>
+      </w:r>
+      <w:r>
+        <w:t xml:space="preserve"> </w:t>
+      </w:r>
+    </w:p>
+    <w:p/>
+    <w:p>
+      <w:r>
+        <w:t xml:space="preserve">Preko grafa hitrosti v koncentrični </w:t>
+      </w:r>
+      <w:r>
+        <w:t xml:space="preserve">je možno </w:t>
+      </w:r>
+      <w:r>
+        <w:t>napove</w:t>
+      </w:r>
+      <w:r>
+        <w:t>dati</w:t>
+      </w:r>
+      <w:r>
+        <w:t xml:space="preserve"> tip treninga na podlagi trenda hitrosti čez ponovitve. Edina predpostavka, ki mora biti izpolnjena za </w:t>
+      </w:r>
+      <w:r>
+        <w:t xml:space="preserve">potrditev </w:t>
+      </w:r>
+      <w:r>
+        <w:t>omenjen</w:t>
+      </w:r>
+      <w:r>
+        <w:t>ih</w:t>
+      </w:r>
+      <w:r>
+        <w:t xml:space="preserve"> ugotovit</w:t>
+      </w:r>
+      <w:r>
+        <w:t>ev</w:t>
+      </w:r>
+      <w:r>
+        <w:t>,</w:t>
+      </w:r>
+      <w:r>
+        <w:t xml:space="preserve"> je ta, da mora uporabnik med ponovit</w:t>
+      </w:r>
+      <w:r>
+        <w:t>vami</w:t>
+      </w:r>
+      <w:r>
+        <w:t xml:space="preserve"> dati vse od sebe.</w:t>
+      </w:r>
+    </w:p>
+    <w:p>
+      <w:pPr>
+        <w:pStyle w:val="Heading3"/>
+      </w:pPr>
+      <w:r>
         <w:lastRenderedPageBreak/>
-        <w:t>Trening na podlagi hitrosti</w:t>
-      </w:r>
-      <w:bookmarkEnd w:id="39"/>
-    </w:p>
-    <w:p>
-      <w:r>
-        <w:t xml:space="preserve">Na grafu </w:t>
-      </w:r>
-      <w:r>
-        <w:fldChar w:fldCharType="begin"/>
-      </w:r>
-      <w:r>
-        <w:instrText xml:space="preserve"> REF _Ref221967533 \h </w:instrText>
-      </w:r>
-      <w:r>
-        <w:instrText xml:space="preserve"> \* MERGEFORMAT </w:instrText>
-      </w:r>
-      <w:r>
-        <w:fldChar w:fldCharType="separate"/>
-      </w:r>
-      <w:r>
-        <w:t xml:space="preserve">Slika </w:t>
-      </w:r>
-      <w:r>
-        <w:rPr>
-          <w:noProof/>
-        </w:rPr>
-        <w:t>2</w:t>
+        <w:t xml:space="preserve"> </w:t>
+      </w:r>
+      <w:bookmarkStart w:id="40" w:name="_Toc221980706"/>
+      <w:r>
+        <w:t>Primerjava med treningi</w:t>
+      </w:r>
+      <w:r>
+        <w:t xml:space="preserve"> skozi čas</w:t>
+      </w:r>
+      <w:bookmarkEnd w:id="40"/>
+    </w:p>
+    <w:p>
+      <w:r>
+        <w:t xml:space="preserve">Zaporedne treninge, ki </w:t>
+      </w:r>
+      <w:r>
+        <w:t xml:space="preserve">se jim </w:t>
+      </w:r>
+      <w:r>
+        <w:t>preko napovedi klasifikacije tipa treninga s pomočjo sklepov na podlagi hitrosti v koncentrični fazi</w:t>
+      </w:r>
+      <w:r>
+        <w:t xml:space="preserve"> določi tip</w:t>
+      </w:r>
+      <w:r>
+        <w:t xml:space="preserve">, je možno združiti v </w:t>
+      </w:r>
+      <w:r>
+        <w:t xml:space="preserve">časovne </w:t>
+      </w:r>
+      <w:r>
+        <w:t>cikle z istim tipom treninga</w:t>
+      </w:r>
+      <w:r>
+        <w:t xml:space="preserve">, kar omogoča grobe primerjave med </w:t>
+      </w:r>
+      <w:r>
+        <w:t xml:space="preserve">pričakovanimi in izmerjenimi </w:t>
+      </w:r>
+      <w:r>
+        <w:t>cilji časovnih ciklov</w:t>
       </w:r>
       <w:r>
         <w:t>.</w:t>
       </w:r>
-      <w:r>
-        <w:rPr>
-          <w:noProof/>
-        </w:rPr>
-        <w:t>3</w:t>
-      </w:r>
-      <w:r>
-        <w:t>: Graf hitrosti v koncentrični fazi</w:t>
-      </w:r>
-      <w:r>
-        <w:fldChar w:fldCharType="end"/>
-      </w:r>
-      <w:r>
-        <w:t xml:space="preserve"> je v</w:t>
-      </w:r>
-      <w:r>
-        <w:t xml:space="preserve">eč kot očiten </w:t>
-      </w:r>
-      <w:r>
-        <w:t xml:space="preserve">trend padanja hitrosti </w:t>
-      </w:r>
-      <w:r>
-        <w:t xml:space="preserve">čez ponovitve, iz česar se sklepa, da je uporabnik vajo opravljal pod </w:t>
-      </w:r>
-      <w:r>
-        <w:t xml:space="preserve">njemu </w:t>
-      </w:r>
-      <w:r>
-        <w:t xml:space="preserve">veliko obremenitvijo in </w:t>
-      </w:r>
-      <w:r>
-        <w:t xml:space="preserve">da je </w:t>
-      </w:r>
-      <w:r>
-        <w:t xml:space="preserve">opravil serijo, ki je značilna za </w:t>
-      </w:r>
-      <w:r>
-        <w:t>trening</w:t>
-      </w:r>
-      <w:r>
+    </w:p>
+    <w:p/>
+    <w:p>
+      <w:pPr>
+        <w:pStyle w:val="Heading1"/>
+      </w:pPr>
+      <w:r>
+        <w:t>VIRI</w:t>
+      </w:r>
+    </w:p>
+    <w:p>
+      <w:pPr>
+        <w:rPr>
+          <w:lang w:val="en-US"/>
+        </w:rPr>
+      </w:pPr>
+      <w:r>
+        <w:rPr>
+          <w:lang w:val="en-US"/>
+        </w:rPr>
+        <w:t>Pose</w:t>
+      </w:r>
+      <w:r>
+        <w:rPr>
+          <w:lang w:val="en-US"/>
+        </w:rPr>
         <w:t xml:space="preserve"> </w:t>
       </w:r>
-      <w:r>
-        <w:t>napredovanj</w:t>
-      </w:r>
-      <w:r>
-        <w:t>a</w:t>
-      </w:r>
-      <w:r>
-        <w:t xml:space="preserve"> v moči.</w:t>
-      </w:r>
-      <w:r>
+      <w:proofErr w:type="spellStart"/>
+      <w:r>
+        <w:rPr>
+          <w:lang w:val="en-US"/>
+        </w:rPr>
+        <w:t>Landmarker</w:t>
+      </w:r>
+      <w:proofErr w:type="spellEnd"/>
+      <w:r>
+        <w:rPr>
+          <w:lang w:val="en-US"/>
+        </w:rPr>
+        <w:t xml:space="preserve">: </w:t>
+      </w:r>
+      <w:r>
+        <w:rPr>
+          <w:lang w:val="en-US"/>
+        </w:rPr>
         <w:t xml:space="preserve"> </w:t>
       </w:r>
-      <w:r>
-        <w:t>Če padajoči trend čez ponovitve ni prisoten in je cilj treninga napredovanje v moči, potem se uporabnika obvesti, da si naj za naslednjo serijo poveča obremenitev</w:t>
-      </w:r>
-      <w:r>
-        <w:t xml:space="preserve">, kajti tak trend </w:t>
-      </w:r>
-      <w:r>
-        <w:t xml:space="preserve">konstantne hitrosti čez ponovitve </w:t>
-      </w:r>
-      <w:r>
-        <w:t xml:space="preserve">je značilen za </w:t>
-      </w:r>
-      <w:r>
-        <w:t>trening ohranjanja moči</w:t>
-      </w:r>
-      <w:r>
-        <w:t>.</w:t>
-      </w:r>
+    </w:p>
+    <w:p>
+      <w:pPr>
+        <w:pStyle w:val="ListParagraph"/>
+        <w:numPr>
+          <w:ilvl w:val="0"/>
+          <w:numId w:val="53"/>
+        </w:numPr>
+        <w:rPr>
+          <w:lang w:val="en-US"/>
+        </w:rPr>
+      </w:pPr>
+      <w:r>
+        <w:t xml:space="preserve">CITATION How </w:t>
+      </w:r>
+      <w:proofErr w:type="spellStart"/>
+      <w:r>
+        <w:t>can</w:t>
+      </w:r>
+      <w:proofErr w:type="spellEnd"/>
       <w:r>
         <w:t xml:space="preserve"> </w:t>
       </w:r>
-    </w:p>
-    <w:p/>
-    <w:p>
-      <w:r>
-        <w:t xml:space="preserve">Preko grafa hitrosti v koncentrični </w:t>
-      </w:r>
-      <w:r>
-        <w:t xml:space="preserve">je možno </w:t>
-      </w:r>
-      <w:r>
-        <w:t>napove</w:t>
-      </w:r>
-      <w:r>
-        <w:t>dati</w:t>
-      </w:r>
-      <w:r>
-        <w:t xml:space="preserve"> tip treninga na podlagi trenda hitrosti čez ponovitve. Edina predpostavka, ki mora biti izpolnjena za </w:t>
-      </w:r>
-      <w:r>
-        <w:t xml:space="preserve">potrditev </w:t>
-      </w:r>
-      <w:r>
-        <w:t>omenjen</w:t>
-      </w:r>
-      <w:r>
-        <w:t>ih</w:t>
-      </w:r>
-      <w:r>
-        <w:t xml:space="preserve"> ugotovit</w:t>
-      </w:r>
-      <w:r>
-        <w:t>ev</w:t>
-      </w:r>
-      <w:r>
-        <w:t>,</w:t>
-      </w:r>
-      <w:r>
-        <w:t xml:space="preserve"> je ta, da mora uporabnik med ponovit</w:t>
-      </w:r>
-      <w:r>
-        <w:t>vami</w:t>
-      </w:r>
-      <w:r>
-        <w:t xml:space="preserve"> dati vse od sebe.</w:t>
-      </w:r>
-    </w:p>
-    <w:p>
-      <w:pPr>
-        <w:pStyle w:val="Heading3"/>
-      </w:pPr>
+      <w:proofErr w:type="spellStart"/>
+      <w:r>
+        <w:t>users</w:t>
+      </w:r>
+      <w:proofErr w:type="spellEnd"/>
       <w:r>
         <w:t xml:space="preserve"> </w:t>
       </w:r>
-      <w:bookmarkStart w:id="40" w:name="_Toc221980706"/>
-      <w:r>
-        <w:t>Primerjava med treningi</w:t>
-      </w:r>
-      <w:r>
-        <w:t xml:space="preserve"> skozi čas</w:t>
-      </w:r>
-      <w:bookmarkEnd w:id="40"/>
-    </w:p>
-    <w:p>
-      <w:r>
-        <w:t xml:space="preserve">Zaporedne treninge, ki </w:t>
-      </w:r>
-      <w:r>
-        <w:t xml:space="preserve">se jim </w:t>
-      </w:r>
-      <w:r>
-        <w:t>preko napovedi klasifikacije tipa treninga s pomočjo sklepov na podlagi hitrosti v koncentrični fazi</w:t>
-      </w:r>
-      <w:r>
-        <w:t xml:space="preserve"> določi tip</w:t>
-      </w:r>
-      <w:r>
-        <w:t xml:space="preserve">, je možno združiti v </w:t>
-      </w:r>
-      <w:r>
-        <w:t xml:space="preserve">časovne </w:t>
-      </w:r>
-      <w:r>
-        <w:t>cikle z istim tipom treninga</w:t>
-      </w:r>
-      <w:r>
-        <w:t xml:space="preserve">, kar omogoča grobe primerjave med </w:t>
-      </w:r>
-      <w:r>
-        <w:t xml:space="preserve">pričakovanimi in izmerjenimi </w:t>
-      </w:r>
-      <w:r>
-        <w:t>cilji časovnih ciklov</w:t>
-      </w:r>
-      <w:r>
-        <w:t>.</w:t>
+      <w:proofErr w:type="spellStart"/>
+      <w:r>
+        <w:t>cite</w:t>
+      </w:r>
+      <w:proofErr w:type="spellEnd"/>
+      <w:r>
+        <w:t xml:space="preserve"> </w:t>
+      </w:r>
+      <w:proofErr w:type="spellStart"/>
+      <w:r>
+        <w:t>your</w:t>
+      </w:r>
+      <w:proofErr w:type="spellEnd"/>
+      <w:r>
+        <w:t xml:space="preserve"> model? </w:t>
+      </w:r>
+      <w:proofErr w:type="spellStart"/>
+      <w:r>
+        <w:t>BlazePose</w:t>
+      </w:r>
+      <w:proofErr w:type="spellEnd"/>
+      <w:r>
+        <w:t xml:space="preserve">: On-device Real-time </w:t>
+      </w:r>
+      <w:proofErr w:type="spellStart"/>
+      <w:r>
+        <w:t>Body</w:t>
+      </w:r>
+      <w:proofErr w:type="spellEnd"/>
+      <w:r>
+        <w:t xml:space="preserve"> Pose </w:t>
+      </w:r>
+      <w:proofErr w:type="spellStart"/>
+      <w:r>
+        <w:t>tracking</w:t>
+      </w:r>
+      <w:proofErr w:type="spellEnd"/>
+      <w:r>
+        <w:t xml:space="preserve">, CVPR </w:t>
+      </w:r>
+      <w:proofErr w:type="spellStart"/>
+      <w:r>
+        <w:t>Workshop</w:t>
+      </w:r>
+      <w:proofErr w:type="spellEnd"/>
+      <w:r>
+        <w:t xml:space="preserve"> on </w:t>
+      </w:r>
+      <w:proofErr w:type="spellStart"/>
+      <w:r>
+        <w:t>Computer</w:t>
+      </w:r>
+      <w:proofErr w:type="spellEnd"/>
+      <w:r>
+        <w:t xml:space="preserve"> </w:t>
+      </w:r>
+      <w:proofErr w:type="spellStart"/>
+      <w:r>
+        <w:t>Vision</w:t>
+      </w:r>
+      <w:proofErr w:type="spellEnd"/>
+      <w:r>
+        <w:t xml:space="preserve"> </w:t>
+      </w:r>
+      <w:proofErr w:type="spellStart"/>
+      <w:r>
+        <w:t>for</w:t>
+      </w:r>
+      <w:proofErr w:type="spellEnd"/>
+      <w:r>
+        <w:t xml:space="preserve"> </w:t>
+      </w:r>
+      <w:proofErr w:type="spellStart"/>
+      <w:r>
+        <w:t>Augmented</w:t>
+      </w:r>
+      <w:proofErr w:type="spellEnd"/>
+      <w:r>
+        <w:t xml:space="preserve"> </w:t>
+      </w:r>
+      <w:proofErr w:type="spellStart"/>
+      <w:r>
+        <w:t>and</w:t>
+      </w:r>
+      <w:proofErr w:type="spellEnd"/>
+      <w:r>
+        <w:t xml:space="preserve"> </w:t>
+      </w:r>
+      <w:proofErr w:type="spellStart"/>
+      <w:r>
+        <w:t>Virtual</w:t>
+      </w:r>
+      <w:proofErr w:type="spellEnd"/>
+      <w:r>
+        <w:t xml:space="preserve"> </w:t>
+      </w:r>
+      <w:proofErr w:type="spellStart"/>
+      <w:r>
+        <w:t>Reality</w:t>
+      </w:r>
+      <w:proofErr w:type="spellEnd"/>
+      <w:r>
+        <w:t>, Seattle, WA, USA, 2020</w:t>
+      </w:r>
+    </w:p>
+    <w:p>
+      <w:pPr>
+        <w:pStyle w:val="ListParagraph"/>
+        <w:numPr>
+          <w:ilvl w:val="0"/>
+          <w:numId w:val="53"/>
+        </w:numPr>
+        <w:rPr>
+          <w:lang w:val="en-US"/>
+        </w:rPr>
+      </w:pPr>
+      <w:r>
+        <w:t xml:space="preserve">GHUM &amp; GHUML: </w:t>
+      </w:r>
+      <w:proofErr w:type="spellStart"/>
+      <w:r>
+        <w:t>Generative</w:t>
+      </w:r>
+      <w:proofErr w:type="spellEnd"/>
+      <w:r>
+        <w:t xml:space="preserve"> 3D Human </w:t>
+      </w:r>
+      <w:proofErr w:type="spellStart"/>
+      <w:r>
+        <w:t>Shape</w:t>
+      </w:r>
+      <w:proofErr w:type="spellEnd"/>
+      <w:r>
+        <w:t xml:space="preserve"> </w:t>
+      </w:r>
+      <w:proofErr w:type="spellStart"/>
+      <w:r>
+        <w:t>and</w:t>
+      </w:r>
+      <w:proofErr w:type="spellEnd"/>
+      <w:r>
+        <w:t xml:space="preserve"> </w:t>
+      </w:r>
+      <w:proofErr w:type="spellStart"/>
+      <w:r>
+        <w:t>Articulated</w:t>
+      </w:r>
+      <w:proofErr w:type="spellEnd"/>
+      <w:r>
+        <w:t xml:space="preserve"> Pose </w:t>
+      </w:r>
+      <w:proofErr w:type="spellStart"/>
+      <w:r>
+        <w:t>Models</w:t>
+      </w:r>
+      <w:proofErr w:type="spellEnd"/>
+      <w:r>
+        <w:t xml:space="preserve"> </w:t>
+      </w:r>
+      <w:proofErr w:type="spellStart"/>
+      <w:r>
+        <w:t>Proceedings</w:t>
+      </w:r>
+      <w:proofErr w:type="spellEnd"/>
+      <w:r>
+        <w:t xml:space="preserve"> </w:t>
+      </w:r>
+      <w:proofErr w:type="spellStart"/>
+      <w:r>
+        <w:t>of</w:t>
+      </w:r>
+      <w:proofErr w:type="spellEnd"/>
+      <w:r>
+        <w:t xml:space="preserve"> </w:t>
+      </w:r>
+      <w:proofErr w:type="spellStart"/>
+      <w:r>
+        <w:t>the</w:t>
+      </w:r>
+      <w:proofErr w:type="spellEnd"/>
+      <w:r>
+        <w:t xml:space="preserve"> IEEE/CVF </w:t>
+      </w:r>
+      <w:proofErr w:type="spellStart"/>
+      <w:r>
+        <w:t>Conference</w:t>
+      </w:r>
+      <w:proofErr w:type="spellEnd"/>
+      <w:r>
+        <w:t xml:space="preserve"> on </w:t>
+      </w:r>
+      <w:proofErr w:type="spellStart"/>
+      <w:r>
+        <w:t>Computer</w:t>
+      </w:r>
+      <w:proofErr w:type="spellEnd"/>
+      <w:r>
+        <w:t xml:space="preserve"> </w:t>
+      </w:r>
+      <w:proofErr w:type="spellStart"/>
+      <w:r>
+        <w:t>Vision</w:t>
+      </w:r>
+      <w:proofErr w:type="spellEnd"/>
+      <w:r>
+        <w:t xml:space="preserve"> </w:t>
+      </w:r>
+      <w:proofErr w:type="spellStart"/>
+      <w:r>
+        <w:t>and</w:t>
+      </w:r>
+      <w:proofErr w:type="spellEnd"/>
+      <w:r>
+        <w:t xml:space="preserve"> </w:t>
+      </w:r>
+      <w:proofErr w:type="spellStart"/>
+      <w:r>
+        <w:t>Pattern</w:t>
+      </w:r>
+      <w:proofErr w:type="spellEnd"/>
+      <w:r>
+        <w:t xml:space="preserve"> </w:t>
+      </w:r>
+      <w:proofErr w:type="spellStart"/>
+      <w:r>
+        <w:t>Recognition</w:t>
+      </w:r>
+      <w:proofErr w:type="spellEnd"/>
+      <w:r>
+        <w:t xml:space="preserve">, </w:t>
+      </w:r>
+      <w:proofErr w:type="spellStart"/>
+      <w:r>
+        <w:t>pages</w:t>
+      </w:r>
+      <w:proofErr w:type="spellEnd"/>
+      <w:r>
+        <w:t xml:space="preserve"> 6184-6193, 2020</w:t>
       </w:r>
     </w:p>
     <w:p/>
     <w:sectPr>
-      <w:headerReference w:type="default" r:id="rId17"/>
+      <w:headerReference w:type="default" r:id="rId18"/>
       <w:pgSz w:w="11901" w:h="16834" w:code="9"/>
       <w:pgMar w:top="1701" w:right="1418" w:bottom="1701" w:left="1985" w:header="709" w:footer="709" w:gutter="0"/>
       <w:pgNumType w:start="1"/>
@@ -5577,18 +6677,71 @@
     <w:pPr>
       <w:pStyle w:val="Header"/>
     </w:pPr>
+    <w:proofErr w:type="spellStart"/>
     <w:r>
-      <w:t xml:space="preserve">Navodila za izdelavo diplomskih </w:t>
+      <w:t>Navodila</w:t>
     </w:r>
-    <w:smartTag w:uri="urn:schemas-microsoft-com:office:smarttags" w:element="place">
-      <w:smartTag w:uri="urn:schemas-microsoft-com:office:smarttags" w:element="State">
+    <w:proofErr w:type="spellEnd"/>
+    <w:r>
+      <w:t xml:space="preserve"> za </w:t>
+    </w:r>
+    <w:proofErr w:type="spellStart"/>
+    <w:r>
+      <w:t>izdelavo</w:t>
+    </w:r>
+    <w:proofErr w:type="spellEnd"/>
+    <w:r>
+      <w:t xml:space="preserve"> </w:t>
+    </w:r>
+    <w:proofErr w:type="spellStart"/>
+    <w:r>
+      <w:t>diplomskih</w:t>
+    </w:r>
+    <w:proofErr w:type="spellEnd"/>
+    <w:r>
+      <w:t xml:space="preserve"> </w:t>
+    </w:r>
+    <w:smartTag w:uri="urn:schemas-microsoft-com:office:smarttags" w:element="State">
+      <w:smartTag w:uri="urn:schemas-microsoft-com:office:smarttags" w:element="place">
         <w:r>
           <w:t>del</w:t>
         </w:r>
       </w:smartTag>
     </w:smartTag>
     <w:r>
-      <w:t xml:space="preserve"> na dodiplomskih študijskih programih UM FERI</w:t>
+      <w:t xml:space="preserve"> </w:t>
+    </w:r>
+    <w:proofErr w:type="spellStart"/>
+    <w:r>
+      <w:t>na</w:t>
+    </w:r>
+    <w:proofErr w:type="spellEnd"/>
+    <w:r>
+      <w:t xml:space="preserve"> </w:t>
+    </w:r>
+    <w:proofErr w:type="spellStart"/>
+    <w:r>
+      <w:t>dodiplomskih</w:t>
+    </w:r>
+    <w:proofErr w:type="spellEnd"/>
+    <w:r>
+      <w:t xml:space="preserve"> </w:t>
+    </w:r>
+    <w:proofErr w:type="spellStart"/>
+    <w:r>
+      <w:t>študijskih</w:t>
+    </w:r>
+    <w:proofErr w:type="spellEnd"/>
+    <w:r>
+      <w:t xml:space="preserve"> </w:t>
+    </w:r>
+    <w:proofErr w:type="spellStart"/>
+    <w:r>
+      <w:t>programih</w:t>
+    </w:r>
+    <w:proofErr w:type="spellEnd"/>
+    <w:r>
+      <w:t xml:space="preserve"> UM FERI</w:t>
     </w:r>
     <w:r>
       <w:rPr>
@@ -6716,6 +7869,119 @@
     </w:lvl>
   </w:abstractNum>
   <w:abstractNum w:abstractNumId="9" w15:restartNumberingAfterBreak="0">
+    <w:nsid w:val="19EB050D"/>
+    <w:multiLevelType w:val="hybridMultilevel"/>
+    <w:tmpl w:val="C1046816"/>
+    <w:lvl w:ilvl="0" w:tplc="20000001">
+      <w:start w:val="1"/>
+      <w:numFmt w:val="bullet"/>
+      <w:lvlText w:val=""/>
+      <w:lvlJc w:val="left"/>
+      <w:pPr>
+        <w:ind w:left="720" w:hanging="360"/>
+      </w:pPr>
+      <w:rPr>
+        <w:rFonts w:ascii="Symbol" w:hAnsi="Symbol" w:hint="default"/>
+      </w:rPr>
+    </w:lvl>
+    <w:lvl w:ilvl="1" w:tplc="20000003" w:tentative="1">
+      <w:start w:val="1"/>
+      <w:numFmt w:val="bullet"/>
+      <w:lvlText w:val="o"/>
+      <w:lvlJc w:val="left"/>
+      <w:pPr>
+        <w:ind w:left="1440" w:hanging="360"/>
+      </w:pPr>
+      <w:rPr>
+        <w:rFonts w:ascii="Courier New" w:hAnsi="Courier New" w:cs="Courier New" w:hint="default"/>
+      </w:rPr>
+    </w:lvl>
+    <w:lvl w:ilvl="2" w:tplc="20000005" w:tentative="1">
+      <w:start w:val="1"/>
+      <w:numFmt w:val="bullet"/>
+      <w:lvlText w:val=""/>
+      <w:lvlJc w:val="left"/>
+      <w:pPr>
+        <w:ind w:left="2160" w:hanging="360"/>
+      </w:pPr>
+      <w:rPr>
+        <w:rFonts w:ascii="Wingdings" w:hAnsi="Wingdings" w:hint="default"/>
+      </w:rPr>
+    </w:lvl>
+    <w:lvl w:ilvl="3" w:tplc="20000001" w:tentative="1">
+      <w:start w:val="1"/>
+      <w:numFmt w:val="bullet"/>
+      <w:lvlText w:val=""/>
+      <w:lvlJc w:val="left"/>
+      <w:pPr>
+        <w:ind w:left="2880" w:hanging="360"/>
+      </w:pPr>
+      <w:rPr>
+        <w:rFonts w:ascii="Symbol" w:hAnsi="Symbol" w:hint="default"/>
+      </w:rPr>
+    </w:lvl>
+    <w:lvl w:ilvl="4" w:tplc="20000003" w:tentative="1">
+      <w:start w:val="1"/>
+      <w:numFmt w:val="bullet"/>
+      <w:lvlText w:val="o"/>
+      <w:lvlJc w:val="left"/>
+      <w:pPr>
+        <w:ind w:left="3600" w:hanging="360"/>
+      </w:pPr>
+      <w:rPr>
+        <w:rFonts w:ascii="Courier New" w:hAnsi="Courier New" w:cs="Courier New" w:hint="default"/>
+      </w:rPr>
+    </w:lvl>
+    <w:lvl w:ilvl="5" w:tplc="20000005" w:tentative="1">
+      <w:start w:val="1"/>
+      <w:numFmt w:val="bullet"/>
+      <w:lvlText w:val=""/>
+      <w:lvlJc w:val="left"/>
+      <w:pPr>
+        <w:ind w:left="4320" w:hanging="360"/>
+      </w:pPr>
+      <w:rPr>
+        <w:rFonts w:ascii="Wingdings" w:hAnsi="Wingdings" w:hint="default"/>
+      </w:rPr>
+    </w:lvl>
+    <w:lvl w:ilvl="6" w:tplc="20000001" w:tentative="1">
+      <w:start w:val="1"/>
+      <w:numFmt w:val="bullet"/>
+      <w:lvlText w:val=""/>
+      <w:lvlJc w:val="left"/>
+      <w:pPr>
+        <w:ind w:left="5040" w:hanging="360"/>
+      </w:pPr>
+      <w:rPr>
+        <w:rFonts w:ascii="Symbol" w:hAnsi="Symbol" w:hint="default"/>
+      </w:rPr>
+    </w:lvl>
+    <w:lvl w:ilvl="7" w:tplc="20000003" w:tentative="1">
+      <w:start w:val="1"/>
+      <w:numFmt w:val="bullet"/>
+      <w:lvlText w:val="o"/>
+      <w:lvlJc w:val="left"/>
+      <w:pPr>
+        <w:ind w:left="5760" w:hanging="360"/>
+      </w:pPr>
+      <w:rPr>
+        <w:rFonts w:ascii="Courier New" w:hAnsi="Courier New" w:cs="Courier New" w:hint="default"/>
+      </w:rPr>
+    </w:lvl>
+    <w:lvl w:ilvl="8" w:tplc="20000005" w:tentative="1">
+      <w:start w:val="1"/>
+      <w:numFmt w:val="bullet"/>
+      <w:lvlText w:val=""/>
+      <w:lvlJc w:val="left"/>
+      <w:pPr>
+        <w:ind w:left="6480" w:hanging="360"/>
+      </w:pPr>
+      <w:rPr>
+        <w:rFonts w:ascii="Wingdings" w:hAnsi="Wingdings" w:hint="default"/>
+      </w:rPr>
+    </w:lvl>
+  </w:abstractNum>
+  <w:abstractNum w:abstractNumId="10" w15:restartNumberingAfterBreak="0">
     <w:nsid w:val="1D3240EF"/>
     <w:multiLevelType w:val="hybridMultilevel"/>
     <w:tmpl w:val="C45EC7D6"/>
@@ -6828,7 +8094,7 @@
       </w:rPr>
     </w:lvl>
   </w:abstractNum>
-  <w:abstractNum w:abstractNumId="10" w15:restartNumberingAfterBreak="0">
+  <w:abstractNum w:abstractNumId="11" w15:restartNumberingAfterBreak="0">
     <w:nsid w:val="230F33CC"/>
     <w:multiLevelType w:val="hybridMultilevel"/>
     <w:tmpl w:val="B338FCA8"/>
@@ -6968,7 +8234,7 @@
       </w:rPr>
     </w:lvl>
   </w:abstractNum>
-  <w:abstractNum w:abstractNumId="11" w15:restartNumberingAfterBreak="0">
+  <w:abstractNum w:abstractNumId="12" w15:restartNumberingAfterBreak="0">
     <w:nsid w:val="24132489"/>
     <w:multiLevelType w:val="hybridMultilevel"/>
     <w:tmpl w:val="074AEF96"/>
@@ -7081,7 +8347,7 @@
       </w:rPr>
     </w:lvl>
   </w:abstractNum>
-  <w:abstractNum w:abstractNumId="12" w15:restartNumberingAfterBreak="0">
+  <w:abstractNum w:abstractNumId="13" w15:restartNumberingAfterBreak="0">
     <w:nsid w:val="2A2506EB"/>
     <w:multiLevelType w:val="hybridMultilevel"/>
     <w:tmpl w:val="31C47450"/>
@@ -7198,7 +8464,7 @@
       </w:rPr>
     </w:lvl>
   </w:abstractNum>
-  <w:abstractNum w:abstractNumId="13" w15:restartNumberingAfterBreak="0">
+  <w:abstractNum w:abstractNumId="14" w15:restartNumberingAfterBreak="0">
     <w:nsid w:val="33BE4792"/>
     <w:multiLevelType w:val="hybridMultilevel"/>
     <w:tmpl w:val="0368EF64"/>
@@ -7338,7 +8604,7 @@
       </w:rPr>
     </w:lvl>
   </w:abstractNum>
-  <w:abstractNum w:abstractNumId="14" w15:restartNumberingAfterBreak="0">
+  <w:abstractNum w:abstractNumId="15" w15:restartNumberingAfterBreak="0">
     <w:nsid w:val="367C600F"/>
     <w:multiLevelType w:val="multilevel"/>
     <w:tmpl w:val="66F66ADC"/>
@@ -7489,7 +8755,7 @@
       </w:rPr>
     </w:lvl>
   </w:abstractNum>
-  <w:abstractNum w:abstractNumId="15" w15:restartNumberingAfterBreak="0">
+  <w:abstractNum w:abstractNumId="16" w15:restartNumberingAfterBreak="0">
     <w:nsid w:val="3D081AB8"/>
     <w:multiLevelType w:val="hybridMultilevel"/>
     <w:tmpl w:val="12163E56"/>
@@ -7602,7 +8868,232 @@
       </w:rPr>
     </w:lvl>
   </w:abstractNum>
-  <w:abstractNum w:abstractNumId="16" w15:restartNumberingAfterBreak="0">
+  <w:abstractNum w:abstractNumId="17" w15:restartNumberingAfterBreak="0">
+    <w:nsid w:val="3E754FB9"/>
+    <w:multiLevelType w:val="hybridMultilevel"/>
+    <w:tmpl w:val="5B2E8608"/>
+    <w:lvl w:ilvl="0" w:tplc="22B03BCC">
+      <w:numFmt w:val="bullet"/>
+      <w:lvlText w:val="-"/>
+      <w:lvlJc w:val="left"/>
+      <w:pPr>
+        <w:ind w:left="720" w:hanging="360"/>
+      </w:pPr>
+      <w:rPr>
+        <w:rFonts w:ascii="Calibri" w:eastAsia="Times New Roman" w:hAnsi="Calibri" w:cs="Calibri" w:hint="default"/>
+      </w:rPr>
+    </w:lvl>
+    <w:lvl w:ilvl="1" w:tplc="20000003" w:tentative="1">
+      <w:start w:val="1"/>
+      <w:numFmt w:val="bullet"/>
+      <w:lvlText w:val="o"/>
+      <w:lvlJc w:val="left"/>
+      <w:pPr>
+        <w:ind w:left="1440" w:hanging="360"/>
+      </w:pPr>
+      <w:rPr>
+        <w:rFonts w:ascii="Courier New" w:hAnsi="Courier New" w:cs="Courier New" w:hint="default"/>
+      </w:rPr>
+    </w:lvl>
+    <w:lvl w:ilvl="2" w:tplc="20000005" w:tentative="1">
+      <w:start w:val="1"/>
+      <w:numFmt w:val="bullet"/>
+      <w:lvlText w:val=""/>
+      <w:lvlJc w:val="left"/>
+      <w:pPr>
+        <w:ind w:left="2160" w:hanging="360"/>
+      </w:pPr>
+      <w:rPr>
+        <w:rFonts w:ascii="Wingdings" w:hAnsi="Wingdings" w:hint="default"/>
+      </w:rPr>
+    </w:lvl>
+    <w:lvl w:ilvl="3" w:tplc="20000001" w:tentative="1">
+      <w:start w:val="1"/>
+      <w:numFmt w:val="bullet"/>
+      <w:lvlText w:val=""/>
+      <w:lvlJc w:val="left"/>
+      <w:pPr>
+        <w:ind w:left="2880" w:hanging="360"/>
+      </w:pPr>
+      <w:rPr>
+        <w:rFonts w:ascii="Symbol" w:hAnsi="Symbol" w:hint="default"/>
+      </w:rPr>
+    </w:lvl>
+    <w:lvl w:ilvl="4" w:tplc="20000003" w:tentative="1">
+      <w:start w:val="1"/>
+      <w:numFmt w:val="bullet"/>
+      <w:lvlText w:val="o"/>
+      <w:lvlJc w:val="left"/>
+      <w:pPr>
+        <w:ind w:left="3600" w:hanging="360"/>
+      </w:pPr>
+      <w:rPr>
+        <w:rFonts w:ascii="Courier New" w:hAnsi="Courier New" w:cs="Courier New" w:hint="default"/>
+      </w:rPr>
+    </w:lvl>
+    <w:lvl w:ilvl="5" w:tplc="20000005" w:tentative="1">
+      <w:start w:val="1"/>
+      <w:numFmt w:val="bullet"/>
+      <w:lvlText w:val=""/>
+      <w:lvlJc w:val="left"/>
+      <w:pPr>
+        <w:ind w:left="4320" w:hanging="360"/>
+      </w:pPr>
+      <w:rPr>
+        <w:rFonts w:ascii="Wingdings" w:hAnsi="Wingdings" w:hint="default"/>
+      </w:rPr>
+    </w:lvl>
+    <w:lvl w:ilvl="6" w:tplc="20000001" w:tentative="1">
+      <w:start w:val="1"/>
+      <w:numFmt w:val="bullet"/>
+      <w:lvlText w:val=""/>
+      <w:lvlJc w:val="left"/>
+      <w:pPr>
+        <w:ind w:left="5040" w:hanging="360"/>
+      </w:pPr>
+      <w:rPr>
+        <w:rFonts w:ascii="Symbol" w:hAnsi="Symbol" w:hint="default"/>
+      </w:rPr>
+    </w:lvl>
+    <w:lvl w:ilvl="7" w:tplc="20000003" w:tentative="1">
+      <w:start w:val="1"/>
+      <w:numFmt w:val="bullet"/>
+      <w:lvlText w:val="o"/>
+      <w:lvlJc w:val="left"/>
+      <w:pPr>
+        <w:ind w:left="5760" w:hanging="360"/>
+      </w:pPr>
+      <w:rPr>
+        <w:rFonts w:ascii="Courier New" w:hAnsi="Courier New" w:cs="Courier New" w:hint="default"/>
+      </w:rPr>
+    </w:lvl>
+    <w:lvl w:ilvl="8" w:tplc="20000005" w:tentative="1">
+      <w:start w:val="1"/>
+      <w:numFmt w:val="bullet"/>
+      <w:lvlText w:val=""/>
+      <w:lvlJc w:val="left"/>
+      <w:pPr>
+        <w:ind w:left="6480" w:hanging="360"/>
+      </w:pPr>
+      <w:rPr>
+        <w:rFonts w:ascii="Wingdings" w:hAnsi="Wingdings" w:hint="default"/>
+      </w:rPr>
+    </w:lvl>
+  </w:abstractNum>
+  <w:abstractNum w:abstractNumId="18" w15:restartNumberingAfterBreak="0">
+    <w:nsid w:val="3E7F57E5"/>
+    <w:multiLevelType w:val="hybridMultilevel"/>
+    <w:tmpl w:val="515A5522"/>
+    <w:lvl w:ilvl="0" w:tplc="20000001">
+      <w:start w:val="1"/>
+      <w:numFmt w:val="bullet"/>
+      <w:lvlText w:val=""/>
+      <w:lvlJc w:val="left"/>
+      <w:pPr>
+        <w:ind w:left="720" w:hanging="360"/>
+      </w:pPr>
+      <w:rPr>
+        <w:rFonts w:ascii="Symbol" w:hAnsi="Symbol" w:hint="default"/>
+      </w:rPr>
+    </w:lvl>
+    <w:lvl w:ilvl="1" w:tplc="20000003" w:tentative="1">
+      <w:start w:val="1"/>
+      <w:numFmt w:val="bullet"/>
+      <w:lvlText w:val="o"/>
+      <w:lvlJc w:val="left"/>
+      <w:pPr>
+        <w:ind w:left="1440" w:hanging="360"/>
+      </w:pPr>
+      <w:rPr>
+        <w:rFonts w:ascii="Courier New" w:hAnsi="Courier New" w:cs="Courier New" w:hint="default"/>
+      </w:rPr>
+    </w:lvl>
+    <w:lvl w:ilvl="2" w:tplc="20000005" w:tentative="1">
+      <w:start w:val="1"/>
+      <w:numFmt w:val="bullet"/>
+      <w:lvlText w:val=""/>
+      <w:lvlJc w:val="left"/>
+      <w:pPr>
+        <w:ind w:left="2160" w:hanging="360"/>
+      </w:pPr>
+      <w:rPr>
+        <w:rFonts w:ascii="Wingdings" w:hAnsi="Wingdings" w:hint="default"/>
+      </w:rPr>
+    </w:lvl>
+    <w:lvl w:ilvl="3" w:tplc="20000001" w:tentative="1">
+      <w:start w:val="1"/>
+      <w:numFmt w:val="bullet"/>
+      <w:lvlText w:val=""/>
+      <w:lvlJc w:val="left"/>
+      <w:pPr>
+        <w:ind w:left="2880" w:hanging="360"/>
+      </w:pPr>
+      <w:rPr>
+        <w:rFonts w:ascii="Symbol" w:hAnsi="Symbol" w:hint="default"/>
+      </w:rPr>
+    </w:lvl>
+    <w:lvl w:ilvl="4" w:tplc="20000003" w:tentative="1">
+      <w:start w:val="1"/>
+      <w:numFmt w:val="bullet"/>
+      <w:lvlText w:val="o"/>
+      <w:lvlJc w:val="left"/>
+      <w:pPr>
+        <w:ind w:left="3600" w:hanging="360"/>
+      </w:pPr>
+      <w:rPr>
+        <w:rFonts w:ascii="Courier New" w:hAnsi="Courier New" w:cs="Courier New" w:hint="default"/>
+      </w:rPr>
+    </w:lvl>
+    <w:lvl w:ilvl="5" w:tplc="20000005" w:tentative="1">
+      <w:start w:val="1"/>
+      <w:numFmt w:val="bullet"/>
+      <w:lvlText w:val=""/>
+      <w:lvlJc w:val="left"/>
+      <w:pPr>
+        <w:ind w:left="4320" w:hanging="360"/>
+      </w:pPr>
+      <w:rPr>
+        <w:rFonts w:ascii="Wingdings" w:hAnsi="Wingdings" w:hint="default"/>
+      </w:rPr>
+    </w:lvl>
+    <w:lvl w:ilvl="6" w:tplc="20000001" w:tentative="1">
+      <w:start w:val="1"/>
+      <w:numFmt w:val="bullet"/>
+      <w:lvlText w:val=""/>
+      <w:lvlJc w:val="left"/>
+      <w:pPr>
+        <w:ind w:left="5040" w:hanging="360"/>
+      </w:pPr>
+      <w:rPr>
+        <w:rFonts w:ascii="Symbol" w:hAnsi="Symbol" w:hint="default"/>
+      </w:rPr>
+    </w:lvl>
+    <w:lvl w:ilvl="7" w:tplc="20000003" w:tentative="1">
+      <w:start w:val="1"/>
+      <w:numFmt w:val="bullet"/>
+      <w:lvlText w:val="o"/>
+      <w:lvlJc w:val="left"/>
+      <w:pPr>
+        <w:ind w:left="5760" w:hanging="360"/>
+      </w:pPr>
+      <w:rPr>
+        <w:rFonts w:ascii="Courier New" w:hAnsi="Courier New" w:cs="Courier New" w:hint="default"/>
+      </w:rPr>
+    </w:lvl>
+    <w:lvl w:ilvl="8" w:tplc="20000005" w:tentative="1">
+      <w:start w:val="1"/>
+      <w:numFmt w:val="bullet"/>
+      <w:lvlText w:val=""/>
+      <w:lvlJc w:val="left"/>
+      <w:pPr>
+        <w:ind w:left="6480" w:hanging="360"/>
+      </w:pPr>
+      <w:rPr>
+        <w:rFonts w:ascii="Wingdings" w:hAnsi="Wingdings" w:hint="default"/>
+      </w:rPr>
+    </w:lvl>
+  </w:abstractNum>
+  <w:abstractNum w:abstractNumId="19" w15:restartNumberingAfterBreak="0">
     <w:nsid w:val="40117AB4"/>
     <w:multiLevelType w:val="singleLevel"/>
     <w:tmpl w:val="0424000F"/>
@@ -7622,7 +9113,7 @@
       </w:rPr>
     </w:lvl>
   </w:abstractNum>
-  <w:abstractNum w:abstractNumId="17" w15:restartNumberingAfterBreak="0">
+  <w:abstractNum w:abstractNumId="20" w15:restartNumberingAfterBreak="0">
     <w:nsid w:val="45F04156"/>
     <w:multiLevelType w:val="hybridMultilevel"/>
     <w:tmpl w:val="8648D69E"/>
@@ -7735,7 +9226,7 @@
       </w:rPr>
     </w:lvl>
   </w:abstractNum>
-  <w:abstractNum w:abstractNumId="18" w15:restartNumberingAfterBreak="0">
+  <w:abstractNum w:abstractNumId="21" w15:restartNumberingAfterBreak="0">
     <w:nsid w:val="4D737F36"/>
     <w:multiLevelType w:val="hybridMultilevel"/>
     <w:tmpl w:val="2FCADFCC"/>
@@ -7848,7 +9339,7 @@
       </w:rPr>
     </w:lvl>
   </w:abstractNum>
-  <w:abstractNum w:abstractNumId="19" w15:restartNumberingAfterBreak="0">
+  <w:abstractNum w:abstractNumId="22" w15:restartNumberingAfterBreak="0">
     <w:nsid w:val="56210033"/>
     <w:multiLevelType w:val="hybridMultilevel"/>
     <w:tmpl w:val="B834133E"/>
@@ -7961,7 +9452,7 @@
       </w:rPr>
     </w:lvl>
   </w:abstractNum>
-  <w:abstractNum w:abstractNumId="20" w15:restartNumberingAfterBreak="0">
+  <w:abstractNum w:abstractNumId="23" w15:restartNumberingAfterBreak="0">
     <w:nsid w:val="566D6DDD"/>
     <w:multiLevelType w:val="hybridMultilevel"/>
     <w:tmpl w:val="E55A3D24"/>
@@ -8101,7 +9592,232 @@
       </w:rPr>
     </w:lvl>
   </w:abstractNum>
-  <w:abstractNum w:abstractNumId="21" w15:restartNumberingAfterBreak="0">
+  <w:abstractNum w:abstractNumId="24" w15:restartNumberingAfterBreak="0">
+    <w:nsid w:val="56C4537D"/>
+    <w:multiLevelType w:val="hybridMultilevel"/>
+    <w:tmpl w:val="66485F72"/>
+    <w:lvl w:ilvl="0" w:tplc="20000001">
+      <w:start w:val="1"/>
+      <w:numFmt w:val="bullet"/>
+      <w:lvlText w:val=""/>
+      <w:lvlJc w:val="left"/>
+      <w:pPr>
+        <w:ind w:left="720" w:hanging="360"/>
+      </w:pPr>
+      <w:rPr>
+        <w:rFonts w:ascii="Symbol" w:hAnsi="Symbol" w:hint="default"/>
+      </w:rPr>
+    </w:lvl>
+    <w:lvl w:ilvl="1" w:tplc="20000003" w:tentative="1">
+      <w:start w:val="1"/>
+      <w:numFmt w:val="bullet"/>
+      <w:lvlText w:val="o"/>
+      <w:lvlJc w:val="left"/>
+      <w:pPr>
+        <w:ind w:left="1440" w:hanging="360"/>
+      </w:pPr>
+      <w:rPr>
+        <w:rFonts w:ascii="Courier New" w:hAnsi="Courier New" w:cs="Courier New" w:hint="default"/>
+      </w:rPr>
+    </w:lvl>
+    <w:lvl w:ilvl="2" w:tplc="20000005" w:tentative="1">
+      <w:start w:val="1"/>
+      <w:numFmt w:val="bullet"/>
+      <w:lvlText w:val=""/>
+      <w:lvlJc w:val="left"/>
+      <w:pPr>
+        <w:ind w:left="2160" w:hanging="360"/>
+      </w:pPr>
+      <w:rPr>
+        <w:rFonts w:ascii="Wingdings" w:hAnsi="Wingdings" w:hint="default"/>
+      </w:rPr>
+    </w:lvl>
+    <w:lvl w:ilvl="3" w:tplc="20000001" w:tentative="1">
+      <w:start w:val="1"/>
+      <w:numFmt w:val="bullet"/>
+      <w:lvlText w:val=""/>
+      <w:lvlJc w:val="left"/>
+      <w:pPr>
+        <w:ind w:left="2880" w:hanging="360"/>
+      </w:pPr>
+      <w:rPr>
+        <w:rFonts w:ascii="Symbol" w:hAnsi="Symbol" w:hint="default"/>
+      </w:rPr>
+    </w:lvl>
+    <w:lvl w:ilvl="4" w:tplc="20000003" w:tentative="1">
+      <w:start w:val="1"/>
+      <w:numFmt w:val="bullet"/>
+      <w:lvlText w:val="o"/>
+      <w:lvlJc w:val="left"/>
+      <w:pPr>
+        <w:ind w:left="3600" w:hanging="360"/>
+      </w:pPr>
+      <w:rPr>
+        <w:rFonts w:ascii="Courier New" w:hAnsi="Courier New" w:cs="Courier New" w:hint="default"/>
+      </w:rPr>
+    </w:lvl>
+    <w:lvl w:ilvl="5" w:tplc="20000005" w:tentative="1">
+      <w:start w:val="1"/>
+      <w:numFmt w:val="bullet"/>
+      <w:lvlText w:val=""/>
+      <w:lvlJc w:val="left"/>
+      <w:pPr>
+        <w:ind w:left="4320" w:hanging="360"/>
+      </w:pPr>
+      <w:rPr>
+        <w:rFonts w:ascii="Wingdings" w:hAnsi="Wingdings" w:hint="default"/>
+      </w:rPr>
+    </w:lvl>
+    <w:lvl w:ilvl="6" w:tplc="20000001" w:tentative="1">
+      <w:start w:val="1"/>
+      <w:numFmt w:val="bullet"/>
+      <w:lvlText w:val=""/>
+      <w:lvlJc w:val="left"/>
+      <w:pPr>
+        <w:ind w:left="5040" w:hanging="360"/>
+      </w:pPr>
+      <w:rPr>
+        <w:rFonts w:ascii="Symbol" w:hAnsi="Symbol" w:hint="default"/>
+      </w:rPr>
+    </w:lvl>
+    <w:lvl w:ilvl="7" w:tplc="20000003" w:tentative="1">
+      <w:start w:val="1"/>
+      <w:numFmt w:val="bullet"/>
+      <w:lvlText w:val="o"/>
+      <w:lvlJc w:val="left"/>
+      <w:pPr>
+        <w:ind w:left="5760" w:hanging="360"/>
+      </w:pPr>
+      <w:rPr>
+        <w:rFonts w:ascii="Courier New" w:hAnsi="Courier New" w:cs="Courier New" w:hint="default"/>
+      </w:rPr>
+    </w:lvl>
+    <w:lvl w:ilvl="8" w:tplc="20000005" w:tentative="1">
+      <w:start w:val="1"/>
+      <w:numFmt w:val="bullet"/>
+      <w:lvlText w:val=""/>
+      <w:lvlJc w:val="left"/>
+      <w:pPr>
+        <w:ind w:left="6480" w:hanging="360"/>
+      </w:pPr>
+      <w:rPr>
+        <w:rFonts w:ascii="Wingdings" w:hAnsi="Wingdings" w:hint="default"/>
+      </w:rPr>
+    </w:lvl>
+  </w:abstractNum>
+  <w:abstractNum w:abstractNumId="25" w15:restartNumberingAfterBreak="0">
+    <w:nsid w:val="574533E9"/>
+    <w:multiLevelType w:val="hybridMultilevel"/>
+    <w:tmpl w:val="5B146962"/>
+    <w:lvl w:ilvl="0" w:tplc="E9DE7EA0">
+      <w:numFmt w:val="bullet"/>
+      <w:lvlText w:val="-"/>
+      <w:lvlJc w:val="left"/>
+      <w:pPr>
+        <w:ind w:left="720" w:hanging="360"/>
+      </w:pPr>
+      <w:rPr>
+        <w:rFonts w:ascii="Calibri" w:eastAsia="Times New Roman" w:hAnsi="Calibri" w:cs="Calibri" w:hint="default"/>
+      </w:rPr>
+    </w:lvl>
+    <w:lvl w:ilvl="1" w:tplc="20000003" w:tentative="1">
+      <w:start w:val="1"/>
+      <w:numFmt w:val="bullet"/>
+      <w:lvlText w:val="o"/>
+      <w:lvlJc w:val="left"/>
+      <w:pPr>
+        <w:ind w:left="1440" w:hanging="360"/>
+      </w:pPr>
+      <w:rPr>
+        <w:rFonts w:ascii="Courier New" w:hAnsi="Courier New" w:cs="Courier New" w:hint="default"/>
+      </w:rPr>
+    </w:lvl>
+    <w:lvl w:ilvl="2" w:tplc="20000005" w:tentative="1">
+      <w:start w:val="1"/>
+      <w:numFmt w:val="bullet"/>
+      <w:lvlText w:val=""/>
+      <w:lvlJc w:val="left"/>
+      <w:pPr>
+        <w:ind w:left="2160" w:hanging="360"/>
+      </w:pPr>
+      <w:rPr>
+        <w:rFonts w:ascii="Wingdings" w:hAnsi="Wingdings" w:hint="default"/>
+      </w:rPr>
+    </w:lvl>
+    <w:lvl w:ilvl="3" w:tplc="20000001" w:tentative="1">
+      <w:start w:val="1"/>
+      <w:numFmt w:val="bullet"/>
+      <w:lvlText w:val=""/>
+      <w:lvlJc w:val="left"/>
+      <w:pPr>
+        <w:ind w:left="2880" w:hanging="360"/>
+      </w:pPr>
+      <w:rPr>
+        <w:rFonts w:ascii="Symbol" w:hAnsi="Symbol" w:hint="default"/>
+      </w:rPr>
+    </w:lvl>
+    <w:lvl w:ilvl="4" w:tplc="20000003" w:tentative="1">
+      <w:start w:val="1"/>
+      <w:numFmt w:val="bullet"/>
+      <w:lvlText w:val="o"/>
+      <w:lvlJc w:val="left"/>
+      <w:pPr>
+        <w:ind w:left="3600" w:hanging="360"/>
+      </w:pPr>
+      <w:rPr>
+        <w:rFonts w:ascii="Courier New" w:hAnsi="Courier New" w:cs="Courier New" w:hint="default"/>
+      </w:rPr>
+    </w:lvl>
+    <w:lvl w:ilvl="5" w:tplc="20000005" w:tentative="1">
+      <w:start w:val="1"/>
+      <w:numFmt w:val="bullet"/>
+      <w:lvlText w:val=""/>
+      <w:lvlJc w:val="left"/>
+      <w:pPr>
+        <w:ind w:left="4320" w:hanging="360"/>
+      </w:pPr>
+      <w:rPr>
+        <w:rFonts w:ascii="Wingdings" w:hAnsi="Wingdings" w:hint="default"/>
+      </w:rPr>
+    </w:lvl>
+    <w:lvl w:ilvl="6" w:tplc="20000001" w:tentative="1">
+      <w:start w:val="1"/>
+      <w:numFmt w:val="bullet"/>
+      <w:lvlText w:val=""/>
+      <w:lvlJc w:val="left"/>
+      <w:pPr>
+        <w:ind w:left="5040" w:hanging="360"/>
+      </w:pPr>
+      <w:rPr>
+        <w:rFonts w:ascii="Symbol" w:hAnsi="Symbol" w:hint="default"/>
+      </w:rPr>
+    </w:lvl>
+    <w:lvl w:ilvl="7" w:tplc="20000003" w:tentative="1">
+      <w:start w:val="1"/>
+      <w:numFmt w:val="bullet"/>
+      <w:lvlText w:val="o"/>
+      <w:lvlJc w:val="left"/>
+      <w:pPr>
+        <w:ind w:left="5760" w:hanging="360"/>
+      </w:pPr>
+      <w:rPr>
+        <w:rFonts w:ascii="Courier New" w:hAnsi="Courier New" w:cs="Courier New" w:hint="default"/>
+      </w:rPr>
+    </w:lvl>
+    <w:lvl w:ilvl="8" w:tplc="20000005" w:tentative="1">
+      <w:start w:val="1"/>
+      <w:numFmt w:val="bullet"/>
+      <w:lvlText w:val=""/>
+      <w:lvlJc w:val="left"/>
+      <w:pPr>
+        <w:ind w:left="6480" w:hanging="360"/>
+      </w:pPr>
+      <w:rPr>
+        <w:rFonts w:ascii="Wingdings" w:hAnsi="Wingdings" w:hint="default"/>
+      </w:rPr>
+    </w:lvl>
+  </w:abstractNum>
+  <w:abstractNum w:abstractNumId="26" w15:restartNumberingAfterBreak="0">
     <w:nsid w:val="58DE7EFA"/>
     <w:multiLevelType w:val="hybridMultilevel"/>
     <w:tmpl w:val="131EA528"/>
@@ -8196,7 +9912,7 @@
       </w:pPr>
     </w:lvl>
   </w:abstractNum>
-  <w:abstractNum w:abstractNumId="22" w15:restartNumberingAfterBreak="0">
+  <w:abstractNum w:abstractNumId="27" w15:restartNumberingAfterBreak="0">
     <w:nsid w:val="5AC4619C"/>
     <w:multiLevelType w:val="hybridMultilevel"/>
     <w:tmpl w:val="DFB60A26"/>
@@ -8308,7 +10024,7 @@
       </w:rPr>
     </w:lvl>
   </w:abstractNum>
-  <w:abstractNum w:abstractNumId="23" w15:restartNumberingAfterBreak="0">
+  <w:abstractNum w:abstractNumId="28" w15:restartNumberingAfterBreak="0">
     <w:nsid w:val="5D4B3E35"/>
     <w:multiLevelType w:val="hybridMultilevel"/>
     <w:tmpl w:val="63006618"/>
@@ -8421,7 +10137,7 @@
       </w:rPr>
     </w:lvl>
   </w:abstractNum>
-  <w:abstractNum w:abstractNumId="24" w15:restartNumberingAfterBreak="0">
+  <w:abstractNum w:abstractNumId="29" w15:restartNumberingAfterBreak="0">
     <w:nsid w:val="5E1C298F"/>
     <w:multiLevelType w:val="hybridMultilevel"/>
     <w:tmpl w:val="7642668E"/>
@@ -8534,7 +10250,7 @@
       </w:rPr>
     </w:lvl>
   </w:abstractNum>
-  <w:abstractNum w:abstractNumId="25" w15:restartNumberingAfterBreak="0">
+  <w:abstractNum w:abstractNumId="30" w15:restartNumberingAfterBreak="0">
     <w:nsid w:val="613216BC"/>
     <w:multiLevelType w:val="hybridMultilevel"/>
     <w:tmpl w:val="DCD43D76"/>
@@ -8647,7 +10363,7 @@
       </w:rPr>
     </w:lvl>
   </w:abstractNum>
-  <w:abstractNum w:abstractNumId="26" w15:restartNumberingAfterBreak="0">
+  <w:abstractNum w:abstractNumId="31" w15:restartNumberingAfterBreak="0">
     <w:nsid w:val="62CA2A8F"/>
     <w:multiLevelType w:val="hybridMultilevel"/>
     <w:tmpl w:val="9E62B7C8"/>
@@ -8760,7 +10476,7 @@
       </w:rPr>
     </w:lvl>
   </w:abstractNum>
-  <w:abstractNum w:abstractNumId="27" w15:restartNumberingAfterBreak="0">
+  <w:abstractNum w:abstractNumId="32" w15:restartNumberingAfterBreak="0">
     <w:nsid w:val="642B0707"/>
     <w:multiLevelType w:val="hybridMultilevel"/>
     <w:tmpl w:val="6F824434"/>
@@ -8873,7 +10589,7 @@
       </w:rPr>
     </w:lvl>
   </w:abstractNum>
-  <w:abstractNum w:abstractNumId="28" w15:restartNumberingAfterBreak="0">
+  <w:abstractNum w:abstractNumId="33" w15:restartNumberingAfterBreak="0">
     <w:nsid w:val="657C167B"/>
     <w:multiLevelType w:val="hybridMultilevel"/>
     <w:tmpl w:val="253E1E4A"/>
@@ -8986,7 +10702,7 @@
       </w:rPr>
     </w:lvl>
   </w:abstractNum>
-  <w:abstractNum w:abstractNumId="29" w15:restartNumberingAfterBreak="0">
+  <w:abstractNum w:abstractNumId="34" w15:restartNumberingAfterBreak="0">
     <w:nsid w:val="6F112B8F"/>
     <w:multiLevelType w:val="hybridMultilevel"/>
     <w:tmpl w:val="DD189394"/>
@@ -9099,7 +10815,7 @@
       </w:rPr>
     </w:lvl>
   </w:abstractNum>
-  <w:abstractNum w:abstractNumId="30" w15:restartNumberingAfterBreak="0">
+  <w:abstractNum w:abstractNumId="35" w15:restartNumberingAfterBreak="0">
     <w:nsid w:val="70624018"/>
     <w:multiLevelType w:val="hybridMultilevel"/>
     <w:tmpl w:val="225C64B6"/>
@@ -9239,7 +10955,7 @@
       </w:rPr>
     </w:lvl>
   </w:abstractNum>
-  <w:abstractNum w:abstractNumId="31" w15:restartNumberingAfterBreak="0">
+  <w:abstractNum w:abstractNumId="36" w15:restartNumberingAfterBreak="0">
     <w:nsid w:val="74967D99"/>
     <w:multiLevelType w:val="multilevel"/>
     <w:tmpl w:val="6F1612AC"/>
@@ -9379,7 +11095,7 @@
       </w:rPr>
     </w:lvl>
   </w:abstractNum>
-  <w:abstractNum w:abstractNumId="32" w15:restartNumberingAfterBreak="0">
+  <w:abstractNum w:abstractNumId="37" w15:restartNumberingAfterBreak="0">
     <w:nsid w:val="780E0E44"/>
     <w:multiLevelType w:val="hybridMultilevel"/>
     <w:tmpl w:val="10468E06"/>
@@ -9493,16 +11209,16 @@
     </w:lvl>
   </w:abstractNum>
   <w:num w:numId="1" w16cid:durableId="1616982145">
+    <w:abstractNumId w:val="15"/>
+  </w:num>
+  <w:num w:numId="2" w16cid:durableId="1563980195">
+    <w:abstractNumId w:val="11"/>
+  </w:num>
+  <w:num w:numId="3" w16cid:durableId="574165386">
     <w:abstractNumId w:val="14"/>
   </w:num>
-  <w:num w:numId="2" w16cid:durableId="1563980195">
-    <w:abstractNumId w:val="10"/>
-  </w:num>
-  <w:num w:numId="3" w16cid:durableId="574165386">
-    <w:abstractNumId w:val="13"/>
-  </w:num>
   <w:num w:numId="4" w16cid:durableId="1982886481">
-    <w:abstractNumId w:val="20"/>
+    <w:abstractNumId w:val="23"/>
     <w:lvlOverride w:ilvl="0"/>
     <w:lvlOverride w:ilvl="1">
       <w:startOverride w:val="1"/>
@@ -9533,40 +11249,40 @@
     <w:abstractNumId w:val="7"/>
   </w:num>
   <w:num w:numId="6" w16cid:durableId="413548033">
-    <w:abstractNumId w:val="30"/>
+    <w:abstractNumId w:val="35"/>
   </w:num>
   <w:num w:numId="7" w16cid:durableId="2517385">
-    <w:abstractNumId w:val="29"/>
+    <w:abstractNumId w:val="34"/>
   </w:num>
   <w:num w:numId="8" w16cid:durableId="1673027270">
-    <w:abstractNumId w:val="11"/>
+    <w:abstractNumId w:val="12"/>
   </w:num>
   <w:num w:numId="9" w16cid:durableId="310713017">
     <w:abstractNumId w:val="5"/>
   </w:num>
   <w:num w:numId="10" w16cid:durableId="642394832">
-    <w:abstractNumId w:val="19"/>
+    <w:abstractNumId w:val="22"/>
   </w:num>
   <w:num w:numId="11" w16cid:durableId="879364368">
-    <w:abstractNumId w:val="9"/>
+    <w:abstractNumId w:val="10"/>
   </w:num>
   <w:num w:numId="12" w16cid:durableId="1154762435">
-    <w:abstractNumId w:val="24"/>
+    <w:abstractNumId w:val="29"/>
   </w:num>
   <w:num w:numId="13" w16cid:durableId="1050419267">
-    <w:abstractNumId w:val="26"/>
+    <w:abstractNumId w:val="31"/>
   </w:num>
   <w:num w:numId="14" w16cid:durableId="1990405806">
     <w:abstractNumId w:val="8"/>
   </w:num>
   <w:num w:numId="15" w16cid:durableId="1546913352">
-    <w:abstractNumId w:val="27"/>
+    <w:abstractNumId w:val="32"/>
   </w:num>
   <w:num w:numId="16" w16cid:durableId="1318874548">
-    <w:abstractNumId w:val="31"/>
+    <w:abstractNumId w:val="36"/>
   </w:num>
   <w:num w:numId="17" w16cid:durableId="722215861">
-    <w:abstractNumId w:val="31"/>
+    <w:abstractNumId w:val="36"/>
     <w:lvlOverride w:ilvl="0">
       <w:startOverride w:val="1"/>
     </w:lvlOverride>
@@ -9596,7 +11312,7 @@
     </w:lvlOverride>
   </w:num>
   <w:num w:numId="18" w16cid:durableId="415446333">
-    <w:abstractNumId w:val="31"/>
+    <w:abstractNumId w:val="36"/>
     <w:lvlOverride w:ilvl="0">
       <w:startOverride w:val="1"/>
     </w:lvlOverride>
@@ -9626,7 +11342,7 @@
     </w:lvlOverride>
   </w:num>
   <w:num w:numId="19" w16cid:durableId="1966346266">
-    <w:abstractNumId w:val="31"/>
+    <w:abstractNumId w:val="36"/>
     <w:lvlOverride w:ilvl="0">
       <w:startOverride w:val="1"/>
     </w:lvlOverride>
@@ -9656,7 +11372,7 @@
     </w:lvlOverride>
   </w:num>
   <w:num w:numId="20" w16cid:durableId="985356155">
-    <w:abstractNumId w:val="31"/>
+    <w:abstractNumId w:val="36"/>
     <w:lvlOverride w:ilvl="0">
       <w:startOverride w:val="1"/>
     </w:lvlOverride>
@@ -9686,7 +11402,7 @@
     </w:lvlOverride>
   </w:num>
   <w:num w:numId="21" w16cid:durableId="971326932">
-    <w:abstractNumId w:val="31"/>
+    <w:abstractNumId w:val="36"/>
     <w:lvlOverride w:ilvl="0">
       <w:startOverride w:val="1"/>
     </w:lvlOverride>
@@ -9716,7 +11432,7 @@
     </w:lvlOverride>
   </w:num>
   <w:num w:numId="22" w16cid:durableId="874578897">
-    <w:abstractNumId w:val="31"/>
+    <w:abstractNumId w:val="36"/>
     <w:lvlOverride w:ilvl="0">
       <w:startOverride w:val="1"/>
     </w:lvlOverride>
@@ -9746,7 +11462,7 @@
     </w:lvlOverride>
   </w:num>
   <w:num w:numId="23" w16cid:durableId="184097708">
-    <w:abstractNumId w:val="31"/>
+    <w:abstractNumId w:val="36"/>
     <w:lvlOverride w:ilvl="0">
       <w:startOverride w:val="1"/>
     </w:lvlOverride>
@@ -9776,7 +11492,7 @@
     </w:lvlOverride>
   </w:num>
   <w:num w:numId="24" w16cid:durableId="1147547601">
-    <w:abstractNumId w:val="31"/>
+    <w:abstractNumId w:val="36"/>
     <w:lvlOverride w:ilvl="0">
       <w:startOverride w:val="1"/>
     </w:lvlOverride>
@@ -9806,7 +11522,7 @@
     </w:lvlOverride>
   </w:num>
   <w:num w:numId="25" w16cid:durableId="697269251">
-    <w:abstractNumId w:val="31"/>
+    <w:abstractNumId w:val="36"/>
     <w:lvlOverride w:ilvl="0">
       <w:startOverride w:val="1"/>
     </w:lvlOverride>
@@ -9836,7 +11552,7 @@
     </w:lvlOverride>
   </w:num>
   <w:num w:numId="26" w16cid:durableId="623387041">
-    <w:abstractNumId w:val="31"/>
+    <w:abstractNumId w:val="36"/>
     <w:lvlOverride w:ilvl="0">
       <w:startOverride w:val="1"/>
     </w:lvlOverride>
@@ -9866,7 +11582,7 @@
     </w:lvlOverride>
   </w:num>
   <w:num w:numId="27" w16cid:durableId="571545525">
-    <w:abstractNumId w:val="31"/>
+    <w:abstractNumId w:val="36"/>
     <w:lvlOverride w:ilvl="0">
       <w:startOverride w:val="1"/>
     </w:lvlOverride>
@@ -9899,19 +11615,19 @@
     <w:abstractNumId w:val="2"/>
   </w:num>
   <w:num w:numId="29" w16cid:durableId="1318532482">
-    <w:abstractNumId w:val="25"/>
+    <w:abstractNumId w:val="30"/>
   </w:num>
   <w:num w:numId="30" w16cid:durableId="2085495198">
     <w:abstractNumId w:val="3"/>
   </w:num>
   <w:num w:numId="31" w16cid:durableId="1159468039">
+    <w:abstractNumId w:val="22"/>
+  </w:num>
+  <w:num w:numId="32" w16cid:durableId="2134787325">
     <w:abstractNumId w:val="19"/>
   </w:num>
-  <w:num w:numId="32" w16cid:durableId="2134787325">
-    <w:abstractNumId w:val="16"/>
-  </w:num>
   <w:num w:numId="33" w16cid:durableId="690107431">
-    <w:abstractNumId w:val="20"/>
+    <w:abstractNumId w:val="23"/>
     <w:lvlOverride w:ilvl="0"/>
     <w:lvlOverride w:ilvl="1">
       <w:startOverride w:val="1"/>
@@ -9939,49 +11655,64 @@
     </w:lvlOverride>
   </w:num>
   <w:num w:numId="34" w16cid:durableId="1695031192">
-    <w:abstractNumId w:val="20"/>
+    <w:abstractNumId w:val="23"/>
   </w:num>
   <w:num w:numId="35" w16cid:durableId="1474131380">
-    <w:abstractNumId w:val="20"/>
+    <w:abstractNumId w:val="23"/>
   </w:num>
   <w:num w:numId="36" w16cid:durableId="385646365">
-    <w:abstractNumId w:val="12"/>
+    <w:abstractNumId w:val="13"/>
   </w:num>
   <w:num w:numId="37" w16cid:durableId="774322130">
     <w:abstractNumId w:val="6"/>
   </w:num>
   <w:num w:numId="38" w16cid:durableId="1273244240">
-    <w:abstractNumId w:val="21"/>
+    <w:abstractNumId w:val="26"/>
   </w:num>
   <w:num w:numId="39" w16cid:durableId="1302419245">
-    <w:abstractNumId w:val="28"/>
+    <w:abstractNumId w:val="33"/>
   </w:num>
   <w:num w:numId="40" w16cid:durableId="671757144">
     <w:abstractNumId w:val="4"/>
   </w:num>
   <w:num w:numId="41" w16cid:durableId="1609465245">
-    <w:abstractNumId w:val="17"/>
+    <w:abstractNumId w:val="20"/>
   </w:num>
   <w:num w:numId="42" w16cid:durableId="1924870052">
-    <w:abstractNumId w:val="23"/>
+    <w:abstractNumId w:val="28"/>
   </w:num>
   <w:num w:numId="43" w16cid:durableId="1546983496">
     <w:abstractNumId w:val="1"/>
   </w:num>
   <w:num w:numId="44" w16cid:durableId="1243755491">
-    <w:abstractNumId w:val="15"/>
+    <w:abstractNumId w:val="16"/>
   </w:num>
   <w:num w:numId="45" w16cid:durableId="2112815720">
-    <w:abstractNumId w:val="22"/>
+    <w:abstractNumId w:val="27"/>
   </w:num>
   <w:num w:numId="46" w16cid:durableId="495389479">
-    <w:abstractNumId w:val="32"/>
+    <w:abstractNumId w:val="37"/>
   </w:num>
   <w:num w:numId="47" w16cid:durableId="1000545877">
-    <w:abstractNumId w:val="18"/>
+    <w:abstractNumId w:val="21"/>
   </w:num>
   <w:num w:numId="48" w16cid:durableId="853347394">
     <w:abstractNumId w:val="0"/>
+  </w:num>
+  <w:num w:numId="49" w16cid:durableId="1105929742">
+    <w:abstractNumId w:val="9"/>
+  </w:num>
+  <w:num w:numId="50" w16cid:durableId="7145556">
+    <w:abstractNumId w:val="18"/>
+  </w:num>
+  <w:num w:numId="51" w16cid:durableId="271405964">
+    <w:abstractNumId w:val="24"/>
+  </w:num>
+  <w:num w:numId="52" w16cid:durableId="1874154734">
+    <w:abstractNumId w:val="25"/>
+  </w:num>
+  <w:num w:numId="53" w16cid:durableId="791943569">
+    <w:abstractNumId w:val="17"/>
   </w:num>
   <w:numIdMacAtCleanup w:val="15"/>
 </w:numbering>

</xml_diff>

<commit_message>
feat: implement YOLO intro
</commit_message>
<xml_diff>
--- a/docs/thesis/magistrsko-delo-jasa-zupancic.docx
+++ b/docs/thesis/magistrsko-delo-jasa-zupancic.docx
@@ -3307,51 +3307,25 @@
       <w:r>
         <w:t xml:space="preserve">Slika </w:t>
       </w:r>
-      <w:r>
-        <w:fldChar w:fldCharType="begin"/>
-      </w:r>
-      <w:r>
-        <w:instrText xml:space="preserve"> STYLEREF 1 \s </w:instrText>
-      </w:r>
-      <w:r>
-        <w:fldChar w:fldCharType="separate"/>
-      </w:r>
-      <w:r>
-        <w:rPr>
-          <w:noProof/>
-        </w:rPr>
-        <w:t>2</w:t>
-      </w:r>
-      <w:r>
-        <w:rPr>
-          <w:noProof/>
-        </w:rPr>
-        <w:fldChar w:fldCharType="end"/>
-      </w:r>
+      <w:fldSimple w:instr=" STYLEREF 1 \s ">
+        <w:r>
+          <w:rPr>
+            <w:noProof/>
+          </w:rPr>
+          <w:t>2</w:t>
+        </w:r>
+      </w:fldSimple>
       <w:r>
         <w:t>.</w:t>
       </w:r>
-      <w:r>
-        <w:fldChar w:fldCharType="begin"/>
-      </w:r>
-      <w:r>
-        <w:instrText xml:space="preserve"> SEQ Slika \* ARABIC \s 1 </w:instrText>
-      </w:r>
-      <w:r>
-        <w:fldChar w:fldCharType="separate"/>
-      </w:r>
-      <w:r>
-        <w:rPr>
-          <w:noProof/>
-        </w:rPr>
-        <w:t>1</w:t>
-      </w:r>
-      <w:r>
-        <w:rPr>
-          <w:noProof/>
-        </w:rPr>
-        <w:fldChar w:fldCharType="end"/>
-      </w:r>
+      <w:fldSimple w:instr=" SEQ Slika \* ARABIC \s 1 ">
+        <w:r>
+          <w:rPr>
+            <w:noProof/>
+          </w:rPr>
+          <w:t>1</w:t>
+        </w:r>
+      </w:fldSimple>
       <w:r>
         <w:t xml:space="preserve">: Shema sklepnih točk modela </w:t>
       </w:r>
@@ -3943,6 +3917,478 @@
         <w:t>o</w:t>
       </w:r>
     </w:p>
+    <w:p/>
+    <w:p>
+      <w:pPr>
+        <w:pStyle w:val="Heading3"/>
+      </w:pPr>
+      <w:r>
+        <w:lastRenderedPageBreak/>
+        <w:t>YOLO</w:t>
+      </w:r>
+      <w:r>
+        <w:t>11</w:t>
+      </w:r>
+      <w:r>
+        <w:t>-</w:t>
+      </w:r>
+      <w:r>
+        <w:t>pose</w:t>
+      </w:r>
+      <w:r>
+        <w:t xml:space="preserve"> (</w:t>
+      </w:r>
+      <w:proofErr w:type="spellStart"/>
+      <w:r>
+        <w:t>Ultralytics</w:t>
+      </w:r>
+      <w:proofErr w:type="spellEnd"/>
+      <w:r>
+        <w:t>)</w:t>
+      </w:r>
+    </w:p>
+    <w:p>
+      <w:r>
+        <w:t xml:space="preserve">YOLO11-pose je različica modelov družine </w:t>
+      </w:r>
+      <w:proofErr w:type="spellStart"/>
+      <w:r>
+        <w:t>Ultralytics</w:t>
+      </w:r>
+      <w:proofErr w:type="spellEnd"/>
+      <w:r>
+        <w:t xml:space="preserve"> YOLO11, namenjena zaznavanju drže. Modeli YOLO11 podpirajo več rešitev na področju računalniškega vida, med njimi tudi zaznavanje sklepnih točk, pri čemer so te različice označene s pripono </w:t>
+      </w:r>
+      <w:r>
+        <w:t>“</w:t>
+      </w:r>
+      <w:r>
+        <w:t>-pose</w:t>
+      </w:r>
+      <w:r>
+        <w:t>“</w:t>
+      </w:r>
+      <w:r>
+        <w:t>.</w:t>
+      </w:r>
+      <w:r>
+        <w:t xml:space="preserve"> Modeli delujejo za več oseb (</w:t>
+      </w:r>
+      <w:proofErr w:type="spellStart"/>
+      <w:r>
+        <w:t>multipose</w:t>
+      </w:r>
+      <w:proofErr w:type="spellEnd"/>
+      <w:r>
+        <w:t>), kar pomeni, da lahko v enem vhodnem kadru hkrati zaznajo več oseb in za njih opravijo zaznavo sklepnih točk.</w:t>
+      </w:r>
+    </w:p>
+    <w:p/>
+    <w:p>
+      <w:r>
+        <w:t>Pod YOLO11-pose modele spada več modelov, slednji si sledijo od najlažjega do najtežjega:</w:t>
+      </w:r>
+    </w:p>
+    <w:p>
+      <w:pPr>
+        <w:pStyle w:val="ListParagraph"/>
+        <w:numPr>
+          <w:ilvl w:val="0"/>
+          <w:numId w:val="54"/>
+        </w:numPr>
+      </w:pPr>
+      <w:r>
+        <w:t>YOLO11n-pose</w:t>
+      </w:r>
+    </w:p>
+    <w:p>
+      <w:pPr>
+        <w:pStyle w:val="ListParagraph"/>
+        <w:numPr>
+          <w:ilvl w:val="0"/>
+          <w:numId w:val="54"/>
+        </w:numPr>
+      </w:pPr>
+      <w:r>
+        <w:t>YOLO11s-pose</w:t>
+      </w:r>
+    </w:p>
+    <w:p>
+      <w:pPr>
+        <w:pStyle w:val="ListParagraph"/>
+        <w:numPr>
+          <w:ilvl w:val="0"/>
+          <w:numId w:val="54"/>
+        </w:numPr>
+      </w:pPr>
+      <w:r>
+        <w:t>YOLO11m-pose</w:t>
+      </w:r>
+    </w:p>
+    <w:p>
+      <w:pPr>
+        <w:pStyle w:val="ListParagraph"/>
+        <w:numPr>
+          <w:ilvl w:val="0"/>
+          <w:numId w:val="54"/>
+        </w:numPr>
+      </w:pPr>
+      <w:r>
+        <w:t>YOLO11l-pose</w:t>
+      </w:r>
+    </w:p>
+    <w:p>
+      <w:pPr>
+        <w:pStyle w:val="ListParagraph"/>
+        <w:numPr>
+          <w:ilvl w:val="0"/>
+          <w:numId w:val="54"/>
+        </w:numPr>
+      </w:pPr>
+      <w:r>
+        <w:t>YOLO11x-pose</w:t>
+      </w:r>
+    </w:p>
+    <w:p>
+      <w:r>
+        <w:t>Pričakovana natančnost omenjenih modelov narašča s težo oz. velikostjo modela, kar pomeni, da ima YOLO11n-pose najmanjšo pričakovano natančnost, YOLO11x-pose pa največjo pričakovano natančnost.</w:t>
+      </w:r>
+    </w:p>
+    <w:p/>
+    <w:p>
+      <w:r>
+        <w:t xml:space="preserve">Pose modeli </w:t>
+      </w:r>
+      <w:proofErr w:type="spellStart"/>
+      <w:r>
+        <w:t>Ultralytics</w:t>
+      </w:r>
+      <w:proofErr w:type="spellEnd"/>
+      <w:r>
+        <w:t xml:space="preserve"> YOLO </w:t>
+      </w:r>
+      <w:r>
+        <w:t xml:space="preserve">so privzeto učeni na podatkovni zbirki </w:t>
+      </w:r>
+      <w:r>
+        <w:t>“</w:t>
+      </w:r>
+      <w:r>
+        <w:t>COCO-pose</w:t>
+      </w:r>
+      <w:r>
+        <w:t>“</w:t>
+      </w:r>
+      <w:r>
+        <w:t xml:space="preserve"> in napovedujejo 17 sklepnih točk, ki ustrezajo standardnim COCO sklepom. V tem pogledu je YOLO pristop bolj minimalističen v primerjavi z ostalimi rešitvami</w:t>
+      </w:r>
+      <w:r>
+        <w:t xml:space="preserve">, ponuja pa drugačne prednosti </w:t>
+      </w:r>
+      <w:r>
+        <w:t>v primerjavi z ostalimi modeli.</w:t>
+      </w:r>
+      <w:r>
+        <w:t>.</w:t>
+      </w:r>
+    </w:p>
+    <w:p/>
+    <w:p>
+      <w:pPr>
+        <w:pStyle w:val="Images"/>
+      </w:pPr>
+      <w:r>
+        <w:rPr>
+          <w:noProof/>
+        </w:rPr>
+        <w:lastRenderedPageBreak/>
+        <w:drawing>
+          <wp:inline distT="0" distB="0" distL="0" distR="0" wp14:anchorId="77A76D0C" wp14:editId="6D0F5C1E">
+            <wp:extent cx="5396230" cy="2526665"/>
+            <wp:effectExtent l="0" t="0" r="0" b="6985"/>
+            <wp:docPr id="352849602" name="Picture 3"/>
+            <wp:cNvGraphicFramePr>
+              <a:graphicFrameLocks xmlns:a="http://schemas.openxmlformats.org/drawingml/2006/main" noChangeAspect="1"/>
+            </wp:cNvGraphicFramePr>
+            <a:graphic xmlns:a="http://schemas.openxmlformats.org/drawingml/2006/main">
+              <a:graphicData uri="http://schemas.openxmlformats.org/drawingml/2006/picture">
+                <pic:pic xmlns:pic="http://schemas.openxmlformats.org/drawingml/2006/picture">
+                  <pic:nvPicPr>
+                    <pic:cNvPr id="0" name="Picture 3"/>
+                    <pic:cNvPicPr>
+                      <a:picLocks noChangeAspect="1" noChangeArrowheads="1"/>
+                    </pic:cNvPicPr>
+                  </pic:nvPicPr>
+                  <pic:blipFill>
+                    <a:blip r:embed="rId15" cstate="print">
+                      <a:extLst>
+                        <a:ext uri="{28A0092B-C50C-407E-A947-70E740481C1C}">
+                          <a14:useLocalDpi xmlns:a14="http://schemas.microsoft.com/office/drawing/2010/main" val="0"/>
+                        </a:ext>
+                      </a:extLst>
+                    </a:blip>
+                    <a:srcRect/>
+                    <a:stretch>
+                      <a:fillRect/>
+                    </a:stretch>
+                  </pic:blipFill>
+                  <pic:spPr bwMode="auto">
+                    <a:xfrm>
+                      <a:off x="0" y="0"/>
+                      <a:ext cx="5396230" cy="2526665"/>
+                    </a:xfrm>
+                    <a:prstGeom prst="rect">
+                      <a:avLst/>
+                    </a:prstGeom>
+                    <a:noFill/>
+                    <a:ln>
+                      <a:noFill/>
+                    </a:ln>
+                  </pic:spPr>
+                </pic:pic>
+              </a:graphicData>
+            </a:graphic>
+          </wp:inline>
+        </w:drawing>
+      </w:r>
+    </w:p>
+    <w:p>
+      <w:pPr>
+        <w:pStyle w:val="Caption"/>
+      </w:pPr>
+      <w:r>
+        <w:t xml:space="preserve">Slika </w:t>
+      </w:r>
+      <w:r>
+        <w:fldChar w:fldCharType="begin"/>
+      </w:r>
+      <w:r>
+        <w:instrText xml:space="preserve"> STYLEREF 1 \s </w:instrText>
+      </w:r>
+      <w:r>
+        <w:fldChar w:fldCharType="separate"/>
+      </w:r>
+      <w:r>
+        <w:rPr>
+          <w:noProof/>
+        </w:rPr>
+        <w:t>2</w:t>
+      </w:r>
+      <w:r>
+        <w:fldChar w:fldCharType="end"/>
+      </w:r>
+      <w:r>
+        <w:t>.</w:t>
+      </w:r>
+      <w:r>
+        <w:fldChar w:fldCharType="begin"/>
+      </w:r>
+      <w:r>
+        <w:instrText xml:space="preserve"> SEQ Slika \* ARABIC \s 1 </w:instrText>
+      </w:r>
+      <w:r>
+        <w:fldChar w:fldCharType="separate"/>
+      </w:r>
+      <w:r>
+        <w:rPr>
+          <w:noProof/>
+        </w:rPr>
+        <w:t>2</w:t>
+      </w:r>
+      <w:r>
+        <w:fldChar w:fldCharType="end"/>
+      </w:r>
+      <w:r>
+        <w:t>: Primer COCO-pose učne množice</w:t>
+      </w:r>
+    </w:p>
+    <w:p/>
+    <w:p>
+      <w:r>
+        <w:t xml:space="preserve">Že naučeni modeli YOLO11-pose so privzeto trenirani za človeško pozo (npr. na COCO-pose učni množici). Je pa delovanje zaznave ključnih točk zasnovana dovolj splošno, da je YOLO-pose modele mogoče učiti ali nastaviti na poljubno definirane poze, kjer ključne točke ne predstavljajo nujno človeških sklepov, temveč katerikoli konsistentno označeni del objekta v učni zbirki. </w:t>
+      </w:r>
+      <w:proofErr w:type="spellStart"/>
+      <w:r>
+        <w:t>Ultralytics</w:t>
+      </w:r>
+      <w:proofErr w:type="spellEnd"/>
+      <w:r>
+        <w:t xml:space="preserve"> dokumentacija navaja tudi primere specializiranih učnih zbirk za živalsko pozo (npr. Tiger-Pose).</w:t>
+      </w:r>
+    </w:p>
+    <w:p/>
+    <w:p>
+      <w:r>
+        <w:t xml:space="preserve">Ključna posebnost YOLO-pose modelov je, da rezultat modelov ne zajema le 17 sklepnih točk, ampak vključuje tudi detekcijske informacije </w:t>
+      </w:r>
+      <w:r>
+        <w:t>za vsako</w:t>
+      </w:r>
+      <w:r>
+        <w:t xml:space="preserve"> oseb</w:t>
+      </w:r>
+      <w:r>
+        <w:t>o v kadru</w:t>
+      </w:r>
+      <w:r>
+        <w:t xml:space="preserve">. V splošnem izhod </w:t>
+      </w:r>
+      <w:r>
+        <w:t xml:space="preserve">za </w:t>
+      </w:r>
+      <w:r>
+        <w:t>vsako</w:t>
+      </w:r>
+      <w:r>
+        <w:t xml:space="preserve"> osebo </w:t>
+      </w:r>
+      <w:r>
+        <w:t>sestavljajo:</w:t>
+      </w:r>
+    </w:p>
+    <w:p>
+      <w:pPr>
+        <w:pStyle w:val="ListParagraph"/>
+        <w:numPr>
+          <w:ilvl w:val="0"/>
+          <w:numId w:val="55"/>
+        </w:numPr>
+      </w:pPr>
+      <w:r>
+        <w:t>Omejitveni pravokotnik (</w:t>
+      </w:r>
+      <w:proofErr w:type="spellStart"/>
+      <w:r>
+        <w:t>bounding</w:t>
+      </w:r>
+      <w:proofErr w:type="spellEnd"/>
+      <w:r>
+        <w:t xml:space="preserve"> </w:t>
+      </w:r>
+      <w:proofErr w:type="spellStart"/>
+      <w:r>
+        <w:t>box</w:t>
+      </w:r>
+      <w:proofErr w:type="spellEnd"/>
+      <w:r>
+        <w:t>) osebe (v normalizirani obliki: x, y, širina, višina)</w:t>
+      </w:r>
+    </w:p>
+    <w:p>
+      <w:pPr>
+        <w:pStyle w:val="ListParagraph"/>
+        <w:numPr>
+          <w:ilvl w:val="0"/>
+          <w:numId w:val="55"/>
+        </w:numPr>
+      </w:pPr>
+      <w:r>
+        <w:t>Ocena zaupanja detekcije</w:t>
+      </w:r>
+    </w:p>
+    <w:p>
+      <w:pPr>
+        <w:pStyle w:val="ListParagraph"/>
+        <w:numPr>
+          <w:ilvl w:val="0"/>
+          <w:numId w:val="55"/>
+        </w:numPr>
+      </w:pPr>
+      <w:r>
+        <w:t>Sklepne točke, kjer vsaka točka vsebuje normalizirano lokacijo in vrednost vidljivosti</w:t>
+      </w:r>
+    </w:p>
+    <w:p/>
+    <w:p>
+      <w:r>
+        <w:t xml:space="preserve">YOLO modeli pri zaznavi uporabljajo parameter </w:t>
+      </w:r>
+      <w:r>
+        <w:t>“</w:t>
+      </w:r>
+      <w:proofErr w:type="spellStart"/>
+      <w:r>
+        <w:t>imgsz</w:t>
+      </w:r>
+      <w:proofErr w:type="spellEnd"/>
+      <w:r>
+        <w:t>“</w:t>
+      </w:r>
+      <w:r>
+        <w:t xml:space="preserve">, ki določa velikost vhodne slike, ki je kvadratno oblikovana. Večja vhodna ločljivost praviloma izboljša kakovost zaznave in natančnost sklepnih točk, vendar poveča računsko zahtevnost in s tem zmanjša hitrost delovanja. Manjša ločljivost ima obratne lastnosti (hitrejše delovanje, praviloma slabšo </w:t>
+      </w:r>
+      <w:r>
+        <w:lastRenderedPageBreak/>
+        <w:t>natančnost). V okviru naloge je opravljena primerjava med dvema modeloma, en ima vhodno ločljivost velikosti 256, drug pa privzeto ločljivost velikosti 640.</w:t>
+      </w:r>
+    </w:p>
+    <w:p/>
+    <w:p>
+      <w:r>
+        <w:t xml:space="preserve">YOLO-pose modele je mogoče izvoziti v več formatov, kar omogoča prilagoditev različnim izvajalnim okoljem. Primarno izvajalno okolje za YOLO je </w:t>
+      </w:r>
+      <w:proofErr w:type="spellStart"/>
+      <w:r>
+        <w:t>Python</w:t>
+      </w:r>
+      <w:proofErr w:type="spellEnd"/>
+      <w:r>
+        <w:t>. Možnost izvažanja modelov v ostale formate je v kontekstu naloge pomembna, saj naloga temelji na izvajanju in delovanju modela v brskalniku in na robnih napravah.</w:t>
+      </w:r>
+    </w:p>
+    <w:p/>
+    <w:p>
+      <w:pPr>
+        <w:rPr>
+          <w:lang w:val="en-SI"/>
+        </w:rPr>
+      </w:pPr>
+      <w:r>
+        <w:t xml:space="preserve">Najučinkovitejšo izvajanje YOLO-pose modelov v okolju brskalnika omogoča knjižnica </w:t>
+      </w:r>
+      <w:proofErr w:type="spellStart"/>
+      <w:r>
+        <w:t>npm</w:t>
+      </w:r>
+      <w:proofErr w:type="spellEnd"/>
+      <w:r>
+        <w:t xml:space="preserve"> </w:t>
+      </w:r>
+      <w:r>
+        <w:t>“</w:t>
+      </w:r>
+      <w:r>
+        <w:t>@</w:t>
+      </w:r>
+      <w:proofErr w:type="spellStart"/>
+      <w:r>
+        <w:t>tensorflow</w:t>
+      </w:r>
+      <w:proofErr w:type="spellEnd"/>
+      <w:r>
+        <w:t>/</w:t>
+      </w:r>
+      <w:proofErr w:type="spellStart"/>
+      <w:r>
+        <w:t>tfjs</w:t>
+      </w:r>
+      <w:proofErr w:type="spellEnd"/>
+      <w:r>
+        <w:t>“</w:t>
+      </w:r>
+      <w:r>
+        <w:t>. Knjižnica omogoča nalaganje modela in tudi izbiro zaledja, ki vpliva na zmogljivost in porabo virov ter je pomemben dejavnik pri optimizaciji hitrosti delovanja modelov v brskalniku.</w:t>
+      </w:r>
+    </w:p>
+    <w:p/>
+    <w:p/>
+    <w:p>
+      <w:r>
+        <w:t>PREDNOST JE UČENJE</w:t>
+      </w:r>
+    </w:p>
+    <w:p/>
+    <w:p/>
     <w:p>
       <w:pPr>
         <w:pStyle w:val="Heading1"/>
@@ -3985,7 +4431,6 @@
     </w:p>
     <w:p>
       <w:r>
-        <w:lastRenderedPageBreak/>
         <w:t xml:space="preserve">Ključni prispevek tega magistrskega dela je realno-časovno spremljanje in analiziranje vadbe posameznika. </w:t>
       </w:r>
       <w:r>
@@ -4039,6 +4484,7 @@
       </w:pPr>
       <w:bookmarkStart w:id="13" w:name="_Toc221980687"/>
       <w:r>
+        <w:lastRenderedPageBreak/>
         <w:t>Mehanizem stanj</w:t>
       </w:r>
       <w:bookmarkEnd w:id="13"/>
@@ -4216,7 +4662,6 @@
       </w:pPr>
       <w:bookmarkStart w:id="14" w:name="_Toc221980688"/>
       <w:r>
-        <w:lastRenderedPageBreak/>
         <w:t>Stanje NI_V_KADRU</w:t>
       </w:r>
       <w:bookmarkEnd w:id="14"/>
@@ -4269,6 +4714,7 @@
       </w:pPr>
       <w:bookmarkStart w:id="15" w:name="_Toc221980689"/>
       <w:r>
+        <w:lastRenderedPageBreak/>
         <w:t>Stanje NI_OBRNJEN_PROTI_KAMERI</w:t>
       </w:r>
       <w:bookmarkEnd w:id="15"/>
@@ -4445,11 +4891,7 @@
         <w:t xml:space="preserve">, </w:t>
       </w:r>
       <w:r>
-        <w:t xml:space="preserve">specificirati </w:t>
-      </w:r>
-      <w:r>
-        <w:lastRenderedPageBreak/>
-        <w:t>pravila, za zaznavo napačne začetne drže. Pravilo preverja eno izmed naslednjih pogojev:</w:t>
+        <w:t>specificirati pravila, za zaznavo napačne začetne drže. Pravilo preverja eno izmed naslednjih pogojev:</w:t>
       </w:r>
     </w:p>
     <w:p>
@@ -4517,6 +4959,7 @@
           <w:sz w:val="44"/>
           <w:szCs w:val="44"/>
         </w:rPr>
+        <w:lastRenderedPageBreak/>
         <w:t xml:space="preserve">SLIKA PRED HALF SQUAT </w:t>
       </w:r>
       <w:r>
@@ -4643,7 +5086,6 @@
           <w:sz w:val="44"/>
           <w:szCs w:val="44"/>
         </w:rPr>
-        <w:lastRenderedPageBreak/>
         <w:t>SLIKA</w:t>
       </w:r>
       <w:r>
@@ -4680,6 +5122,7 @@
       </w:pPr>
       <w:bookmarkStart w:id="20" w:name="_Toc221980694"/>
       <w:r>
+        <w:lastRenderedPageBreak/>
         <w:t>Predpisi vaj</w:t>
       </w:r>
       <w:bookmarkEnd w:id="20"/>
@@ -4863,7 +5306,6 @@
       </w:pPr>
       <w:bookmarkStart w:id="21" w:name="_Toc221980695"/>
       <w:r>
-        <w:lastRenderedPageBreak/>
         <w:t>Zajemanje ponovitev</w:t>
       </w:r>
       <w:bookmarkEnd w:id="21"/>
@@ -4926,6 +5368,7 @@
         <w:spacing w:line="360" w:lineRule="auto"/>
       </w:pPr>
       <w:r>
+        <w:lastRenderedPageBreak/>
         <w:t xml:space="preserve">Trend gibanja izbrane sklepne točke je izpolnil pogoje za </w:t>
       </w:r>
       <w:r>
@@ -5083,28 +5526,28 @@
       </w:pPr>
       <w:bookmarkStart w:id="23" w:name="_Toc221980697"/>
       <w:r>
+        <w:t>Čas ekscentrične faze</w:t>
+      </w:r>
+      <w:bookmarkEnd w:id="23"/>
+    </w:p>
+    <w:p>
+      <w:r>
+        <w:t>Ekscentrična faza je nasprotje koncentrični, saj se v njej glavna mišica podaljšuje, uporabnik pa gibanje kontrolirano zavira, kar predstavlja manjšo breme kot med koncentrično fazo.</w:t>
+      </w:r>
+      <w:r>
+        <w:t xml:space="preserve"> Pri vaji upogib bicepsa je to druga faza, ki se začne v časovnem trenutku, ko se zapestje z utežjo začne iz najvišje točke spuščati navzdol, praviloma pa se konča, ko zapestje preide v začetno pozicijo.</w:t>
+      </w:r>
+      <w:r>
+        <w:t xml:space="preserve"> Pri vaji počep, pa je ekscentrična faza nastopi prva, torej ko se uporabnik iz začetne pozicije začne spuščati proti najnižji poziciji ponovitve.</w:t>
+      </w:r>
+    </w:p>
+    <w:p>
+      <w:pPr>
+        <w:pStyle w:val="Heading3"/>
+      </w:pPr>
+      <w:bookmarkStart w:id="24" w:name="_Toc221980698"/>
+      <w:r>
         <w:lastRenderedPageBreak/>
-        <w:t>Čas ekscentrične faze</w:t>
-      </w:r>
-      <w:bookmarkEnd w:id="23"/>
-    </w:p>
-    <w:p>
-      <w:r>
-        <w:t>Ekscentrična faza je nasprotje koncentrični, saj se v njej glavna mišica podaljšuje, uporabnik pa gibanje kontrolirano zavira, kar predstavlja manjšo breme kot med koncentrično fazo.</w:t>
-      </w:r>
-      <w:r>
-        <w:t xml:space="preserve"> Pri vaji upogib bicepsa je to druga faza, ki se začne v časovnem trenutku, ko se zapestje z utežjo začne iz najvišje točke spuščati navzdol, praviloma pa se konča, ko zapestje preide v začetno pozicijo.</w:t>
-      </w:r>
-      <w:r>
-        <w:t xml:space="preserve"> Pri vaji počep, pa je ekscentrična faza nastopi prva, torej ko se uporabnik iz začetne pozicije začne spuščati proti najnižji poziciji ponovitve.</w:t>
-      </w:r>
-    </w:p>
-    <w:p>
-      <w:pPr>
-        <w:pStyle w:val="Heading3"/>
-      </w:pPr>
-      <w:bookmarkStart w:id="24" w:name="_Toc221980698"/>
-      <w:r>
         <w:t>Čas izometrične faze</w:t>
       </w:r>
       <w:bookmarkEnd w:id="24"/>
@@ -5245,48 +5688,48 @@
     <w:p/>
     <w:p>
       <w:r>
+        <w:t>Časovni graf prikaže vsako ponovitev kot stolpec, ki vsebuje tri informacije. Rumen</w:t>
+      </w:r>
+      <w:r>
+        <w:t xml:space="preserve"> in svetlo zelen</w:t>
+      </w:r>
+      <w:r>
+        <w:t xml:space="preserve"> del </w:t>
+      </w:r>
+      <w:r>
+        <w:t>predstavljata</w:t>
+      </w:r>
+      <w:r>
+        <w:t xml:space="preserve"> čas koncentrične faze, oranžen</w:t>
+      </w:r>
+      <w:r>
+        <w:t xml:space="preserve"> in temno zelen</w:t>
+      </w:r>
+      <w:r>
+        <w:t xml:space="preserve"> del čas ekscentrične faze</w:t>
+      </w:r>
+      <w:r>
+        <w:t xml:space="preserve">, </w:t>
+      </w:r>
+      <w:r>
+        <w:t xml:space="preserve">črna črta na sredini stolpca </w:t>
+      </w:r>
+      <w:r>
+        <w:t xml:space="preserve">pa </w:t>
+      </w:r>
+      <w:r>
+        <w:t>čas izometrične faze.</w:t>
+      </w:r>
+    </w:p>
+    <w:p>
+      <w:pPr>
+        <w:pStyle w:val="Images"/>
+      </w:pPr>
+      <w:r>
+        <w:rPr>
+          <w:noProof/>
+        </w:rPr>
         <w:lastRenderedPageBreak/>
-        <w:t>Časovni graf prikaže vsako ponovitev kot stolpec, ki vsebuje tri informacije. Rumen</w:t>
-      </w:r>
-      <w:r>
-        <w:t xml:space="preserve"> in svetlo zelen</w:t>
-      </w:r>
-      <w:r>
-        <w:t xml:space="preserve"> del </w:t>
-      </w:r>
-      <w:r>
-        <w:t>predstavljata</w:t>
-      </w:r>
-      <w:r>
-        <w:t xml:space="preserve"> čas koncentrične faze, oranžen</w:t>
-      </w:r>
-      <w:r>
-        <w:t xml:space="preserve"> in temno zelen</w:t>
-      </w:r>
-      <w:r>
-        <w:t xml:space="preserve"> del čas ekscentrične faze</w:t>
-      </w:r>
-      <w:r>
-        <w:t xml:space="preserve">, </w:t>
-      </w:r>
-      <w:r>
-        <w:t xml:space="preserve">črna črta na sredini stolpca </w:t>
-      </w:r>
-      <w:r>
-        <w:t xml:space="preserve">pa </w:t>
-      </w:r>
-      <w:r>
-        <w:t>čas izometrične faze.</w:t>
-      </w:r>
-    </w:p>
-    <w:p>
-      <w:pPr>
-        <w:pStyle w:val="Images"/>
-      </w:pPr>
-      <w:r>
-        <w:rPr>
-          <w:noProof/>
-        </w:rPr>
         <w:drawing>
           <wp:inline distT="0" distB="0" distL="0" distR="0" wp14:anchorId="1E28F347" wp14:editId="4BB88319">
             <wp:extent cx="4933950" cy="3071499"/>
@@ -5303,7 +5746,7 @@
                     <pic:cNvPicPr/>
                   </pic:nvPicPr>
                   <pic:blipFill>
-                    <a:blip r:embed="rId15"/>
+                    <a:blip r:embed="rId16"/>
                     <a:stretch>
                       <a:fillRect/>
                     </a:stretch>
@@ -5333,51 +5776,25 @@
       <w:r>
         <w:t xml:space="preserve">Slika </w:t>
       </w:r>
-      <w:r>
-        <w:fldChar w:fldCharType="begin"/>
-      </w:r>
-      <w:r>
-        <w:instrText xml:space="preserve"> STYLEREF 1 \s </w:instrText>
-      </w:r>
-      <w:r>
-        <w:fldChar w:fldCharType="separate"/>
-      </w:r>
-      <w:r>
-        <w:rPr>
-          <w:noProof/>
-        </w:rPr>
-        <w:t>3</w:t>
-      </w:r>
-      <w:r>
-        <w:rPr>
-          <w:noProof/>
-        </w:rPr>
-        <w:fldChar w:fldCharType="end"/>
-      </w:r>
+      <w:fldSimple w:instr=" STYLEREF 1 \s ">
+        <w:r>
+          <w:rPr>
+            <w:noProof/>
+          </w:rPr>
+          <w:t>3</w:t>
+        </w:r>
+      </w:fldSimple>
       <w:r>
         <w:t>.</w:t>
       </w:r>
-      <w:r>
-        <w:fldChar w:fldCharType="begin"/>
-      </w:r>
-      <w:r>
-        <w:instrText xml:space="preserve"> SEQ Slika \* ARABIC \s 1 </w:instrText>
-      </w:r>
-      <w:r>
-        <w:fldChar w:fldCharType="separate"/>
-      </w:r>
-      <w:r>
-        <w:rPr>
-          <w:noProof/>
-        </w:rPr>
-        <w:t>1</w:t>
-      </w:r>
-      <w:r>
-        <w:rPr>
-          <w:noProof/>
-        </w:rPr>
-        <w:fldChar w:fldCharType="end"/>
-      </w:r>
+      <w:fldSimple w:instr=" SEQ Slika \* ARABIC \s 1 ">
+        <w:r>
+          <w:rPr>
+            <w:noProof/>
+          </w:rPr>
+          <w:t>1</w:t>
+        </w:r>
+      </w:fldSimple>
       <w:r>
         <w:t>: Časovni graf</w:t>
       </w:r>
@@ -5410,7 +5827,6 @@
         <w:rPr>
           <w:noProof/>
         </w:rPr>
-        <w:lastRenderedPageBreak/>
         <w:drawing>
           <wp:inline distT="0" distB="0" distL="0" distR="0" wp14:anchorId="26B7BC38" wp14:editId="448F4768">
             <wp:extent cx="4895918" cy="3124200"/>
@@ -5427,7 +5843,7 @@
                     <pic:cNvPicPr/>
                   </pic:nvPicPr>
                   <pic:blipFill>
-                    <a:blip r:embed="rId16"/>
+                    <a:blip r:embed="rId17"/>
                     <a:stretch>
                       <a:fillRect/>
                     </a:stretch>
@@ -5457,51 +5873,25 @@
       <w:r>
         <w:t xml:space="preserve">Slika </w:t>
       </w:r>
-      <w:r>
-        <w:fldChar w:fldCharType="begin"/>
-      </w:r>
-      <w:r>
-        <w:instrText xml:space="preserve"> STYLEREF 1 \s </w:instrText>
-      </w:r>
-      <w:r>
-        <w:fldChar w:fldCharType="separate"/>
-      </w:r>
-      <w:r>
-        <w:rPr>
-          <w:noProof/>
-        </w:rPr>
-        <w:t>3</w:t>
-      </w:r>
-      <w:r>
-        <w:rPr>
-          <w:noProof/>
-        </w:rPr>
-        <w:fldChar w:fldCharType="end"/>
-      </w:r>
+      <w:fldSimple w:instr=" STYLEREF 1 \s ">
+        <w:r>
+          <w:rPr>
+            <w:noProof/>
+          </w:rPr>
+          <w:t>3</w:t>
+        </w:r>
+      </w:fldSimple>
       <w:r>
         <w:t>.</w:t>
       </w:r>
-      <w:r>
-        <w:fldChar w:fldCharType="begin"/>
-      </w:r>
-      <w:r>
-        <w:instrText xml:space="preserve"> SEQ Slika \* ARABIC \s 1 </w:instrText>
-      </w:r>
-      <w:r>
-        <w:fldChar w:fldCharType="separate"/>
-      </w:r>
-      <w:r>
-        <w:rPr>
-          <w:noProof/>
-        </w:rPr>
-        <w:t>2</w:t>
-      </w:r>
-      <w:r>
-        <w:rPr>
-          <w:noProof/>
-        </w:rPr>
-        <w:fldChar w:fldCharType="end"/>
-      </w:r>
+      <w:fldSimple w:instr=" SEQ Slika \* ARABIC \s 1 ">
+        <w:r>
+          <w:rPr>
+            <w:noProof/>
+          </w:rPr>
+          <w:t>2</w:t>
+        </w:r>
+      </w:fldSimple>
       <w:r>
         <w:t xml:space="preserve">: Graf prepotovane </w:t>
       </w:r>
@@ -5514,6 +5904,7 @@
     <w:p/>
     <w:p>
       <w:r>
+        <w:lastRenderedPageBreak/>
         <w:t xml:space="preserve">Graf hitrosti je enak grafu prepotovane distance, le da se </w:t>
       </w:r>
       <w:r>
@@ -5544,7 +5935,7 @@
                     <pic:cNvPicPr/>
                   </pic:nvPicPr>
                   <pic:blipFill>
-                    <a:blip r:embed="rId17"/>
+                    <a:blip r:embed="rId18"/>
                     <a:stretch>
                       <a:fillRect/>
                     </a:stretch>
@@ -5576,51 +5967,25 @@
       <w:r>
         <w:t xml:space="preserve">Slika </w:t>
       </w:r>
-      <w:r>
-        <w:fldChar w:fldCharType="begin"/>
-      </w:r>
-      <w:r>
-        <w:instrText xml:space="preserve"> STYLEREF 1 \s </w:instrText>
-      </w:r>
-      <w:r>
-        <w:fldChar w:fldCharType="separate"/>
-      </w:r>
-      <w:r>
-        <w:rPr>
-          <w:noProof/>
-        </w:rPr>
-        <w:t>3</w:t>
-      </w:r>
-      <w:r>
-        <w:rPr>
-          <w:noProof/>
-        </w:rPr>
-        <w:fldChar w:fldCharType="end"/>
-      </w:r>
+      <w:fldSimple w:instr=" STYLEREF 1 \s ">
+        <w:r>
+          <w:rPr>
+            <w:noProof/>
+          </w:rPr>
+          <w:t>3</w:t>
+        </w:r>
+      </w:fldSimple>
       <w:r>
         <w:t>.</w:t>
       </w:r>
-      <w:r>
-        <w:fldChar w:fldCharType="begin"/>
-      </w:r>
-      <w:r>
-        <w:instrText xml:space="preserve"> SEQ Slika \* ARABIC \s 1 </w:instrText>
-      </w:r>
-      <w:r>
-        <w:fldChar w:fldCharType="separate"/>
-      </w:r>
-      <w:r>
-        <w:rPr>
-          <w:noProof/>
-        </w:rPr>
-        <w:t>3</w:t>
-      </w:r>
-      <w:r>
-        <w:rPr>
-          <w:noProof/>
-        </w:rPr>
-        <w:fldChar w:fldCharType="end"/>
-      </w:r>
+      <w:fldSimple w:instr=" SEQ Slika \* ARABIC \s 1 ">
+        <w:r>
+          <w:rPr>
+            <w:noProof/>
+          </w:rPr>
+          <w:t>3</w:t>
+        </w:r>
+      </w:fldSimple>
       <w:r>
         <w:t>: Graf hitrosti</w:t>
       </w:r>
@@ -5638,7 +6003,6 @@
       </w:pPr>
       <w:bookmarkStart w:id="35" w:name="_Toc221980701"/>
       <w:r>
-        <w:lastRenderedPageBreak/>
         <w:t>Informacije o nepravilni drži telesa</w:t>
       </w:r>
       <w:bookmarkEnd w:id="35"/>
@@ -5746,6 +6110,7 @@
           <w:sz w:val="44"/>
           <w:szCs w:val="44"/>
         </w:rPr>
+        <w:lastRenderedPageBreak/>
         <w:t>SLIKA</w:t>
       </w:r>
       <w:r>
@@ -5826,371 +6191,367 @@
       </w:pPr>
       <w:bookmarkStart w:id="38" w:name="_Toc221980704"/>
       <w:r>
+        <w:t xml:space="preserve">Primerjava ponovitev znotraj </w:t>
+      </w:r>
+      <w:r>
+        <w:t xml:space="preserve">iste </w:t>
+      </w:r>
+      <w:r>
+        <w:t>serije</w:t>
+      </w:r>
+      <w:bookmarkEnd w:id="38"/>
+    </w:p>
+    <w:p>
+      <w:r>
+        <w:t xml:space="preserve">Osredotočimo se na </w:t>
+      </w:r>
+      <w:r>
+        <w:t>grafe</w:t>
+      </w:r>
+      <w:r>
+        <w:t xml:space="preserve"> </w:t>
+      </w:r>
+      <w:r>
+        <w:fldChar w:fldCharType="begin"/>
+      </w:r>
+      <w:r>
+        <w:instrText xml:space="preserve"> REF _Ref221966222 \h </w:instrText>
+      </w:r>
+      <w:r>
+        <w:instrText xml:space="preserve"> \* MERGEFORMAT </w:instrText>
+      </w:r>
+      <w:r>
+        <w:fldChar w:fldCharType="separate"/>
+      </w:r>
+      <w:r>
+        <w:t xml:space="preserve">Slika </w:t>
+      </w:r>
+      <w:r>
+        <w:rPr>
+          <w:noProof/>
+        </w:rPr>
+        <w:t>2</w:t>
+      </w:r>
+      <w:r>
+        <w:t>.</w:t>
+      </w:r>
+      <w:r>
+        <w:rPr>
+          <w:noProof/>
+        </w:rPr>
+        <w:t>1</w:t>
+      </w:r>
+      <w:r>
+        <w:t>: Časovni graf</w:t>
+      </w:r>
+      <w:r>
+        <w:fldChar w:fldCharType="end"/>
+      </w:r>
+      <w:r>
+        <w:t xml:space="preserve">, </w:t>
+      </w:r>
+      <w:r>
+        <w:fldChar w:fldCharType="begin"/>
+      </w:r>
+      <w:r>
+        <w:instrText xml:space="preserve"> REF _Ref221966255 \h </w:instrText>
+      </w:r>
+      <w:r>
+        <w:instrText xml:space="preserve"> \* MERGEFORMAT </w:instrText>
+      </w:r>
+      <w:r>
+        <w:fldChar w:fldCharType="separate"/>
+      </w:r>
+      <w:r>
+        <w:t xml:space="preserve">Slika </w:t>
+      </w:r>
+      <w:r>
+        <w:rPr>
+          <w:noProof/>
+        </w:rPr>
+        <w:t>2</w:t>
+      </w:r>
+      <w:r>
+        <w:t>.</w:t>
+      </w:r>
+      <w:r>
+        <w:rPr>
+          <w:noProof/>
+        </w:rPr>
+        <w:t>2</w:t>
+      </w:r>
+      <w:r>
+        <w:t xml:space="preserve">: Graf prepotovane </w:t>
+      </w:r>
+      <w:r>
+        <w:t>razdalje</w:t>
+      </w:r>
+      <w:r>
+        <w:fldChar w:fldCharType="end"/>
+      </w:r>
+      <w:r>
+        <w:t xml:space="preserve">, </w:t>
+      </w:r>
+      <w:r>
+        <w:fldChar w:fldCharType="begin"/>
+      </w:r>
+      <w:r>
+        <w:instrText xml:space="preserve"> REF _Ref221968150 \h </w:instrText>
+      </w:r>
+      <w:r>
+        <w:instrText xml:space="preserve"> \* MERGEFORMAT </w:instrText>
+      </w:r>
+      <w:r>
+        <w:fldChar w:fldCharType="separate"/>
+      </w:r>
+      <w:r>
+        <w:t xml:space="preserve">Slika </w:t>
+      </w:r>
+      <w:r>
+        <w:rPr>
+          <w:noProof/>
+        </w:rPr>
+        <w:t>2</w:t>
+      </w:r>
+      <w:r>
+        <w:t>.</w:t>
+      </w:r>
+      <w:r>
+        <w:rPr>
+          <w:noProof/>
+        </w:rPr>
+        <w:t>3</w:t>
+      </w:r>
+      <w:r>
+        <w:t>: Graf hitrosti v koncentrični fazi</w:t>
+      </w:r>
+      <w:r>
+        <w:fldChar w:fldCharType="end"/>
+      </w:r>
+      <w:r>
+        <w:t>.</w:t>
+      </w:r>
+    </w:p>
+    <w:p/>
+    <w:p>
+      <w:r>
+        <w:t xml:space="preserve">Na časovnem grafu je trend naraščanja časa koncentrične faze med ponovitvami zelo očiten. Po tem lahko slepo sklepamo, da je proti koncu serije uporabnik potreboval več napora, da je opravil ponovitev. To je le sklep, kajti uporabnik bi lahko proti koncu serije premagoval večjo razdaljo in bi zato lahko bili časi ponovitev daljši. </w:t>
+      </w:r>
+    </w:p>
+    <w:p>
+      <w:r>
+        <w:t>Iz samega g</w:t>
+      </w:r>
+      <w:r>
+        <w:t>raf</w:t>
+      </w:r>
+      <w:r>
+        <w:t>a</w:t>
+      </w:r>
+      <w:r>
+        <w:t xml:space="preserve"> prepotovane </w:t>
+      </w:r>
+      <w:r>
+        <w:t>razdalje je težko kaj sklepati, kajti med ponovitvami ni večjega odstopanja vrednosti. Lahko potrdimo le, da je uporabnik v tem pogledu pravilno opravil serijo.</w:t>
+      </w:r>
+    </w:p>
+    <w:p/>
+    <w:p>
+      <w:r>
+        <w:t xml:space="preserve">Iz grafa hitrosti v koncentrični fazi je možno narediti večje analize, saj graf hitrosti </w:t>
+      </w:r>
+      <w:r>
+        <w:t xml:space="preserve">združi rezultate </w:t>
+      </w:r>
+      <w:r>
+        <w:t>časovn</w:t>
+      </w:r>
+      <w:r>
+        <w:t xml:space="preserve">ega </w:t>
+      </w:r>
+      <w:r>
+        <w:t>graf</w:t>
+      </w:r>
+      <w:r>
+        <w:t>a</w:t>
+      </w:r>
+      <w:r>
+        <w:t xml:space="preserve"> in graf</w:t>
+      </w:r>
+      <w:r>
+        <w:t>a</w:t>
+      </w:r>
+      <w:r>
+        <w:t xml:space="preserve"> prepotovane razdalje. </w:t>
+      </w:r>
+      <w:r>
+        <w:t xml:space="preserve">Ob grafu hitrosti v koncentrični fazi je mogoče izpeljati ugotovitve enega najbolj priznanih predpisov treninga, ki temelji na podlagi hitrosti. </w:t>
+      </w:r>
+    </w:p>
+    <w:p>
+      <w:pPr>
+        <w:pStyle w:val="Heading3"/>
+      </w:pPr>
+      <w:bookmarkStart w:id="39" w:name="_Toc221980705"/>
+      <w:r>
         <w:lastRenderedPageBreak/>
-        <w:t xml:space="preserve">Primerjava ponovitev znotraj </w:t>
-      </w:r>
-      <w:r>
-        <w:t xml:space="preserve">iste </w:t>
-      </w:r>
-      <w:r>
-        <w:t>serije</w:t>
-      </w:r>
-      <w:bookmarkEnd w:id="38"/>
-    </w:p>
-    <w:p>
-      <w:r>
-        <w:t xml:space="preserve">Osredotočimo se na </w:t>
-      </w:r>
-      <w:r>
-        <w:t>grafe</w:t>
+        <w:t>Trening na podlagi hitrosti</w:t>
+      </w:r>
+      <w:bookmarkEnd w:id="39"/>
+    </w:p>
+    <w:p>
+      <w:r>
+        <w:t xml:space="preserve">Na grafu </w:t>
+      </w:r>
+      <w:r>
+        <w:fldChar w:fldCharType="begin"/>
+      </w:r>
+      <w:r>
+        <w:instrText xml:space="preserve"> REF _Ref221967533 \h </w:instrText>
+      </w:r>
+      <w:r>
+        <w:instrText xml:space="preserve"> \* MERGEFORMAT </w:instrText>
+      </w:r>
+      <w:r>
+        <w:fldChar w:fldCharType="separate"/>
+      </w:r>
+      <w:r>
+        <w:t xml:space="preserve">Slika </w:t>
+      </w:r>
+      <w:r>
+        <w:rPr>
+          <w:noProof/>
+        </w:rPr>
+        <w:t>2</w:t>
+      </w:r>
+      <w:r>
+        <w:t>.</w:t>
+      </w:r>
+      <w:r>
+        <w:rPr>
+          <w:noProof/>
+        </w:rPr>
+        <w:t>3</w:t>
+      </w:r>
+      <w:r>
+        <w:t>: Graf hitrosti v koncentrični fazi</w:t>
+      </w:r>
+      <w:r>
+        <w:fldChar w:fldCharType="end"/>
+      </w:r>
+      <w:r>
+        <w:t xml:space="preserve"> je v</w:t>
+      </w:r>
+      <w:r>
+        <w:t xml:space="preserve">eč kot očiten </w:t>
+      </w:r>
+      <w:r>
+        <w:t xml:space="preserve">trend padanja hitrosti </w:t>
+      </w:r>
+      <w:r>
+        <w:t xml:space="preserve">čez ponovitve, iz česar se sklepa, da je uporabnik vajo opravljal pod </w:t>
+      </w:r>
+      <w:r>
+        <w:t xml:space="preserve">njemu </w:t>
+      </w:r>
+      <w:r>
+        <w:t xml:space="preserve">veliko obremenitvijo in </w:t>
+      </w:r>
+      <w:r>
+        <w:t xml:space="preserve">da je </w:t>
+      </w:r>
+      <w:r>
+        <w:t xml:space="preserve">opravil serijo, ki je značilna za </w:t>
+      </w:r>
+      <w:r>
+        <w:t>trening</w:t>
       </w:r>
       <w:r>
         <w:t xml:space="preserve"> </w:t>
       </w:r>
       <w:r>
-        <w:fldChar w:fldCharType="begin"/>
-      </w:r>
-      <w:r>
-        <w:instrText xml:space="preserve"> REF _Ref221966222 \h </w:instrText>
-      </w:r>
-      <w:r>
-        <w:instrText xml:space="preserve"> \* MERGEFORMAT </w:instrText>
-      </w:r>
-      <w:r>
-        <w:fldChar w:fldCharType="separate"/>
-      </w:r>
-      <w:r>
-        <w:t xml:space="preserve">Slika </w:t>
-      </w:r>
-      <w:r>
-        <w:rPr>
-          <w:noProof/>
-        </w:rPr>
-        <w:t>2</w:t>
+        <w:t>napredovanj</w:t>
+      </w:r>
+      <w:r>
+        <w:t>a</w:t>
+      </w:r>
+      <w:r>
+        <w:t xml:space="preserve"> v moči.</w:t>
+      </w:r>
+      <w:r>
+        <w:t xml:space="preserve"> </w:t>
+      </w:r>
+      <w:r>
+        <w:t>Če padajoči trend čez ponovitve ni prisoten in je cilj treninga napredovanje v moči, potem se uporabnika obvesti, da si naj za naslednjo serijo poveča obremenitev</w:t>
+      </w:r>
+      <w:r>
+        <w:t xml:space="preserve">, kajti tak trend </w:t>
+      </w:r>
+      <w:r>
+        <w:t xml:space="preserve">konstantne hitrosti čez ponovitve </w:t>
+      </w:r>
+      <w:r>
+        <w:t xml:space="preserve">je značilen za </w:t>
+      </w:r>
+      <w:r>
+        <w:t>trening ohranjanja moči</w:t>
       </w:r>
       <w:r>
         <w:t>.</w:t>
       </w:r>
       <w:r>
-        <w:rPr>
-          <w:noProof/>
-        </w:rPr>
-        <w:t>1</w:t>
-      </w:r>
-      <w:r>
-        <w:t>: Časovni graf</w:t>
-      </w:r>
-      <w:r>
-        <w:fldChar w:fldCharType="end"/>
-      </w:r>
-      <w:r>
-        <w:t xml:space="preserve">, </w:t>
-      </w:r>
-      <w:r>
-        <w:fldChar w:fldCharType="begin"/>
-      </w:r>
-      <w:r>
-        <w:instrText xml:space="preserve"> REF _Ref221966255 \h </w:instrText>
-      </w:r>
-      <w:r>
-        <w:instrText xml:space="preserve"> \* MERGEFORMAT </w:instrText>
-      </w:r>
-      <w:r>
-        <w:fldChar w:fldCharType="separate"/>
-      </w:r>
-      <w:r>
-        <w:t xml:space="preserve">Slika </w:t>
-      </w:r>
-      <w:r>
-        <w:rPr>
-          <w:noProof/>
-        </w:rPr>
-        <w:t>2</w:t>
-      </w:r>
-      <w:r>
-        <w:t>.</w:t>
-      </w:r>
-      <w:r>
-        <w:rPr>
-          <w:noProof/>
-        </w:rPr>
-        <w:t>2</w:t>
-      </w:r>
-      <w:r>
-        <w:t xml:space="preserve">: Graf prepotovane </w:t>
-      </w:r>
-      <w:r>
-        <w:t>razdalje</w:t>
-      </w:r>
-      <w:r>
-        <w:fldChar w:fldCharType="end"/>
-      </w:r>
-      <w:r>
-        <w:t xml:space="preserve">, </w:t>
-      </w:r>
-      <w:r>
-        <w:fldChar w:fldCharType="begin"/>
-      </w:r>
-      <w:r>
-        <w:instrText xml:space="preserve"> REF _Ref221968150 \h </w:instrText>
-      </w:r>
-      <w:r>
-        <w:instrText xml:space="preserve"> \* MERGEFORMAT </w:instrText>
-      </w:r>
-      <w:r>
-        <w:fldChar w:fldCharType="separate"/>
-      </w:r>
-      <w:r>
-        <w:t xml:space="preserve">Slika </w:t>
-      </w:r>
-      <w:r>
-        <w:rPr>
-          <w:noProof/>
-        </w:rPr>
-        <w:t>2</w:t>
-      </w:r>
-      <w:r>
-        <w:t>.</w:t>
-      </w:r>
-      <w:r>
-        <w:rPr>
-          <w:noProof/>
-        </w:rPr>
-        <w:t>3</w:t>
-      </w:r>
-      <w:r>
-        <w:t>: Graf hitrosti v koncentrični fazi</w:t>
-      </w:r>
-      <w:r>
-        <w:fldChar w:fldCharType="end"/>
-      </w:r>
-      <w:r>
-        <w:t>.</w:t>
+        <w:t xml:space="preserve"> </w:t>
       </w:r>
     </w:p>
     <w:p/>
     <w:p>
       <w:r>
-        <w:t xml:space="preserve">Na časovnem grafu je trend naraščanja časa koncentrične faze med ponovitvami zelo očiten. Po tem lahko slepo sklepamo, da je proti koncu serije uporabnik potreboval več napora, da je opravil ponovitev. To je le sklep, kajti uporabnik bi lahko proti koncu serije premagoval večjo razdaljo in bi zato lahko bili časi ponovitev daljši. </w:t>
-      </w:r>
-    </w:p>
-    <w:p>
-      <w:r>
-        <w:t>Iz samega g</w:t>
-      </w:r>
-      <w:r>
-        <w:t>raf</w:t>
-      </w:r>
-      <w:r>
-        <w:t>a</w:t>
-      </w:r>
-      <w:r>
-        <w:t xml:space="preserve"> prepotovane </w:t>
-      </w:r>
-      <w:r>
-        <w:t>razdalje je težko kaj sklepati, kajti med ponovitvami ni večjega odstopanja vrednosti. Lahko potrdimo le, da je uporabnik v tem pogledu pravilno opravil serijo.</w:t>
-      </w:r>
-    </w:p>
-    <w:p/>
-    <w:p>
-      <w:r>
-        <w:t xml:space="preserve">Iz grafa hitrosti v koncentrični fazi je možno narediti večje analize, saj graf hitrosti </w:t>
-      </w:r>
-      <w:r>
-        <w:t xml:space="preserve">združi rezultate </w:t>
-      </w:r>
-      <w:r>
-        <w:t>časovn</w:t>
-      </w:r>
-      <w:r>
-        <w:t xml:space="preserve">ega </w:t>
-      </w:r>
-      <w:r>
-        <w:t>graf</w:t>
-      </w:r>
-      <w:r>
-        <w:t>a</w:t>
-      </w:r>
-      <w:r>
-        <w:t xml:space="preserve"> in graf</w:t>
-      </w:r>
-      <w:r>
-        <w:t>a</w:t>
-      </w:r>
-      <w:r>
-        <w:t xml:space="preserve"> prepotovane razdalje. </w:t>
-      </w:r>
-      <w:r>
-        <w:t xml:space="preserve">Ob grafu hitrosti v koncentrični fazi je mogoče izpeljati ugotovitve enega najbolj priznanih predpisov treninga, ki temelji na podlagi hitrosti. </w:t>
+        <w:t xml:space="preserve">Preko grafa hitrosti v koncentrični </w:t>
+      </w:r>
+      <w:r>
+        <w:t xml:space="preserve">je možno </w:t>
+      </w:r>
+      <w:r>
+        <w:t>napove</w:t>
+      </w:r>
+      <w:r>
+        <w:t>dati</w:t>
+      </w:r>
+      <w:r>
+        <w:t xml:space="preserve"> tip treninga na podlagi trenda hitrosti čez ponovitve. Edina predpostavka, ki mora biti izpolnjena za </w:t>
+      </w:r>
+      <w:r>
+        <w:t xml:space="preserve">potrditev </w:t>
+      </w:r>
+      <w:r>
+        <w:t>omenjen</w:t>
+      </w:r>
+      <w:r>
+        <w:t>ih</w:t>
+      </w:r>
+      <w:r>
+        <w:t xml:space="preserve"> ugotovit</w:t>
+      </w:r>
+      <w:r>
+        <w:t>ev</w:t>
+      </w:r>
+      <w:r>
+        <w:t>,</w:t>
+      </w:r>
+      <w:r>
+        <w:t xml:space="preserve"> je ta, da mora uporabnik med ponovit</w:t>
+      </w:r>
+      <w:r>
+        <w:t>vami</w:t>
+      </w:r>
+      <w:r>
+        <w:t xml:space="preserve"> dati vse od sebe.</w:t>
       </w:r>
     </w:p>
     <w:p>
       <w:pPr>
         <w:pStyle w:val="Heading3"/>
       </w:pPr>
-      <w:bookmarkStart w:id="39" w:name="_Toc221980705"/>
-      <w:r>
-        <w:t>Trening na podlagi hitrosti</w:t>
-      </w:r>
-      <w:bookmarkEnd w:id="39"/>
-    </w:p>
-    <w:p>
-      <w:r>
-        <w:t xml:space="preserve">Na grafu </w:t>
-      </w:r>
-      <w:r>
-        <w:fldChar w:fldCharType="begin"/>
-      </w:r>
-      <w:r>
-        <w:instrText xml:space="preserve"> REF _Ref221967533 \h </w:instrText>
-      </w:r>
-      <w:r>
-        <w:instrText xml:space="preserve"> \* MERGEFORMAT </w:instrText>
-      </w:r>
-      <w:r>
-        <w:fldChar w:fldCharType="separate"/>
-      </w:r>
-      <w:r>
-        <w:t xml:space="preserve">Slika </w:t>
-      </w:r>
-      <w:r>
-        <w:rPr>
-          <w:noProof/>
-        </w:rPr>
-        <w:t>2</w:t>
-      </w:r>
-      <w:r>
-        <w:t>.</w:t>
-      </w:r>
-      <w:r>
-        <w:rPr>
-          <w:noProof/>
-        </w:rPr>
-        <w:t>3</w:t>
-      </w:r>
-      <w:r>
-        <w:t>: Graf hitrosti v koncentrični fazi</w:t>
-      </w:r>
-      <w:r>
-        <w:fldChar w:fldCharType="end"/>
-      </w:r>
-      <w:r>
-        <w:t xml:space="preserve"> je v</w:t>
-      </w:r>
-      <w:r>
-        <w:t xml:space="preserve">eč kot očiten </w:t>
-      </w:r>
-      <w:r>
-        <w:t xml:space="preserve">trend padanja hitrosti </w:t>
-      </w:r>
-      <w:r>
-        <w:t xml:space="preserve">čez ponovitve, iz česar se sklepa, da je uporabnik vajo opravljal pod </w:t>
-      </w:r>
-      <w:r>
-        <w:t xml:space="preserve">njemu </w:t>
-      </w:r>
-      <w:r>
-        <w:t xml:space="preserve">veliko obremenitvijo in </w:t>
-      </w:r>
-      <w:r>
-        <w:t xml:space="preserve">da je </w:t>
-      </w:r>
-      <w:r>
-        <w:t xml:space="preserve">opravil serijo, ki je značilna za </w:t>
-      </w:r>
-      <w:r>
-        <w:t>trening</w:t>
-      </w:r>
-      <w:r>
-        <w:t xml:space="preserve"> </w:t>
-      </w:r>
-      <w:r>
-        <w:t>napredovanj</w:t>
-      </w:r>
-      <w:r>
-        <w:t>a</w:t>
-      </w:r>
-      <w:r>
-        <w:t xml:space="preserve"> v moči.</w:t>
-      </w:r>
-      <w:r>
-        <w:t xml:space="preserve"> </w:t>
-      </w:r>
-      <w:r>
-        <w:t>Če padajoči trend čez ponovitve ni prisoten in je cilj treninga napredovanje v moči, potem se uporabnika obvesti, da si naj za naslednjo serijo poveča obremenitev</w:t>
-      </w:r>
-      <w:r>
-        <w:t xml:space="preserve">, kajti tak trend </w:t>
-      </w:r>
-      <w:r>
-        <w:t xml:space="preserve">konstantne hitrosti čez ponovitve </w:t>
-      </w:r>
-      <w:r>
-        <w:t xml:space="preserve">je značilen za </w:t>
-      </w:r>
-      <w:r>
-        <w:t>trening ohranjanja moči</w:t>
-      </w:r>
-      <w:r>
-        <w:t>.</w:t>
-      </w:r>
-      <w:r>
-        <w:t xml:space="preserve"> </w:t>
-      </w:r>
-    </w:p>
-    <w:p/>
-    <w:p>
-      <w:r>
-        <w:t xml:space="preserve">Preko grafa hitrosti v koncentrični </w:t>
-      </w:r>
-      <w:r>
-        <w:t xml:space="preserve">je možno </w:t>
-      </w:r>
-      <w:r>
-        <w:t>napove</w:t>
-      </w:r>
-      <w:r>
-        <w:t>dati</w:t>
-      </w:r>
-      <w:r>
-        <w:t xml:space="preserve"> tip treninga na podlagi trenda hitrosti čez ponovitve. Edina predpostavka, ki mora biti izpolnjena za </w:t>
-      </w:r>
-      <w:r>
-        <w:t xml:space="preserve">potrditev </w:t>
-      </w:r>
-      <w:r>
-        <w:t>omenjen</w:t>
-      </w:r>
-      <w:r>
-        <w:t>ih</w:t>
-      </w:r>
-      <w:r>
-        <w:t xml:space="preserve"> ugotovit</w:t>
-      </w:r>
-      <w:r>
-        <w:t>ev</w:t>
-      </w:r>
-      <w:r>
-        <w:t>,</w:t>
-      </w:r>
-      <w:r>
-        <w:t xml:space="preserve"> je ta, da mora uporabnik med ponovit</w:t>
-      </w:r>
-      <w:r>
-        <w:t>vami</w:t>
-      </w:r>
-      <w:r>
-        <w:t xml:space="preserve"> dati vse od sebe.</w:t>
-      </w:r>
-    </w:p>
-    <w:p>
-      <w:pPr>
-        <w:pStyle w:val="Heading3"/>
-      </w:pPr>
-      <w:r>
-        <w:lastRenderedPageBreak/>
-        <w:t xml:space="preserve"> </w:t>
-      </w:r>
       <w:bookmarkStart w:id="40" w:name="_Toc221980706"/>
       <w:r>
         <w:t>Primerjava med treningi</w:t>
@@ -6555,7 +6916,7 @@
     </w:p>
     <w:p/>
     <w:sectPr>
-      <w:headerReference w:type="default" r:id="rId18"/>
+      <w:headerReference w:type="default" r:id="rId19"/>
       <w:pgSz w:w="11901" w:h="16834" w:code="9"/>
       <w:pgMar w:top="1701" w:right="1418" w:bottom="1701" w:left="1985" w:header="709" w:footer="709" w:gutter="0"/>
       <w:pgNumType w:start="1"/>
@@ -6701,8 +7062,8 @@
     <w:r>
       <w:t xml:space="preserve"> </w:t>
     </w:r>
-    <w:smartTag w:uri="urn:schemas-microsoft-com:office:smarttags" w:element="State">
-      <w:smartTag w:uri="urn:schemas-microsoft-com:office:smarttags" w:element="place">
+    <w:smartTag w:uri="urn:schemas-microsoft-com:office:smarttags" w:element="place">
+      <w:smartTag w:uri="urn:schemas-microsoft-com:office:smarttags" w:element="State">
         <w:r>
           <w:t>del</w:t>
         </w:r>
@@ -7503,6 +7864,119 @@
     </w:lvl>
   </w:abstractNum>
   <w:abstractNum w:abstractNumId="6" w15:restartNumberingAfterBreak="0">
+    <w:nsid w:val="09CA42D3"/>
+    <w:multiLevelType w:val="hybridMultilevel"/>
+    <w:tmpl w:val="AF90D838"/>
+    <w:lvl w:ilvl="0" w:tplc="20000001">
+      <w:start w:val="1"/>
+      <w:numFmt w:val="bullet"/>
+      <w:lvlText w:val=""/>
+      <w:lvlJc w:val="left"/>
+      <w:pPr>
+        <w:ind w:left="720" w:hanging="360"/>
+      </w:pPr>
+      <w:rPr>
+        <w:rFonts w:ascii="Symbol" w:hAnsi="Symbol" w:hint="default"/>
+      </w:rPr>
+    </w:lvl>
+    <w:lvl w:ilvl="1" w:tplc="20000003" w:tentative="1">
+      <w:start w:val="1"/>
+      <w:numFmt w:val="bullet"/>
+      <w:lvlText w:val="o"/>
+      <w:lvlJc w:val="left"/>
+      <w:pPr>
+        <w:ind w:left="1440" w:hanging="360"/>
+      </w:pPr>
+      <w:rPr>
+        <w:rFonts w:ascii="Courier New" w:hAnsi="Courier New" w:cs="Courier New" w:hint="default"/>
+      </w:rPr>
+    </w:lvl>
+    <w:lvl w:ilvl="2" w:tplc="20000005" w:tentative="1">
+      <w:start w:val="1"/>
+      <w:numFmt w:val="bullet"/>
+      <w:lvlText w:val=""/>
+      <w:lvlJc w:val="left"/>
+      <w:pPr>
+        <w:ind w:left="2160" w:hanging="360"/>
+      </w:pPr>
+      <w:rPr>
+        <w:rFonts w:ascii="Wingdings" w:hAnsi="Wingdings" w:hint="default"/>
+      </w:rPr>
+    </w:lvl>
+    <w:lvl w:ilvl="3" w:tplc="20000001" w:tentative="1">
+      <w:start w:val="1"/>
+      <w:numFmt w:val="bullet"/>
+      <w:lvlText w:val=""/>
+      <w:lvlJc w:val="left"/>
+      <w:pPr>
+        <w:ind w:left="2880" w:hanging="360"/>
+      </w:pPr>
+      <w:rPr>
+        <w:rFonts w:ascii="Symbol" w:hAnsi="Symbol" w:hint="default"/>
+      </w:rPr>
+    </w:lvl>
+    <w:lvl w:ilvl="4" w:tplc="20000003" w:tentative="1">
+      <w:start w:val="1"/>
+      <w:numFmt w:val="bullet"/>
+      <w:lvlText w:val="o"/>
+      <w:lvlJc w:val="left"/>
+      <w:pPr>
+        <w:ind w:left="3600" w:hanging="360"/>
+      </w:pPr>
+      <w:rPr>
+        <w:rFonts w:ascii="Courier New" w:hAnsi="Courier New" w:cs="Courier New" w:hint="default"/>
+      </w:rPr>
+    </w:lvl>
+    <w:lvl w:ilvl="5" w:tplc="20000005" w:tentative="1">
+      <w:start w:val="1"/>
+      <w:numFmt w:val="bullet"/>
+      <w:lvlText w:val=""/>
+      <w:lvlJc w:val="left"/>
+      <w:pPr>
+        <w:ind w:left="4320" w:hanging="360"/>
+      </w:pPr>
+      <w:rPr>
+        <w:rFonts w:ascii="Wingdings" w:hAnsi="Wingdings" w:hint="default"/>
+      </w:rPr>
+    </w:lvl>
+    <w:lvl w:ilvl="6" w:tplc="20000001" w:tentative="1">
+      <w:start w:val="1"/>
+      <w:numFmt w:val="bullet"/>
+      <w:lvlText w:val=""/>
+      <w:lvlJc w:val="left"/>
+      <w:pPr>
+        <w:ind w:left="5040" w:hanging="360"/>
+      </w:pPr>
+      <w:rPr>
+        <w:rFonts w:ascii="Symbol" w:hAnsi="Symbol" w:hint="default"/>
+      </w:rPr>
+    </w:lvl>
+    <w:lvl w:ilvl="7" w:tplc="20000003" w:tentative="1">
+      <w:start w:val="1"/>
+      <w:numFmt w:val="bullet"/>
+      <w:lvlText w:val="o"/>
+      <w:lvlJc w:val="left"/>
+      <w:pPr>
+        <w:ind w:left="5760" w:hanging="360"/>
+      </w:pPr>
+      <w:rPr>
+        <w:rFonts w:ascii="Courier New" w:hAnsi="Courier New" w:cs="Courier New" w:hint="default"/>
+      </w:rPr>
+    </w:lvl>
+    <w:lvl w:ilvl="8" w:tplc="20000005" w:tentative="1">
+      <w:start w:val="1"/>
+      <w:numFmt w:val="bullet"/>
+      <w:lvlText w:val=""/>
+      <w:lvlJc w:val="left"/>
+      <w:pPr>
+        <w:ind w:left="6480" w:hanging="360"/>
+      </w:pPr>
+      <w:rPr>
+        <w:rFonts w:ascii="Wingdings" w:hAnsi="Wingdings" w:hint="default"/>
+      </w:rPr>
+    </w:lvl>
+  </w:abstractNum>
+  <w:abstractNum w:abstractNumId="7" w15:restartNumberingAfterBreak="0">
     <w:nsid w:val="12BB3466"/>
     <w:multiLevelType w:val="hybridMultilevel"/>
     <w:tmpl w:val="A9BE7BD8"/>
@@ -7615,7 +8089,7 @@
       </w:rPr>
     </w:lvl>
   </w:abstractNum>
-  <w:abstractNum w:abstractNumId="7" w15:restartNumberingAfterBreak="0">
+  <w:abstractNum w:abstractNumId="8" w15:restartNumberingAfterBreak="0">
     <w:nsid w:val="15E64213"/>
     <w:multiLevelType w:val="hybridMultilevel"/>
     <w:tmpl w:val="373412B0"/>
@@ -7755,7 +8229,7 @@
       </w:rPr>
     </w:lvl>
   </w:abstractNum>
-  <w:abstractNum w:abstractNumId="8" w15:restartNumberingAfterBreak="0">
+  <w:abstractNum w:abstractNumId="9" w15:restartNumberingAfterBreak="0">
     <w:nsid w:val="15F62775"/>
     <w:multiLevelType w:val="hybridMultilevel"/>
     <w:tmpl w:val="45808BD4"/>
@@ -7868,7 +8342,7 @@
       </w:rPr>
     </w:lvl>
   </w:abstractNum>
-  <w:abstractNum w:abstractNumId="9" w15:restartNumberingAfterBreak="0">
+  <w:abstractNum w:abstractNumId="10" w15:restartNumberingAfterBreak="0">
     <w:nsid w:val="19EB050D"/>
     <w:multiLevelType w:val="hybridMultilevel"/>
     <w:tmpl w:val="C1046816"/>
@@ -7981,7 +8455,7 @@
       </w:rPr>
     </w:lvl>
   </w:abstractNum>
-  <w:abstractNum w:abstractNumId="10" w15:restartNumberingAfterBreak="0">
+  <w:abstractNum w:abstractNumId="11" w15:restartNumberingAfterBreak="0">
     <w:nsid w:val="1D3240EF"/>
     <w:multiLevelType w:val="hybridMultilevel"/>
     <w:tmpl w:val="C45EC7D6"/>
@@ -8094,7 +8568,7 @@
       </w:rPr>
     </w:lvl>
   </w:abstractNum>
-  <w:abstractNum w:abstractNumId="11" w15:restartNumberingAfterBreak="0">
+  <w:abstractNum w:abstractNumId="12" w15:restartNumberingAfterBreak="0">
     <w:nsid w:val="230F33CC"/>
     <w:multiLevelType w:val="hybridMultilevel"/>
     <w:tmpl w:val="B338FCA8"/>
@@ -8234,7 +8708,7 @@
       </w:rPr>
     </w:lvl>
   </w:abstractNum>
-  <w:abstractNum w:abstractNumId="12" w15:restartNumberingAfterBreak="0">
+  <w:abstractNum w:abstractNumId="13" w15:restartNumberingAfterBreak="0">
     <w:nsid w:val="24132489"/>
     <w:multiLevelType w:val="hybridMultilevel"/>
     <w:tmpl w:val="074AEF96"/>
@@ -8347,7 +8821,120 @@
       </w:rPr>
     </w:lvl>
   </w:abstractNum>
-  <w:abstractNum w:abstractNumId="13" w15:restartNumberingAfterBreak="0">
+  <w:abstractNum w:abstractNumId="14" w15:restartNumberingAfterBreak="0">
+    <w:nsid w:val="24E4038C"/>
+    <w:multiLevelType w:val="hybridMultilevel"/>
+    <w:tmpl w:val="8908963E"/>
+    <w:lvl w:ilvl="0" w:tplc="20000001">
+      <w:start w:val="1"/>
+      <w:numFmt w:val="bullet"/>
+      <w:lvlText w:val=""/>
+      <w:lvlJc w:val="left"/>
+      <w:pPr>
+        <w:ind w:left="774" w:hanging="360"/>
+      </w:pPr>
+      <w:rPr>
+        <w:rFonts w:ascii="Symbol" w:hAnsi="Symbol" w:hint="default"/>
+      </w:rPr>
+    </w:lvl>
+    <w:lvl w:ilvl="1" w:tplc="20000003" w:tentative="1">
+      <w:start w:val="1"/>
+      <w:numFmt w:val="bullet"/>
+      <w:lvlText w:val="o"/>
+      <w:lvlJc w:val="left"/>
+      <w:pPr>
+        <w:ind w:left="1494" w:hanging="360"/>
+      </w:pPr>
+      <w:rPr>
+        <w:rFonts w:ascii="Courier New" w:hAnsi="Courier New" w:cs="Courier New" w:hint="default"/>
+      </w:rPr>
+    </w:lvl>
+    <w:lvl w:ilvl="2" w:tplc="20000005" w:tentative="1">
+      <w:start w:val="1"/>
+      <w:numFmt w:val="bullet"/>
+      <w:lvlText w:val=""/>
+      <w:lvlJc w:val="left"/>
+      <w:pPr>
+        <w:ind w:left="2214" w:hanging="360"/>
+      </w:pPr>
+      <w:rPr>
+        <w:rFonts w:ascii="Wingdings" w:hAnsi="Wingdings" w:hint="default"/>
+      </w:rPr>
+    </w:lvl>
+    <w:lvl w:ilvl="3" w:tplc="20000001" w:tentative="1">
+      <w:start w:val="1"/>
+      <w:numFmt w:val="bullet"/>
+      <w:lvlText w:val=""/>
+      <w:lvlJc w:val="left"/>
+      <w:pPr>
+        <w:ind w:left="2934" w:hanging="360"/>
+      </w:pPr>
+      <w:rPr>
+        <w:rFonts w:ascii="Symbol" w:hAnsi="Symbol" w:hint="default"/>
+      </w:rPr>
+    </w:lvl>
+    <w:lvl w:ilvl="4" w:tplc="20000003" w:tentative="1">
+      <w:start w:val="1"/>
+      <w:numFmt w:val="bullet"/>
+      <w:lvlText w:val="o"/>
+      <w:lvlJc w:val="left"/>
+      <w:pPr>
+        <w:ind w:left="3654" w:hanging="360"/>
+      </w:pPr>
+      <w:rPr>
+        <w:rFonts w:ascii="Courier New" w:hAnsi="Courier New" w:cs="Courier New" w:hint="default"/>
+      </w:rPr>
+    </w:lvl>
+    <w:lvl w:ilvl="5" w:tplc="20000005" w:tentative="1">
+      <w:start w:val="1"/>
+      <w:numFmt w:val="bullet"/>
+      <w:lvlText w:val=""/>
+      <w:lvlJc w:val="left"/>
+      <w:pPr>
+        <w:ind w:left="4374" w:hanging="360"/>
+      </w:pPr>
+      <w:rPr>
+        <w:rFonts w:ascii="Wingdings" w:hAnsi="Wingdings" w:hint="default"/>
+      </w:rPr>
+    </w:lvl>
+    <w:lvl w:ilvl="6" w:tplc="20000001" w:tentative="1">
+      <w:start w:val="1"/>
+      <w:numFmt w:val="bullet"/>
+      <w:lvlText w:val=""/>
+      <w:lvlJc w:val="left"/>
+      <w:pPr>
+        <w:ind w:left="5094" w:hanging="360"/>
+      </w:pPr>
+      <w:rPr>
+        <w:rFonts w:ascii="Symbol" w:hAnsi="Symbol" w:hint="default"/>
+      </w:rPr>
+    </w:lvl>
+    <w:lvl w:ilvl="7" w:tplc="20000003" w:tentative="1">
+      <w:start w:val="1"/>
+      <w:numFmt w:val="bullet"/>
+      <w:lvlText w:val="o"/>
+      <w:lvlJc w:val="left"/>
+      <w:pPr>
+        <w:ind w:left="5814" w:hanging="360"/>
+      </w:pPr>
+      <w:rPr>
+        <w:rFonts w:ascii="Courier New" w:hAnsi="Courier New" w:cs="Courier New" w:hint="default"/>
+      </w:rPr>
+    </w:lvl>
+    <w:lvl w:ilvl="8" w:tplc="20000005" w:tentative="1">
+      <w:start w:val="1"/>
+      <w:numFmt w:val="bullet"/>
+      <w:lvlText w:val=""/>
+      <w:lvlJc w:val="left"/>
+      <w:pPr>
+        <w:ind w:left="6534" w:hanging="360"/>
+      </w:pPr>
+      <w:rPr>
+        <w:rFonts w:ascii="Wingdings" w:hAnsi="Wingdings" w:hint="default"/>
+      </w:rPr>
+    </w:lvl>
+  </w:abstractNum>
+  <w:abstractNum w:abstractNumId="15" w15:restartNumberingAfterBreak="0">
     <w:nsid w:val="2A2506EB"/>
     <w:multiLevelType w:val="hybridMultilevel"/>
     <w:tmpl w:val="31C47450"/>
@@ -8464,7 +9051,7 @@
       </w:rPr>
     </w:lvl>
   </w:abstractNum>
-  <w:abstractNum w:abstractNumId="14" w15:restartNumberingAfterBreak="0">
+  <w:abstractNum w:abstractNumId="16" w15:restartNumberingAfterBreak="0">
     <w:nsid w:val="33BE4792"/>
     <w:multiLevelType w:val="hybridMultilevel"/>
     <w:tmpl w:val="0368EF64"/>
@@ -8604,7 +9191,7 @@
       </w:rPr>
     </w:lvl>
   </w:abstractNum>
-  <w:abstractNum w:abstractNumId="15" w15:restartNumberingAfterBreak="0">
+  <w:abstractNum w:abstractNumId="17" w15:restartNumberingAfterBreak="0">
     <w:nsid w:val="367C600F"/>
     <w:multiLevelType w:val="multilevel"/>
     <w:tmpl w:val="66F66ADC"/>
@@ -8755,7 +9342,7 @@
       </w:rPr>
     </w:lvl>
   </w:abstractNum>
-  <w:abstractNum w:abstractNumId="16" w15:restartNumberingAfterBreak="0">
+  <w:abstractNum w:abstractNumId="18" w15:restartNumberingAfterBreak="0">
     <w:nsid w:val="3D081AB8"/>
     <w:multiLevelType w:val="hybridMultilevel"/>
     <w:tmpl w:val="12163E56"/>
@@ -8868,7 +9455,7 @@
       </w:rPr>
     </w:lvl>
   </w:abstractNum>
-  <w:abstractNum w:abstractNumId="17" w15:restartNumberingAfterBreak="0">
+  <w:abstractNum w:abstractNumId="19" w15:restartNumberingAfterBreak="0">
     <w:nsid w:val="3E754FB9"/>
     <w:multiLevelType w:val="hybridMultilevel"/>
     <w:tmpl w:val="5B2E8608"/>
@@ -8980,7 +9567,7 @@
       </w:rPr>
     </w:lvl>
   </w:abstractNum>
-  <w:abstractNum w:abstractNumId="18" w15:restartNumberingAfterBreak="0">
+  <w:abstractNum w:abstractNumId="20" w15:restartNumberingAfterBreak="0">
     <w:nsid w:val="3E7F57E5"/>
     <w:multiLevelType w:val="hybridMultilevel"/>
     <w:tmpl w:val="515A5522"/>
@@ -9093,7 +9680,7 @@
       </w:rPr>
     </w:lvl>
   </w:abstractNum>
-  <w:abstractNum w:abstractNumId="19" w15:restartNumberingAfterBreak="0">
+  <w:abstractNum w:abstractNumId="21" w15:restartNumberingAfterBreak="0">
     <w:nsid w:val="40117AB4"/>
     <w:multiLevelType w:val="singleLevel"/>
     <w:tmpl w:val="0424000F"/>
@@ -9113,7 +9700,7 @@
       </w:rPr>
     </w:lvl>
   </w:abstractNum>
-  <w:abstractNum w:abstractNumId="20" w15:restartNumberingAfterBreak="0">
+  <w:abstractNum w:abstractNumId="22" w15:restartNumberingAfterBreak="0">
     <w:nsid w:val="45F04156"/>
     <w:multiLevelType w:val="hybridMultilevel"/>
     <w:tmpl w:val="8648D69E"/>
@@ -9226,7 +9813,7 @@
       </w:rPr>
     </w:lvl>
   </w:abstractNum>
-  <w:abstractNum w:abstractNumId="21" w15:restartNumberingAfterBreak="0">
+  <w:abstractNum w:abstractNumId="23" w15:restartNumberingAfterBreak="0">
     <w:nsid w:val="4D737F36"/>
     <w:multiLevelType w:val="hybridMultilevel"/>
     <w:tmpl w:val="2FCADFCC"/>
@@ -9339,7 +9926,7 @@
       </w:rPr>
     </w:lvl>
   </w:abstractNum>
-  <w:abstractNum w:abstractNumId="22" w15:restartNumberingAfterBreak="0">
+  <w:abstractNum w:abstractNumId="24" w15:restartNumberingAfterBreak="0">
     <w:nsid w:val="56210033"/>
     <w:multiLevelType w:val="hybridMultilevel"/>
     <w:tmpl w:val="B834133E"/>
@@ -9452,7 +10039,7 @@
       </w:rPr>
     </w:lvl>
   </w:abstractNum>
-  <w:abstractNum w:abstractNumId="23" w15:restartNumberingAfterBreak="0">
+  <w:abstractNum w:abstractNumId="25" w15:restartNumberingAfterBreak="0">
     <w:nsid w:val="566D6DDD"/>
     <w:multiLevelType w:val="hybridMultilevel"/>
     <w:tmpl w:val="E55A3D24"/>
@@ -9592,7 +10179,7 @@
       </w:rPr>
     </w:lvl>
   </w:abstractNum>
-  <w:abstractNum w:abstractNumId="24" w15:restartNumberingAfterBreak="0">
+  <w:abstractNum w:abstractNumId="26" w15:restartNumberingAfterBreak="0">
     <w:nsid w:val="56C4537D"/>
     <w:multiLevelType w:val="hybridMultilevel"/>
     <w:tmpl w:val="66485F72"/>
@@ -9705,7 +10292,7 @@
       </w:rPr>
     </w:lvl>
   </w:abstractNum>
-  <w:abstractNum w:abstractNumId="25" w15:restartNumberingAfterBreak="0">
+  <w:abstractNum w:abstractNumId="27" w15:restartNumberingAfterBreak="0">
     <w:nsid w:val="574533E9"/>
     <w:multiLevelType w:val="hybridMultilevel"/>
     <w:tmpl w:val="5B146962"/>
@@ -9817,7 +10404,7 @@
       </w:rPr>
     </w:lvl>
   </w:abstractNum>
-  <w:abstractNum w:abstractNumId="26" w15:restartNumberingAfterBreak="0">
+  <w:abstractNum w:abstractNumId="28" w15:restartNumberingAfterBreak="0">
     <w:nsid w:val="58DE7EFA"/>
     <w:multiLevelType w:val="hybridMultilevel"/>
     <w:tmpl w:val="131EA528"/>
@@ -9912,7 +10499,7 @@
       </w:pPr>
     </w:lvl>
   </w:abstractNum>
-  <w:abstractNum w:abstractNumId="27" w15:restartNumberingAfterBreak="0">
+  <w:abstractNum w:abstractNumId="29" w15:restartNumberingAfterBreak="0">
     <w:nsid w:val="5AC4619C"/>
     <w:multiLevelType w:val="hybridMultilevel"/>
     <w:tmpl w:val="DFB60A26"/>
@@ -10024,7 +10611,7 @@
       </w:rPr>
     </w:lvl>
   </w:abstractNum>
-  <w:abstractNum w:abstractNumId="28" w15:restartNumberingAfterBreak="0">
+  <w:abstractNum w:abstractNumId="30" w15:restartNumberingAfterBreak="0">
     <w:nsid w:val="5D4B3E35"/>
     <w:multiLevelType w:val="hybridMultilevel"/>
     <w:tmpl w:val="63006618"/>
@@ -10137,7 +10724,7 @@
       </w:rPr>
     </w:lvl>
   </w:abstractNum>
-  <w:abstractNum w:abstractNumId="29" w15:restartNumberingAfterBreak="0">
+  <w:abstractNum w:abstractNumId="31" w15:restartNumberingAfterBreak="0">
     <w:nsid w:val="5E1C298F"/>
     <w:multiLevelType w:val="hybridMultilevel"/>
     <w:tmpl w:val="7642668E"/>
@@ -10250,7 +10837,7 @@
       </w:rPr>
     </w:lvl>
   </w:abstractNum>
-  <w:abstractNum w:abstractNumId="30" w15:restartNumberingAfterBreak="0">
+  <w:abstractNum w:abstractNumId="32" w15:restartNumberingAfterBreak="0">
     <w:nsid w:val="613216BC"/>
     <w:multiLevelType w:val="hybridMultilevel"/>
     <w:tmpl w:val="DCD43D76"/>
@@ -10363,7 +10950,7 @@
       </w:rPr>
     </w:lvl>
   </w:abstractNum>
-  <w:abstractNum w:abstractNumId="31" w15:restartNumberingAfterBreak="0">
+  <w:abstractNum w:abstractNumId="33" w15:restartNumberingAfterBreak="0">
     <w:nsid w:val="62CA2A8F"/>
     <w:multiLevelType w:val="hybridMultilevel"/>
     <w:tmpl w:val="9E62B7C8"/>
@@ -10476,7 +11063,7 @@
       </w:rPr>
     </w:lvl>
   </w:abstractNum>
-  <w:abstractNum w:abstractNumId="32" w15:restartNumberingAfterBreak="0">
+  <w:abstractNum w:abstractNumId="34" w15:restartNumberingAfterBreak="0">
     <w:nsid w:val="642B0707"/>
     <w:multiLevelType w:val="hybridMultilevel"/>
     <w:tmpl w:val="6F824434"/>
@@ -10589,7 +11176,7 @@
       </w:rPr>
     </w:lvl>
   </w:abstractNum>
-  <w:abstractNum w:abstractNumId="33" w15:restartNumberingAfterBreak="0">
+  <w:abstractNum w:abstractNumId="35" w15:restartNumberingAfterBreak="0">
     <w:nsid w:val="657C167B"/>
     <w:multiLevelType w:val="hybridMultilevel"/>
     <w:tmpl w:val="253E1E4A"/>
@@ -10702,7 +11289,7 @@
       </w:rPr>
     </w:lvl>
   </w:abstractNum>
-  <w:abstractNum w:abstractNumId="34" w15:restartNumberingAfterBreak="0">
+  <w:abstractNum w:abstractNumId="36" w15:restartNumberingAfterBreak="0">
     <w:nsid w:val="6F112B8F"/>
     <w:multiLevelType w:val="hybridMultilevel"/>
     <w:tmpl w:val="DD189394"/>
@@ -10815,7 +11402,120 @@
       </w:rPr>
     </w:lvl>
   </w:abstractNum>
-  <w:abstractNum w:abstractNumId="35" w15:restartNumberingAfterBreak="0">
+  <w:abstractNum w:abstractNumId="37" w15:restartNumberingAfterBreak="0">
+    <w:nsid w:val="6F7A5BE4"/>
+    <w:multiLevelType w:val="hybridMultilevel"/>
+    <w:tmpl w:val="1B76D9FC"/>
+    <w:lvl w:ilvl="0" w:tplc="20000001">
+      <w:start w:val="1"/>
+      <w:numFmt w:val="bullet"/>
+      <w:lvlText w:val=""/>
+      <w:lvlJc w:val="left"/>
+      <w:pPr>
+        <w:ind w:left="720" w:hanging="360"/>
+      </w:pPr>
+      <w:rPr>
+        <w:rFonts w:ascii="Symbol" w:hAnsi="Symbol" w:hint="default"/>
+      </w:rPr>
+    </w:lvl>
+    <w:lvl w:ilvl="1" w:tplc="20000003" w:tentative="1">
+      <w:start w:val="1"/>
+      <w:numFmt w:val="bullet"/>
+      <w:lvlText w:val="o"/>
+      <w:lvlJc w:val="left"/>
+      <w:pPr>
+        <w:ind w:left="1440" w:hanging="360"/>
+      </w:pPr>
+      <w:rPr>
+        <w:rFonts w:ascii="Courier New" w:hAnsi="Courier New" w:cs="Courier New" w:hint="default"/>
+      </w:rPr>
+    </w:lvl>
+    <w:lvl w:ilvl="2" w:tplc="20000005" w:tentative="1">
+      <w:start w:val="1"/>
+      <w:numFmt w:val="bullet"/>
+      <w:lvlText w:val=""/>
+      <w:lvlJc w:val="left"/>
+      <w:pPr>
+        <w:ind w:left="2160" w:hanging="360"/>
+      </w:pPr>
+      <w:rPr>
+        <w:rFonts w:ascii="Wingdings" w:hAnsi="Wingdings" w:hint="default"/>
+      </w:rPr>
+    </w:lvl>
+    <w:lvl w:ilvl="3" w:tplc="20000001" w:tentative="1">
+      <w:start w:val="1"/>
+      <w:numFmt w:val="bullet"/>
+      <w:lvlText w:val=""/>
+      <w:lvlJc w:val="left"/>
+      <w:pPr>
+        <w:ind w:left="2880" w:hanging="360"/>
+      </w:pPr>
+      <w:rPr>
+        <w:rFonts w:ascii="Symbol" w:hAnsi="Symbol" w:hint="default"/>
+      </w:rPr>
+    </w:lvl>
+    <w:lvl w:ilvl="4" w:tplc="20000003" w:tentative="1">
+      <w:start w:val="1"/>
+      <w:numFmt w:val="bullet"/>
+      <w:lvlText w:val="o"/>
+      <w:lvlJc w:val="left"/>
+      <w:pPr>
+        <w:ind w:left="3600" w:hanging="360"/>
+      </w:pPr>
+      <w:rPr>
+        <w:rFonts w:ascii="Courier New" w:hAnsi="Courier New" w:cs="Courier New" w:hint="default"/>
+      </w:rPr>
+    </w:lvl>
+    <w:lvl w:ilvl="5" w:tplc="20000005" w:tentative="1">
+      <w:start w:val="1"/>
+      <w:numFmt w:val="bullet"/>
+      <w:lvlText w:val=""/>
+      <w:lvlJc w:val="left"/>
+      <w:pPr>
+        <w:ind w:left="4320" w:hanging="360"/>
+      </w:pPr>
+      <w:rPr>
+        <w:rFonts w:ascii="Wingdings" w:hAnsi="Wingdings" w:hint="default"/>
+      </w:rPr>
+    </w:lvl>
+    <w:lvl w:ilvl="6" w:tplc="20000001" w:tentative="1">
+      <w:start w:val="1"/>
+      <w:numFmt w:val="bullet"/>
+      <w:lvlText w:val=""/>
+      <w:lvlJc w:val="left"/>
+      <w:pPr>
+        <w:ind w:left="5040" w:hanging="360"/>
+      </w:pPr>
+      <w:rPr>
+        <w:rFonts w:ascii="Symbol" w:hAnsi="Symbol" w:hint="default"/>
+      </w:rPr>
+    </w:lvl>
+    <w:lvl w:ilvl="7" w:tplc="20000003" w:tentative="1">
+      <w:start w:val="1"/>
+      <w:numFmt w:val="bullet"/>
+      <w:lvlText w:val="o"/>
+      <w:lvlJc w:val="left"/>
+      <w:pPr>
+        <w:ind w:left="5760" w:hanging="360"/>
+      </w:pPr>
+      <w:rPr>
+        <w:rFonts w:ascii="Courier New" w:hAnsi="Courier New" w:cs="Courier New" w:hint="default"/>
+      </w:rPr>
+    </w:lvl>
+    <w:lvl w:ilvl="8" w:tplc="20000005" w:tentative="1">
+      <w:start w:val="1"/>
+      <w:numFmt w:val="bullet"/>
+      <w:lvlText w:val=""/>
+      <w:lvlJc w:val="left"/>
+      <w:pPr>
+        <w:ind w:left="6480" w:hanging="360"/>
+      </w:pPr>
+      <w:rPr>
+        <w:rFonts w:ascii="Wingdings" w:hAnsi="Wingdings" w:hint="default"/>
+      </w:rPr>
+    </w:lvl>
+  </w:abstractNum>
+  <w:abstractNum w:abstractNumId="38" w15:restartNumberingAfterBreak="0">
     <w:nsid w:val="70624018"/>
     <w:multiLevelType w:val="hybridMultilevel"/>
     <w:tmpl w:val="225C64B6"/>
@@ -10955,7 +11655,7 @@
       </w:rPr>
     </w:lvl>
   </w:abstractNum>
-  <w:abstractNum w:abstractNumId="36" w15:restartNumberingAfterBreak="0">
+  <w:abstractNum w:abstractNumId="39" w15:restartNumberingAfterBreak="0">
     <w:nsid w:val="74967D99"/>
     <w:multiLevelType w:val="multilevel"/>
     <w:tmpl w:val="6F1612AC"/>
@@ -11095,7 +11795,7 @@
       </w:rPr>
     </w:lvl>
   </w:abstractNum>
-  <w:abstractNum w:abstractNumId="37" w15:restartNumberingAfterBreak="0">
+  <w:abstractNum w:abstractNumId="40" w15:restartNumberingAfterBreak="0">
     <w:nsid w:val="780E0E44"/>
     <w:multiLevelType w:val="hybridMultilevel"/>
     <w:tmpl w:val="10468E06"/>
@@ -11209,16 +11909,16 @@
     </w:lvl>
   </w:abstractNum>
   <w:num w:numId="1" w16cid:durableId="1616982145">
-    <w:abstractNumId w:val="15"/>
+    <w:abstractNumId w:val="17"/>
   </w:num>
   <w:num w:numId="2" w16cid:durableId="1563980195">
-    <w:abstractNumId w:val="11"/>
+    <w:abstractNumId w:val="12"/>
   </w:num>
   <w:num w:numId="3" w16cid:durableId="574165386">
-    <w:abstractNumId w:val="14"/>
+    <w:abstractNumId w:val="16"/>
   </w:num>
   <w:num w:numId="4" w16cid:durableId="1982886481">
-    <w:abstractNumId w:val="23"/>
+    <w:abstractNumId w:val="25"/>
     <w:lvlOverride w:ilvl="0"/>
     <w:lvlOverride w:ilvl="1">
       <w:startOverride w:val="1"/>
@@ -11246,43 +11946,43 @@
     </w:lvlOverride>
   </w:num>
   <w:num w:numId="5" w16cid:durableId="1343313269">
-    <w:abstractNumId w:val="7"/>
+    <w:abstractNumId w:val="8"/>
   </w:num>
   <w:num w:numId="6" w16cid:durableId="413548033">
-    <w:abstractNumId w:val="35"/>
+    <w:abstractNumId w:val="38"/>
   </w:num>
   <w:num w:numId="7" w16cid:durableId="2517385">
-    <w:abstractNumId w:val="34"/>
+    <w:abstractNumId w:val="36"/>
   </w:num>
   <w:num w:numId="8" w16cid:durableId="1673027270">
-    <w:abstractNumId w:val="12"/>
+    <w:abstractNumId w:val="13"/>
   </w:num>
   <w:num w:numId="9" w16cid:durableId="310713017">
     <w:abstractNumId w:val="5"/>
   </w:num>
   <w:num w:numId="10" w16cid:durableId="642394832">
-    <w:abstractNumId w:val="22"/>
+    <w:abstractNumId w:val="24"/>
   </w:num>
   <w:num w:numId="11" w16cid:durableId="879364368">
-    <w:abstractNumId w:val="10"/>
+    <w:abstractNumId w:val="11"/>
   </w:num>
   <w:num w:numId="12" w16cid:durableId="1154762435">
-    <w:abstractNumId w:val="29"/>
+    <w:abstractNumId w:val="31"/>
   </w:num>
   <w:num w:numId="13" w16cid:durableId="1050419267">
-    <w:abstractNumId w:val="31"/>
+    <w:abstractNumId w:val="33"/>
   </w:num>
   <w:num w:numId="14" w16cid:durableId="1990405806">
-    <w:abstractNumId w:val="8"/>
+    <w:abstractNumId w:val="9"/>
   </w:num>
   <w:num w:numId="15" w16cid:durableId="1546913352">
-    <w:abstractNumId w:val="32"/>
+    <w:abstractNumId w:val="34"/>
   </w:num>
   <w:num w:numId="16" w16cid:durableId="1318874548">
-    <w:abstractNumId w:val="36"/>
+    <w:abstractNumId w:val="39"/>
   </w:num>
   <w:num w:numId="17" w16cid:durableId="722215861">
-    <w:abstractNumId w:val="36"/>
+    <w:abstractNumId w:val="39"/>
     <w:lvlOverride w:ilvl="0">
       <w:startOverride w:val="1"/>
     </w:lvlOverride>
@@ -11312,7 +12012,7 @@
     </w:lvlOverride>
   </w:num>
   <w:num w:numId="18" w16cid:durableId="415446333">
-    <w:abstractNumId w:val="36"/>
+    <w:abstractNumId w:val="39"/>
     <w:lvlOverride w:ilvl="0">
       <w:startOverride w:val="1"/>
     </w:lvlOverride>
@@ -11342,7 +12042,7 @@
     </w:lvlOverride>
   </w:num>
   <w:num w:numId="19" w16cid:durableId="1966346266">
-    <w:abstractNumId w:val="36"/>
+    <w:abstractNumId w:val="39"/>
     <w:lvlOverride w:ilvl="0">
       <w:startOverride w:val="1"/>
     </w:lvlOverride>
@@ -11372,7 +12072,7 @@
     </w:lvlOverride>
   </w:num>
   <w:num w:numId="20" w16cid:durableId="985356155">
-    <w:abstractNumId w:val="36"/>
+    <w:abstractNumId w:val="39"/>
     <w:lvlOverride w:ilvl="0">
       <w:startOverride w:val="1"/>
     </w:lvlOverride>
@@ -11402,7 +12102,7 @@
     </w:lvlOverride>
   </w:num>
   <w:num w:numId="21" w16cid:durableId="971326932">
-    <w:abstractNumId w:val="36"/>
+    <w:abstractNumId w:val="39"/>
     <w:lvlOverride w:ilvl="0">
       <w:startOverride w:val="1"/>
     </w:lvlOverride>
@@ -11432,7 +12132,7 @@
     </w:lvlOverride>
   </w:num>
   <w:num w:numId="22" w16cid:durableId="874578897">
-    <w:abstractNumId w:val="36"/>
+    <w:abstractNumId w:val="39"/>
     <w:lvlOverride w:ilvl="0">
       <w:startOverride w:val="1"/>
     </w:lvlOverride>
@@ -11462,7 +12162,7 @@
     </w:lvlOverride>
   </w:num>
   <w:num w:numId="23" w16cid:durableId="184097708">
-    <w:abstractNumId w:val="36"/>
+    <w:abstractNumId w:val="39"/>
     <w:lvlOverride w:ilvl="0">
       <w:startOverride w:val="1"/>
     </w:lvlOverride>
@@ -11492,7 +12192,7 @@
     </w:lvlOverride>
   </w:num>
   <w:num w:numId="24" w16cid:durableId="1147547601">
-    <w:abstractNumId w:val="36"/>
+    <w:abstractNumId w:val="39"/>
     <w:lvlOverride w:ilvl="0">
       <w:startOverride w:val="1"/>
     </w:lvlOverride>
@@ -11522,7 +12222,7 @@
     </w:lvlOverride>
   </w:num>
   <w:num w:numId="25" w16cid:durableId="697269251">
-    <w:abstractNumId w:val="36"/>
+    <w:abstractNumId w:val="39"/>
     <w:lvlOverride w:ilvl="0">
       <w:startOverride w:val="1"/>
     </w:lvlOverride>
@@ -11552,7 +12252,7 @@
     </w:lvlOverride>
   </w:num>
   <w:num w:numId="26" w16cid:durableId="623387041">
-    <w:abstractNumId w:val="36"/>
+    <w:abstractNumId w:val="39"/>
     <w:lvlOverride w:ilvl="0">
       <w:startOverride w:val="1"/>
     </w:lvlOverride>
@@ -11582,7 +12282,7 @@
     </w:lvlOverride>
   </w:num>
   <w:num w:numId="27" w16cid:durableId="571545525">
-    <w:abstractNumId w:val="36"/>
+    <w:abstractNumId w:val="39"/>
     <w:lvlOverride w:ilvl="0">
       <w:startOverride w:val="1"/>
     </w:lvlOverride>
@@ -11615,19 +12315,19 @@
     <w:abstractNumId w:val="2"/>
   </w:num>
   <w:num w:numId="29" w16cid:durableId="1318532482">
-    <w:abstractNumId w:val="30"/>
+    <w:abstractNumId w:val="32"/>
   </w:num>
   <w:num w:numId="30" w16cid:durableId="2085495198">
     <w:abstractNumId w:val="3"/>
   </w:num>
   <w:num w:numId="31" w16cid:durableId="1159468039">
-    <w:abstractNumId w:val="22"/>
+    <w:abstractNumId w:val="24"/>
   </w:num>
   <w:num w:numId="32" w16cid:durableId="2134787325">
-    <w:abstractNumId w:val="19"/>
+    <w:abstractNumId w:val="21"/>
   </w:num>
   <w:num w:numId="33" w16cid:durableId="690107431">
-    <w:abstractNumId w:val="23"/>
+    <w:abstractNumId w:val="25"/>
     <w:lvlOverride w:ilvl="0"/>
     <w:lvlOverride w:ilvl="1">
       <w:startOverride w:val="1"/>
@@ -11655,64 +12355,73 @@
     </w:lvlOverride>
   </w:num>
   <w:num w:numId="34" w16cid:durableId="1695031192">
-    <w:abstractNumId w:val="23"/>
+    <w:abstractNumId w:val="25"/>
   </w:num>
   <w:num w:numId="35" w16cid:durableId="1474131380">
-    <w:abstractNumId w:val="23"/>
+    <w:abstractNumId w:val="25"/>
   </w:num>
   <w:num w:numId="36" w16cid:durableId="385646365">
-    <w:abstractNumId w:val="13"/>
+    <w:abstractNumId w:val="15"/>
   </w:num>
   <w:num w:numId="37" w16cid:durableId="774322130">
-    <w:abstractNumId w:val="6"/>
+    <w:abstractNumId w:val="7"/>
   </w:num>
   <w:num w:numId="38" w16cid:durableId="1273244240">
-    <w:abstractNumId w:val="26"/>
+    <w:abstractNumId w:val="28"/>
   </w:num>
   <w:num w:numId="39" w16cid:durableId="1302419245">
-    <w:abstractNumId w:val="33"/>
+    <w:abstractNumId w:val="35"/>
   </w:num>
   <w:num w:numId="40" w16cid:durableId="671757144">
     <w:abstractNumId w:val="4"/>
   </w:num>
   <w:num w:numId="41" w16cid:durableId="1609465245">
-    <w:abstractNumId w:val="20"/>
+    <w:abstractNumId w:val="22"/>
   </w:num>
   <w:num w:numId="42" w16cid:durableId="1924870052">
-    <w:abstractNumId w:val="28"/>
+    <w:abstractNumId w:val="30"/>
   </w:num>
   <w:num w:numId="43" w16cid:durableId="1546983496">
     <w:abstractNumId w:val="1"/>
   </w:num>
   <w:num w:numId="44" w16cid:durableId="1243755491">
-    <w:abstractNumId w:val="16"/>
+    <w:abstractNumId w:val="18"/>
   </w:num>
   <w:num w:numId="45" w16cid:durableId="2112815720">
-    <w:abstractNumId w:val="27"/>
+    <w:abstractNumId w:val="29"/>
   </w:num>
   <w:num w:numId="46" w16cid:durableId="495389479">
-    <w:abstractNumId w:val="37"/>
+    <w:abstractNumId w:val="40"/>
   </w:num>
   <w:num w:numId="47" w16cid:durableId="1000545877">
-    <w:abstractNumId w:val="21"/>
+    <w:abstractNumId w:val="23"/>
   </w:num>
   <w:num w:numId="48" w16cid:durableId="853347394">
     <w:abstractNumId w:val="0"/>
   </w:num>
   <w:num w:numId="49" w16cid:durableId="1105929742">
-    <w:abstractNumId w:val="9"/>
+    <w:abstractNumId w:val="10"/>
   </w:num>
   <w:num w:numId="50" w16cid:durableId="7145556">
-    <w:abstractNumId w:val="18"/>
+    <w:abstractNumId w:val="20"/>
   </w:num>
   <w:num w:numId="51" w16cid:durableId="271405964">
-    <w:abstractNumId w:val="24"/>
+    <w:abstractNumId w:val="26"/>
   </w:num>
   <w:num w:numId="52" w16cid:durableId="1874154734">
-    <w:abstractNumId w:val="25"/>
+    <w:abstractNumId w:val="27"/>
   </w:num>
   <w:num w:numId="53" w16cid:durableId="791943569">
-    <w:abstractNumId w:val="17"/>
+    <w:abstractNumId w:val="19"/>
+  </w:num>
+  <w:num w:numId="54" w16cid:durableId="1422987211">
+    <w:abstractNumId w:val="6"/>
+  </w:num>
+  <w:num w:numId="55" w16cid:durableId="2036425246">
+    <w:abstractNumId w:val="37"/>
+  </w:num>
+  <w:num w:numId="56" w16cid:durableId="305286039">
+    <w:abstractNumId w:val="14"/>
   </w:num>
   <w:numIdMacAtCleanup w:val="15"/>
 </w:numbering>

</xml_diff>

<commit_message>
feat: implement PCK and by keypoint comparison
</commit_message>
<xml_diff>
--- a/docs/thesis/magistrsko-delo-jasa-zupancic.docx
+++ b/docs/thesis/magistrsko-delo-jasa-zupancic.docx
@@ -10727,44 +10727,59 @@
         <w:t xml:space="preserve">podrobneje opisana v </w:t>
       </w:r>
       <w:r>
-        <w:t xml:space="preserve">poglavju </w:t>
+        <w:t>poglavju</w:t>
       </w:r>
       <w:r>
         <w:rPr>
           <w:color w:val="EE0000"/>
         </w:rPr>
+        <w:t xml:space="preserve"> </w:t>
+      </w:r>
+      <w:r>
+        <w:t xml:space="preserve">4: </w:t>
+      </w:r>
+      <w:r>
+        <w:fldChar w:fldCharType="begin"/>
+      </w:r>
+      <w:r>
+        <w:instrText xml:space="preserve"> REF _Ref227322707 </w:instrText>
+      </w:r>
+      <w:r>
+        <w:instrText xml:space="preserve"> \* MERGEFORMAT </w:instrText>
+      </w:r>
+      <w:r>
+        <w:fldChar w:fldCharType="separate"/>
+      </w:r>
+      <w:r>
+        <w:t>LASTNA UČNA MNOŽICA</w:t>
+      </w:r>
+      <w:r>
+        <w:fldChar w:fldCharType="end"/>
+      </w:r>
+      <w:r>
+        <w:t xml:space="preserve">. </w:t>
+      </w:r>
+      <w:r>
         <w:t>T</w:t>
       </w:r>
       <w:r>
-        <w:rPr>
-          <w:color w:val="EE0000"/>
-        </w:rPr>
-        <w:t>ODO: T</w:t>
-      </w:r>
-      <w:r>
-        <w:rPr>
-          <w:color w:val="EE0000"/>
-        </w:rPr>
-        <w:t>UKAJ NAVEDI POGLAVJE KO PRIDEŠ DO TJA</w:t>
-      </w:r>
-      <w:r>
-        <w:rPr>
-          <w:color w:val="EE0000"/>
-        </w:rPr>
-        <w:t xml:space="preserve">. </w:t>
-      </w:r>
-      <w:r>
-        <w:t xml:space="preserve">Testno množico sestavlja 944 slik različnih oseb </w:t>
+        <w:t>estno</w:t>
+      </w:r>
+      <w:r>
+        <w:t xml:space="preserve"> </w:t>
+      </w:r>
+      <w:r>
+        <w:t xml:space="preserve">množico sestavlja 944 slik različnih oseb </w:t>
       </w:r>
       <w:r>
         <w:t>z</w:t>
       </w:r>
       <w:r>
-        <w:t xml:space="preserve"> različnimi telesnimi držami med </w:t>
+        <w:t xml:space="preserve"> različnimi telesnimi držami med izvajanjem telesne </w:t>
       </w:r>
       <w:r>
         <w:lastRenderedPageBreak/>
-        <w:t xml:space="preserve">izvajanjem telesne vadbe na fitnesu. </w:t>
+        <w:t xml:space="preserve">vadbe na fitnesu. </w:t>
       </w:r>
       <w:r>
         <w:t xml:space="preserve">Glavni izziv primerjave uspešnosti med modeli predstavlja določitev </w:t>
@@ -10836,22 +10851,27 @@
         <w:t>MPJPE</w:t>
       </w:r>
       <w:r>
+        <w:t xml:space="preserve"> (</w:t>
+      </w:r>
+      <w:proofErr w:type="spellStart"/>
+      <w:r>
+        <w:t>Mean</w:t>
+      </w:r>
+      <w:proofErr w:type="spellEnd"/>
+      <w:r>
+        <w:t xml:space="preserve"> Per </w:t>
+      </w:r>
+      <w:proofErr w:type="spellStart"/>
+      <w:r>
+        <w:t>Joint</w:t>
+      </w:r>
+      <w:proofErr w:type="spellEnd"/>
+      <w:r>
         <w:t xml:space="preserve"> </w:t>
       </w:r>
-      <w:r>
-        <w:t>(</w:t>
-      </w:r>
-      <w:proofErr w:type="spellStart"/>
-      <w:r>
-        <w:t>Mean</w:t>
-      </w:r>
-      <w:proofErr w:type="spellEnd"/>
-      <w:r>
-        <w:t xml:space="preserve"> Per </w:t>
-      </w:r>
-      <w:proofErr w:type="spellStart"/>
-      <w:r>
-        <w:t>Joint</w:t>
+      <w:proofErr w:type="spellStart"/>
+      <w:r>
+        <w:t>Position</w:t>
       </w:r>
       <w:proofErr w:type="spellEnd"/>
       <w:r>
@@ -10859,14 +10879,6 @@
       </w:r>
       <w:proofErr w:type="spellStart"/>
       <w:r>
-        <w:t>Position</w:t>
-      </w:r>
-      <w:proofErr w:type="spellEnd"/>
-      <w:r>
-        <w:t xml:space="preserve"> </w:t>
-      </w:r>
-      <w:proofErr w:type="spellStart"/>
-      <w:r>
         <w:t>Error</w:t>
       </w:r>
       <w:proofErr w:type="spellEnd"/>
@@ -10879,10 +10891,7 @@
         <w:t xml:space="preserve">MPJPE velja za glavno metriko za prikaz napake med napovedano in dejansko vrednostjo. V kontekstu modelov za zaznavo telesne drže </w:t>
       </w:r>
       <w:r>
-        <w:t xml:space="preserve">MPJPE meri </w:t>
-      </w:r>
-      <w:r>
-        <w:t>povprečno razdaljo med sklepno točko referenčne resnice in napovedan</w:t>
+        <w:t>MPJPE meri povprečno razdaljo med sklepno točko referenčne resnice in napovedan</w:t>
       </w:r>
       <w:r>
         <w:t>o</w:t>
@@ -11776,14 +11785,19 @@
         <w:t>PCK</w:t>
       </w:r>
       <w:r>
+        <w:t xml:space="preserve"> (</w:t>
+      </w:r>
+      <w:proofErr w:type="spellStart"/>
+      <w:r>
+        <w:t>Percentage</w:t>
+      </w:r>
+      <w:proofErr w:type="spellEnd"/>
+      <w:r>
         <w:t xml:space="preserve"> </w:t>
       </w:r>
-      <w:r>
-        <w:t>(</w:t>
-      </w:r>
-      <w:proofErr w:type="spellStart"/>
-      <w:r>
-        <w:t>Percentage</w:t>
+      <w:proofErr w:type="spellStart"/>
+      <w:r>
+        <w:t>of</w:t>
       </w:r>
       <w:proofErr w:type="spellEnd"/>
       <w:r>
@@ -11791,7 +11805,7 @@
       </w:r>
       <w:proofErr w:type="spellStart"/>
       <w:r>
-        <w:t>of</w:t>
+        <w:t>Correct</w:t>
       </w:r>
       <w:proofErr w:type="spellEnd"/>
       <w:r>
@@ -11799,7 +11813,760 @@
       </w:r>
       <w:proofErr w:type="spellStart"/>
       <w:r>
-        <w:t>Correct</w:t>
+        <w:t>Keypoints</w:t>
+      </w:r>
+      <w:proofErr w:type="spellEnd"/>
+      <w:r>
+        <w:t>)</w:t>
+      </w:r>
+    </w:p>
+    <w:p>
+      <w:r>
+        <w:t>Metrika PCK, oziroma delež pravilno zaznanih sklepnih točk, meri, kolikšen delež sklepnih točk je po napovedi dovolj blizu točkam iz referenčne resnice</w:t>
+      </w:r>
+      <w:r>
+        <w:t>. Pravilnost se določi s pragom razdalje, zato je bilo uporabljenih več različnih pragov.</w:t>
+      </w:r>
+    </w:p>
+    <w:p>
+      <w:pPr>
+        <w:pStyle w:val="Caption"/>
+        <w:keepNext/>
+      </w:pPr>
+      <w:bookmarkStart w:id="42" w:name="_Ref227319621"/>
+      <w:r>
+        <w:t xml:space="preserve">Enačba </w:t>
+      </w:r>
+      <w:fldSimple w:instr=" SEQ Enačba \* ARABIC ">
+        <w:r>
+          <w:rPr>
+            <w:noProof/>
+          </w:rPr>
+          <w:t>3</w:t>
+        </w:r>
+      </w:fldSimple>
+      <w:r>
+        <w:t>: Pravilnost sklepne točke za metriko PCK</w:t>
+      </w:r>
+      <w:bookmarkEnd w:id="42"/>
+    </w:p>
+    <w:p>
+      <m:oMathPara>
+        <m:oMath>
+          <m:sSub>
+            <m:sSubPr>
+              <m:ctrlPr>
+                <w:rPr>
+                  <w:rFonts w:ascii="Cambria Math" w:hAnsi="Cambria Math"/>
+                  <w:i/>
+                </w:rPr>
+              </m:ctrlPr>
+            </m:sSubPr>
+            <m:e>
+              <m:r>
+                <w:rPr>
+                  <w:rFonts w:ascii="Cambria Math" w:hAnsi="Cambria Math"/>
+                </w:rPr>
+                <m:t>c</m:t>
+              </m:r>
+            </m:e>
+            <m:sub>
+              <m:r>
+                <w:rPr>
+                  <w:rFonts w:ascii="Cambria Math" w:hAnsi="Cambria Math"/>
+                </w:rPr>
+                <m:t>i,j</m:t>
+              </m:r>
+            </m:sub>
+          </m:sSub>
+          <m:r>
+            <w:rPr>
+              <w:rFonts w:ascii="Cambria Math" w:hAnsi="Cambria Math"/>
+            </w:rPr>
+            <m:t xml:space="preserve">= </m:t>
+          </m:r>
+          <m:d>
+            <m:dPr>
+              <m:begChr m:val="{"/>
+              <m:endChr m:val=""/>
+              <m:ctrlPr>
+                <w:rPr>
+                  <w:rFonts w:ascii="Cambria Math" w:hAnsi="Cambria Math"/>
+                  <w:i/>
+                </w:rPr>
+              </m:ctrlPr>
+            </m:dPr>
+            <m:e>
+              <m:eqArr>
+                <m:eqArrPr>
+                  <m:ctrlPr>
+                    <w:rPr>
+                      <w:rFonts w:ascii="Cambria Math" w:hAnsi="Cambria Math"/>
+                      <w:i/>
+                    </w:rPr>
+                  </m:ctrlPr>
+                </m:eqArrPr>
+                <m:e>
+                  <m:r>
+                    <w:rPr>
+                      <w:rFonts w:ascii="Cambria Math" w:hAnsi="Cambria Math"/>
+                    </w:rPr>
+                    <m:t xml:space="preserve">1,   </m:t>
+                  </m:r>
+                  <m:sSub>
+                    <m:sSubPr>
+                      <m:ctrlPr>
+                        <w:rPr>
+                          <w:rFonts w:ascii="Cambria Math" w:hAnsi="Cambria Math"/>
+                          <w:i/>
+                        </w:rPr>
+                      </m:ctrlPr>
+                    </m:sSubPr>
+                    <m:e>
+                      <m:r>
+                        <w:rPr>
+                          <w:rFonts w:ascii="Cambria Math" w:hAnsi="Cambria Math"/>
+                        </w:rPr>
+                        <m:t>e</m:t>
+                      </m:r>
+                    </m:e>
+                    <m:sub>
+                      <m:r>
+                        <w:rPr>
+                          <w:rFonts w:ascii="Cambria Math" w:hAnsi="Cambria Math"/>
+                        </w:rPr>
+                        <m:t>i,j</m:t>
+                      </m:r>
+                    </m:sub>
+                  </m:sSub>
+                  <m:r>
+                    <w:rPr>
+                      <w:rFonts w:ascii="Cambria Math" w:hAnsi="Cambria Math"/>
+                    </w:rPr>
+                    <m:t>≤</m:t>
+                  </m:r>
+                  <m:r>
+                    <w:rPr>
+                      <w:rFonts w:ascii="Cambria Math" w:hAnsi="Cambria Math"/>
+                    </w:rPr>
+                    <m:t>τ</m:t>
+                  </m:r>
+                </m:e>
+                <m:e>
+                  <m:r>
+                    <w:rPr>
+                      <w:rFonts w:ascii="Cambria Math" w:hAnsi="Cambria Math"/>
+                    </w:rPr>
+                    <m:t xml:space="preserve">0,   </m:t>
+                  </m:r>
+                  <m:sSub>
+                    <m:sSubPr>
+                      <m:ctrlPr>
+                        <w:rPr>
+                          <w:rFonts w:ascii="Cambria Math" w:hAnsi="Cambria Math"/>
+                          <w:i/>
+                        </w:rPr>
+                      </m:ctrlPr>
+                    </m:sSubPr>
+                    <m:e>
+                      <m:r>
+                        <w:rPr>
+                          <w:rFonts w:ascii="Cambria Math" w:hAnsi="Cambria Math"/>
+                        </w:rPr>
+                        <m:t>e</m:t>
+                      </m:r>
+                    </m:e>
+                    <m:sub>
+                      <m:r>
+                        <w:rPr>
+                          <w:rFonts w:ascii="Cambria Math" w:hAnsi="Cambria Math"/>
+                        </w:rPr>
+                        <m:t>i,j</m:t>
+                      </m:r>
+                    </m:sub>
+                  </m:sSub>
+                  <m:r>
+                    <w:rPr>
+                      <w:rFonts w:ascii="Cambria Math" w:hAnsi="Cambria Math"/>
+                    </w:rPr>
+                    <m:t>&gt;</m:t>
+                  </m:r>
+                  <m:r>
+                    <w:rPr>
+                      <w:rFonts w:ascii="Cambria Math" w:hAnsi="Cambria Math"/>
+                    </w:rPr>
+                    <m:t>τ</m:t>
+                  </m:r>
+                </m:e>
+              </m:eqArr>
+            </m:e>
+          </m:d>
+        </m:oMath>
+      </m:oMathPara>
+    </w:p>
+    <w:p/>
+    <w:p>
+      <w:r>
+        <w:lastRenderedPageBreak/>
+        <w:t xml:space="preserve">Sklepna točka se šteje kot pravilno zaznana, če je njena napaka manjša ali enaka izbranemu pragu </w:t>
+      </w:r>
+      <m:oMath>
+        <m:r>
+          <w:rPr>
+            <w:rFonts w:ascii="Cambria Math" w:hAnsi="Cambria Math"/>
+          </w:rPr>
+          <m:t>τ</m:t>
+        </m:r>
+      </m:oMath>
+      <w:r>
+        <w:t xml:space="preserve"> (</w:t>
+      </w:r>
+      <w:r>
+        <w:fldChar w:fldCharType="begin"/>
+      </w:r>
+      <w:r>
+        <w:instrText xml:space="preserve"> REF _Ref227319621 \h </w:instrText>
+      </w:r>
+      <w:r>
+        <w:fldChar w:fldCharType="separate"/>
+      </w:r>
+      <w:r>
+        <w:t xml:space="preserve">Enačba </w:t>
+      </w:r>
+      <w:r>
+        <w:rPr>
+          <w:noProof/>
+        </w:rPr>
+        <w:t>3</w:t>
+      </w:r>
+      <w:r>
+        <w:t>: Pravilnost sklepne točke za metriko PCK</w:t>
+      </w:r>
+      <w:r>
+        <w:fldChar w:fldCharType="end"/>
+      </w:r>
+      <w:r>
+        <w:t xml:space="preserve">). Metrika PCK je definirana kot delež pravilnih točk </w:t>
+      </w:r>
+      <w:r>
+        <w:t>preko vseh sklepov in vseh slik</w:t>
+      </w:r>
+      <w:r>
+        <w:t xml:space="preserve">, definicija je prikazana </w:t>
+      </w:r>
+      <w:r>
+        <w:t xml:space="preserve">s spodnjo </w:t>
+      </w:r>
+      <w:r>
+        <w:t>enačbo</w:t>
+      </w:r>
+      <w:r>
+        <w:t>.</w:t>
+      </w:r>
+    </w:p>
+    <w:p>
+      <w:pPr>
+        <w:pStyle w:val="Caption"/>
+        <w:keepNext/>
+      </w:pPr>
+      <w:r>
+        <w:t xml:space="preserve">Enačba </w:t>
+      </w:r>
+      <w:fldSimple w:instr=" SEQ Enačba \* ARABIC ">
+        <w:r>
+          <w:rPr>
+            <w:noProof/>
+          </w:rPr>
+          <w:t>4</w:t>
+        </w:r>
+      </w:fldSimple>
+      <w:r>
+        <w:t>: Definicija PCK</w:t>
+      </w:r>
+    </w:p>
+    <w:p>
+      <m:oMathPara>
+        <m:oMath>
+          <m:r>
+            <w:rPr>
+              <w:rFonts w:ascii="Cambria Math" w:hAnsi="Cambria Math"/>
+            </w:rPr>
+            <m:t>PCK</m:t>
+          </m:r>
+          <m:d>
+            <m:dPr>
+              <m:ctrlPr>
+                <w:rPr>
+                  <w:rFonts w:ascii="Cambria Math" w:hAnsi="Cambria Math"/>
+                  <w:i/>
+                </w:rPr>
+              </m:ctrlPr>
+            </m:dPr>
+            <m:e>
+              <m:r>
+                <w:rPr>
+                  <w:rFonts w:ascii="Cambria Math" w:hAnsi="Cambria Math"/>
+                </w:rPr>
+                <m:t>τ</m:t>
+              </m:r>
+            </m:e>
+          </m:d>
+          <m:r>
+            <w:rPr>
+              <w:rFonts w:ascii="Cambria Math" w:hAnsi="Cambria Math"/>
+            </w:rPr>
+            <m:t xml:space="preserve">= </m:t>
+          </m:r>
+          <m:f>
+            <m:fPr>
+              <m:ctrlPr>
+                <w:rPr>
+                  <w:rFonts w:ascii="Cambria Math" w:hAnsi="Cambria Math"/>
+                  <w:i/>
+                </w:rPr>
+              </m:ctrlPr>
+            </m:fPr>
+            <m:num>
+              <m:r>
+                <w:rPr>
+                  <w:rFonts w:ascii="Cambria Math" w:hAnsi="Cambria Math"/>
+                </w:rPr>
+                <m:t>1</m:t>
+              </m:r>
+            </m:num>
+            <m:den>
+              <m:r>
+                <w:rPr>
+                  <w:rFonts w:ascii="Cambria Math" w:hAnsi="Cambria Math"/>
+                </w:rPr>
+                <m:t>N*K</m:t>
+              </m:r>
+            </m:den>
+          </m:f>
+          <m:r>
+            <w:rPr>
+              <w:rFonts w:ascii="Cambria Math" w:hAnsi="Cambria Math"/>
+            </w:rPr>
+            <m:t xml:space="preserve"> </m:t>
+          </m:r>
+          <m:nary>
+            <m:naryPr>
+              <m:chr m:val="∑"/>
+              <m:limLoc m:val="undOvr"/>
+              <m:ctrlPr>
+                <w:rPr>
+                  <w:rFonts w:ascii="Cambria Math" w:hAnsi="Cambria Math"/>
+                  <w:i/>
+                </w:rPr>
+              </m:ctrlPr>
+            </m:naryPr>
+            <m:sub>
+              <m:r>
+                <w:rPr>
+                  <w:rFonts w:ascii="Cambria Math" w:hAnsi="Cambria Math"/>
+                </w:rPr>
+                <m:t>i=1</m:t>
+              </m:r>
+            </m:sub>
+            <m:sup>
+              <m:r>
+                <w:rPr>
+                  <w:rFonts w:ascii="Cambria Math" w:hAnsi="Cambria Math"/>
+                </w:rPr>
+                <m:t>N</m:t>
+              </m:r>
+            </m:sup>
+            <m:e>
+              <m:nary>
+                <m:naryPr>
+                  <m:chr m:val="∑"/>
+                  <m:limLoc m:val="undOvr"/>
+                  <m:ctrlPr>
+                    <w:rPr>
+                      <w:rFonts w:ascii="Cambria Math" w:hAnsi="Cambria Math"/>
+                      <w:i/>
+                    </w:rPr>
+                  </m:ctrlPr>
+                </m:naryPr>
+                <m:sub>
+                  <m:r>
+                    <w:rPr>
+                      <w:rFonts w:ascii="Cambria Math" w:hAnsi="Cambria Math"/>
+                    </w:rPr>
+                    <m:t>j=1</m:t>
+                  </m:r>
+                </m:sub>
+                <m:sup>
+                  <m:r>
+                    <w:rPr>
+                      <w:rFonts w:ascii="Cambria Math" w:hAnsi="Cambria Math"/>
+                    </w:rPr>
+                    <m:t>K</m:t>
+                  </m:r>
+                </m:sup>
+                <m:e>
+                  <m:sSub>
+                    <m:sSubPr>
+                      <m:ctrlPr>
+                        <w:rPr>
+                          <w:rFonts w:ascii="Cambria Math" w:hAnsi="Cambria Math"/>
+                          <w:i/>
+                        </w:rPr>
+                      </m:ctrlPr>
+                    </m:sSubPr>
+                    <m:e>
+                      <m:r>
+                        <w:rPr>
+                          <w:rFonts w:ascii="Cambria Math" w:hAnsi="Cambria Math"/>
+                        </w:rPr>
+                        <m:t>c</m:t>
+                      </m:r>
+                    </m:e>
+                    <m:sub>
+                      <m:r>
+                        <w:rPr>
+                          <w:rFonts w:ascii="Cambria Math" w:hAnsi="Cambria Math"/>
+                        </w:rPr>
+                        <m:t>i,j</m:t>
+                      </m:r>
+                    </m:sub>
+                  </m:sSub>
+                </m:e>
+              </m:nary>
+            </m:e>
+          </m:nary>
+        </m:oMath>
+      </m:oMathPara>
+    </w:p>
+    <w:p>
+      <w:pPr>
+        <w:pStyle w:val="Images"/>
+        <w:jc w:val="both"/>
+      </w:pPr>
+      <w:r>
+        <w:t xml:space="preserve">Na slikah </w:t>
+      </w:r>
+      <w:r>
+        <w:fldChar w:fldCharType="begin"/>
+      </w:r>
+      <w:r>
+        <w:instrText xml:space="preserve"> REF _Ref227320775 \h </w:instrText>
+      </w:r>
+      <w:r>
+        <w:fldChar w:fldCharType="separate"/>
+      </w:r>
+      <w:r>
+        <w:t xml:space="preserve">Slika </w:t>
+      </w:r>
+      <w:r>
+        <w:rPr>
+          <w:noProof/>
+        </w:rPr>
+        <w:t>5</w:t>
+      </w:r>
+      <w:r>
+        <w:t>: Rezultati metrike PCK pri pragu 0.01</w:t>
+      </w:r>
+      <w:r>
+        <w:fldChar w:fldCharType="end"/>
+      </w:r>
+      <w:r>
+        <w:t xml:space="preserve">, </w:t>
+      </w:r>
+      <w:r>
+        <w:fldChar w:fldCharType="begin"/>
+      </w:r>
+      <w:r>
+        <w:instrText xml:space="preserve"> REF _Ref227320779 \h </w:instrText>
+      </w:r>
+      <w:r>
+        <w:fldChar w:fldCharType="separate"/>
+      </w:r>
+      <w:r>
+        <w:t xml:space="preserve">Slika </w:t>
+      </w:r>
+      <w:r>
+        <w:rPr>
+          <w:noProof/>
+        </w:rPr>
+        <w:t>6</w:t>
+      </w:r>
+      <w:r>
+        <w:t>: Rezultati metrike PCK pri pragu 0.02</w:t>
+      </w:r>
+      <w:r>
+        <w:fldChar w:fldCharType="end"/>
+      </w:r>
+      <w:r>
+        <w:t xml:space="preserve"> in </w:t>
+      </w:r>
+      <w:r>
+        <w:fldChar w:fldCharType="begin"/>
+      </w:r>
+      <w:r>
+        <w:instrText xml:space="preserve"> REF _Ref227320780 \h </w:instrText>
+      </w:r>
+      <w:r>
+        <w:fldChar w:fldCharType="separate"/>
+      </w:r>
+      <w:r>
+        <w:t xml:space="preserve">Slika </w:t>
+      </w:r>
+      <w:r>
+        <w:rPr>
+          <w:noProof/>
+        </w:rPr>
+        <w:t>7</w:t>
+      </w:r>
+      <w:r>
+        <w:t xml:space="preserve">: </w:t>
+      </w:r>
+      <w:r>
+        <w:t>Rezultati metrike PCK pri pragu 0.0</w:t>
+      </w:r>
+      <w:r>
+        <w:t>4</w:t>
+      </w:r>
+      <w:r>
+        <w:fldChar w:fldCharType="end"/>
+      </w:r>
+      <w:r>
+        <w:t xml:space="preserve"> so prikazani rezultati metrike PCK nad izbranimi modeli. Vsaka slika prikazuje rezultat metrike z različnim pragom. </w:t>
+      </w:r>
+      <w:r>
+        <w:t xml:space="preserve">Podobno kot pri metriki MPJPE, </w:t>
+      </w:r>
+      <w:r>
+        <w:t>referenčna resnica</w:t>
+      </w:r>
+      <w:r>
+        <w:t xml:space="preserve"> za rezultate metrike PCK</w:t>
+      </w:r>
+      <w:r>
+        <w:t xml:space="preserve"> predstavlja napovedi modela RTMO-X</w:t>
+      </w:r>
+      <w:r>
+        <w:t>.</w:t>
+      </w:r>
+    </w:p>
+    <w:p>
+      <w:pPr>
+        <w:pStyle w:val="Images"/>
+      </w:pPr>
+      <w:r>
+        <w:drawing>
+          <wp:inline distT="0" distB="0" distL="0" distR="0" wp14:anchorId="019D5745" wp14:editId="5092E82A">
+            <wp:extent cx="5396230" cy="2237105"/>
+            <wp:effectExtent l="0" t="0" r="0" b="0"/>
+            <wp:docPr id="1819771264" name="Picture 1"/>
+            <wp:cNvGraphicFramePr>
+              <a:graphicFrameLocks xmlns:a="http://schemas.openxmlformats.org/drawingml/2006/main" noChangeAspect="1"/>
+            </wp:cNvGraphicFramePr>
+            <a:graphic xmlns:a="http://schemas.openxmlformats.org/drawingml/2006/main">
+              <a:graphicData uri="http://schemas.openxmlformats.org/drawingml/2006/picture">
+                <pic:pic xmlns:pic="http://schemas.openxmlformats.org/drawingml/2006/picture">
+                  <pic:nvPicPr>
+                    <pic:cNvPr id="1819771264" name=""/>
+                    <pic:cNvPicPr/>
+                  </pic:nvPicPr>
+                  <pic:blipFill>
+                    <a:blip r:embed="rId27"/>
+                    <a:stretch>
+                      <a:fillRect/>
+                    </a:stretch>
+                  </pic:blipFill>
+                  <pic:spPr>
+                    <a:xfrm>
+                      <a:off x="0" y="0"/>
+                      <a:ext cx="5396230" cy="2237105"/>
+                    </a:xfrm>
+                    <a:prstGeom prst="rect">
+                      <a:avLst/>
+                    </a:prstGeom>
+                  </pic:spPr>
+                </pic:pic>
+              </a:graphicData>
+            </a:graphic>
+          </wp:inline>
+        </w:drawing>
+      </w:r>
+    </w:p>
+    <w:p>
+      <w:pPr>
+        <w:pStyle w:val="Caption"/>
+      </w:pPr>
+      <w:bookmarkStart w:id="43" w:name="_Ref227320775"/>
+      <w:r>
+        <w:t xml:space="preserve">Slika </w:t>
+      </w:r>
+      <w:fldSimple w:instr=" SEQ Slika \* ARABIC ">
+        <w:r>
+          <w:rPr>
+            <w:noProof/>
+          </w:rPr>
+          <w:t>5</w:t>
+        </w:r>
+      </w:fldSimple>
+      <w:r>
+        <w:t xml:space="preserve">: Rezultati </w:t>
+      </w:r>
+      <w:r>
+        <w:t xml:space="preserve">metrike </w:t>
+      </w:r>
+      <w:r>
+        <w:t>PCK pri pragu 0.01</w:t>
+      </w:r>
+      <w:bookmarkEnd w:id="43"/>
+    </w:p>
+    <w:p>
+      <w:pPr>
+        <w:pStyle w:val="Images"/>
+      </w:pPr>
+      <w:r>
+        <w:lastRenderedPageBreak/>
+        <w:drawing>
+          <wp:inline distT="0" distB="0" distL="0" distR="0" wp14:anchorId="7258E1CD" wp14:editId="64077337">
+            <wp:extent cx="5396230" cy="2237105"/>
+            <wp:effectExtent l="0" t="0" r="0" b="0"/>
+            <wp:docPr id="1170356641" name="Picture 1"/>
+            <wp:cNvGraphicFramePr>
+              <a:graphicFrameLocks xmlns:a="http://schemas.openxmlformats.org/drawingml/2006/main" noChangeAspect="1"/>
+            </wp:cNvGraphicFramePr>
+            <a:graphic xmlns:a="http://schemas.openxmlformats.org/drawingml/2006/main">
+              <a:graphicData uri="http://schemas.openxmlformats.org/drawingml/2006/picture">
+                <pic:pic xmlns:pic="http://schemas.openxmlformats.org/drawingml/2006/picture">
+                  <pic:nvPicPr>
+                    <pic:cNvPr id="1170356641" name=""/>
+                    <pic:cNvPicPr/>
+                  </pic:nvPicPr>
+                  <pic:blipFill>
+                    <a:blip r:embed="rId28"/>
+                    <a:stretch>
+                      <a:fillRect/>
+                    </a:stretch>
+                  </pic:blipFill>
+                  <pic:spPr>
+                    <a:xfrm>
+                      <a:off x="0" y="0"/>
+                      <a:ext cx="5396230" cy="2237105"/>
+                    </a:xfrm>
+                    <a:prstGeom prst="rect">
+                      <a:avLst/>
+                    </a:prstGeom>
+                  </pic:spPr>
+                </pic:pic>
+              </a:graphicData>
+            </a:graphic>
+          </wp:inline>
+        </w:drawing>
+      </w:r>
+    </w:p>
+    <w:p>
+      <w:pPr>
+        <w:pStyle w:val="Caption"/>
+      </w:pPr>
+      <w:bookmarkStart w:id="44" w:name="_Ref227320779"/>
+      <w:r>
+        <w:t xml:space="preserve">Slika </w:t>
+      </w:r>
+      <w:fldSimple w:instr=" SEQ Slika \* ARABIC ">
+        <w:r>
+          <w:rPr>
+            <w:noProof/>
+          </w:rPr>
+          <w:t>6</w:t>
+        </w:r>
+      </w:fldSimple>
+      <w:r>
+        <w:t>: Rezultati metrike PCK pri pragu 0.02</w:t>
+      </w:r>
+      <w:bookmarkEnd w:id="44"/>
+    </w:p>
+    <w:p>
+      <w:pPr>
+        <w:pStyle w:val="Images"/>
+      </w:pPr>
+      <w:r>
+        <w:drawing>
+          <wp:inline distT="0" distB="0" distL="0" distR="0" wp14:anchorId="69F82535" wp14:editId="4800961B">
+            <wp:extent cx="5396230" cy="2237105"/>
+            <wp:effectExtent l="0" t="0" r="0" b="0"/>
+            <wp:docPr id="1883364277" name="Picture 1"/>
+            <wp:cNvGraphicFramePr>
+              <a:graphicFrameLocks xmlns:a="http://schemas.openxmlformats.org/drawingml/2006/main" noChangeAspect="1"/>
+            </wp:cNvGraphicFramePr>
+            <a:graphic xmlns:a="http://schemas.openxmlformats.org/drawingml/2006/main">
+              <a:graphicData uri="http://schemas.openxmlformats.org/drawingml/2006/picture">
+                <pic:pic xmlns:pic="http://schemas.openxmlformats.org/drawingml/2006/picture">
+                  <pic:nvPicPr>
+                    <pic:cNvPr id="1883364277" name=""/>
+                    <pic:cNvPicPr/>
+                  </pic:nvPicPr>
+                  <pic:blipFill>
+                    <a:blip r:embed="rId29"/>
+                    <a:stretch>
+                      <a:fillRect/>
+                    </a:stretch>
+                  </pic:blipFill>
+                  <pic:spPr>
+                    <a:xfrm>
+                      <a:off x="0" y="0"/>
+                      <a:ext cx="5396230" cy="2237105"/>
+                    </a:xfrm>
+                    <a:prstGeom prst="rect">
+                      <a:avLst/>
+                    </a:prstGeom>
+                  </pic:spPr>
+                </pic:pic>
+              </a:graphicData>
+            </a:graphic>
+          </wp:inline>
+        </w:drawing>
+      </w:r>
+    </w:p>
+    <w:p>
+      <w:pPr>
+        <w:pStyle w:val="Caption"/>
+      </w:pPr>
+      <w:bookmarkStart w:id="45" w:name="_Ref227320780"/>
+      <w:r>
+        <w:t xml:space="preserve">Slika </w:t>
+      </w:r>
+      <w:fldSimple w:instr=" SEQ Slika \* ARABIC ">
+        <w:r>
+          <w:rPr>
+            <w:noProof/>
+          </w:rPr>
+          <w:t>7</w:t>
+        </w:r>
+      </w:fldSimple>
+      <w:r>
+        <w:t xml:space="preserve">: </w:t>
+      </w:r>
+      <w:r>
+        <w:t>Rezultati metrike PCK pri pragu 0.0</w:t>
+      </w:r>
+      <w:r>
+        <w:t>4</w:t>
+      </w:r>
+      <w:bookmarkEnd w:id="45"/>
+    </w:p>
+    <w:p/>
+    <w:p>
+      <w:r>
+        <w:t xml:space="preserve">Rezultatov metrike PCK nad različnimi pragi so dokaj konstantni – </w:t>
+      </w:r>
+      <w:proofErr w:type="spellStart"/>
+      <w:r>
+        <w:t>Mediapipe</w:t>
+      </w:r>
+      <w:proofErr w:type="spellEnd"/>
+      <w:r>
+        <w:t xml:space="preserve"> Pose </w:t>
+      </w:r>
+      <w:proofErr w:type="spellStart"/>
+      <w:r>
+        <w:t>Landmarker</w:t>
       </w:r>
       <w:proofErr w:type="spellEnd"/>
       <w:r>
@@ -11807,69 +12574,465 @@
       </w:r>
       <w:proofErr w:type="spellStart"/>
       <w:r>
-        <w:t>Keypoints</w:t>
-      </w:r>
-      <w:proofErr w:type="spellEnd"/>
-      <w:r>
-        <w:t>)</w:t>
-      </w:r>
-    </w:p>
-    <w:p>
-      <w:r>
-        <w:t>TO IMPLEMENT FIRST()</w:t>
-      </w:r>
-    </w:p>
+        <w:t>Heavy</w:t>
+      </w:r>
+      <w:proofErr w:type="spellEnd"/>
+      <w:r>
+        <w:t xml:space="preserve"> je vedno najboljše ocenjen model, </w:t>
+      </w:r>
+      <w:proofErr w:type="spellStart"/>
+      <w:r>
+        <w:t>PoseNet</w:t>
+      </w:r>
+      <w:proofErr w:type="spellEnd"/>
+      <w:r>
+        <w:t xml:space="preserve"> </w:t>
+      </w:r>
+      <w:proofErr w:type="spellStart"/>
+      <w:r>
+        <w:t>MobileNet</w:t>
+      </w:r>
+      <w:proofErr w:type="spellEnd"/>
+      <w:r>
+        <w:t xml:space="preserve"> pa je vedno najslabše ocenjen model. </w:t>
+      </w:r>
+      <w:r>
+        <w:t xml:space="preserve">Zanimiv je rezultat modela </w:t>
+      </w:r>
+      <w:proofErr w:type="spellStart"/>
+      <w:r>
+        <w:t>MoveNet</w:t>
+      </w:r>
+      <w:proofErr w:type="spellEnd"/>
+      <w:r>
+        <w:t xml:space="preserve"> </w:t>
+      </w:r>
+      <w:proofErr w:type="spellStart"/>
+      <w:r>
+        <w:t>SinglePose</w:t>
+      </w:r>
+      <w:proofErr w:type="spellEnd"/>
+      <w:r>
+        <w:t xml:space="preserve"> </w:t>
+      </w:r>
+      <w:proofErr w:type="spellStart"/>
+      <w:r>
+        <w:t>Thunder</w:t>
+      </w:r>
+      <w:proofErr w:type="spellEnd"/>
+      <w:r>
+        <w:t xml:space="preserve">, ki se pri pragu 0.01 najbolj približa modelu </w:t>
+      </w:r>
+      <w:proofErr w:type="spellStart"/>
+      <w:r>
+        <w:t>Mediapipe</w:t>
+      </w:r>
+      <w:proofErr w:type="spellEnd"/>
+      <w:r>
+        <w:t xml:space="preserve"> Pose </w:t>
+      </w:r>
+      <w:proofErr w:type="spellStart"/>
+      <w:r>
+        <w:t>Landmarker</w:t>
+      </w:r>
+      <w:proofErr w:type="spellEnd"/>
+      <w:r>
+        <w:t xml:space="preserve"> </w:t>
+      </w:r>
+      <w:proofErr w:type="spellStart"/>
+      <w:r>
+        <w:t>Heavy</w:t>
+      </w:r>
+      <w:proofErr w:type="spellEnd"/>
+      <w:r>
+        <w:t>, pri pragu 0.04 pa predstavlja povpreč</w:t>
+      </w:r>
+      <w:r>
+        <w:t>en model</w:t>
+      </w:r>
+      <w:r>
+        <w:t>.</w:t>
+      </w:r>
+    </w:p>
+    <w:p/>
     <w:p>
       <w:pPr>
         <w:pStyle w:val="Heading3"/>
       </w:pPr>
       <w:r>
-        <w:t>Napaka napovedi celotne telesne drže</w:t>
-      </w:r>
-    </w:p>
-    <w:p>
-      <w:r>
-        <w:t xml:space="preserve">TU OPIŠI DA JE TO </w:t>
-      </w:r>
-      <w:r>
-        <w:t>»</w:t>
-      </w:r>
-      <w:r>
-        <w:t>TVOJA</w:t>
-      </w:r>
-      <w:r>
-        <w:t>«</w:t>
-      </w:r>
-      <w:r>
-        <w:t xml:space="preserve"> METRIKA</w:t>
-      </w:r>
+        <w:t>Primerjava napak sklepnih točk</w:t>
+      </w:r>
+    </w:p>
+    <w:p>
+      <w:r>
+        <w:t xml:space="preserve">V prejšnjih podpoglavjih </w:t>
+      </w:r>
+      <w:r>
+        <w:t xml:space="preserve">je </w:t>
+      </w:r>
+      <w:r>
+        <w:t>uspešnost modelov ocenjen</w:t>
+      </w:r>
+      <w:r>
+        <w:t>a</w:t>
+      </w:r>
+      <w:r>
+        <w:t xml:space="preserve"> z metrikama MPJPE in PCK, ki podata celostno sliko o povprečnem odstopanju ter deležu “dovolj pravilnih” sklepnih </w:t>
+      </w:r>
+      <w:r>
+        <w:lastRenderedPageBreak/>
+        <w:t>točk</w:t>
+      </w:r>
+      <w:r>
+        <w:t xml:space="preserve">. </w:t>
+      </w:r>
+      <w:r>
+        <w:t>Nobena od njiju ne poda podrobnejše informacije o natančnosti posameznih sklepnih točk znotraj primerjave</w:t>
+      </w:r>
+      <w:r>
+        <w:t xml:space="preserve"> med modeli</w:t>
+      </w:r>
+      <w:r>
+        <w:t xml:space="preserve">. </w:t>
+      </w:r>
+      <w:r>
+        <w:t xml:space="preserve">V tem podpoglavju je predstavljena napaka posameznih sklepnih točk med najboljše in najslabše ocenjenim modelom </w:t>
+      </w:r>
+      <w:r>
+        <w:t xml:space="preserve">po </w:t>
+      </w:r>
+      <w:r>
+        <w:t xml:space="preserve">metrikah </w:t>
+      </w:r>
+      <w:r>
+        <w:t>MPJPE in PC</w:t>
+      </w:r>
+      <w:r>
+        <w:t>K</w:t>
+      </w:r>
+      <w:r>
+        <w:t xml:space="preserve">. </w:t>
+      </w:r>
+      <w:r>
+        <w:t xml:space="preserve">Pri obeh sta najboljše in najslabše ocenjena modela enaka, najboljši je </w:t>
+      </w:r>
+      <w:proofErr w:type="spellStart"/>
+      <w:r>
+        <w:t>Mediapipe</w:t>
+      </w:r>
+      <w:proofErr w:type="spellEnd"/>
+      <w:r>
+        <w:t xml:space="preserve"> Pose </w:t>
+      </w:r>
+      <w:proofErr w:type="spellStart"/>
+      <w:r>
+        <w:t>Landmarker</w:t>
+      </w:r>
+      <w:proofErr w:type="spellEnd"/>
+      <w:r>
+        <w:t xml:space="preserve"> </w:t>
+      </w:r>
+      <w:proofErr w:type="spellStart"/>
+      <w:r>
+        <w:t>Heavy</w:t>
+      </w:r>
+      <w:proofErr w:type="spellEnd"/>
+      <w:r>
+        <w:t xml:space="preserve">, najslabši pa </w:t>
+      </w:r>
+      <w:proofErr w:type="spellStart"/>
+      <w:r>
+        <w:t>PoseNet</w:t>
+      </w:r>
+      <w:proofErr w:type="spellEnd"/>
+      <w:r>
+        <w:t xml:space="preserve"> </w:t>
+      </w:r>
+      <w:proofErr w:type="spellStart"/>
+      <w:r>
+        <w:t>MobineNet</w:t>
+      </w:r>
+      <w:proofErr w:type="spellEnd"/>
+      <w:r>
+        <w:t>.</w:t>
+      </w:r>
+    </w:p>
+    <w:p>
+      <w:pPr>
+        <w:pStyle w:val="Images"/>
+      </w:pPr>
+      <w:r>
+        <w:drawing>
+          <wp:inline distT="0" distB="0" distL="0" distR="0" wp14:anchorId="07B557F3" wp14:editId="4D717EFA">
+            <wp:extent cx="5396230" cy="2677795"/>
+            <wp:effectExtent l="0" t="0" r="0" b="8255"/>
+            <wp:docPr id="742054068" name="Picture 1"/>
+            <wp:cNvGraphicFramePr>
+              <a:graphicFrameLocks xmlns:a="http://schemas.openxmlformats.org/drawingml/2006/main" noChangeAspect="1"/>
+            </wp:cNvGraphicFramePr>
+            <a:graphic xmlns:a="http://schemas.openxmlformats.org/drawingml/2006/main">
+              <a:graphicData uri="http://schemas.openxmlformats.org/drawingml/2006/picture">
+                <pic:pic xmlns:pic="http://schemas.openxmlformats.org/drawingml/2006/picture">
+                  <pic:nvPicPr>
+                    <pic:cNvPr id="742054068" name=""/>
+                    <pic:cNvPicPr/>
+                  </pic:nvPicPr>
+                  <pic:blipFill>
+                    <a:blip r:embed="rId30"/>
+                    <a:stretch>
+                      <a:fillRect/>
+                    </a:stretch>
+                  </pic:blipFill>
+                  <pic:spPr>
+                    <a:xfrm>
+                      <a:off x="0" y="0"/>
+                      <a:ext cx="5396230" cy="2677795"/>
+                    </a:xfrm>
+                    <a:prstGeom prst="rect">
+                      <a:avLst/>
+                    </a:prstGeom>
+                  </pic:spPr>
+                </pic:pic>
+              </a:graphicData>
+            </a:graphic>
+          </wp:inline>
+        </w:drawing>
+      </w:r>
+    </w:p>
+    <w:p>
+      <w:pPr>
+        <w:pStyle w:val="Caption"/>
+      </w:pPr>
+      <w:r>
+        <w:t xml:space="preserve">Slika </w:t>
+      </w:r>
+      <w:fldSimple w:instr=" SEQ Slika \* ARABIC ">
+        <w:r>
+          <w:rPr>
+            <w:noProof/>
+          </w:rPr>
+          <w:t>8</w:t>
+        </w:r>
+      </w:fldSimple>
+      <w:r>
+        <w:t xml:space="preserve">: Primerjava med napovedmi sklepnih točk za model </w:t>
+      </w:r>
+      <w:proofErr w:type="spellStart"/>
+      <w:r>
+        <w:t>Mediapipe</w:t>
+      </w:r>
+      <w:proofErr w:type="spellEnd"/>
+      <w:r>
+        <w:t xml:space="preserve"> Pose </w:t>
+      </w:r>
+      <w:proofErr w:type="spellStart"/>
+      <w:r>
+        <w:t>Landmarker</w:t>
+      </w:r>
+      <w:proofErr w:type="spellEnd"/>
+      <w:r>
+        <w:t xml:space="preserve"> </w:t>
+      </w:r>
+      <w:proofErr w:type="spellStart"/>
+      <w:r>
+        <w:t>Heavy</w:t>
+      </w:r>
+      <w:proofErr w:type="spellEnd"/>
+    </w:p>
+    <w:p>
+      <w:pPr>
+        <w:keepNext/>
+      </w:pPr>
+      <w:r>
+        <w:drawing>
+          <wp:inline distT="0" distB="0" distL="0" distR="0" wp14:anchorId="665758D8" wp14:editId="7C8FBF02">
+            <wp:extent cx="5396230" cy="2675255"/>
+            <wp:effectExtent l="0" t="0" r="0" b="0"/>
+            <wp:docPr id="7596625" name="Picture 1"/>
+            <wp:cNvGraphicFramePr>
+              <a:graphicFrameLocks xmlns:a="http://schemas.openxmlformats.org/drawingml/2006/main" noChangeAspect="1"/>
+            </wp:cNvGraphicFramePr>
+            <a:graphic xmlns:a="http://schemas.openxmlformats.org/drawingml/2006/main">
+              <a:graphicData uri="http://schemas.openxmlformats.org/drawingml/2006/picture">
+                <pic:pic xmlns:pic="http://schemas.openxmlformats.org/drawingml/2006/picture">
+                  <pic:nvPicPr>
+                    <pic:cNvPr id="7596625" name=""/>
+                    <pic:cNvPicPr/>
+                  </pic:nvPicPr>
+                  <pic:blipFill>
+                    <a:blip r:embed="rId31"/>
+                    <a:stretch>
+                      <a:fillRect/>
+                    </a:stretch>
+                  </pic:blipFill>
+                  <pic:spPr>
+                    <a:xfrm>
+                      <a:off x="0" y="0"/>
+                      <a:ext cx="5396230" cy="2675255"/>
+                    </a:xfrm>
+                    <a:prstGeom prst="rect">
+                      <a:avLst/>
+                    </a:prstGeom>
+                  </pic:spPr>
+                </pic:pic>
+              </a:graphicData>
+            </a:graphic>
+          </wp:inline>
+        </w:drawing>
+      </w:r>
+    </w:p>
+    <w:p>
+      <w:pPr>
+        <w:pStyle w:val="Caption"/>
+      </w:pPr>
+      <w:r>
+        <w:t xml:space="preserve">Slika </w:t>
+      </w:r>
+      <w:fldSimple w:instr=" SEQ Slika \* ARABIC ">
+        <w:r>
+          <w:rPr>
+            <w:noProof/>
+          </w:rPr>
+          <w:t>9</w:t>
+        </w:r>
+      </w:fldSimple>
+      <w:r>
+        <w:t xml:space="preserve">: </w:t>
+      </w:r>
+      <w:r>
+        <w:t>Primerjava med napovedmi sklepnih točk za model</w:t>
+      </w:r>
+      <w:r>
+        <w:t xml:space="preserve"> </w:t>
+      </w:r>
+      <w:proofErr w:type="spellStart"/>
+      <w:r>
+        <w:t>PoseNet</w:t>
+      </w:r>
+      <w:proofErr w:type="spellEnd"/>
+      <w:r>
+        <w:t xml:space="preserve"> </w:t>
+      </w:r>
+      <w:proofErr w:type="spellStart"/>
+      <w:r>
+        <w:t>MobileNet</w:t>
+      </w:r>
+      <w:proofErr w:type="spellEnd"/>
     </w:p>
     <w:p/>
     <w:p>
       <w:r>
-        <w:t>TU PRIKAŽI TUDI BY KEYPOINT ERRORJE MED NAJSLABŠE PERFORMANIM IN NAJBOLJŠE PERFORMANIM MODELOM IN ARGUMENTIRAJ</w:t>
+        <w:lastRenderedPageBreak/>
+        <w:t xml:space="preserve">Rezultati sklepnih točk za model </w:t>
+      </w:r>
+      <w:proofErr w:type="spellStart"/>
+      <w:r>
+        <w:t>Mediapipe</w:t>
+      </w:r>
+      <w:proofErr w:type="spellEnd"/>
+      <w:r>
+        <w:t xml:space="preserve"> Pose </w:t>
+      </w:r>
+      <w:proofErr w:type="spellStart"/>
+      <w:r>
+        <w:t>Landmarker</w:t>
+      </w:r>
+      <w:proofErr w:type="spellEnd"/>
+      <w:r>
+        <w:t xml:space="preserve"> </w:t>
+      </w:r>
+      <w:proofErr w:type="spellStart"/>
+      <w:r>
+        <w:t>Heavy</w:t>
+      </w:r>
+      <w:proofErr w:type="spellEnd"/>
+      <w:r>
+        <w:t xml:space="preserve"> so zelo konstantn</w:t>
+      </w:r>
+      <w:r>
+        <w:t>i</w:t>
+      </w:r>
+      <w:r>
+        <w:t xml:space="preserve">, medtem ko se natančnost sklepnih točk spodnjega dela telesa pri modelu </w:t>
+      </w:r>
+      <w:proofErr w:type="spellStart"/>
+      <w:r>
+        <w:t>PoseNet</w:t>
+      </w:r>
+      <w:proofErr w:type="spellEnd"/>
+      <w:r>
+        <w:t xml:space="preserve"> </w:t>
+      </w:r>
+      <w:proofErr w:type="spellStart"/>
+      <w:r>
+        <w:t>MobileNet</w:t>
+      </w:r>
+      <w:proofErr w:type="spellEnd"/>
+      <w:r>
+        <w:t xml:space="preserve"> v primerjavi z natančnostjo sklepnih točk zgornjega dela telesa</w:t>
+      </w:r>
+      <w:r>
+        <w:t xml:space="preserve"> </w:t>
+      </w:r>
+      <w:r>
+        <w:t>zelo poslabša.</w:t>
+      </w:r>
+    </w:p>
+    <w:p/>
+    <w:p>
+      <w:pPr>
+        <w:pStyle w:val="Heading2"/>
+      </w:pPr>
+      <w:r>
+        <w:t>Končna evaluacija uspešnosti modelov</w:t>
+      </w:r>
+    </w:p>
+    <w:p>
+      <w:r>
+        <w:t>RABIŠ PRVO FPS REZULTATE</w:t>
       </w:r>
     </w:p>
     <w:p>
       <w:pPr>
         <w:spacing w:line="240" w:lineRule="auto"/>
         <w:jc w:val="left"/>
-        <w:rPr>
-          <w:rFonts w:cs="Times New Roman"/>
-          <w:b/>
-          <w:bCs/>
-          <w:caps/>
-          <w:kern w:val="32"/>
-          <w:sz w:val="36"/>
-          <w:szCs w:val="36"/>
-        </w:rPr>
-      </w:pPr>
-      <w:r>
+      </w:pPr>
+      <w:r>
+        <w:br w:type="page"/>
+      </w:r>
+    </w:p>
+    <w:p>
+      <w:pPr>
+        <w:pStyle w:val="Heading1"/>
+        <w:spacing w:line="360" w:lineRule="auto"/>
         <w:rPr>
           <w:b/>
           <w:sz w:val="36"/>
           <w:szCs w:val="36"/>
-        </w:rPr>
+          <w:lang w:val="sl-SI"/>
+        </w:rPr>
+      </w:pPr>
+      <w:bookmarkStart w:id="46" w:name="_Ref227322707"/>
+      <w:r>
+        <w:rPr>
+          <w:b/>
+          <w:sz w:val="36"/>
+          <w:szCs w:val="36"/>
+          <w:lang w:val="sl-SI"/>
+        </w:rPr>
+        <w:lastRenderedPageBreak/>
+        <w:t>LASTNA UČNA MNOŽICA</w:t>
+      </w:r>
+      <w:bookmarkEnd w:id="46"/>
+    </w:p>
+    <w:p>
+      <w:pPr>
+        <w:pStyle w:val="Images"/>
+      </w:pPr>
+      <w:r>
+        <w:t xml:space="preserve"> </w:t>
+      </w:r>
+      <w:r>
         <w:br w:type="page"/>
       </w:r>
     </w:p>
@@ -11967,11 +13130,11 @@
           <w:tab w:val="num" w:pos="567"/>
         </w:tabs>
       </w:pPr>
-      <w:bookmarkStart w:id="42" w:name="_Toc225593982"/>
+      <w:bookmarkStart w:id="47" w:name="_Toc225593982"/>
       <w:r>
         <w:t>Mehanizem stanj</w:t>
       </w:r>
-      <w:bookmarkEnd w:id="42"/>
+      <w:bookmarkEnd w:id="47"/>
     </w:p>
     <w:p>
       <w:r>
@@ -12144,12 +13307,12 @@
       <w:pPr>
         <w:pStyle w:val="Heading3"/>
       </w:pPr>
-      <w:bookmarkStart w:id="43" w:name="_Toc225593983"/>
+      <w:bookmarkStart w:id="48" w:name="_Toc225593983"/>
       <w:r>
         <w:lastRenderedPageBreak/>
         <w:t>Stanje NI_V_KADRU</w:t>
       </w:r>
-      <w:bookmarkEnd w:id="43"/>
+      <w:bookmarkEnd w:id="48"/>
     </w:p>
     <w:p>
       <w:r>
@@ -12197,11 +13360,11 @@
       <w:pPr>
         <w:pStyle w:val="Heading3"/>
       </w:pPr>
-      <w:bookmarkStart w:id="44" w:name="_Toc225593984"/>
+      <w:bookmarkStart w:id="49" w:name="_Toc225593984"/>
       <w:r>
         <w:t>Stanje NI_OBRNJEN_PROTI_KAMERI</w:t>
       </w:r>
-      <w:bookmarkEnd w:id="44"/>
+      <w:bookmarkEnd w:id="49"/>
     </w:p>
     <w:p>
       <w:r>
@@ -12244,11 +13407,11 @@
       <w:pPr>
         <w:pStyle w:val="Heading3"/>
       </w:pPr>
-      <w:bookmarkStart w:id="45" w:name="_Toc225593985"/>
+      <w:bookmarkStart w:id="50" w:name="_Toc225593985"/>
       <w:r>
         <w:t>Stanje NI_PRI_MIRU</w:t>
       </w:r>
-      <w:bookmarkEnd w:id="45"/>
+      <w:bookmarkEnd w:id="50"/>
     </w:p>
     <w:p>
       <w:r>
@@ -12337,11 +13500,11 @@
       <w:pPr>
         <w:pStyle w:val="Heading3"/>
       </w:pPr>
-      <w:bookmarkStart w:id="46" w:name="_Toc225593986"/>
+      <w:bookmarkStart w:id="51" w:name="_Toc225593986"/>
       <w:r>
         <w:t>Stanje ZAČETNI_POGOJI_DRŽE_NISO_IZPOLNJENI</w:t>
       </w:r>
-      <w:bookmarkEnd w:id="46"/>
+      <w:bookmarkEnd w:id="51"/>
     </w:p>
     <w:p>
       <w:r>
@@ -12475,11 +13638,11 @@
       <w:pPr>
         <w:pStyle w:val="Heading3"/>
       </w:pPr>
-      <w:bookmarkStart w:id="47" w:name="_Toc225593987"/>
+      <w:bookmarkStart w:id="52" w:name="_Toc225593987"/>
       <w:r>
         <w:t>Stanje OPRAVI_SERIJO</w:t>
       </w:r>
-      <w:bookmarkEnd w:id="47"/>
+      <w:bookmarkEnd w:id="52"/>
     </w:p>
     <w:p>
       <w:r>
@@ -12589,11 +13752,11 @@
       <w:pPr>
         <w:pStyle w:val="Heading3"/>
       </w:pPr>
-      <w:bookmarkStart w:id="48" w:name="_Toc225593988"/>
+      <w:bookmarkStart w:id="53" w:name="_Toc225593988"/>
       <w:r>
         <w:t>Stanje USTAVLJENO</w:t>
       </w:r>
-      <w:bookmarkEnd w:id="48"/>
+      <w:bookmarkEnd w:id="53"/>
     </w:p>
     <w:p>
       <w:r>
@@ -12608,11 +13771,11 @@
       <w:pPr>
         <w:pStyle w:val="Heading2"/>
       </w:pPr>
-      <w:bookmarkStart w:id="49" w:name="_Toc225593989"/>
+      <w:bookmarkStart w:id="54" w:name="_Toc225593989"/>
       <w:r>
         <w:t>Predpisi vaj</w:t>
       </w:r>
-      <w:bookmarkEnd w:id="49"/>
+      <w:bookmarkEnd w:id="54"/>
     </w:p>
     <w:p>
       <w:r>
@@ -12791,12 +13954,12 @@
       <w:pPr>
         <w:pStyle w:val="Heading2"/>
       </w:pPr>
-      <w:bookmarkStart w:id="50" w:name="_Toc225593990"/>
+      <w:bookmarkStart w:id="55" w:name="_Toc225593990"/>
       <w:r>
         <w:lastRenderedPageBreak/>
         <w:t>Zajemanje ponovitev</w:t>
       </w:r>
-      <w:bookmarkEnd w:id="50"/>
+      <w:bookmarkEnd w:id="55"/>
     </w:p>
     <w:p>
       <w:r>
@@ -12969,11 +14132,11 @@
       <w:pPr>
         <w:pStyle w:val="Heading3"/>
       </w:pPr>
-      <w:bookmarkStart w:id="51" w:name="_Toc225593991"/>
+      <w:bookmarkStart w:id="56" w:name="_Toc225593991"/>
       <w:r>
         <w:t>Čas koncentrične faze</w:t>
       </w:r>
-      <w:bookmarkEnd w:id="51"/>
+      <w:bookmarkEnd w:id="56"/>
     </w:p>
     <w:p>
       <w:r>
@@ -13011,12 +14174,12 @@
       <w:pPr>
         <w:pStyle w:val="Heading3"/>
       </w:pPr>
-      <w:bookmarkStart w:id="52" w:name="_Toc225593992"/>
+      <w:bookmarkStart w:id="57" w:name="_Toc225593992"/>
       <w:r>
         <w:lastRenderedPageBreak/>
         <w:t>Čas ekscentrične faze</w:t>
       </w:r>
-      <w:bookmarkEnd w:id="52"/>
+      <w:bookmarkEnd w:id="57"/>
     </w:p>
     <w:p>
       <w:r>
@@ -13033,11 +14196,11 @@
       <w:pPr>
         <w:pStyle w:val="Heading3"/>
       </w:pPr>
-      <w:bookmarkStart w:id="53" w:name="_Toc225593993"/>
+      <w:bookmarkStart w:id="58" w:name="_Toc225593993"/>
       <w:r>
         <w:t>Čas izometrične faze</w:t>
       </w:r>
-      <w:bookmarkEnd w:id="53"/>
+      <w:bookmarkEnd w:id="58"/>
     </w:p>
     <w:p>
       <w:r>
@@ -13094,21 +14257,21 @@
       <w:pPr>
         <w:pStyle w:val="Heading2"/>
       </w:pPr>
-      <w:bookmarkStart w:id="54" w:name="_Toc225593994"/>
+      <w:bookmarkStart w:id="59" w:name="_Toc225593994"/>
       <w:r>
         <w:t>Povratne informacije</w:t>
       </w:r>
-      <w:bookmarkEnd w:id="54"/>
+      <w:bookmarkEnd w:id="59"/>
     </w:p>
     <w:p>
       <w:pPr>
         <w:pStyle w:val="Heading3"/>
       </w:pPr>
-      <w:bookmarkStart w:id="55" w:name="_Toc225593995"/>
+      <w:bookmarkStart w:id="60" w:name="_Toc225593995"/>
       <w:r>
         <w:t>Grafične povratne informacije</w:t>
       </w:r>
-      <w:bookmarkEnd w:id="55"/>
+      <w:bookmarkEnd w:id="60"/>
     </w:p>
     <w:p>
       <w:r>
@@ -13233,7 +14396,7 @@
                     <pic:cNvPicPr/>
                   </pic:nvPicPr>
                   <pic:blipFill>
-                    <a:blip r:embed="rId27"/>
+                    <a:blip r:embed="rId32"/>
                     <a:stretch>
                       <a:fillRect/>
                     </a:stretch>
@@ -13258,8 +14421,8 @@
       <w:pPr>
         <w:pStyle w:val="Caption"/>
       </w:pPr>
-      <w:bookmarkStart w:id="56" w:name="_Ref221966222"/>
-      <w:bookmarkStart w:id="57" w:name="_Toc225594007"/>
+      <w:bookmarkStart w:id="61" w:name="_Ref221966222"/>
+      <w:bookmarkStart w:id="62" w:name="_Toc225594007"/>
       <w:r>
         <w:t xml:space="preserve">Slika </w:t>
       </w:r>
@@ -13285,11 +14448,11 @@
       <w:r>
         <w:t>: Časovni graf</w:t>
       </w:r>
-      <w:bookmarkEnd w:id="56"/>
+      <w:bookmarkEnd w:id="61"/>
       <w:r>
         <w:t xml:space="preserve"> vsake ponovitve</w:t>
       </w:r>
-      <w:bookmarkEnd w:id="57"/>
+      <w:bookmarkEnd w:id="62"/>
     </w:p>
     <w:p/>
     <w:p>
@@ -13334,7 +14497,7 @@
                     <pic:cNvPicPr/>
                   </pic:nvPicPr>
                   <pic:blipFill>
-                    <a:blip r:embed="rId28"/>
+                    <a:blip r:embed="rId33"/>
                     <a:stretch>
                       <a:fillRect/>
                     </a:stretch>
@@ -13359,8 +14522,8 @@
       <w:pPr>
         <w:pStyle w:val="Caption"/>
       </w:pPr>
-      <w:bookmarkStart w:id="58" w:name="_Ref221966255"/>
-      <w:bookmarkStart w:id="59" w:name="_Toc225594008"/>
+      <w:bookmarkStart w:id="63" w:name="_Ref221966255"/>
+      <w:bookmarkStart w:id="64" w:name="_Toc225594008"/>
       <w:r>
         <w:t xml:space="preserve">Slika </w:t>
       </w:r>
@@ -13386,14 +14549,14 @@
       <w:r>
         <w:t xml:space="preserve">: Graf prepotovane </w:t>
       </w:r>
-      <w:bookmarkEnd w:id="58"/>
+      <w:bookmarkEnd w:id="63"/>
       <w:r>
         <w:t>razdalje</w:t>
       </w:r>
       <w:r>
         <w:t xml:space="preserve"> za vsako ponovitev</w:t>
       </w:r>
-      <w:bookmarkEnd w:id="59"/>
+      <w:bookmarkEnd w:id="64"/>
     </w:p>
     <w:p/>
     <w:p>
@@ -13428,7 +14591,7 @@
                     <pic:cNvPicPr/>
                   </pic:nvPicPr>
                   <pic:blipFill>
-                    <a:blip r:embed="rId29"/>
+                    <a:blip r:embed="rId34"/>
                     <a:stretch>
                       <a:fillRect/>
                     </a:stretch>
@@ -13453,10 +14616,10 @@
       <w:pPr>
         <w:pStyle w:val="Caption"/>
       </w:pPr>
-      <w:bookmarkStart w:id="60" w:name="_Ref221966277"/>
-      <w:bookmarkStart w:id="61" w:name="_Ref221967533"/>
-      <w:bookmarkStart w:id="62" w:name="_Ref221968150"/>
-      <w:bookmarkStart w:id="63" w:name="_Toc225594009"/>
+      <w:bookmarkStart w:id="65" w:name="_Ref221966277"/>
+      <w:bookmarkStart w:id="66" w:name="_Ref221967533"/>
+      <w:bookmarkStart w:id="67" w:name="_Ref221968150"/>
+      <w:bookmarkStart w:id="68" w:name="_Toc225594009"/>
       <w:r>
         <w:t xml:space="preserve">Slika </w:t>
       </w:r>
@@ -13482,27 +14645,27 @@
       <w:r>
         <w:t>: Graf hitrosti</w:t>
       </w:r>
-      <w:bookmarkEnd w:id="60"/>
+      <w:bookmarkEnd w:id="65"/>
       <w:r>
         <w:t xml:space="preserve"> v koncentrični fazi</w:t>
       </w:r>
-      <w:bookmarkEnd w:id="61"/>
-      <w:bookmarkEnd w:id="62"/>
+      <w:bookmarkEnd w:id="66"/>
+      <w:bookmarkEnd w:id="67"/>
       <w:r>
         <w:t xml:space="preserve"> za vsako ponovitev</w:t>
       </w:r>
-      <w:bookmarkEnd w:id="63"/>
+      <w:bookmarkEnd w:id="68"/>
     </w:p>
     <w:p>
       <w:pPr>
         <w:pStyle w:val="Heading3"/>
       </w:pPr>
-      <w:bookmarkStart w:id="64" w:name="_Toc225593996"/>
+      <w:bookmarkStart w:id="69" w:name="_Toc225593996"/>
       <w:r>
         <w:lastRenderedPageBreak/>
         <w:t>Informacije o nepravilni drži telesa</w:t>
       </w:r>
-      <w:bookmarkEnd w:id="64"/>
+      <w:bookmarkEnd w:id="69"/>
     </w:p>
     <w:p>
       <w:r>
@@ -13562,11 +14725,11 @@
       <w:pPr>
         <w:pStyle w:val="Heading2"/>
       </w:pPr>
-      <w:bookmarkStart w:id="65" w:name="_Toc225593997"/>
+      <w:bookmarkStart w:id="70" w:name="_Toc225593997"/>
       <w:r>
         <w:t>Kalibracija uporabnika</w:t>
       </w:r>
-      <w:bookmarkEnd w:id="65"/>
+      <w:bookmarkEnd w:id="70"/>
     </w:p>
     <w:p>
       <w:r>
@@ -13653,25 +14816,25 @@
       <w:pPr>
         <w:pStyle w:val="Heading2"/>
       </w:pPr>
-      <w:bookmarkStart w:id="66" w:name="_Toc225593998"/>
+      <w:bookmarkStart w:id="71" w:name="_Toc225593998"/>
       <w:r>
         <w:t xml:space="preserve">Merjenje </w:t>
       </w:r>
       <w:r>
         <w:t>višine skoka</w:t>
       </w:r>
-      <w:bookmarkEnd w:id="66"/>
+      <w:bookmarkEnd w:id="71"/>
     </w:p>
     <w:p/>
     <w:p>
       <w:pPr>
         <w:pStyle w:val="Heading2"/>
       </w:pPr>
-      <w:bookmarkStart w:id="67" w:name="_Toc225593999"/>
+      <w:bookmarkStart w:id="72" w:name="_Toc225593999"/>
       <w:r>
         <w:t>Uporaba izmerjenih podatkov med analizo in pomen treninga na podlagi hitrosti</w:t>
       </w:r>
-      <w:bookmarkEnd w:id="67"/>
+      <w:bookmarkEnd w:id="72"/>
     </w:p>
     <w:p>
       <w:r>
@@ -13695,7 +14858,7 @@
       <w:pPr>
         <w:pStyle w:val="Heading3"/>
       </w:pPr>
-      <w:bookmarkStart w:id="68" w:name="_Toc225594000"/>
+      <w:bookmarkStart w:id="73" w:name="_Toc225594000"/>
       <w:r>
         <w:t xml:space="preserve">Primerjava ponovitev znotraj </w:t>
       </w:r>
@@ -13705,7 +14868,7 @@
       <w:r>
         <w:t>serije</w:t>
       </w:r>
-      <w:bookmarkEnd w:id="68"/>
+      <w:bookmarkEnd w:id="73"/>
     </w:p>
     <w:p>
       <w:r>
@@ -13844,11 +15007,11 @@
       <w:pPr>
         <w:pStyle w:val="Heading3"/>
       </w:pPr>
-      <w:bookmarkStart w:id="69" w:name="_Toc225594001"/>
+      <w:bookmarkStart w:id="74" w:name="_Toc225594001"/>
       <w:r>
         <w:t>Trening na podlagi hitrosti</w:t>
       </w:r>
-      <w:bookmarkEnd w:id="69"/>
+      <w:bookmarkEnd w:id="74"/>
     </w:p>
     <w:p>
       <w:r>
@@ -13985,7 +15148,7 @@
       <w:pPr>
         <w:pStyle w:val="Heading3"/>
       </w:pPr>
-      <w:bookmarkStart w:id="70" w:name="_Toc225594002"/>
+      <w:bookmarkStart w:id="75" w:name="_Toc225594002"/>
       <w:r>
         <w:lastRenderedPageBreak/>
         <w:t>Primerjava med treningi</w:t>
@@ -13993,7 +15156,7 @@
       <w:r>
         <w:t xml:space="preserve"> skozi čas</w:t>
       </w:r>
-      <w:bookmarkEnd w:id="70"/>
+      <w:bookmarkEnd w:id="75"/>
     </w:p>
     <w:p>
       <w:r>
@@ -14038,14 +15201,14 @@
           <w:lang w:val="sl-SI"/>
         </w:rPr>
       </w:pPr>
-      <w:bookmarkStart w:id="71" w:name="_Toc225594003"/>
+      <w:bookmarkStart w:id="76" w:name="_Toc225594003"/>
       <w:r>
         <w:rPr>
           <w:lang w:val="sl-SI"/>
         </w:rPr>
         <w:t>VIRI</w:t>
       </w:r>
-      <w:bookmarkEnd w:id="71"/>
+      <w:bookmarkEnd w:id="76"/>
     </w:p>
     <w:p>
       <w:r>
@@ -14326,7 +15489,7 @@
     </w:p>
     <w:p/>
     <w:sectPr>
-      <w:headerReference w:type="default" r:id="rId30"/>
+      <w:headerReference w:type="default" r:id="rId35"/>
       <w:pgSz w:w="11901" w:h="16834" w:code="9"/>
       <w:pgMar w:top="1701" w:right="1418" w:bottom="1701" w:left="1985" w:header="709" w:footer="709" w:gutter="0"/>
       <w:pgNumType w:start="1"/>
@@ -14387,13 +15550,7 @@
       <w:rPr>
         <w:lang w:val="sl-SI"/>
       </w:rPr>
-      <w:t>1</w:t>
-    </w:r>
-    <w:r>
-      <w:rPr>
-        <w:lang w:val="sl-SI"/>
-      </w:rPr>
-      <w:t>8</w:t>
+      <w:t>18</w:t>
     </w:r>
     <w:r>
       <w:rPr>
@@ -14499,8 +15656,8 @@
       </w:rPr>
       <w:t xml:space="preserve">Navodila za izdelavo diplomskih </w:t>
     </w:r>
-    <w:smartTag w:uri="urn:schemas-microsoft-com:office:smarttags" w:element="State">
-      <w:smartTag w:uri="urn:schemas-microsoft-com:office:smarttags" w:element="place">
+    <w:smartTag w:uri="urn:schemas-microsoft-com:office:smarttags" w:element="place">
+      <w:smartTag w:uri="urn:schemas-microsoft-com:office:smarttags" w:element="State">
         <w:r>
           <w:rPr>
             <w:lang w:val="sl-SI"/>
@@ -22769,7 +23926,7 @@
     <w:basedOn w:val="Normal"/>
     <w:link w:val="ImagesChar"/>
     <w:qFormat/>
-    <w:rsid w:val="004B3253"/>
+    <w:rsid w:val="00792A39"/>
     <w:pPr>
       <w:keepNext/>
       <w:jc w:val="center"/>
@@ -22779,7 +23936,7 @@
     <w:name w:val="Images Char"/>
     <w:basedOn w:val="DefaultParagraphFont"/>
     <w:link w:val="Images"/>
-    <w:rsid w:val="004B3253"/>
+    <w:rsid w:val="00792A39"/>
     <w:rPr>
       <w:rFonts w:ascii="Calibri" w:hAnsi="Calibri" w:cs="Arial"/>
       <w:sz w:val="24"/>

</xml_diff>

<commit_message>
feat: implement dataset section and init model training section
</commit_message>
<xml_diff>
--- a/docs/thesis/magistrsko-delo-jasa-zupancic.docx
+++ b/docs/thesis/magistrsko-delo-jasa-zupancic.docx
@@ -5229,25 +5229,51 @@
       <w:r>
         <w:t xml:space="preserve">Slika </w:t>
       </w:r>
-      <w:fldSimple w:instr=" STYLEREF 1 \s ">
-        <w:r>
-          <w:rPr>
-            <w:noProof/>
-          </w:rPr>
-          <w:t>2</w:t>
-        </w:r>
-      </w:fldSimple>
+      <w:r>
+        <w:fldChar w:fldCharType="begin"/>
+      </w:r>
+      <w:r>
+        <w:instrText xml:space="preserve"> STYLEREF 1 \s </w:instrText>
+      </w:r>
+      <w:r>
+        <w:fldChar w:fldCharType="separate"/>
+      </w:r>
+      <w:r>
+        <w:rPr>
+          <w:noProof/>
+        </w:rPr>
+        <w:t>2</w:t>
+      </w:r>
+      <w:r>
+        <w:rPr>
+          <w:noProof/>
+        </w:rPr>
+        <w:fldChar w:fldCharType="end"/>
+      </w:r>
       <w:r>
         <w:t>.</w:t>
       </w:r>
-      <w:fldSimple w:instr=" SEQ Slika \* ARABIC \s 1 ">
-        <w:r>
-          <w:rPr>
-            <w:noProof/>
-          </w:rPr>
-          <w:t>1</w:t>
-        </w:r>
-      </w:fldSimple>
+      <w:r>
+        <w:fldChar w:fldCharType="begin"/>
+      </w:r>
+      <w:r>
+        <w:instrText xml:space="preserve"> SEQ Slika \* ARABIC \s 1 </w:instrText>
+      </w:r>
+      <w:r>
+        <w:fldChar w:fldCharType="separate"/>
+      </w:r>
+      <w:r>
+        <w:rPr>
+          <w:noProof/>
+        </w:rPr>
+        <w:t>1</w:t>
+      </w:r>
+      <w:r>
+        <w:rPr>
+          <w:noProof/>
+        </w:rPr>
+        <w:fldChar w:fldCharType="end"/>
+      </w:r>
       <w:r>
         <w:t xml:space="preserve">: </w:t>
       </w:r>
@@ -6057,25 +6083,51 @@
       <w:r>
         <w:t xml:space="preserve">Slika </w:t>
       </w:r>
-      <w:fldSimple w:instr=" STYLEREF 1 \s ">
-        <w:r>
-          <w:rPr>
-            <w:noProof/>
-          </w:rPr>
-          <w:t>2</w:t>
-        </w:r>
-      </w:fldSimple>
+      <w:r>
+        <w:fldChar w:fldCharType="begin"/>
+      </w:r>
+      <w:r>
+        <w:instrText xml:space="preserve"> STYLEREF 1 \s </w:instrText>
+      </w:r>
+      <w:r>
+        <w:fldChar w:fldCharType="separate"/>
+      </w:r>
+      <w:r>
+        <w:rPr>
+          <w:noProof/>
+        </w:rPr>
+        <w:t>2</w:t>
+      </w:r>
+      <w:r>
+        <w:rPr>
+          <w:noProof/>
+        </w:rPr>
+        <w:fldChar w:fldCharType="end"/>
+      </w:r>
       <w:r>
         <w:t>.</w:t>
       </w:r>
-      <w:fldSimple w:instr=" SEQ Slika \* ARABIC \s 1 ">
-        <w:r>
-          <w:rPr>
-            <w:noProof/>
-          </w:rPr>
-          <w:t>2</w:t>
-        </w:r>
-      </w:fldSimple>
+      <w:r>
+        <w:fldChar w:fldCharType="begin"/>
+      </w:r>
+      <w:r>
+        <w:instrText xml:space="preserve"> SEQ Slika \* ARABIC \s 1 </w:instrText>
+      </w:r>
+      <w:r>
+        <w:fldChar w:fldCharType="separate"/>
+      </w:r>
+      <w:r>
+        <w:rPr>
+          <w:noProof/>
+        </w:rPr>
+        <w:t>2</w:t>
+      </w:r>
+      <w:r>
+        <w:rPr>
+          <w:noProof/>
+        </w:rPr>
+        <w:fldChar w:fldCharType="end"/>
+      </w:r>
       <w:r>
         <w:t>: Primer COCO-pose učne množice</w:t>
       </w:r>
@@ -6507,25 +6559,51 @@
       <w:r>
         <w:t xml:space="preserve">Slika </w:t>
       </w:r>
-      <w:fldSimple w:instr=" STYLEREF 1 \s ">
-        <w:r>
-          <w:rPr>
-            <w:noProof/>
-          </w:rPr>
-          <w:t>2</w:t>
-        </w:r>
-      </w:fldSimple>
+      <w:r>
+        <w:fldChar w:fldCharType="begin"/>
+      </w:r>
+      <w:r>
+        <w:instrText xml:space="preserve"> STYLEREF 1 \s </w:instrText>
+      </w:r>
+      <w:r>
+        <w:fldChar w:fldCharType="separate"/>
+      </w:r>
+      <w:r>
+        <w:rPr>
+          <w:noProof/>
+        </w:rPr>
+        <w:t>2</w:t>
+      </w:r>
+      <w:r>
+        <w:rPr>
+          <w:noProof/>
+        </w:rPr>
+        <w:fldChar w:fldCharType="end"/>
+      </w:r>
       <w:r>
         <w:t>.</w:t>
       </w:r>
-      <w:fldSimple w:instr=" SEQ Slika \* ARABIC \s 1 ">
-        <w:r>
-          <w:rPr>
-            <w:noProof/>
-          </w:rPr>
-          <w:t>3</w:t>
-        </w:r>
-      </w:fldSimple>
+      <w:r>
+        <w:fldChar w:fldCharType="begin"/>
+      </w:r>
+      <w:r>
+        <w:instrText xml:space="preserve"> SEQ Slika \* ARABIC \s 1 </w:instrText>
+      </w:r>
+      <w:r>
+        <w:fldChar w:fldCharType="separate"/>
+      </w:r>
+      <w:r>
+        <w:rPr>
+          <w:noProof/>
+        </w:rPr>
+        <w:t>3</w:t>
+      </w:r>
+      <w:r>
+        <w:rPr>
+          <w:noProof/>
+        </w:rPr>
+        <w:fldChar w:fldCharType="end"/>
+      </w:r>
       <w:r>
         <w:t xml:space="preserve">: </w:t>
       </w:r>
@@ -8565,14 +8643,27 @@
       <w:r>
         <w:t xml:space="preserve">Tabela </w:t>
       </w:r>
-      <w:fldSimple w:instr=" SEQ Tabela \* ARABIC ">
-        <w:r>
-          <w:rPr>
-            <w:noProof/>
-          </w:rPr>
-          <w:t>1</w:t>
-        </w:r>
-      </w:fldSimple>
+      <w:r>
+        <w:fldChar w:fldCharType="begin"/>
+      </w:r>
+      <w:r>
+        <w:instrText xml:space="preserve"> SEQ Tabela \* ARABIC </w:instrText>
+      </w:r>
+      <w:r>
+        <w:fldChar w:fldCharType="separate"/>
+      </w:r>
+      <w:r>
+        <w:rPr>
+          <w:noProof/>
+        </w:rPr>
+        <w:t>1</w:t>
+      </w:r>
+      <w:r>
+        <w:rPr>
+          <w:noProof/>
+        </w:rPr>
+        <w:fldChar w:fldCharType="end"/>
+      </w:r>
       <w:r>
         <w:t xml:space="preserve">: </w:t>
       </w:r>
@@ -8861,14 +8952,27 @@
       <w:r>
         <w:t xml:space="preserve">Tabela </w:t>
       </w:r>
-      <w:fldSimple w:instr=" SEQ Tabela \* ARABIC ">
-        <w:r>
-          <w:rPr>
-            <w:noProof/>
-          </w:rPr>
-          <w:t>2</w:t>
-        </w:r>
-      </w:fldSimple>
+      <w:r>
+        <w:fldChar w:fldCharType="begin"/>
+      </w:r>
+      <w:r>
+        <w:instrText xml:space="preserve"> SEQ Tabela \* ARABIC </w:instrText>
+      </w:r>
+      <w:r>
+        <w:fldChar w:fldCharType="separate"/>
+      </w:r>
+      <w:r>
+        <w:rPr>
+          <w:noProof/>
+        </w:rPr>
+        <w:t>2</w:t>
+      </w:r>
+      <w:r>
+        <w:rPr>
+          <w:noProof/>
+        </w:rPr>
+        <w:fldChar w:fldCharType="end"/>
+      </w:r>
       <w:r>
         <w:t xml:space="preserve">: </w:t>
       </w:r>
@@ -10180,14 +10284,27 @@
       <w:r>
         <w:t xml:space="preserve">Tabela </w:t>
       </w:r>
-      <w:fldSimple w:instr=" SEQ Tabela \* ARABIC ">
-        <w:r>
-          <w:rPr>
-            <w:noProof/>
-          </w:rPr>
-          <w:t>3</w:t>
-        </w:r>
-      </w:fldSimple>
+      <w:r>
+        <w:fldChar w:fldCharType="begin"/>
+      </w:r>
+      <w:r>
+        <w:instrText xml:space="preserve"> SEQ Tabela \* ARABIC </w:instrText>
+      </w:r>
+      <w:r>
+        <w:fldChar w:fldCharType="separate"/>
+      </w:r>
+      <w:r>
+        <w:rPr>
+          <w:noProof/>
+        </w:rPr>
+        <w:t>3</w:t>
+      </w:r>
+      <w:r>
+        <w:rPr>
+          <w:noProof/>
+        </w:rPr>
+        <w:fldChar w:fldCharType="end"/>
+      </w:r>
       <w:r>
         <w:t xml:space="preserve">: Primerjava povprečnega FPS-a </w:t>
       </w:r>
@@ -10760,10 +10877,7 @@
         <w:t xml:space="preserve">. </w:t>
       </w:r>
       <w:r>
-        <w:t>T</w:t>
-      </w:r>
-      <w:r>
-        <w:t>estno</w:t>
+        <w:t>Testno</w:t>
       </w:r>
       <w:r>
         <w:t xml:space="preserve"> </w:t>
@@ -10934,14 +11048,27 @@
       <w:r>
         <w:t xml:space="preserve">Enačba </w:t>
       </w:r>
-      <w:fldSimple w:instr=" SEQ Enačba \* ARABIC ">
-        <w:r>
-          <w:rPr>
-            <w:noProof/>
-          </w:rPr>
-          <w:t>1</w:t>
-        </w:r>
-      </w:fldSimple>
+      <w:r>
+        <w:fldChar w:fldCharType="begin"/>
+      </w:r>
+      <w:r>
+        <w:instrText xml:space="preserve"> SEQ Enačba \* ARABIC </w:instrText>
+      </w:r>
+      <w:r>
+        <w:fldChar w:fldCharType="separate"/>
+      </w:r>
+      <w:r>
+        <w:rPr>
+          <w:noProof/>
+        </w:rPr>
+        <w:t>1</w:t>
+      </w:r>
+      <w:r>
+        <w:rPr>
+          <w:noProof/>
+        </w:rPr>
+        <w:fldChar w:fldCharType="end"/>
+      </w:r>
       <w:r>
         <w:t>: Napaka med referenčno in napovedano sklepno točko</w:t>
       </w:r>
@@ -11330,14 +11457,27 @@
       <w:r>
         <w:t xml:space="preserve">Enačba </w:t>
       </w:r>
-      <w:fldSimple w:instr=" SEQ Enačba \* ARABIC ">
-        <w:r>
-          <w:rPr>
-            <w:noProof/>
-          </w:rPr>
-          <w:t>2</w:t>
-        </w:r>
-      </w:fldSimple>
+      <w:r>
+        <w:fldChar w:fldCharType="begin"/>
+      </w:r>
+      <w:r>
+        <w:instrText xml:space="preserve"> SEQ Enačba \* ARABIC </w:instrText>
+      </w:r>
+      <w:r>
+        <w:fldChar w:fldCharType="separate"/>
+      </w:r>
+      <w:r>
+        <w:rPr>
+          <w:noProof/>
+        </w:rPr>
+        <w:t>2</w:t>
+      </w:r>
+      <w:r>
+        <w:rPr>
+          <w:noProof/>
+        </w:rPr>
+        <w:fldChar w:fldCharType="end"/>
+      </w:r>
       <w:r>
         <w:t>: MPJPE</w:t>
       </w:r>
@@ -11694,14 +11834,27 @@
       <w:r>
         <w:t xml:space="preserve">Slika </w:t>
       </w:r>
-      <w:fldSimple w:instr=" SEQ Slika \* ARABIC ">
-        <w:r>
-          <w:rPr>
-            <w:noProof/>
-          </w:rPr>
-          <w:t>4</w:t>
-        </w:r>
-      </w:fldSimple>
+      <w:r>
+        <w:fldChar w:fldCharType="begin"/>
+      </w:r>
+      <w:r>
+        <w:instrText xml:space="preserve"> SEQ Slika \* ARABIC </w:instrText>
+      </w:r>
+      <w:r>
+        <w:fldChar w:fldCharType="separate"/>
+      </w:r>
+      <w:r>
+        <w:rPr>
+          <w:noProof/>
+        </w:rPr>
+        <w:t>4</w:t>
+      </w:r>
+      <w:r>
+        <w:rPr>
+          <w:noProof/>
+        </w:rPr>
+        <w:fldChar w:fldCharType="end"/>
+      </w:r>
       <w:r>
         <w:t>: Rezultati MPJPE nad izbranimi modeli</w:t>
       </w:r>
@@ -11822,7 +11975,13 @@
     </w:p>
     <w:p>
       <w:r>
-        <w:t>Metrika PCK, oziroma delež pravilno zaznanih sklepnih točk, meri, kolikšen delež sklepnih točk je po napovedi dovolj blizu točkam iz referenčne resnice</w:t>
+        <w:t xml:space="preserve">Metrika PCK, oziroma delež pravilno zaznanih sklepnih točk, meri, kolikšen delež </w:t>
+      </w:r>
+      <w:r>
+        <w:t xml:space="preserve">napovedanih </w:t>
+      </w:r>
+      <w:r>
+        <w:t>sklepnih točk je dovolj blizu točkam iz referenčne resnice</w:t>
       </w:r>
       <w:r>
         <w:t>. Pravilnost se določi s pragom razdalje, zato je bilo uporabljenih več različnih pragov.</w:t>
@@ -11837,14 +11996,27 @@
       <w:r>
         <w:t xml:space="preserve">Enačba </w:t>
       </w:r>
-      <w:fldSimple w:instr=" SEQ Enačba \* ARABIC ">
-        <w:r>
-          <w:rPr>
-            <w:noProof/>
-          </w:rPr>
-          <w:t>3</w:t>
-        </w:r>
-      </w:fldSimple>
+      <w:r>
+        <w:fldChar w:fldCharType="begin"/>
+      </w:r>
+      <w:r>
+        <w:instrText xml:space="preserve"> SEQ Enačba \* ARABIC </w:instrText>
+      </w:r>
+      <w:r>
+        <w:fldChar w:fldCharType="separate"/>
+      </w:r>
+      <w:r>
+        <w:rPr>
+          <w:noProof/>
+        </w:rPr>
+        <w:t>3</w:t>
+      </w:r>
+      <w:r>
+        <w:rPr>
+          <w:noProof/>
+        </w:rPr>
+        <w:fldChar w:fldCharType="end"/>
+      </w:r>
       <w:r>
         <w:t>: Pravilnost sklepne točke za metriko PCK</w:t>
       </w:r>
@@ -11943,13 +12115,7 @@
                     <w:rPr>
                       <w:rFonts w:ascii="Cambria Math" w:hAnsi="Cambria Math"/>
                     </w:rPr>
-                    <m:t>≤</m:t>
-                  </m:r>
-                  <m:r>
-                    <w:rPr>
-                      <w:rFonts w:ascii="Cambria Math" w:hAnsi="Cambria Math"/>
-                    </w:rPr>
-                    <m:t>τ</m:t>
+                    <m:t>≤τ</m:t>
                   </m:r>
                 </m:e>
                 <m:e>
@@ -11989,13 +12155,7 @@
                     <w:rPr>
                       <w:rFonts w:ascii="Cambria Math" w:hAnsi="Cambria Math"/>
                     </w:rPr>
-                    <m:t>&gt;</m:t>
-                  </m:r>
-                  <m:r>
-                    <w:rPr>
-                      <w:rFonts w:ascii="Cambria Math" w:hAnsi="Cambria Math"/>
-                    </w:rPr>
-                    <m:t>τ</m:t>
+                    <m:t>&gt;τ</m:t>
                   </m:r>
                 </m:e>
               </m:eqArr>
@@ -12072,14 +12232,27 @@
       <w:r>
         <w:t xml:space="preserve">Enačba </w:t>
       </w:r>
-      <w:fldSimple w:instr=" SEQ Enačba \* ARABIC ">
-        <w:r>
-          <w:rPr>
-            <w:noProof/>
-          </w:rPr>
-          <w:t>4</w:t>
-        </w:r>
-      </w:fldSimple>
+      <w:r>
+        <w:fldChar w:fldCharType="begin"/>
+      </w:r>
+      <w:r>
+        <w:instrText xml:space="preserve"> SEQ Enačba \* ARABIC </w:instrText>
+      </w:r>
+      <w:r>
+        <w:fldChar w:fldCharType="separate"/>
+      </w:r>
+      <w:r>
+        <w:rPr>
+          <w:noProof/>
+        </w:rPr>
+        <w:t>4</w:t>
+      </w:r>
+      <w:r>
+        <w:rPr>
+          <w:noProof/>
+        </w:rPr>
+        <w:fldChar w:fldCharType="end"/>
+      </w:r>
       <w:r>
         <w:t>: Definicija PCK</w:t>
       </w:r>
@@ -12354,6 +12527,9 @@
         <w:pStyle w:val="Images"/>
       </w:pPr>
       <w:r>
+        <w:rPr>
+          <w:noProof/>
+        </w:rPr>
         <w:drawing>
           <wp:inline distT="0" distB="0" distL="0" distR="0" wp14:anchorId="019D5745" wp14:editId="5092E82A">
             <wp:extent cx="5396230" cy="2237105"/>
@@ -12399,14 +12575,27 @@
       <w:r>
         <w:t xml:space="preserve">Slika </w:t>
       </w:r>
-      <w:fldSimple w:instr=" SEQ Slika \* ARABIC ">
-        <w:r>
-          <w:rPr>
-            <w:noProof/>
-          </w:rPr>
-          <w:t>5</w:t>
-        </w:r>
-      </w:fldSimple>
+      <w:r>
+        <w:fldChar w:fldCharType="begin"/>
+      </w:r>
+      <w:r>
+        <w:instrText xml:space="preserve"> SEQ Slika \* ARABIC </w:instrText>
+      </w:r>
+      <w:r>
+        <w:fldChar w:fldCharType="separate"/>
+      </w:r>
+      <w:r>
+        <w:rPr>
+          <w:noProof/>
+        </w:rPr>
+        <w:t>5</w:t>
+      </w:r>
+      <w:r>
+        <w:rPr>
+          <w:noProof/>
+        </w:rPr>
+        <w:fldChar w:fldCharType="end"/>
+      </w:r>
       <w:r>
         <w:t xml:space="preserve">: Rezultati </w:t>
       </w:r>
@@ -12423,6 +12612,9 @@
         <w:pStyle w:val="Images"/>
       </w:pPr>
       <w:r>
+        <w:rPr>
+          <w:noProof/>
+        </w:rPr>
         <w:lastRenderedPageBreak/>
         <w:drawing>
           <wp:inline distT="0" distB="0" distL="0" distR="0" wp14:anchorId="7258E1CD" wp14:editId="64077337">
@@ -12469,14 +12661,27 @@
       <w:r>
         <w:t xml:space="preserve">Slika </w:t>
       </w:r>
-      <w:fldSimple w:instr=" SEQ Slika \* ARABIC ">
-        <w:r>
-          <w:rPr>
-            <w:noProof/>
-          </w:rPr>
-          <w:t>6</w:t>
-        </w:r>
-      </w:fldSimple>
+      <w:r>
+        <w:fldChar w:fldCharType="begin"/>
+      </w:r>
+      <w:r>
+        <w:instrText xml:space="preserve"> SEQ Slika \* ARABIC </w:instrText>
+      </w:r>
+      <w:r>
+        <w:fldChar w:fldCharType="separate"/>
+      </w:r>
+      <w:r>
+        <w:rPr>
+          <w:noProof/>
+        </w:rPr>
+        <w:t>6</w:t>
+      </w:r>
+      <w:r>
+        <w:rPr>
+          <w:noProof/>
+        </w:rPr>
+        <w:fldChar w:fldCharType="end"/>
+      </w:r>
       <w:r>
         <w:t>: Rezultati metrike PCK pri pragu 0.02</w:t>
       </w:r>
@@ -12487,6 +12692,9 @@
         <w:pStyle w:val="Images"/>
       </w:pPr>
       <w:r>
+        <w:rPr>
+          <w:noProof/>
+        </w:rPr>
         <w:drawing>
           <wp:inline distT="0" distB="0" distL="0" distR="0" wp14:anchorId="69F82535" wp14:editId="4800961B">
             <wp:extent cx="5396230" cy="2237105"/>
@@ -12532,14 +12740,27 @@
       <w:r>
         <w:t xml:space="preserve">Slika </w:t>
       </w:r>
-      <w:fldSimple w:instr=" SEQ Slika \* ARABIC ">
-        <w:r>
-          <w:rPr>
-            <w:noProof/>
-          </w:rPr>
-          <w:t>7</w:t>
-        </w:r>
-      </w:fldSimple>
+      <w:r>
+        <w:fldChar w:fldCharType="begin"/>
+      </w:r>
+      <w:r>
+        <w:instrText xml:space="preserve"> SEQ Slika \* ARABIC </w:instrText>
+      </w:r>
+      <w:r>
+        <w:fldChar w:fldCharType="separate"/>
+      </w:r>
+      <w:r>
+        <w:rPr>
+          <w:noProof/>
+        </w:rPr>
+        <w:t>7</w:t>
+      </w:r>
+      <w:r>
+        <w:rPr>
+          <w:noProof/>
+        </w:rPr>
+        <w:fldChar w:fldCharType="end"/>
+      </w:r>
       <w:r>
         <w:t xml:space="preserve">: </w:t>
       </w:r>
@@ -12762,6 +12983,9 @@
         <w:pStyle w:val="Images"/>
       </w:pPr>
       <w:r>
+        <w:rPr>
+          <w:noProof/>
+        </w:rPr>
         <w:drawing>
           <wp:inline distT="0" distB="0" distL="0" distR="0" wp14:anchorId="07B557F3" wp14:editId="4D717EFA">
             <wp:extent cx="5396230" cy="2677795"/>
@@ -12806,14 +13030,27 @@
       <w:r>
         <w:t xml:space="preserve">Slika </w:t>
       </w:r>
-      <w:fldSimple w:instr=" SEQ Slika \* ARABIC ">
-        <w:r>
-          <w:rPr>
-            <w:noProof/>
-          </w:rPr>
-          <w:t>8</w:t>
-        </w:r>
-      </w:fldSimple>
+      <w:r>
+        <w:fldChar w:fldCharType="begin"/>
+      </w:r>
+      <w:r>
+        <w:instrText xml:space="preserve"> SEQ Slika \* ARABIC </w:instrText>
+      </w:r>
+      <w:r>
+        <w:fldChar w:fldCharType="separate"/>
+      </w:r>
+      <w:r>
+        <w:rPr>
+          <w:noProof/>
+        </w:rPr>
+        <w:t>8</w:t>
+      </w:r>
+      <w:r>
+        <w:rPr>
+          <w:noProof/>
+        </w:rPr>
+        <w:fldChar w:fldCharType="end"/>
+      </w:r>
       <w:r>
         <w:t xml:space="preserve">: Primerjava med napovedmi sklepnih točk za model </w:t>
       </w:r>
@@ -12844,6 +13081,9 @@
         <w:keepNext/>
       </w:pPr>
       <w:r>
+        <w:rPr>
+          <w:noProof/>
+        </w:rPr>
         <w:drawing>
           <wp:inline distT="0" distB="0" distL="0" distR="0" wp14:anchorId="665758D8" wp14:editId="7C8FBF02">
             <wp:extent cx="5396230" cy="2675255"/>
@@ -12888,14 +13128,27 @@
       <w:r>
         <w:t xml:space="preserve">Slika </w:t>
       </w:r>
-      <w:fldSimple w:instr=" SEQ Slika \* ARABIC ">
-        <w:r>
-          <w:rPr>
-            <w:noProof/>
-          </w:rPr>
-          <w:t>9</w:t>
-        </w:r>
-      </w:fldSimple>
+      <w:r>
+        <w:fldChar w:fldCharType="begin"/>
+      </w:r>
+      <w:r>
+        <w:instrText xml:space="preserve"> SEQ Slika \* ARABIC </w:instrText>
+      </w:r>
+      <w:r>
+        <w:fldChar w:fldCharType="separate"/>
+      </w:r>
+      <w:r>
+        <w:rPr>
+          <w:noProof/>
+        </w:rPr>
+        <w:t>9</w:t>
+      </w:r>
+      <w:r>
+        <w:rPr>
+          <w:noProof/>
+        </w:rPr>
+        <w:fldChar w:fldCharType="end"/>
+      </w:r>
       <w:r>
         <w:t xml:space="preserve">: </w:t>
       </w:r>
@@ -13026,12 +13279,1625 @@
       <w:bookmarkEnd w:id="46"/>
     </w:p>
     <w:p>
+      <w:r>
+        <w:t>Učna množica v okviru tega magistrskega dela ni nastala z ločenim, namenskim snemanjem v laboratorijskih pogojih, temveč kot rezultat uporabe razvitega orodja za realno-časovno analizo vadbe</w:t>
+      </w:r>
+      <w:r>
+        <w:t xml:space="preserve">. </w:t>
+      </w:r>
+      <w:r>
+        <w:t xml:space="preserve">Dostop do aplikacije je bil omogočen le vnaprej določenemu krogu uporabnikov, ki so se </w:t>
+      </w:r>
+      <w:r>
+        <w:t xml:space="preserve">strinjali </w:t>
+      </w:r>
+      <w:r>
+        <w:t>z zajemom slik med izvajanjem vadbe, ki sestavljajo učno množico.</w:t>
+      </w:r>
+      <w:r>
+        <w:t xml:space="preserve"> Takšen pristop je omogočil, da so se podatki zbirali v realnih </w:t>
+      </w:r>
+      <w:r>
+        <w:t xml:space="preserve">in spreminjajočih se </w:t>
+      </w:r>
+      <w:r>
+        <w:t>pogojih izvajanja vadbe</w:t>
+      </w:r>
+      <w:r>
+        <w:t xml:space="preserve"> (različni uporabniki, različne vadbe</w:t>
+      </w:r>
+      <w:r>
+        <w:t>, zajem slik na različnih napravah</w:t>
+      </w:r>
+      <w:r>
+        <w:t>)</w:t>
+      </w:r>
+      <w:r>
+        <w:t>, kar povečuje raznolikost učne množice</w:t>
+      </w:r>
+      <w:r>
+        <w:t>.</w:t>
+      </w:r>
+    </w:p>
+    <w:p/>
+    <w:p>
+      <w:pPr>
+        <w:pStyle w:val="Heading2"/>
+      </w:pPr>
+      <w:r>
+        <w:t>Zajem učnih podatkov</w:t>
+      </w:r>
+    </w:p>
+    <w:p>
+      <w:r>
+        <w:t xml:space="preserve">Zajem učnih podatkov je vgrajen v aplikaciji med uporabo realno-časovne analize vadbe. </w:t>
+      </w:r>
+      <w:r>
+        <w:t>Med izvajanjem analize se v določenih trenutkih zajamejo slike</w:t>
+      </w:r>
+      <w:r>
+        <w:t xml:space="preserve">. </w:t>
+      </w:r>
+      <w:r>
+        <w:t>Ti trenutki so določeni preko analize gibanja napovedanih sklepnih točk</w:t>
+      </w:r>
+      <w:r>
+        <w:t>, specifično v ekstremnih točkah ponovitve, torej v izometričnih položajih vsake ponovitve.</w:t>
+      </w:r>
+      <w:r>
+        <w:t xml:space="preserve"> Izometrični položaj v primeru vadbe počepa nastopi takrat, ko je uporabnik v najnižji možni točki, torej v najglobljem počepu.</w:t>
+      </w:r>
+      <w:r>
+        <w:t xml:space="preserve"> </w:t>
+      </w:r>
+      <w:r>
+        <w:t xml:space="preserve">Model, ki se je uporabljal med uporabo aplikacije za zajem učne množice, je bil </w:t>
+      </w:r>
+      <w:proofErr w:type="spellStart"/>
+      <w:r>
+        <w:t>MediaPipe</w:t>
+      </w:r>
+      <w:proofErr w:type="spellEnd"/>
+      <w:r>
+        <w:t xml:space="preserve"> </w:t>
+      </w:r>
+      <w:proofErr w:type="spellStart"/>
+      <w:r>
+        <w:t>Full</w:t>
+      </w:r>
+      <w:proofErr w:type="spellEnd"/>
+      <w:r>
+        <w:t>.</w:t>
+      </w:r>
+    </w:p>
+    <w:p/>
+    <w:p>
+      <w:r>
+        <w:t xml:space="preserve">Tak način zbiranja podatkov ima tudi praktično prednost, saj so slike zajete med dejansko uporabo sistema, kar pomeni, da se učna množica naravno prilagaja ciljnemu scenariju aplikacije. Sklepamo lahko, da bi </w:t>
+      </w:r>
+      <w:r>
+        <w:t xml:space="preserve">verzija </w:t>
+      </w:r>
+      <w:r>
+        <w:t>model</w:t>
+      </w:r>
+      <w:r>
+        <w:t>a</w:t>
+      </w:r>
+      <w:r>
+        <w:t>, ki je naučen</w:t>
+      </w:r>
+      <w:r>
+        <w:t>a</w:t>
+      </w:r>
+      <w:r>
+        <w:t xml:space="preserve"> na lastni učni množici, zajeti med uporabo aplikacije, nad testno množico doseg</w:t>
+      </w:r>
+      <w:r>
+        <w:t>la</w:t>
+      </w:r>
+      <w:r>
+        <w:t xml:space="preserve"> boljše rezultate kot </w:t>
+      </w:r>
+      <w:r>
+        <w:t xml:space="preserve">verzija istega </w:t>
+      </w:r>
+      <w:r>
+        <w:t>model</w:t>
+      </w:r>
+      <w:r>
+        <w:t>a</w:t>
+      </w:r>
+      <w:r>
+        <w:t>, ki ni naučen</w:t>
+      </w:r>
+      <w:r>
+        <w:t>a</w:t>
+      </w:r>
+      <w:r>
+        <w:t xml:space="preserve"> na lastni učni množici.</w:t>
+      </w:r>
+    </w:p>
+    <w:p/>
+    <w:p>
+      <w:pPr>
+        <w:pStyle w:val="Heading2"/>
+      </w:pPr>
+      <w:r>
+        <w:t>Označevanje učnih podatkov</w:t>
+      </w:r>
+    </w:p>
+    <w:p>
+      <w:r>
+        <w:t xml:space="preserve">Označevanje učnih podatkov predstavlja enega najbolj časovno zahtevnih korakov pri pripravi lastne učne množice. Ročno označevanje podatkov bi za vsako sliko zahtevalo </w:t>
+      </w:r>
+      <w:r>
+        <w:t xml:space="preserve">ročno </w:t>
+      </w:r>
+      <w:r>
+        <w:t xml:space="preserve">označbo osebe v kadru kot tudi </w:t>
+      </w:r>
+      <w:r>
+        <w:t xml:space="preserve">ročno </w:t>
+      </w:r>
+      <w:r>
+        <w:t xml:space="preserve">označbo vsake sklepne točke posebej. Po </w:t>
+      </w:r>
+      <w:r>
+        <w:lastRenderedPageBreak/>
+        <w:t xml:space="preserve">navadi je teh sklepnih točk 17, kar nad tisočih slikah zahteva veliko časa in preciznosti. </w:t>
+      </w:r>
+      <w:r>
+        <w:t xml:space="preserve">Zaradi tega je bilo za označevanje učnih podatkov uporabljeno samodejno označevanje z uporabo napovedi visokozmogljivega modela RTMO-X. </w:t>
+      </w:r>
+      <w:r>
+        <w:t>N</w:t>
+      </w:r>
+      <w:r>
+        <w:t xml:space="preserve">apovedi modela RTMO-X so se uporabile kot referenčna resnica, torej model RTMO-X deluje kot </w:t>
+      </w:r>
+      <w:r>
+        <w:t>“</w:t>
+      </w:r>
+      <w:r>
+        <w:t>učitelj</w:t>
+      </w:r>
+      <w:r>
+        <w:t>“</w:t>
+      </w:r>
+      <w:r>
+        <w:t>.</w:t>
+      </w:r>
+      <w:r>
+        <w:t xml:space="preserve"> Na ta način označevanje učne množice ni bilo preveč časovno zahtevno.</w:t>
+      </w:r>
+    </w:p>
+    <w:p/>
+    <w:p>
+      <w:pPr>
+        <w:pStyle w:val="Heading2"/>
+      </w:pPr>
+      <w:r>
+        <w:t>Čiščenje učne množice</w:t>
+      </w:r>
+    </w:p>
+    <w:p>
+      <w:r>
+        <w:t xml:space="preserve">Pred označevanjem učne množice z uporabo modela RTMO-X je bilo opravljeno čiščenje učne množice. </w:t>
+      </w:r>
+      <w:r>
+        <w:t>Čiščenje učne množice pomeni izločanje slik, ki niso primerne za učenje</w:t>
+      </w:r>
+      <w:r>
+        <w:t xml:space="preserve"> ali pa bi lahko poslabšale kakovost modela.</w:t>
+      </w:r>
+      <w:r>
+        <w:t xml:space="preserve"> Ker je bil zajem slik izveden v med realno-časovnim zajemom izvajanja vadbe, so se v učni množici pojavili primeri, ki niso primerni za učenje. Razlogov za klasificirane slike kot neprimerne za učenje je več:</w:t>
+      </w:r>
+    </w:p>
+    <w:p>
+      <w:pPr>
+        <w:pStyle w:val="ListParagraph"/>
+        <w:numPr>
+          <w:ilvl w:val="0"/>
+          <w:numId w:val="71"/>
+        </w:numPr>
+      </w:pPr>
+      <w:r>
+        <w:t>Na sliki je več kot ena oseba</w:t>
+      </w:r>
+    </w:p>
+    <w:p>
+      <w:pPr>
+        <w:pStyle w:val="ListParagraph"/>
+        <w:numPr>
+          <w:ilvl w:val="0"/>
+          <w:numId w:val="71"/>
+        </w:numPr>
+      </w:pPr>
+      <w:r>
+        <w:t xml:space="preserve">Oseba </w:t>
+      </w:r>
+      <w:r>
+        <w:t xml:space="preserve">na sliki </w:t>
+      </w:r>
+      <w:r>
+        <w:t>ni v celoti v kadru</w:t>
+      </w:r>
+    </w:p>
+    <w:p>
+      <w:pPr>
+        <w:pStyle w:val="ListParagraph"/>
+        <w:numPr>
+          <w:ilvl w:val="0"/>
+          <w:numId w:val="71"/>
+        </w:numPr>
+      </w:pPr>
+      <w:r>
+        <w:t xml:space="preserve">Oseba na sliki </w:t>
+      </w:r>
+      <w:r>
+        <w:t>je popačena</w:t>
+      </w:r>
+    </w:p>
+    <w:p>
+      <w:pPr>
+        <w:pStyle w:val="ListParagraph"/>
+        <w:numPr>
+          <w:ilvl w:val="0"/>
+          <w:numId w:val="71"/>
+        </w:numPr>
+      </w:pPr>
+      <w:r>
+        <w:t>Oseba na sliki je v zelo nenaravnem položaju</w:t>
+      </w:r>
+    </w:p>
+    <w:p>
+      <w:pPr>
+        <w:pStyle w:val="ListParagraph"/>
+        <w:numPr>
+          <w:ilvl w:val="0"/>
+          <w:numId w:val="71"/>
+        </w:numPr>
+      </w:pPr>
+      <w:r>
+        <w:t>…</w:t>
+      </w:r>
+    </w:p>
+    <w:p/>
+    <w:p>
+      <w:pPr>
+        <w:pStyle w:val="Heading2"/>
+      </w:pPr>
+      <w:r>
+        <w:t>Pregled in analiza učne množice</w:t>
+      </w:r>
+    </w:p>
+    <w:p>
+      <w:r>
+        <w:t>Analiza učne množice ima velik pomen, saj</w:t>
+      </w:r>
+      <w:r>
+        <w:t xml:space="preserve"> </w:t>
+      </w:r>
+      <w:r>
+        <w:t xml:space="preserve">ima velik vpliv na učenje modelov. </w:t>
+      </w:r>
+      <w:r>
+        <w:t xml:space="preserve">V primeru lastne učne množice, </w:t>
+      </w:r>
+      <w:r>
+        <w:t>je analiza osredotočena predvsem na zastopanost posameznih vaj</w:t>
+      </w:r>
+      <w:r>
+        <w:t xml:space="preserve"> ter </w:t>
+      </w:r>
+      <w:r>
+        <w:t>porazdelitev podatkov po uporabnikih</w:t>
+      </w:r>
+      <w:r>
+        <w:t>.</w:t>
+      </w:r>
+    </w:p>
+    <w:p>
+      <w:pPr>
+        <w:pStyle w:val="Heading3"/>
+      </w:pPr>
+      <w:r>
+        <w:t>Delitev učne množice</w:t>
+      </w:r>
+    </w:p>
+    <w:p>
+      <w:r>
+        <w:t>Učna množica je razdeljena na tri dele:</w:t>
+      </w:r>
+    </w:p>
+    <w:p>
+      <w:pPr>
+        <w:pStyle w:val="ListParagraph"/>
+        <w:numPr>
+          <w:ilvl w:val="0"/>
+          <w:numId w:val="72"/>
+        </w:numPr>
+      </w:pPr>
+      <w:r>
+        <w:t>Učni del (</w:t>
+      </w:r>
+      <w:proofErr w:type="spellStart"/>
+      <w:r>
+        <w:t>train</w:t>
+      </w:r>
+      <w:proofErr w:type="spellEnd"/>
+      <w:r>
+        <w:t>): 80%</w:t>
+      </w:r>
+    </w:p>
+    <w:p>
+      <w:pPr>
+        <w:pStyle w:val="ListParagraph"/>
+        <w:numPr>
+          <w:ilvl w:val="0"/>
+          <w:numId w:val="72"/>
+        </w:numPr>
+      </w:pPr>
+      <w:proofErr w:type="spellStart"/>
+      <w:r>
+        <w:t>Validacijski</w:t>
+      </w:r>
+      <w:proofErr w:type="spellEnd"/>
+      <w:r>
+        <w:t xml:space="preserve"> del (val): 10%</w:t>
+      </w:r>
+    </w:p>
+    <w:p>
+      <w:pPr>
+        <w:pStyle w:val="ListParagraph"/>
+        <w:numPr>
+          <w:ilvl w:val="0"/>
+          <w:numId w:val="72"/>
+        </w:numPr>
+      </w:pPr>
+      <w:r>
+        <w:t>Testni del (test): 10%</w:t>
+      </w:r>
+    </w:p>
+    <w:p/>
+    <w:p>
+      <w:r>
+        <w:lastRenderedPageBreak/>
+        <w:t xml:space="preserve">Takšna delitev omogoča učenje modela na večini podatkov, sprotno spremljanje učenja in izbiro parametrov na </w:t>
+      </w:r>
+      <w:proofErr w:type="spellStart"/>
+      <w:r>
+        <w:t>validacijski</w:t>
+      </w:r>
+      <w:proofErr w:type="spellEnd"/>
+      <w:r>
+        <w:t xml:space="preserve"> množici, ter končno oceno uspešnosti na testnem delu.</w:t>
+      </w:r>
+    </w:p>
+    <w:p>
+      <w:pPr>
+        <w:pStyle w:val="Heading3"/>
+      </w:pPr>
+      <w:r>
+        <w:t>Zastopanost posameznih vaj</w:t>
+      </w:r>
+    </w:p>
+    <w:p>
+      <w:r>
+        <w:t>Ker so bile slike iz učne množice zajete med uporabo aplikacije pri različnih vadbah, je porazdelitev podatkov po vajah neenakomerna. Za analizo te porazdelitve je najprimerneje pripraviti histogram, ki prikazuje število slik po posamezni vaji. Takšen prikaz je pomemben, saj lahko prevlada ene vaje povzroči, da se model pri učenju bolj prilagodi tipičnim položajem in gibalnim vzorcem te vaje, medtem ko je pri redkeje zastopanih vajah natančnost lahko slabša.</w:t>
+      </w:r>
+    </w:p>
+    <w:p>
       <w:pPr>
         <w:pStyle w:val="Images"/>
       </w:pPr>
       <w:r>
+        <w:drawing>
+          <wp:inline distT="0" distB="0" distL="0" distR="0" wp14:anchorId="100F35AD" wp14:editId="61203F43">
+            <wp:extent cx="5396230" cy="2677795"/>
+            <wp:effectExtent l="0" t="0" r="0" b="8255"/>
+            <wp:docPr id="1163669533" name="Picture 1"/>
+            <wp:cNvGraphicFramePr>
+              <a:graphicFrameLocks xmlns:a="http://schemas.openxmlformats.org/drawingml/2006/main" noChangeAspect="1"/>
+            </wp:cNvGraphicFramePr>
+            <a:graphic xmlns:a="http://schemas.openxmlformats.org/drawingml/2006/main">
+              <a:graphicData uri="http://schemas.openxmlformats.org/drawingml/2006/picture">
+                <pic:pic xmlns:pic="http://schemas.openxmlformats.org/drawingml/2006/picture">
+                  <pic:nvPicPr>
+                    <pic:cNvPr id="1163669533" name=""/>
+                    <pic:cNvPicPr/>
+                  </pic:nvPicPr>
+                  <pic:blipFill>
+                    <a:blip r:embed="rId32"/>
+                    <a:stretch>
+                      <a:fillRect/>
+                    </a:stretch>
+                  </pic:blipFill>
+                  <pic:spPr>
+                    <a:xfrm>
+                      <a:off x="0" y="0"/>
+                      <a:ext cx="5396230" cy="2677795"/>
+                    </a:xfrm>
+                    <a:prstGeom prst="rect">
+                      <a:avLst/>
+                    </a:prstGeom>
+                  </pic:spPr>
+                </pic:pic>
+              </a:graphicData>
+            </a:graphic>
+          </wp:inline>
+        </w:drawing>
+      </w:r>
+    </w:p>
+    <w:p>
+      <w:pPr>
+        <w:pStyle w:val="Caption"/>
+      </w:pPr>
+      <w:r>
+        <w:t xml:space="preserve">Slika </w:t>
+      </w:r>
+      <w:r>
+        <w:fldChar w:fldCharType="begin"/>
+      </w:r>
+      <w:r>
+        <w:instrText xml:space="preserve"> SEQ Slika \* ARABIC </w:instrText>
+      </w:r>
+      <w:r>
+        <w:fldChar w:fldCharType="separate"/>
+      </w:r>
+      <w:r>
+        <w:rPr>
+          <w:noProof/>
+        </w:rPr>
+        <w:t>10</w:t>
+      </w:r>
+      <w:r>
+        <w:fldChar w:fldCharType="end"/>
+      </w:r>
+      <w:r>
+        <w:t>: Histogram zastopanosti vaj v učni množici</w:t>
+      </w:r>
+    </w:p>
+    <w:p>
+      <w:pPr>
+        <w:pStyle w:val="Heading3"/>
+      </w:pPr>
+      <w:r>
+        <w:t>Zastopanost posameznih uporabnikov</w:t>
+      </w:r>
+    </w:p>
+    <w:p>
+      <w:r>
+        <w:t xml:space="preserve">Poleg zastopanosti vaj je pomemben tudi pogled na to, koliko podatkov pripada posameznemu uporabniku. </w:t>
+      </w:r>
+      <w:r>
+        <w:t xml:space="preserve">Prevelika koncentracija slik enega uporabnika lahko vodi v prilagoditev modela na specifične lastnosti tega uporabnika. </w:t>
+      </w:r>
+      <w:r>
+        <w:t>Število unikatnih uporabnikov v učni množici je 134. Na histogramu je prikazanih 30 najbolj zastopanih</w:t>
+      </w:r>
+      <w:r>
+        <w:t>.</w:t>
+      </w:r>
+      <w:r>
+        <w:t xml:space="preserve"> Identitete uporabnikov so na histogramu </w:t>
+      </w:r>
+      <w:r>
+        <w:t>skrite.</w:t>
+      </w:r>
+    </w:p>
+    <w:p>
+      <w:pPr>
+        <w:pStyle w:val="Images"/>
+      </w:pPr>
+      <w:r>
+        <w:lastRenderedPageBreak/>
+        <w:drawing>
+          <wp:inline distT="0" distB="0" distL="0" distR="0" wp14:anchorId="61C0C3E1" wp14:editId="13C3024A">
+            <wp:extent cx="5620167" cy="2788920"/>
+            <wp:effectExtent l="0" t="0" r="0" b="0"/>
+            <wp:docPr id="613070822" name="Picture 1"/>
+            <wp:cNvGraphicFramePr>
+              <a:graphicFrameLocks xmlns:a="http://schemas.openxmlformats.org/drawingml/2006/main" noChangeAspect="1"/>
+            </wp:cNvGraphicFramePr>
+            <a:graphic xmlns:a="http://schemas.openxmlformats.org/drawingml/2006/main">
+              <a:graphicData uri="http://schemas.openxmlformats.org/drawingml/2006/picture">
+                <pic:pic xmlns:pic="http://schemas.openxmlformats.org/drawingml/2006/picture">
+                  <pic:nvPicPr>
+                    <pic:cNvPr id="613070822" name=""/>
+                    <pic:cNvPicPr/>
+                  </pic:nvPicPr>
+                  <pic:blipFill>
+                    <a:blip r:embed="rId33"/>
+                    <a:stretch>
+                      <a:fillRect/>
+                    </a:stretch>
+                  </pic:blipFill>
+                  <pic:spPr>
+                    <a:xfrm>
+                      <a:off x="0" y="0"/>
+                      <a:ext cx="5622763" cy="2790208"/>
+                    </a:xfrm>
+                    <a:prstGeom prst="rect">
+                      <a:avLst/>
+                    </a:prstGeom>
+                  </pic:spPr>
+                </pic:pic>
+              </a:graphicData>
+            </a:graphic>
+          </wp:inline>
+        </w:drawing>
+      </w:r>
+    </w:p>
+    <w:p>
+      <w:pPr>
+        <w:pStyle w:val="Caption"/>
+      </w:pPr>
+      <w:r>
+        <w:t xml:space="preserve">Slika </w:t>
+      </w:r>
+      <w:r>
+        <w:fldChar w:fldCharType="begin"/>
+      </w:r>
+      <w:r>
+        <w:instrText xml:space="preserve"> SEQ Slika \* ARABIC </w:instrText>
+      </w:r>
+      <w:r>
+        <w:fldChar w:fldCharType="separate"/>
+      </w:r>
+      <w:r>
+        <w:rPr>
+          <w:noProof/>
+        </w:rPr>
+        <w:t>11</w:t>
+      </w:r>
+      <w:r>
+        <w:fldChar w:fldCharType="end"/>
+      </w:r>
+      <w:r>
+        <w:t xml:space="preserve">: Histogram zastopanosti </w:t>
+      </w:r>
+      <w:proofErr w:type="spellStart"/>
+      <w:r>
+        <w:t>zporabnikov</w:t>
+      </w:r>
+      <w:proofErr w:type="spellEnd"/>
+      <w:r>
+        <w:t xml:space="preserve"> v učni množici</w:t>
+      </w:r>
+    </w:p>
+    <w:p>
+      <w:pPr>
+        <w:pStyle w:val="Heading3"/>
+      </w:pPr>
+      <w:r>
+        <w:t>Primeri iz učne množice</w:t>
+      </w:r>
+    </w:p>
+    <w:p>
+      <w:r>
+        <w:t xml:space="preserve">Zaradi varstva osebnih podatkov so prikazani zgolj primeri slik, na katerih nastopa avtor. </w:t>
+      </w:r>
+    </w:p>
+    <w:tbl>
+      <w:tblPr>
+        <w:tblStyle w:val="TableGrid"/>
+        <w:tblW w:w="0" w:type="auto"/>
+        <w:tblBorders>
+          <w:top w:val="none" w:sz="0" w:space="0" w:color="auto"/>
+          <w:left w:val="none" w:sz="0" w:space="0" w:color="auto"/>
+          <w:bottom w:val="none" w:sz="0" w:space="0" w:color="auto"/>
+          <w:right w:val="none" w:sz="0" w:space="0" w:color="auto"/>
+          <w:insideH w:val="none" w:sz="0" w:space="0" w:color="auto"/>
+          <w:insideV w:val="none" w:sz="0" w:space="0" w:color="auto"/>
+        </w:tblBorders>
+        <w:tblLook w:val="04A0" w:firstRow="1" w:lastRow="0" w:firstColumn="1" w:lastColumn="0" w:noHBand="0" w:noVBand="1"/>
+      </w:tblPr>
+      <w:tblGrid>
+        <w:gridCol w:w="4244"/>
+        <w:gridCol w:w="4244"/>
+      </w:tblGrid>
+      <w:tr>
+        <w:tc>
+          <w:tcPr>
+            <w:tcW w:w="4244" w:type="dxa"/>
+          </w:tcPr>
+          <w:p>
+            <w:pPr>
+              <w:keepNext/>
+              <w:jc w:val="center"/>
+            </w:pPr>
+            <w:r>
+              <w:rPr>
+                <w:noProof/>
+              </w:rPr>
+              <w:drawing>
+                <wp:inline distT="0" distB="0" distL="0" distR="0" wp14:anchorId="686C8A76" wp14:editId="70D4F002">
+                  <wp:extent cx="2228400" cy="2970000"/>
+                  <wp:effectExtent l="0" t="0" r="635" b="1905"/>
+                  <wp:docPr id="1752376723" name="Picture 2"/>
+                  <wp:cNvGraphicFramePr>
+                    <a:graphicFrameLocks xmlns:a="http://schemas.openxmlformats.org/drawingml/2006/main" noChangeAspect="1"/>
+                  </wp:cNvGraphicFramePr>
+                  <a:graphic xmlns:a="http://schemas.openxmlformats.org/drawingml/2006/main">
+                    <a:graphicData uri="http://schemas.openxmlformats.org/drawingml/2006/picture">
+                      <pic:pic xmlns:pic="http://schemas.openxmlformats.org/drawingml/2006/picture">
+                        <pic:nvPicPr>
+                          <pic:cNvPr id="0" name="Picture 1"/>
+                          <pic:cNvPicPr>
+                            <a:picLocks noChangeAspect="1" noChangeArrowheads="1"/>
+                          </pic:cNvPicPr>
+                        </pic:nvPicPr>
+                        <pic:blipFill>
+                          <a:blip r:embed="rId34">
+                            <a:extLst>
+                              <a:ext uri="{28A0092B-C50C-407E-A947-70E740481C1C}">
+                                <a14:useLocalDpi xmlns:a14="http://schemas.microsoft.com/office/drawing/2010/main" val="0"/>
+                              </a:ext>
+                            </a:extLst>
+                          </a:blip>
+                          <a:srcRect/>
+                          <a:stretch>
+                            <a:fillRect/>
+                          </a:stretch>
+                        </pic:blipFill>
+                        <pic:spPr bwMode="auto">
+                          <a:xfrm>
+                            <a:off x="0" y="0"/>
+                            <a:ext cx="2228400" cy="2970000"/>
+                          </a:xfrm>
+                          <a:prstGeom prst="rect">
+                            <a:avLst/>
+                          </a:prstGeom>
+                          <a:noFill/>
+                          <a:ln>
+                            <a:noFill/>
+                          </a:ln>
+                        </pic:spPr>
+                      </pic:pic>
+                    </a:graphicData>
+                  </a:graphic>
+                </wp:inline>
+              </w:drawing>
+            </w:r>
+          </w:p>
+          <w:p>
+            <w:pPr>
+              <w:pStyle w:val="Caption"/>
+              <w:rPr>
+                <w:szCs w:val="24"/>
+              </w:rPr>
+            </w:pPr>
+            <w:r>
+              <w:rPr>
+                <w:szCs w:val="24"/>
+              </w:rPr>
+              <w:t xml:space="preserve">Slika </w:t>
+            </w:r>
+            <w:r>
+              <w:rPr>
+                <w:szCs w:val="24"/>
+              </w:rPr>
+              <w:fldChar w:fldCharType="begin"/>
+            </w:r>
+            <w:r>
+              <w:rPr>
+                <w:szCs w:val="24"/>
+              </w:rPr>
+              <w:instrText xml:space="preserve"> SEQ Slika \* ARABIC </w:instrText>
+            </w:r>
+            <w:r>
+              <w:rPr>
+                <w:szCs w:val="24"/>
+              </w:rPr>
+              <w:fldChar w:fldCharType="separate"/>
+            </w:r>
+            <w:r>
+              <w:rPr>
+                <w:noProof/>
+                <w:szCs w:val="24"/>
+              </w:rPr>
+              <w:t>12</w:t>
+            </w:r>
+            <w:r>
+              <w:rPr>
+                <w:szCs w:val="24"/>
+              </w:rPr>
+              <w:fldChar w:fldCharType="end"/>
+            </w:r>
+            <w:r>
+              <w:rPr>
+                <w:szCs w:val="24"/>
+              </w:rPr>
+              <w:t>: Primer iz učne množice: diagonalni stranski dvig na kablu</w:t>
+            </w:r>
+          </w:p>
+        </w:tc>
+        <w:tc>
+          <w:tcPr>
+            <w:tcW w:w="4244" w:type="dxa"/>
+          </w:tcPr>
+          <w:p>
+            <w:pPr>
+              <w:keepNext/>
+              <w:jc w:val="center"/>
+            </w:pPr>
+            <w:r>
+              <w:rPr>
+                <w:noProof/>
+              </w:rPr>
+              <w:drawing>
+                <wp:inline distT="0" distB="0" distL="0" distR="0" wp14:anchorId="4AEDD416" wp14:editId="34087A75">
+                  <wp:extent cx="2228400" cy="2970000"/>
+                  <wp:effectExtent l="0" t="0" r="635" b="1905"/>
+                  <wp:docPr id="1873076409" name="Picture 3"/>
+                  <wp:cNvGraphicFramePr>
+                    <a:graphicFrameLocks xmlns:a="http://schemas.openxmlformats.org/drawingml/2006/main" noChangeAspect="1"/>
+                  </wp:cNvGraphicFramePr>
+                  <a:graphic xmlns:a="http://schemas.openxmlformats.org/drawingml/2006/main">
+                    <a:graphicData uri="http://schemas.openxmlformats.org/drawingml/2006/picture">
+                      <pic:pic xmlns:pic="http://schemas.openxmlformats.org/drawingml/2006/picture">
+                        <pic:nvPicPr>
+                          <pic:cNvPr id="0" name="Picture 3"/>
+                          <pic:cNvPicPr>
+                            <a:picLocks noChangeAspect="1" noChangeArrowheads="1"/>
+                          </pic:cNvPicPr>
+                        </pic:nvPicPr>
+                        <pic:blipFill>
+                          <a:blip r:embed="rId35">
+                            <a:extLst>
+                              <a:ext uri="{28A0092B-C50C-407E-A947-70E740481C1C}">
+                                <a14:useLocalDpi xmlns:a14="http://schemas.microsoft.com/office/drawing/2010/main" val="0"/>
+                              </a:ext>
+                            </a:extLst>
+                          </a:blip>
+                          <a:srcRect/>
+                          <a:stretch>
+                            <a:fillRect/>
+                          </a:stretch>
+                        </pic:blipFill>
+                        <pic:spPr bwMode="auto">
+                          <a:xfrm>
+                            <a:off x="0" y="0"/>
+                            <a:ext cx="2228400" cy="2970000"/>
+                          </a:xfrm>
+                          <a:prstGeom prst="rect">
+                            <a:avLst/>
+                          </a:prstGeom>
+                          <a:noFill/>
+                          <a:ln>
+                            <a:noFill/>
+                          </a:ln>
+                        </pic:spPr>
+                      </pic:pic>
+                    </a:graphicData>
+                  </a:graphic>
+                </wp:inline>
+              </w:drawing>
+            </w:r>
+          </w:p>
+          <w:p>
+            <w:pPr>
+              <w:pStyle w:val="Caption"/>
+            </w:pPr>
+            <w:r>
+              <w:t xml:space="preserve">Slika </w:t>
+            </w:r>
+            <w:r>
+              <w:fldChar w:fldCharType="begin"/>
+            </w:r>
+            <w:r>
+              <w:instrText xml:space="preserve"> SEQ Slika \* ARABIC </w:instrText>
+            </w:r>
+            <w:r>
+              <w:fldChar w:fldCharType="separate"/>
+            </w:r>
+            <w:r>
+              <w:rPr>
+                <w:noProof/>
+              </w:rPr>
+              <w:t>13</w:t>
+            </w:r>
+            <w:r>
+              <w:fldChar w:fldCharType="end"/>
+            </w:r>
+            <w:r>
+              <w:t>: Primer iz učne množice: biceps pregib s palico</w:t>
+            </w:r>
+          </w:p>
+        </w:tc>
+      </w:tr>
+    </w:tbl>
+    <w:p>
+      <w:pPr>
+        <w:tabs>
+          <w:tab w:val="left" w:pos="852"/>
+        </w:tabs>
+      </w:pPr>
+    </w:p>
+    <w:tbl>
+      <w:tblPr>
+        <w:tblStyle w:val="TableGrid"/>
+        <w:tblW w:w="0" w:type="auto"/>
+        <w:tblBorders>
+          <w:top w:val="none" w:sz="0" w:space="0" w:color="auto"/>
+          <w:left w:val="none" w:sz="0" w:space="0" w:color="auto"/>
+          <w:bottom w:val="none" w:sz="0" w:space="0" w:color="auto"/>
+          <w:right w:val="none" w:sz="0" w:space="0" w:color="auto"/>
+          <w:insideH w:val="none" w:sz="0" w:space="0" w:color="auto"/>
+          <w:insideV w:val="none" w:sz="0" w:space="0" w:color="auto"/>
+        </w:tblBorders>
+        <w:tblLook w:val="04A0" w:firstRow="1" w:lastRow="0" w:firstColumn="1" w:lastColumn="0" w:noHBand="0" w:noVBand="1"/>
+      </w:tblPr>
+      <w:tblGrid>
+        <w:gridCol w:w="4244"/>
+        <w:gridCol w:w="4244"/>
+      </w:tblGrid>
+      <w:tr>
+        <w:tc>
+          <w:tcPr>
+            <w:tcW w:w="4244" w:type="dxa"/>
+          </w:tcPr>
+          <w:p>
+            <w:pPr>
+              <w:keepNext/>
+              <w:tabs>
+                <w:tab w:val="left" w:pos="852"/>
+              </w:tabs>
+              <w:jc w:val="center"/>
+            </w:pPr>
+            <w:r>
+              <w:rPr>
+                <w:noProof/>
+              </w:rPr>
+              <w:lastRenderedPageBreak/>
+              <w:drawing>
+                <wp:inline distT="0" distB="0" distL="0" distR="0" wp14:anchorId="44A185E7" wp14:editId="444EAC8D">
+                  <wp:extent cx="2224800" cy="2970000"/>
+                  <wp:effectExtent l="0" t="0" r="4445" b="1905"/>
+                  <wp:docPr id="2013327616" name="Picture 5"/>
+                  <wp:cNvGraphicFramePr>
+                    <a:graphicFrameLocks xmlns:a="http://schemas.openxmlformats.org/drawingml/2006/main" noChangeAspect="1"/>
+                  </wp:cNvGraphicFramePr>
+                  <a:graphic xmlns:a="http://schemas.openxmlformats.org/drawingml/2006/main">
+                    <a:graphicData uri="http://schemas.openxmlformats.org/drawingml/2006/picture">
+                      <pic:pic xmlns:pic="http://schemas.openxmlformats.org/drawingml/2006/picture">
+                        <pic:nvPicPr>
+                          <pic:cNvPr id="0" name="Picture 7"/>
+                          <pic:cNvPicPr>
+                            <a:picLocks noChangeAspect="1" noChangeArrowheads="1"/>
+                          </pic:cNvPicPr>
+                        </pic:nvPicPr>
+                        <pic:blipFill>
+                          <a:blip r:embed="rId36">
+                            <a:extLst>
+                              <a:ext uri="{28A0092B-C50C-407E-A947-70E740481C1C}">
+                                <a14:useLocalDpi xmlns:a14="http://schemas.microsoft.com/office/drawing/2010/main" val="0"/>
+                              </a:ext>
+                            </a:extLst>
+                          </a:blip>
+                          <a:srcRect/>
+                          <a:stretch>
+                            <a:fillRect/>
+                          </a:stretch>
+                        </pic:blipFill>
+                        <pic:spPr bwMode="auto">
+                          <a:xfrm>
+                            <a:off x="0" y="0"/>
+                            <a:ext cx="2224800" cy="2970000"/>
+                          </a:xfrm>
+                          <a:prstGeom prst="rect">
+                            <a:avLst/>
+                          </a:prstGeom>
+                          <a:noFill/>
+                          <a:ln>
+                            <a:noFill/>
+                          </a:ln>
+                        </pic:spPr>
+                      </pic:pic>
+                    </a:graphicData>
+                  </a:graphic>
+                </wp:inline>
+              </w:drawing>
+            </w:r>
+          </w:p>
+          <w:p>
+            <w:pPr>
+              <w:pStyle w:val="Caption"/>
+            </w:pPr>
+            <w:r>
+              <w:t xml:space="preserve">Slika </w:t>
+            </w:r>
+            <w:r>
+              <w:fldChar w:fldCharType="begin"/>
+            </w:r>
+            <w:r>
+              <w:instrText xml:space="preserve"> SEQ Slika \* ARABIC </w:instrText>
+            </w:r>
+            <w:r>
+              <w:fldChar w:fldCharType="separate"/>
+            </w:r>
+            <w:r>
+              <w:rPr>
+                <w:noProof/>
+              </w:rPr>
+              <w:t>14</w:t>
+            </w:r>
+            <w:r>
+              <w:fldChar w:fldCharType="end"/>
+            </w:r>
+            <w:r>
+              <w:t>: Primer iz učne množice: veslanje v predklonu s palico</w:t>
+            </w:r>
+          </w:p>
+        </w:tc>
+        <w:tc>
+          <w:tcPr>
+            <w:tcW w:w="4244" w:type="dxa"/>
+          </w:tcPr>
+          <w:p>
+            <w:pPr>
+              <w:keepNext/>
+              <w:tabs>
+                <w:tab w:val="left" w:pos="852"/>
+              </w:tabs>
+              <w:jc w:val="center"/>
+            </w:pPr>
+            <w:r>
+              <w:rPr>
+                <w:noProof/>
+              </w:rPr>
+              <w:drawing>
+                <wp:inline distT="0" distB="0" distL="0" distR="0" wp14:anchorId="217367B0" wp14:editId="193E7318">
+                  <wp:extent cx="2224800" cy="2970000"/>
+                  <wp:effectExtent l="0" t="0" r="4445" b="1905"/>
+                  <wp:docPr id="1804345779" name="Picture 8"/>
+                  <wp:cNvGraphicFramePr>
+                    <a:graphicFrameLocks xmlns:a="http://schemas.openxmlformats.org/drawingml/2006/main" noChangeAspect="1"/>
+                  </wp:cNvGraphicFramePr>
+                  <a:graphic xmlns:a="http://schemas.openxmlformats.org/drawingml/2006/main">
+                    <a:graphicData uri="http://schemas.openxmlformats.org/drawingml/2006/picture">
+                      <pic:pic xmlns:pic="http://schemas.openxmlformats.org/drawingml/2006/picture">
+                        <pic:nvPicPr>
+                          <pic:cNvPr id="0" name="Picture 13"/>
+                          <pic:cNvPicPr>
+                            <a:picLocks noChangeAspect="1" noChangeArrowheads="1"/>
+                          </pic:cNvPicPr>
+                        </pic:nvPicPr>
+                        <pic:blipFill>
+                          <a:blip r:embed="rId37">
+                            <a:extLst>
+                              <a:ext uri="{28A0092B-C50C-407E-A947-70E740481C1C}">
+                                <a14:useLocalDpi xmlns:a14="http://schemas.microsoft.com/office/drawing/2010/main" val="0"/>
+                              </a:ext>
+                            </a:extLst>
+                          </a:blip>
+                          <a:srcRect/>
+                          <a:stretch>
+                            <a:fillRect/>
+                          </a:stretch>
+                        </pic:blipFill>
+                        <pic:spPr bwMode="auto">
+                          <a:xfrm>
+                            <a:off x="0" y="0"/>
+                            <a:ext cx="2224800" cy="2970000"/>
+                          </a:xfrm>
+                          <a:prstGeom prst="rect">
+                            <a:avLst/>
+                          </a:prstGeom>
+                          <a:noFill/>
+                          <a:ln>
+                            <a:noFill/>
+                          </a:ln>
+                        </pic:spPr>
+                      </pic:pic>
+                    </a:graphicData>
+                  </a:graphic>
+                </wp:inline>
+              </w:drawing>
+            </w:r>
+          </w:p>
+          <w:p>
+            <w:pPr>
+              <w:pStyle w:val="Caption"/>
+            </w:pPr>
+            <w:r>
+              <w:t xml:space="preserve">Slika </w:t>
+            </w:r>
+            <w:r>
+              <w:fldChar w:fldCharType="begin"/>
+            </w:r>
+            <w:r>
+              <w:instrText xml:space="preserve"> SEQ Slika \* ARABIC </w:instrText>
+            </w:r>
+            <w:r>
+              <w:fldChar w:fldCharType="separate"/>
+            </w:r>
+            <w:r>
+              <w:rPr>
+                <w:noProof/>
+              </w:rPr>
+              <w:t>15</w:t>
+            </w:r>
+            <w:r>
+              <w:fldChar w:fldCharType="end"/>
+            </w:r>
+            <w:r>
+              <w:t>: Primer iz učne množice: potisk z ročkami na poševni klopi</w:t>
+            </w:r>
+          </w:p>
+        </w:tc>
+      </w:tr>
+    </w:tbl>
+    <w:p>
+      <w:pPr>
+        <w:tabs>
+          <w:tab w:val="left" w:pos="852"/>
+        </w:tabs>
+      </w:pPr>
+    </w:p>
+    <w:tbl>
+      <w:tblPr>
+        <w:tblStyle w:val="TableGrid"/>
+        <w:tblW w:w="0" w:type="auto"/>
+        <w:tblBorders>
+          <w:top w:val="none" w:sz="0" w:space="0" w:color="auto"/>
+          <w:left w:val="none" w:sz="0" w:space="0" w:color="auto"/>
+          <w:bottom w:val="none" w:sz="0" w:space="0" w:color="auto"/>
+          <w:right w:val="none" w:sz="0" w:space="0" w:color="auto"/>
+          <w:insideH w:val="none" w:sz="0" w:space="0" w:color="auto"/>
+          <w:insideV w:val="none" w:sz="0" w:space="0" w:color="auto"/>
+        </w:tblBorders>
+        <w:tblLook w:val="04A0" w:firstRow="1" w:lastRow="0" w:firstColumn="1" w:lastColumn="0" w:noHBand="0" w:noVBand="1"/>
+      </w:tblPr>
+      <w:tblGrid>
+        <w:gridCol w:w="4244"/>
+        <w:gridCol w:w="4244"/>
+      </w:tblGrid>
+      <w:tr>
+        <w:tc>
+          <w:tcPr>
+            <w:tcW w:w="4244" w:type="dxa"/>
+          </w:tcPr>
+          <w:p>
+            <w:pPr>
+              <w:keepNext/>
+              <w:jc w:val="center"/>
+            </w:pPr>
+            <w:r>
+              <w:rPr>
+                <w:noProof/>
+              </w:rPr>
+              <w:drawing>
+                <wp:inline distT="0" distB="0" distL="0" distR="0" wp14:anchorId="49F1BD72" wp14:editId="79B72B92">
+                  <wp:extent cx="2228400" cy="2970000"/>
+                  <wp:effectExtent l="0" t="0" r="635" b="1905"/>
+                  <wp:docPr id="80642138" name="Picture 12"/>
+                  <wp:cNvGraphicFramePr>
+                    <a:graphicFrameLocks xmlns:a="http://schemas.openxmlformats.org/drawingml/2006/main" noChangeAspect="1"/>
+                  </wp:cNvGraphicFramePr>
+                  <a:graphic xmlns:a="http://schemas.openxmlformats.org/drawingml/2006/main">
+                    <a:graphicData uri="http://schemas.openxmlformats.org/drawingml/2006/picture">
+                      <pic:pic xmlns:pic="http://schemas.openxmlformats.org/drawingml/2006/picture">
+                        <pic:nvPicPr>
+                          <pic:cNvPr id="0" name="Picture 21"/>
+                          <pic:cNvPicPr>
+                            <a:picLocks noChangeAspect="1" noChangeArrowheads="1"/>
+                          </pic:cNvPicPr>
+                        </pic:nvPicPr>
+                        <pic:blipFill>
+                          <a:blip r:embed="rId38">
+                            <a:extLst>
+                              <a:ext uri="{28A0092B-C50C-407E-A947-70E740481C1C}">
+                                <a14:useLocalDpi xmlns:a14="http://schemas.microsoft.com/office/drawing/2010/main" val="0"/>
+                              </a:ext>
+                            </a:extLst>
+                          </a:blip>
+                          <a:srcRect/>
+                          <a:stretch>
+                            <a:fillRect/>
+                          </a:stretch>
+                        </pic:blipFill>
+                        <pic:spPr bwMode="auto">
+                          <a:xfrm>
+                            <a:off x="0" y="0"/>
+                            <a:ext cx="2228400" cy="2970000"/>
+                          </a:xfrm>
+                          <a:prstGeom prst="rect">
+                            <a:avLst/>
+                          </a:prstGeom>
+                          <a:noFill/>
+                          <a:ln>
+                            <a:noFill/>
+                          </a:ln>
+                        </pic:spPr>
+                      </pic:pic>
+                    </a:graphicData>
+                  </a:graphic>
+                </wp:inline>
+              </w:drawing>
+            </w:r>
+          </w:p>
+          <w:p>
+            <w:pPr>
+              <w:pStyle w:val="Caption"/>
+            </w:pPr>
+            <w:r>
+              <w:t xml:space="preserve">Slika </w:t>
+            </w:r>
+            <w:r>
+              <w:fldChar w:fldCharType="begin"/>
+            </w:r>
+            <w:r>
+              <w:instrText xml:space="preserve"> SEQ Slika \* ARABIC </w:instrText>
+            </w:r>
+            <w:r>
+              <w:fldChar w:fldCharType="separate"/>
+            </w:r>
+            <w:r>
+              <w:rPr>
+                <w:noProof/>
+              </w:rPr>
+              <w:t>16</w:t>
+            </w:r>
+            <w:r>
+              <w:fldChar w:fldCharType="end"/>
+            </w:r>
+            <w:r>
+              <w:t>: Primer iz učne množice: biceps pregib na Scott klopi</w:t>
+            </w:r>
+          </w:p>
+        </w:tc>
+        <w:tc>
+          <w:tcPr>
+            <w:tcW w:w="4244" w:type="dxa"/>
+          </w:tcPr>
+          <w:p>
+            <w:pPr>
+              <w:keepNext/>
+              <w:jc w:val="center"/>
+            </w:pPr>
+            <w:r>
+              <w:rPr>
+                <w:lang w:val="en-SI"/>
+              </w:rPr>
+              <w:drawing>
+                <wp:inline distT="0" distB="0" distL="0" distR="0" wp14:anchorId="08ADD16F" wp14:editId="030F88A3">
+                  <wp:extent cx="2228400" cy="2970000"/>
+                  <wp:effectExtent l="0" t="0" r="635" b="1905"/>
+                  <wp:docPr id="1065741449" name="Picture 15"/>
+                  <wp:cNvGraphicFramePr>
+                    <a:graphicFrameLocks xmlns:a="http://schemas.openxmlformats.org/drawingml/2006/main" noChangeAspect="1"/>
+                  </wp:cNvGraphicFramePr>
+                  <a:graphic xmlns:a="http://schemas.openxmlformats.org/drawingml/2006/main">
+                    <a:graphicData uri="http://schemas.openxmlformats.org/drawingml/2006/picture">
+                      <pic:pic xmlns:pic="http://schemas.openxmlformats.org/drawingml/2006/picture">
+                        <pic:nvPicPr>
+                          <pic:cNvPr id="0" name="Picture 30"/>
+                          <pic:cNvPicPr>
+                            <a:picLocks noChangeAspect="1" noChangeArrowheads="1"/>
+                          </pic:cNvPicPr>
+                        </pic:nvPicPr>
+                        <pic:blipFill>
+                          <a:blip r:embed="rId39">
+                            <a:extLst>
+                              <a:ext uri="{28A0092B-C50C-407E-A947-70E740481C1C}">
+                                <a14:useLocalDpi xmlns:a14="http://schemas.microsoft.com/office/drawing/2010/main" val="0"/>
+                              </a:ext>
+                            </a:extLst>
+                          </a:blip>
+                          <a:srcRect/>
+                          <a:stretch>
+                            <a:fillRect/>
+                          </a:stretch>
+                        </pic:blipFill>
+                        <pic:spPr bwMode="auto">
+                          <a:xfrm>
+                            <a:off x="0" y="0"/>
+                            <a:ext cx="2228400" cy="2970000"/>
+                          </a:xfrm>
+                          <a:prstGeom prst="rect">
+                            <a:avLst/>
+                          </a:prstGeom>
+                          <a:noFill/>
+                          <a:ln>
+                            <a:noFill/>
+                          </a:ln>
+                        </pic:spPr>
+                      </pic:pic>
+                    </a:graphicData>
+                  </a:graphic>
+                </wp:inline>
+              </w:drawing>
+            </w:r>
+          </w:p>
+          <w:p>
+            <w:pPr>
+              <w:pStyle w:val="Caption"/>
+              <w:rPr>
+                <w:lang w:val="en-SI"/>
+              </w:rPr>
+            </w:pPr>
+            <w:r>
+              <w:t xml:space="preserve">Slika </w:t>
+            </w:r>
+            <w:r>
+              <w:fldChar w:fldCharType="begin"/>
+            </w:r>
+            <w:r>
+              <w:instrText xml:space="preserve"> SEQ Slika \* ARABIC </w:instrText>
+            </w:r>
+            <w:r>
+              <w:fldChar w:fldCharType="separate"/>
+            </w:r>
+            <w:r>
+              <w:rPr>
+                <w:noProof/>
+              </w:rPr>
+              <w:t>17</w:t>
+            </w:r>
+            <w:r>
+              <w:fldChar w:fldCharType="end"/>
+            </w:r>
+            <w:r>
+              <w:t>: Primer iz učne množice: izteg za triceps</w:t>
+            </w:r>
+            <w:r>
+              <w:rPr>
+                <w:noProof/>
+              </w:rPr>
+              <w:t xml:space="preserve"> na kablu</w:t>
+            </w:r>
+          </w:p>
+          <w:p/>
+        </w:tc>
+      </w:tr>
+    </w:tbl>
+    <w:p/>
+    <w:p/>
+    <w:p>
+      <w:pPr>
+        <w:pStyle w:val="Heading1"/>
+        <w:spacing w:line="360" w:lineRule="auto"/>
+        <w:rPr>
+          <w:b/>
+          <w:sz w:val="36"/>
+          <w:szCs w:val="36"/>
+          <w:lang w:val="sl-SI"/>
+        </w:rPr>
+      </w:pPr>
+      <w:r>
+        <w:rPr>
+          <w:b/>
+          <w:sz w:val="36"/>
+          <w:szCs w:val="36"/>
+          <w:lang w:val="sl-SI"/>
+        </w:rPr>
+        <w:lastRenderedPageBreak/>
+        <w:t>Učenje modelov in primerjava učinkovitosti delovanja po učenju</w:t>
+      </w:r>
+    </w:p>
+    <w:p>
+      <w:r>
+        <w:t>V prejšnjih poglavjih so modeli primerjani v osnovni, neprilagojeni različici, kjer je uspe</w:t>
+      </w:r>
+      <w:r>
+        <w:t xml:space="preserve">šnost odvisna predvsem od splošne sposobnosti modela za zaznavo drže. Ker pa se realni pogoji uporabe (kamera, osvetlitev, ozadja, …) pogosto razlikujejo od standardnih podatkovnih zbirk, je smiselno preveriti, ali se z lastnim učenjem robustnost in natančnost zaznave </w:t>
+      </w:r>
+      <w:r>
+        <w:t xml:space="preserve">v ciljnem scenariju </w:t>
+      </w:r>
+      <w:r>
+        <w:t>lahko izboljša.</w:t>
+      </w:r>
+    </w:p>
+    <w:p>
+      <w:pPr>
+        <w:pStyle w:val="Heading2"/>
+      </w:pPr>
+      <w:r>
+        <w:t>Izbira modela za učenje</w:t>
+      </w:r>
+    </w:p>
+    <w:p>
+      <w:r>
+        <w:t>Za učenje je bil izbran model YOLO11n-pose z vhodno velikostjo 256x256. Velja za dobro izbiro, saj se je v primerjavi z ostalimi modeli izkazal kot manj natančen</w:t>
+      </w:r>
+      <w:r>
+        <w:t xml:space="preserve"> in lahko zaradi tega po učenju pričakujemo večjo razliko v učinkovitosti kot pri ostalih modelih</w:t>
+      </w:r>
+      <w:r>
+        <w:t>, hkrati pa omogoča praktičen in dobro dokumentiran postopek učenja.</w:t>
+      </w:r>
+      <w:r>
         <w:t xml:space="preserve"> </w:t>
       </w:r>
+      <w:r>
+        <w:t>Učenje</w:t>
+      </w:r>
+      <w:r>
+        <w:t xml:space="preserve"> modela</w:t>
+      </w:r>
+      <w:r>
+        <w:t xml:space="preserve"> bo potekalo na lastni učni množici.</w:t>
+      </w:r>
+    </w:p>
+    <w:p>
+      <w:pPr>
+        <w:pStyle w:val="Heading3"/>
+      </w:pPr>
+      <w:r>
+        <w:t xml:space="preserve">Prilagoditev </w:t>
+      </w:r>
+      <w:r>
+        <w:t xml:space="preserve">učne množice </w:t>
+      </w:r>
+      <w:r>
+        <w:t xml:space="preserve">za učenje modela </w:t>
+      </w:r>
+      <w:r>
+        <w:t xml:space="preserve">(vir: </w:t>
+      </w:r>
+      <w:hyperlink r:id="rId40" w:anchor="ultralytics-yolo-format" w:history="1">
+        <w:r>
+          <w:rPr>
+            <w:rStyle w:val="Hyperlink"/>
+            <w:rFonts w:cs="Arial"/>
+          </w:rPr>
+          <w:t>https://docs.ultralytics.com/datasets/pose/#ultralytics-yolo-format</w:t>
+        </w:r>
+      </w:hyperlink>
+      <w:r>
+        <w:t xml:space="preserve"> )</w:t>
+      </w:r>
+    </w:p>
+    <w:p>
+      <w:r>
+        <w:t xml:space="preserve">Oznake učne množice je bilo potrebno pripraviti v formatu, ki ga zahteva </w:t>
+      </w:r>
+      <w:r>
+        <w:t>YOLO11n-pose model</w:t>
+      </w:r>
+      <w:r>
+        <w:t>.</w:t>
+      </w:r>
+      <w:r>
+        <w:t xml:space="preserve"> To pomeni</w:t>
+      </w:r>
+      <w:r>
+        <w:t xml:space="preserve">, da je za vsako sliko potrebno </w:t>
+      </w:r>
+      <w:r>
+        <w:t>pripraviti</w:t>
+      </w:r>
+      <w:r>
+        <w:t xml:space="preserve"> tekstovno datoteko, ki mora biti enako poimenovana kot slik</w:t>
+      </w:r>
+      <w:r>
+        <w:t>a</w:t>
+      </w:r>
+      <w:r>
+        <w:t xml:space="preserve">. </w:t>
+      </w:r>
+      <w:r>
+        <w:t>Vsaka t</w:t>
+      </w:r>
+      <w:r>
+        <w:t>ekstovna datoteka mora vsebovati</w:t>
+      </w:r>
+      <w:r>
+        <w:t>:</w:t>
+      </w:r>
+    </w:p>
+    <w:p>
+      <w:pPr>
+        <w:pStyle w:val="ListParagraph"/>
+        <w:numPr>
+          <w:ilvl w:val="0"/>
+          <w:numId w:val="70"/>
+        </w:numPr>
+      </w:pPr>
+      <w:r>
+        <w:t>Uskladitev nabora sklepnih točk na topologijo COCO-17, ki zajema 17 določenih sklepnih točk po določenem zaporedju</w:t>
+      </w:r>
+    </w:p>
+    <w:p>
+      <w:pPr>
+        <w:pStyle w:val="ListParagraph"/>
+        <w:numPr>
+          <w:ilvl w:val="0"/>
+          <w:numId w:val="70"/>
+        </w:numPr>
+      </w:pPr>
+      <w:r>
+        <w:t>Shranjevanje koordinat v normalizirani obliki glede na dimenzije slike</w:t>
+      </w:r>
+    </w:p>
+    <w:p>
+      <w:pPr>
+        <w:pStyle w:val="ListParagraph"/>
+        <w:numPr>
+          <w:ilvl w:val="0"/>
+          <w:numId w:val="70"/>
+        </w:numPr>
+      </w:pPr>
+      <w:r>
+        <w:t>Normalizirane koordinate okvira osebe v kadru</w:t>
+      </w:r>
+    </w:p>
+    <w:p>
+      <w:pPr>
+        <w:pStyle w:val="Heading3"/>
+      </w:pPr>
+      <w:r>
+        <w:t>Predpriprava in konfiguracija učenja</w:t>
+      </w:r>
+    </w:p>
+    <w:p>
+      <w:r>
+        <w:t xml:space="preserve">Vsak del učne množice (učni, </w:t>
+      </w:r>
+      <w:proofErr w:type="spellStart"/>
+      <w:r>
+        <w:t>validacijski</w:t>
+      </w:r>
+      <w:proofErr w:type="spellEnd"/>
+      <w:r>
+        <w:t xml:space="preserve">, testni) mora biti </w:t>
+      </w:r>
+      <w:r>
+        <w:t xml:space="preserve">ločen </w:t>
+      </w:r>
+      <w:r>
+        <w:t>v svojem direktoriju</w:t>
+      </w:r>
+      <w:r>
+        <w:t xml:space="preserve">. Potrebno je pripraviti tudi datoteko s konfiguracijo učenja, imenovano </w:t>
+      </w:r>
+      <w:r>
+        <w:t>“</w:t>
+      </w:r>
+      <w:proofErr w:type="spellStart"/>
+      <w:r>
+        <w:t>data.yaml</w:t>
+      </w:r>
+      <w:proofErr w:type="spellEnd"/>
+      <w:r>
+        <w:t>“</w:t>
+      </w:r>
+      <w:r>
+        <w:t>, ki mora vsebovati:</w:t>
+      </w:r>
+    </w:p>
+    <w:p>
+      <w:pPr>
+        <w:pStyle w:val="ListParagraph"/>
+        <w:numPr>
+          <w:ilvl w:val="0"/>
+          <w:numId w:val="75"/>
+        </w:numPr>
+      </w:pPr>
+      <w:r>
+        <w:t xml:space="preserve">Pot do direktorija, v katerem so slike in tekstovne datoteke učnega, </w:t>
+      </w:r>
+      <w:proofErr w:type="spellStart"/>
+      <w:r>
+        <w:t>validacijskega</w:t>
+      </w:r>
+      <w:proofErr w:type="spellEnd"/>
+      <w:r>
+        <w:t xml:space="preserve"> in testnega dela učne množice</w:t>
+      </w:r>
+    </w:p>
+    <w:p>
+      <w:pPr>
+        <w:pStyle w:val="ListParagraph"/>
+        <w:numPr>
+          <w:ilvl w:val="0"/>
+          <w:numId w:val="75"/>
+        </w:numPr>
+      </w:pPr>
+      <w:r>
+        <w:lastRenderedPageBreak/>
+        <w:t xml:space="preserve">Relativno pot znotraj zgoraj navedenega direktorija za učne, </w:t>
+      </w:r>
+      <w:proofErr w:type="spellStart"/>
+      <w:r>
+        <w:t>validacijske</w:t>
+      </w:r>
+      <w:proofErr w:type="spellEnd"/>
+      <w:r>
+        <w:t xml:space="preserve"> in teste slike</w:t>
+      </w:r>
+    </w:p>
+    <w:p>
+      <w:pPr>
+        <w:pStyle w:val="ListParagraph"/>
+        <w:numPr>
+          <w:ilvl w:val="0"/>
+          <w:numId w:val="75"/>
+        </w:numPr>
+      </w:pPr>
+      <w:r>
+        <w:t>Obliko sklepnih točk – število sklepnih točk (17) in število dimenzij (2).</w:t>
+      </w:r>
+    </w:p>
+    <w:p>
+      <w:pPr>
+        <w:pStyle w:val="ListParagraph"/>
+        <w:numPr>
+          <w:ilvl w:val="0"/>
+          <w:numId w:val="75"/>
+        </w:numPr>
+      </w:pPr>
+      <w:r>
+        <w:t>Ime r</w:t>
+      </w:r>
+      <w:r>
+        <w:t>azred</w:t>
+      </w:r>
+      <w:r>
+        <w:t>a</w:t>
+      </w:r>
+      <w:r>
+        <w:t xml:space="preserve"> za prepoznavo osebe</w:t>
+      </w:r>
+    </w:p>
+    <w:p>
+      <w:pPr>
+        <w:pStyle w:val="ListParagraph"/>
+        <w:numPr>
+          <w:ilvl w:val="0"/>
+          <w:numId w:val="75"/>
+        </w:numPr>
+      </w:pPr>
+      <w:r>
+        <w:t>Identifikator za vsako sklepno točko</w:t>
+      </w:r>
+    </w:p>
+    <w:p>
+      <w:pPr>
+        <w:ind w:left="360"/>
+      </w:pPr>
+    </w:p>
+    <w:p>
+      <w:pPr>
+        <w:pStyle w:val="Heading2"/>
+      </w:pPr>
+      <w:r>
+        <w:t>Potek učenja modela</w:t>
+      </w:r>
+    </w:p>
+    <w:p>
+      <w:r>
+        <w:t xml:space="preserve">Učenje je potekalo v okolju </w:t>
+      </w:r>
+      <w:proofErr w:type="spellStart"/>
+      <w:r>
+        <w:t>Python</w:t>
+      </w:r>
+      <w:proofErr w:type="spellEnd"/>
+      <w:r>
+        <w:t xml:space="preserve"> z uporabo knjižnice </w:t>
+      </w:r>
+      <w:r>
+        <w:t>“</w:t>
+      </w:r>
+      <w:proofErr w:type="spellStart"/>
+      <w:r>
+        <w:t>ultralytics</w:t>
+      </w:r>
+      <w:proofErr w:type="spellEnd"/>
+      <w:r>
+        <w:t>“</w:t>
+      </w:r>
+      <w:r>
+        <w:t>.</w:t>
+      </w:r>
+    </w:p>
+    <w:p>
       <w:r>
         <w:br w:type="page"/>
       </w:r>
@@ -14396,7 +16262,7 @@
                     <pic:cNvPicPr/>
                   </pic:nvPicPr>
                   <pic:blipFill>
-                    <a:blip r:embed="rId32"/>
+                    <a:blip r:embed="rId41"/>
                     <a:stretch>
                       <a:fillRect/>
                     </a:stretch>
@@ -14426,25 +16292,51 @@
       <w:r>
         <w:t xml:space="preserve">Slika </w:t>
       </w:r>
-      <w:fldSimple w:instr=" STYLEREF 1 \s ">
-        <w:r>
-          <w:rPr>
-            <w:noProof/>
-          </w:rPr>
-          <w:t>4</w:t>
-        </w:r>
-      </w:fldSimple>
+      <w:r>
+        <w:fldChar w:fldCharType="begin"/>
+      </w:r>
+      <w:r>
+        <w:instrText xml:space="preserve"> STYLEREF 1 \s </w:instrText>
+      </w:r>
+      <w:r>
+        <w:fldChar w:fldCharType="separate"/>
+      </w:r>
+      <w:r>
+        <w:rPr>
+          <w:noProof/>
+        </w:rPr>
+        <w:t>6</w:t>
+      </w:r>
+      <w:r>
+        <w:rPr>
+          <w:noProof/>
+        </w:rPr>
+        <w:fldChar w:fldCharType="end"/>
+      </w:r>
       <w:r>
         <w:t>.</w:t>
       </w:r>
-      <w:fldSimple w:instr=" SEQ Slika \* ARABIC \s 1 ">
-        <w:r>
-          <w:rPr>
-            <w:noProof/>
-          </w:rPr>
-          <w:t>1</w:t>
-        </w:r>
-      </w:fldSimple>
+      <w:r>
+        <w:fldChar w:fldCharType="begin"/>
+      </w:r>
+      <w:r>
+        <w:instrText xml:space="preserve"> SEQ Slika \* ARABIC \s 1 </w:instrText>
+      </w:r>
+      <w:r>
+        <w:fldChar w:fldCharType="separate"/>
+      </w:r>
+      <w:r>
+        <w:rPr>
+          <w:noProof/>
+        </w:rPr>
+        <w:t>1</w:t>
+      </w:r>
+      <w:r>
+        <w:rPr>
+          <w:noProof/>
+        </w:rPr>
+        <w:fldChar w:fldCharType="end"/>
+      </w:r>
       <w:r>
         <w:t>: Časovni graf</w:t>
       </w:r>
@@ -14497,7 +16389,7 @@
                     <pic:cNvPicPr/>
                   </pic:nvPicPr>
                   <pic:blipFill>
-                    <a:blip r:embed="rId33"/>
+                    <a:blip r:embed="rId42"/>
                     <a:stretch>
                       <a:fillRect/>
                     </a:stretch>
@@ -14527,25 +16419,51 @@
       <w:r>
         <w:t xml:space="preserve">Slika </w:t>
       </w:r>
-      <w:fldSimple w:instr=" STYLEREF 1 \s ">
-        <w:r>
-          <w:rPr>
-            <w:noProof/>
-          </w:rPr>
-          <w:t>4</w:t>
-        </w:r>
-      </w:fldSimple>
+      <w:r>
+        <w:fldChar w:fldCharType="begin"/>
+      </w:r>
+      <w:r>
+        <w:instrText xml:space="preserve"> STYLEREF 1 \s </w:instrText>
+      </w:r>
+      <w:r>
+        <w:fldChar w:fldCharType="separate"/>
+      </w:r>
+      <w:r>
+        <w:rPr>
+          <w:noProof/>
+        </w:rPr>
+        <w:t>6</w:t>
+      </w:r>
+      <w:r>
+        <w:rPr>
+          <w:noProof/>
+        </w:rPr>
+        <w:fldChar w:fldCharType="end"/>
+      </w:r>
       <w:r>
         <w:t>.</w:t>
       </w:r>
-      <w:fldSimple w:instr=" SEQ Slika \* ARABIC \s 1 ">
-        <w:r>
-          <w:rPr>
-            <w:noProof/>
-          </w:rPr>
-          <w:t>2</w:t>
-        </w:r>
-      </w:fldSimple>
+      <w:r>
+        <w:fldChar w:fldCharType="begin"/>
+      </w:r>
+      <w:r>
+        <w:instrText xml:space="preserve"> SEQ Slika \* ARABIC \s 1 </w:instrText>
+      </w:r>
+      <w:r>
+        <w:fldChar w:fldCharType="separate"/>
+      </w:r>
+      <w:r>
+        <w:rPr>
+          <w:noProof/>
+        </w:rPr>
+        <w:t>2</w:t>
+      </w:r>
+      <w:r>
+        <w:rPr>
+          <w:noProof/>
+        </w:rPr>
+        <w:fldChar w:fldCharType="end"/>
+      </w:r>
       <w:r>
         <w:t xml:space="preserve">: Graf prepotovane </w:t>
       </w:r>
@@ -14591,7 +16509,7 @@
                     <pic:cNvPicPr/>
                   </pic:nvPicPr>
                   <pic:blipFill>
-                    <a:blip r:embed="rId34"/>
+                    <a:blip r:embed="rId43"/>
                     <a:stretch>
                       <a:fillRect/>
                     </a:stretch>
@@ -14623,25 +16541,51 @@
       <w:r>
         <w:t xml:space="preserve">Slika </w:t>
       </w:r>
-      <w:fldSimple w:instr=" STYLEREF 1 \s ">
-        <w:r>
-          <w:rPr>
-            <w:noProof/>
-          </w:rPr>
-          <w:t>4</w:t>
-        </w:r>
-      </w:fldSimple>
+      <w:r>
+        <w:fldChar w:fldCharType="begin"/>
+      </w:r>
+      <w:r>
+        <w:instrText xml:space="preserve"> STYLEREF 1 \s </w:instrText>
+      </w:r>
+      <w:r>
+        <w:fldChar w:fldCharType="separate"/>
+      </w:r>
+      <w:r>
+        <w:rPr>
+          <w:noProof/>
+        </w:rPr>
+        <w:t>6</w:t>
+      </w:r>
+      <w:r>
+        <w:rPr>
+          <w:noProof/>
+        </w:rPr>
+        <w:fldChar w:fldCharType="end"/>
+      </w:r>
       <w:r>
         <w:t>.</w:t>
       </w:r>
-      <w:fldSimple w:instr=" SEQ Slika \* ARABIC \s 1 ">
-        <w:r>
-          <w:rPr>
-            <w:noProof/>
-          </w:rPr>
-          <w:t>3</w:t>
-        </w:r>
-      </w:fldSimple>
+      <w:r>
+        <w:fldChar w:fldCharType="begin"/>
+      </w:r>
+      <w:r>
+        <w:instrText xml:space="preserve"> SEQ Slika \* ARABIC \s 1 </w:instrText>
+      </w:r>
+      <w:r>
+        <w:fldChar w:fldCharType="separate"/>
+      </w:r>
+      <w:r>
+        <w:rPr>
+          <w:noProof/>
+        </w:rPr>
+        <w:t>3</w:t>
+      </w:r>
+      <w:r>
+        <w:rPr>
+          <w:noProof/>
+        </w:rPr>
+        <w:fldChar w:fldCharType="end"/>
+      </w:r>
       <w:r>
         <w:t>: Graf hitrosti</w:t>
       </w:r>
@@ -14825,7 +16769,6 @@
       </w:r>
       <w:bookmarkEnd w:id="71"/>
     </w:p>
-    <w:p/>
     <w:p>
       <w:pPr>
         <w:pStyle w:val="Heading2"/>
@@ -14844,22 +16787,19 @@
         <w:t xml:space="preserve">v koncentrični fazi </w:t>
       </w:r>
       <w:r>
-        <w:t xml:space="preserve">in prepotovana distanca za vsako ponovitev so zelo pomembni podatki za ugotavljanje mnogih trendov med treningom in </w:t>
-      </w:r>
+        <w:t>in prepotovana distanca za vsako ponovitev so zelo pomembni podatki za ugotavljanje mnogih trendov med treningom in razlikovanjem med pravilno in napačno izvedbo vadbe.</w:t>
+      </w:r>
+      <w:r>
+        <w:t xml:space="preserve"> Največ pomena nosi hitrost v koncentrični fazi.</w:t>
+      </w:r>
+    </w:p>
+    <w:p>
+      <w:pPr>
+        <w:pStyle w:val="Heading3"/>
+      </w:pPr>
+      <w:bookmarkStart w:id="73" w:name="_Toc225594000"/>
       <w:r>
         <w:lastRenderedPageBreak/>
-        <w:t>razlikovanjem med pravilno in napačno izvedbo vadbe.</w:t>
-      </w:r>
-      <w:r>
-        <w:t xml:space="preserve"> Največ pomena nosi hitrost v koncentrični fazi.</w:t>
-      </w:r>
-    </w:p>
-    <w:p>
-      <w:pPr>
-        <w:pStyle w:val="Heading3"/>
-      </w:pPr>
-      <w:bookmarkStart w:id="73" w:name="_Toc225594000"/>
-      <w:r>
         <w:t xml:space="preserve">Primerjava ponovitev znotraj </w:t>
       </w:r>
       <w:r>
@@ -15192,23 +17132,36 @@
       <w:r>
         <w:t>.</w:t>
       </w:r>
-    </w:p>
-    <w:p/>
+      <w:r>
+        <w:rPr>
+          <w:b/>
+          <w:sz w:val="36"/>
+          <w:szCs w:val="36"/>
+        </w:rPr>
+        <w:br w:type="page"/>
+      </w:r>
+    </w:p>
     <w:p>
       <w:pPr>
         <w:pStyle w:val="Heading1"/>
-        <w:rPr>
+        <w:spacing w:line="360" w:lineRule="auto"/>
+        <w:rPr>
+          <w:b/>
+          <w:sz w:val="36"/>
+          <w:szCs w:val="36"/>
           <w:lang w:val="sl-SI"/>
         </w:rPr>
       </w:pPr>
-      <w:bookmarkStart w:id="76" w:name="_Toc225594003"/>
-      <w:r>
-        <w:rPr>
+      <w:r>
+        <w:rPr>
+          <w:b/>
+          <w:sz w:val="36"/>
+          <w:szCs w:val="36"/>
           <w:lang w:val="sl-SI"/>
         </w:rPr>
+        <w:lastRenderedPageBreak/>
         <w:t>VIRI</w:t>
       </w:r>
-      <w:bookmarkEnd w:id="76"/>
     </w:p>
     <w:p>
       <w:r>
@@ -15489,7 +17442,7 @@
     </w:p>
     <w:p/>
     <w:sectPr>
-      <w:headerReference w:type="default" r:id="rId35"/>
+      <w:headerReference w:type="default" r:id="rId44"/>
       <w:pgSz w:w="11901" w:h="16834" w:code="9"/>
       <w:pgMar w:top="1701" w:right="1418" w:bottom="1701" w:left="1985" w:header="709" w:footer="709" w:gutter="0"/>
       <w:pgNumType w:start="1"/>
@@ -17259,6 +19212,119 @@
     </w:lvl>
   </w:abstractNum>
   <w:abstractNum w:abstractNumId="13" w15:restartNumberingAfterBreak="0">
+    <w:nsid w:val="16E63C73"/>
+    <w:multiLevelType w:val="hybridMultilevel"/>
+    <w:tmpl w:val="7DF0BE96"/>
+    <w:lvl w:ilvl="0" w:tplc="20000001">
+      <w:start w:val="1"/>
+      <w:numFmt w:val="bullet"/>
+      <w:lvlText w:val=""/>
+      <w:lvlJc w:val="left"/>
+      <w:pPr>
+        <w:ind w:left="3600" w:hanging="360"/>
+      </w:pPr>
+      <w:rPr>
+        <w:rFonts w:ascii="Symbol" w:hAnsi="Symbol" w:hint="default"/>
+      </w:rPr>
+    </w:lvl>
+    <w:lvl w:ilvl="1" w:tplc="20000003" w:tentative="1">
+      <w:start w:val="1"/>
+      <w:numFmt w:val="bullet"/>
+      <w:lvlText w:val="o"/>
+      <w:lvlJc w:val="left"/>
+      <w:pPr>
+        <w:ind w:left="4320" w:hanging="360"/>
+      </w:pPr>
+      <w:rPr>
+        <w:rFonts w:ascii="Courier New" w:hAnsi="Courier New" w:cs="Courier New" w:hint="default"/>
+      </w:rPr>
+    </w:lvl>
+    <w:lvl w:ilvl="2" w:tplc="20000005" w:tentative="1">
+      <w:start w:val="1"/>
+      <w:numFmt w:val="bullet"/>
+      <w:lvlText w:val=""/>
+      <w:lvlJc w:val="left"/>
+      <w:pPr>
+        <w:ind w:left="5040" w:hanging="360"/>
+      </w:pPr>
+      <w:rPr>
+        <w:rFonts w:ascii="Wingdings" w:hAnsi="Wingdings" w:hint="default"/>
+      </w:rPr>
+    </w:lvl>
+    <w:lvl w:ilvl="3" w:tplc="20000001" w:tentative="1">
+      <w:start w:val="1"/>
+      <w:numFmt w:val="bullet"/>
+      <w:lvlText w:val=""/>
+      <w:lvlJc w:val="left"/>
+      <w:pPr>
+        <w:ind w:left="5760" w:hanging="360"/>
+      </w:pPr>
+      <w:rPr>
+        <w:rFonts w:ascii="Symbol" w:hAnsi="Symbol" w:hint="default"/>
+      </w:rPr>
+    </w:lvl>
+    <w:lvl w:ilvl="4" w:tplc="20000003" w:tentative="1">
+      <w:start w:val="1"/>
+      <w:numFmt w:val="bullet"/>
+      <w:lvlText w:val="o"/>
+      <w:lvlJc w:val="left"/>
+      <w:pPr>
+        <w:ind w:left="6480" w:hanging="360"/>
+      </w:pPr>
+      <w:rPr>
+        <w:rFonts w:ascii="Courier New" w:hAnsi="Courier New" w:cs="Courier New" w:hint="default"/>
+      </w:rPr>
+    </w:lvl>
+    <w:lvl w:ilvl="5" w:tplc="20000005" w:tentative="1">
+      <w:start w:val="1"/>
+      <w:numFmt w:val="bullet"/>
+      <w:lvlText w:val=""/>
+      <w:lvlJc w:val="left"/>
+      <w:pPr>
+        <w:ind w:left="7200" w:hanging="360"/>
+      </w:pPr>
+      <w:rPr>
+        <w:rFonts w:ascii="Wingdings" w:hAnsi="Wingdings" w:hint="default"/>
+      </w:rPr>
+    </w:lvl>
+    <w:lvl w:ilvl="6" w:tplc="20000001" w:tentative="1">
+      <w:start w:val="1"/>
+      <w:numFmt w:val="bullet"/>
+      <w:lvlText w:val=""/>
+      <w:lvlJc w:val="left"/>
+      <w:pPr>
+        <w:ind w:left="7920" w:hanging="360"/>
+      </w:pPr>
+      <w:rPr>
+        <w:rFonts w:ascii="Symbol" w:hAnsi="Symbol" w:hint="default"/>
+      </w:rPr>
+    </w:lvl>
+    <w:lvl w:ilvl="7" w:tplc="20000003" w:tentative="1">
+      <w:start w:val="1"/>
+      <w:numFmt w:val="bullet"/>
+      <w:lvlText w:val="o"/>
+      <w:lvlJc w:val="left"/>
+      <w:pPr>
+        <w:ind w:left="8640" w:hanging="360"/>
+      </w:pPr>
+      <w:rPr>
+        <w:rFonts w:ascii="Courier New" w:hAnsi="Courier New" w:cs="Courier New" w:hint="default"/>
+      </w:rPr>
+    </w:lvl>
+    <w:lvl w:ilvl="8" w:tplc="20000005" w:tentative="1">
+      <w:start w:val="1"/>
+      <w:numFmt w:val="bullet"/>
+      <w:lvlText w:val=""/>
+      <w:lvlJc w:val="left"/>
+      <w:pPr>
+        <w:ind w:left="9360" w:hanging="360"/>
+      </w:pPr>
+      <w:rPr>
+        <w:rFonts w:ascii="Wingdings" w:hAnsi="Wingdings" w:hint="default"/>
+      </w:rPr>
+    </w:lvl>
+  </w:abstractNum>
+  <w:abstractNum w:abstractNumId="14" w15:restartNumberingAfterBreak="0">
     <w:nsid w:val="17D907E5"/>
     <w:multiLevelType w:val="hybridMultilevel"/>
     <w:tmpl w:val="024C663A"/>
@@ -17370,7 +19436,7 @@
       </w:rPr>
     </w:lvl>
   </w:abstractNum>
-  <w:abstractNum w:abstractNumId="14" w15:restartNumberingAfterBreak="0">
+  <w:abstractNum w:abstractNumId="15" w15:restartNumberingAfterBreak="0">
     <w:nsid w:val="19EB050D"/>
     <w:multiLevelType w:val="hybridMultilevel"/>
     <w:tmpl w:val="C1046816"/>
@@ -17483,7 +19549,120 @@
       </w:rPr>
     </w:lvl>
   </w:abstractNum>
-  <w:abstractNum w:abstractNumId="15" w15:restartNumberingAfterBreak="0">
+  <w:abstractNum w:abstractNumId="16" w15:restartNumberingAfterBreak="0">
+    <w:nsid w:val="1D3127EB"/>
+    <w:multiLevelType w:val="hybridMultilevel"/>
+    <w:tmpl w:val="26E2F8C0"/>
+    <w:lvl w:ilvl="0" w:tplc="20000001">
+      <w:start w:val="1"/>
+      <w:numFmt w:val="bullet"/>
+      <w:lvlText w:val=""/>
+      <w:lvlJc w:val="left"/>
+      <w:pPr>
+        <w:ind w:left="3600" w:hanging="360"/>
+      </w:pPr>
+      <w:rPr>
+        <w:rFonts w:ascii="Symbol" w:hAnsi="Symbol" w:hint="default"/>
+      </w:rPr>
+    </w:lvl>
+    <w:lvl w:ilvl="1" w:tplc="20000003" w:tentative="1">
+      <w:start w:val="1"/>
+      <w:numFmt w:val="bullet"/>
+      <w:lvlText w:val="o"/>
+      <w:lvlJc w:val="left"/>
+      <w:pPr>
+        <w:ind w:left="4320" w:hanging="360"/>
+      </w:pPr>
+      <w:rPr>
+        <w:rFonts w:ascii="Courier New" w:hAnsi="Courier New" w:cs="Courier New" w:hint="default"/>
+      </w:rPr>
+    </w:lvl>
+    <w:lvl w:ilvl="2" w:tplc="20000005" w:tentative="1">
+      <w:start w:val="1"/>
+      <w:numFmt w:val="bullet"/>
+      <w:lvlText w:val=""/>
+      <w:lvlJc w:val="left"/>
+      <w:pPr>
+        <w:ind w:left="5040" w:hanging="360"/>
+      </w:pPr>
+      <w:rPr>
+        <w:rFonts w:ascii="Wingdings" w:hAnsi="Wingdings" w:hint="default"/>
+      </w:rPr>
+    </w:lvl>
+    <w:lvl w:ilvl="3" w:tplc="20000001" w:tentative="1">
+      <w:start w:val="1"/>
+      <w:numFmt w:val="bullet"/>
+      <w:lvlText w:val=""/>
+      <w:lvlJc w:val="left"/>
+      <w:pPr>
+        <w:ind w:left="5760" w:hanging="360"/>
+      </w:pPr>
+      <w:rPr>
+        <w:rFonts w:ascii="Symbol" w:hAnsi="Symbol" w:hint="default"/>
+      </w:rPr>
+    </w:lvl>
+    <w:lvl w:ilvl="4" w:tplc="20000003" w:tentative="1">
+      <w:start w:val="1"/>
+      <w:numFmt w:val="bullet"/>
+      <w:lvlText w:val="o"/>
+      <w:lvlJc w:val="left"/>
+      <w:pPr>
+        <w:ind w:left="6480" w:hanging="360"/>
+      </w:pPr>
+      <w:rPr>
+        <w:rFonts w:ascii="Courier New" w:hAnsi="Courier New" w:cs="Courier New" w:hint="default"/>
+      </w:rPr>
+    </w:lvl>
+    <w:lvl w:ilvl="5" w:tplc="20000005" w:tentative="1">
+      <w:start w:val="1"/>
+      <w:numFmt w:val="bullet"/>
+      <w:lvlText w:val=""/>
+      <w:lvlJc w:val="left"/>
+      <w:pPr>
+        <w:ind w:left="7200" w:hanging="360"/>
+      </w:pPr>
+      <w:rPr>
+        <w:rFonts w:ascii="Wingdings" w:hAnsi="Wingdings" w:hint="default"/>
+      </w:rPr>
+    </w:lvl>
+    <w:lvl w:ilvl="6" w:tplc="20000001" w:tentative="1">
+      <w:start w:val="1"/>
+      <w:numFmt w:val="bullet"/>
+      <w:lvlText w:val=""/>
+      <w:lvlJc w:val="left"/>
+      <w:pPr>
+        <w:ind w:left="7920" w:hanging="360"/>
+      </w:pPr>
+      <w:rPr>
+        <w:rFonts w:ascii="Symbol" w:hAnsi="Symbol" w:hint="default"/>
+      </w:rPr>
+    </w:lvl>
+    <w:lvl w:ilvl="7" w:tplc="20000003" w:tentative="1">
+      <w:start w:val="1"/>
+      <w:numFmt w:val="bullet"/>
+      <w:lvlText w:val="o"/>
+      <w:lvlJc w:val="left"/>
+      <w:pPr>
+        <w:ind w:left="8640" w:hanging="360"/>
+      </w:pPr>
+      <w:rPr>
+        <w:rFonts w:ascii="Courier New" w:hAnsi="Courier New" w:cs="Courier New" w:hint="default"/>
+      </w:rPr>
+    </w:lvl>
+    <w:lvl w:ilvl="8" w:tplc="20000005" w:tentative="1">
+      <w:start w:val="1"/>
+      <w:numFmt w:val="bullet"/>
+      <w:lvlText w:val=""/>
+      <w:lvlJc w:val="left"/>
+      <w:pPr>
+        <w:ind w:left="9360" w:hanging="360"/>
+      </w:pPr>
+      <w:rPr>
+        <w:rFonts w:ascii="Wingdings" w:hAnsi="Wingdings" w:hint="default"/>
+      </w:rPr>
+    </w:lvl>
+  </w:abstractNum>
+  <w:abstractNum w:abstractNumId="17" w15:restartNumberingAfterBreak="0">
     <w:nsid w:val="1D3240EF"/>
     <w:multiLevelType w:val="hybridMultilevel"/>
     <w:tmpl w:val="C45EC7D6"/>
@@ -17596,7 +19775,7 @@
       </w:rPr>
     </w:lvl>
   </w:abstractNum>
-  <w:abstractNum w:abstractNumId="16" w15:restartNumberingAfterBreak="0">
+  <w:abstractNum w:abstractNumId="18" w15:restartNumberingAfterBreak="0">
     <w:nsid w:val="1E960A11"/>
     <w:multiLevelType w:val="hybridMultilevel"/>
     <w:tmpl w:val="CAEAFCE2"/>
@@ -17709,7 +19888,7 @@
       </w:rPr>
     </w:lvl>
   </w:abstractNum>
-  <w:abstractNum w:abstractNumId="17" w15:restartNumberingAfterBreak="0">
+  <w:abstractNum w:abstractNumId="19" w15:restartNumberingAfterBreak="0">
     <w:nsid w:val="21E869E7"/>
     <w:multiLevelType w:val="hybridMultilevel"/>
     <w:tmpl w:val="0C20A6B2"/>
@@ -17822,7 +20001,7 @@
       </w:rPr>
     </w:lvl>
   </w:abstractNum>
-  <w:abstractNum w:abstractNumId="18" w15:restartNumberingAfterBreak="0">
+  <w:abstractNum w:abstractNumId="20" w15:restartNumberingAfterBreak="0">
     <w:nsid w:val="230F33CC"/>
     <w:multiLevelType w:val="hybridMultilevel"/>
     <w:tmpl w:val="B338FCA8"/>
@@ -17962,7 +20141,7 @@
       </w:rPr>
     </w:lvl>
   </w:abstractNum>
-  <w:abstractNum w:abstractNumId="19" w15:restartNumberingAfterBreak="0">
+  <w:abstractNum w:abstractNumId="21" w15:restartNumberingAfterBreak="0">
     <w:nsid w:val="24132489"/>
     <w:multiLevelType w:val="hybridMultilevel"/>
     <w:tmpl w:val="074AEF96"/>
@@ -18075,7 +20254,7 @@
       </w:rPr>
     </w:lvl>
   </w:abstractNum>
-  <w:abstractNum w:abstractNumId="20" w15:restartNumberingAfterBreak="0">
+  <w:abstractNum w:abstractNumId="22" w15:restartNumberingAfterBreak="0">
     <w:nsid w:val="24E4038C"/>
     <w:multiLevelType w:val="hybridMultilevel"/>
     <w:tmpl w:val="8908963E"/>
@@ -18188,7 +20367,7 @@
       </w:rPr>
     </w:lvl>
   </w:abstractNum>
-  <w:abstractNum w:abstractNumId="21" w15:restartNumberingAfterBreak="0">
+  <w:abstractNum w:abstractNumId="23" w15:restartNumberingAfterBreak="0">
     <w:nsid w:val="2A2506EB"/>
     <w:multiLevelType w:val="hybridMultilevel"/>
     <w:tmpl w:val="31C47450"/>
@@ -18305,7 +20484,120 @@
       </w:rPr>
     </w:lvl>
   </w:abstractNum>
-  <w:abstractNum w:abstractNumId="22" w15:restartNumberingAfterBreak="0">
+  <w:abstractNum w:abstractNumId="24" w15:restartNumberingAfterBreak="0">
+    <w:nsid w:val="2FFA4276"/>
+    <w:multiLevelType w:val="hybridMultilevel"/>
+    <w:tmpl w:val="AD9CC612"/>
+    <w:lvl w:ilvl="0" w:tplc="20000001">
+      <w:start w:val="1"/>
+      <w:numFmt w:val="bullet"/>
+      <w:lvlText w:val=""/>
+      <w:lvlJc w:val="left"/>
+      <w:pPr>
+        <w:ind w:left="720" w:hanging="360"/>
+      </w:pPr>
+      <w:rPr>
+        <w:rFonts w:ascii="Symbol" w:hAnsi="Symbol" w:hint="default"/>
+      </w:rPr>
+    </w:lvl>
+    <w:lvl w:ilvl="1" w:tplc="20000003" w:tentative="1">
+      <w:start w:val="1"/>
+      <w:numFmt w:val="bullet"/>
+      <w:lvlText w:val="o"/>
+      <w:lvlJc w:val="left"/>
+      <w:pPr>
+        <w:ind w:left="1440" w:hanging="360"/>
+      </w:pPr>
+      <w:rPr>
+        <w:rFonts w:ascii="Courier New" w:hAnsi="Courier New" w:cs="Courier New" w:hint="default"/>
+      </w:rPr>
+    </w:lvl>
+    <w:lvl w:ilvl="2" w:tplc="20000005" w:tentative="1">
+      <w:start w:val="1"/>
+      <w:numFmt w:val="bullet"/>
+      <w:lvlText w:val=""/>
+      <w:lvlJc w:val="left"/>
+      <w:pPr>
+        <w:ind w:left="2160" w:hanging="360"/>
+      </w:pPr>
+      <w:rPr>
+        <w:rFonts w:ascii="Wingdings" w:hAnsi="Wingdings" w:hint="default"/>
+      </w:rPr>
+    </w:lvl>
+    <w:lvl w:ilvl="3" w:tplc="20000001" w:tentative="1">
+      <w:start w:val="1"/>
+      <w:numFmt w:val="bullet"/>
+      <w:lvlText w:val=""/>
+      <w:lvlJc w:val="left"/>
+      <w:pPr>
+        <w:ind w:left="2880" w:hanging="360"/>
+      </w:pPr>
+      <w:rPr>
+        <w:rFonts w:ascii="Symbol" w:hAnsi="Symbol" w:hint="default"/>
+      </w:rPr>
+    </w:lvl>
+    <w:lvl w:ilvl="4" w:tplc="20000003" w:tentative="1">
+      <w:start w:val="1"/>
+      <w:numFmt w:val="bullet"/>
+      <w:lvlText w:val="o"/>
+      <w:lvlJc w:val="left"/>
+      <w:pPr>
+        <w:ind w:left="3600" w:hanging="360"/>
+      </w:pPr>
+      <w:rPr>
+        <w:rFonts w:ascii="Courier New" w:hAnsi="Courier New" w:cs="Courier New" w:hint="default"/>
+      </w:rPr>
+    </w:lvl>
+    <w:lvl w:ilvl="5" w:tplc="20000005" w:tentative="1">
+      <w:start w:val="1"/>
+      <w:numFmt w:val="bullet"/>
+      <w:lvlText w:val=""/>
+      <w:lvlJc w:val="left"/>
+      <w:pPr>
+        <w:ind w:left="4320" w:hanging="360"/>
+      </w:pPr>
+      <w:rPr>
+        <w:rFonts w:ascii="Wingdings" w:hAnsi="Wingdings" w:hint="default"/>
+      </w:rPr>
+    </w:lvl>
+    <w:lvl w:ilvl="6" w:tplc="20000001" w:tentative="1">
+      <w:start w:val="1"/>
+      <w:numFmt w:val="bullet"/>
+      <w:lvlText w:val=""/>
+      <w:lvlJc w:val="left"/>
+      <w:pPr>
+        <w:ind w:left="5040" w:hanging="360"/>
+      </w:pPr>
+      <w:rPr>
+        <w:rFonts w:ascii="Symbol" w:hAnsi="Symbol" w:hint="default"/>
+      </w:rPr>
+    </w:lvl>
+    <w:lvl w:ilvl="7" w:tplc="20000003" w:tentative="1">
+      <w:start w:val="1"/>
+      <w:numFmt w:val="bullet"/>
+      <w:lvlText w:val="o"/>
+      <w:lvlJc w:val="left"/>
+      <w:pPr>
+        <w:ind w:left="5760" w:hanging="360"/>
+      </w:pPr>
+      <w:rPr>
+        <w:rFonts w:ascii="Courier New" w:hAnsi="Courier New" w:cs="Courier New" w:hint="default"/>
+      </w:rPr>
+    </w:lvl>
+    <w:lvl w:ilvl="8" w:tplc="20000005" w:tentative="1">
+      <w:start w:val="1"/>
+      <w:numFmt w:val="bullet"/>
+      <w:lvlText w:val=""/>
+      <w:lvlJc w:val="left"/>
+      <w:pPr>
+        <w:ind w:left="6480" w:hanging="360"/>
+      </w:pPr>
+      <w:rPr>
+        <w:rFonts w:ascii="Wingdings" w:hAnsi="Wingdings" w:hint="default"/>
+      </w:rPr>
+    </w:lvl>
+  </w:abstractNum>
+  <w:abstractNum w:abstractNumId="25" w15:restartNumberingAfterBreak="0">
     <w:nsid w:val="33BE4792"/>
     <w:multiLevelType w:val="hybridMultilevel"/>
     <w:tmpl w:val="0368EF64"/>
@@ -18445,7 +20737,7 @@
       </w:rPr>
     </w:lvl>
   </w:abstractNum>
-  <w:abstractNum w:abstractNumId="23" w15:restartNumberingAfterBreak="0">
+  <w:abstractNum w:abstractNumId="26" w15:restartNumberingAfterBreak="0">
     <w:nsid w:val="367C600F"/>
     <w:multiLevelType w:val="multilevel"/>
     <w:tmpl w:val="66F66ADC"/>
@@ -18596,7 +20888,7 @@
       </w:rPr>
     </w:lvl>
   </w:abstractNum>
-  <w:abstractNum w:abstractNumId="24" w15:restartNumberingAfterBreak="0">
+  <w:abstractNum w:abstractNumId="27" w15:restartNumberingAfterBreak="0">
     <w:nsid w:val="3D081AB8"/>
     <w:multiLevelType w:val="hybridMultilevel"/>
     <w:tmpl w:val="12163E56"/>
@@ -18709,7 +21001,7 @@
       </w:rPr>
     </w:lvl>
   </w:abstractNum>
-  <w:abstractNum w:abstractNumId="25" w15:restartNumberingAfterBreak="0">
+  <w:abstractNum w:abstractNumId="28" w15:restartNumberingAfterBreak="0">
     <w:nsid w:val="3E754FB9"/>
     <w:multiLevelType w:val="hybridMultilevel"/>
     <w:tmpl w:val="5B2E8608"/>
@@ -18821,7 +21113,7 @@
       </w:rPr>
     </w:lvl>
   </w:abstractNum>
-  <w:abstractNum w:abstractNumId="26" w15:restartNumberingAfterBreak="0">
+  <w:abstractNum w:abstractNumId="29" w15:restartNumberingAfterBreak="0">
     <w:nsid w:val="3E7F57E5"/>
     <w:multiLevelType w:val="hybridMultilevel"/>
     <w:tmpl w:val="515A5522"/>
@@ -18934,7 +21226,7 @@
       </w:rPr>
     </w:lvl>
   </w:abstractNum>
-  <w:abstractNum w:abstractNumId="27" w15:restartNumberingAfterBreak="0">
+  <w:abstractNum w:abstractNumId="30" w15:restartNumberingAfterBreak="0">
     <w:nsid w:val="40117AB4"/>
     <w:multiLevelType w:val="singleLevel"/>
     <w:tmpl w:val="0424000F"/>
@@ -18954,7 +21246,7 @@
       </w:rPr>
     </w:lvl>
   </w:abstractNum>
-  <w:abstractNum w:abstractNumId="28" w15:restartNumberingAfterBreak="0">
+  <w:abstractNum w:abstractNumId="31" w15:restartNumberingAfterBreak="0">
     <w:nsid w:val="44386100"/>
     <w:multiLevelType w:val="hybridMultilevel"/>
     <w:tmpl w:val="15BAF672"/>
@@ -19067,7 +21359,7 @@
       </w:rPr>
     </w:lvl>
   </w:abstractNum>
-  <w:abstractNum w:abstractNumId="29" w15:restartNumberingAfterBreak="0">
+  <w:abstractNum w:abstractNumId="32" w15:restartNumberingAfterBreak="0">
     <w:nsid w:val="44CD2EE9"/>
     <w:multiLevelType w:val="hybridMultilevel"/>
     <w:tmpl w:val="AD32F244"/>
@@ -19180,7 +21472,7 @@
       </w:rPr>
     </w:lvl>
   </w:abstractNum>
-  <w:abstractNum w:abstractNumId="30" w15:restartNumberingAfterBreak="0">
+  <w:abstractNum w:abstractNumId="33" w15:restartNumberingAfterBreak="0">
     <w:nsid w:val="45F04156"/>
     <w:multiLevelType w:val="hybridMultilevel"/>
     <w:tmpl w:val="8648D69E"/>
@@ -19293,7 +21585,7 @@
       </w:rPr>
     </w:lvl>
   </w:abstractNum>
-  <w:abstractNum w:abstractNumId="31" w15:restartNumberingAfterBreak="0">
+  <w:abstractNum w:abstractNumId="34" w15:restartNumberingAfterBreak="0">
     <w:nsid w:val="489362F3"/>
     <w:multiLevelType w:val="hybridMultilevel"/>
     <w:tmpl w:val="A8EE65A4"/>
@@ -19406,7 +21698,120 @@
       </w:rPr>
     </w:lvl>
   </w:abstractNum>
-  <w:abstractNum w:abstractNumId="32" w15:restartNumberingAfterBreak="0">
+  <w:abstractNum w:abstractNumId="35" w15:restartNumberingAfterBreak="0">
+    <w:nsid w:val="4B221AD8"/>
+    <w:multiLevelType w:val="hybridMultilevel"/>
+    <w:tmpl w:val="FB58206E"/>
+    <w:lvl w:ilvl="0" w:tplc="20000001">
+      <w:start w:val="1"/>
+      <w:numFmt w:val="bullet"/>
+      <w:lvlText w:val=""/>
+      <w:lvlJc w:val="left"/>
+      <w:pPr>
+        <w:ind w:left="720" w:hanging="360"/>
+      </w:pPr>
+      <w:rPr>
+        <w:rFonts w:ascii="Symbol" w:hAnsi="Symbol" w:hint="default"/>
+      </w:rPr>
+    </w:lvl>
+    <w:lvl w:ilvl="1" w:tplc="20000003" w:tentative="1">
+      <w:start w:val="1"/>
+      <w:numFmt w:val="bullet"/>
+      <w:lvlText w:val="o"/>
+      <w:lvlJc w:val="left"/>
+      <w:pPr>
+        <w:ind w:left="1440" w:hanging="360"/>
+      </w:pPr>
+      <w:rPr>
+        <w:rFonts w:ascii="Courier New" w:hAnsi="Courier New" w:cs="Courier New" w:hint="default"/>
+      </w:rPr>
+    </w:lvl>
+    <w:lvl w:ilvl="2" w:tplc="20000005" w:tentative="1">
+      <w:start w:val="1"/>
+      <w:numFmt w:val="bullet"/>
+      <w:lvlText w:val=""/>
+      <w:lvlJc w:val="left"/>
+      <w:pPr>
+        <w:ind w:left="2160" w:hanging="360"/>
+      </w:pPr>
+      <w:rPr>
+        <w:rFonts w:ascii="Wingdings" w:hAnsi="Wingdings" w:hint="default"/>
+      </w:rPr>
+    </w:lvl>
+    <w:lvl w:ilvl="3" w:tplc="20000001" w:tentative="1">
+      <w:start w:val="1"/>
+      <w:numFmt w:val="bullet"/>
+      <w:lvlText w:val=""/>
+      <w:lvlJc w:val="left"/>
+      <w:pPr>
+        <w:ind w:left="2880" w:hanging="360"/>
+      </w:pPr>
+      <w:rPr>
+        <w:rFonts w:ascii="Symbol" w:hAnsi="Symbol" w:hint="default"/>
+      </w:rPr>
+    </w:lvl>
+    <w:lvl w:ilvl="4" w:tplc="20000003" w:tentative="1">
+      <w:start w:val="1"/>
+      <w:numFmt w:val="bullet"/>
+      <w:lvlText w:val="o"/>
+      <w:lvlJc w:val="left"/>
+      <w:pPr>
+        <w:ind w:left="3600" w:hanging="360"/>
+      </w:pPr>
+      <w:rPr>
+        <w:rFonts w:ascii="Courier New" w:hAnsi="Courier New" w:cs="Courier New" w:hint="default"/>
+      </w:rPr>
+    </w:lvl>
+    <w:lvl w:ilvl="5" w:tplc="20000005" w:tentative="1">
+      <w:start w:val="1"/>
+      <w:numFmt w:val="bullet"/>
+      <w:lvlText w:val=""/>
+      <w:lvlJc w:val="left"/>
+      <w:pPr>
+        <w:ind w:left="4320" w:hanging="360"/>
+      </w:pPr>
+      <w:rPr>
+        <w:rFonts w:ascii="Wingdings" w:hAnsi="Wingdings" w:hint="default"/>
+      </w:rPr>
+    </w:lvl>
+    <w:lvl w:ilvl="6" w:tplc="20000001" w:tentative="1">
+      <w:start w:val="1"/>
+      <w:numFmt w:val="bullet"/>
+      <w:lvlText w:val=""/>
+      <w:lvlJc w:val="left"/>
+      <w:pPr>
+        <w:ind w:left="5040" w:hanging="360"/>
+      </w:pPr>
+      <w:rPr>
+        <w:rFonts w:ascii="Symbol" w:hAnsi="Symbol" w:hint="default"/>
+      </w:rPr>
+    </w:lvl>
+    <w:lvl w:ilvl="7" w:tplc="20000003" w:tentative="1">
+      <w:start w:val="1"/>
+      <w:numFmt w:val="bullet"/>
+      <w:lvlText w:val="o"/>
+      <w:lvlJc w:val="left"/>
+      <w:pPr>
+        <w:ind w:left="5760" w:hanging="360"/>
+      </w:pPr>
+      <w:rPr>
+        <w:rFonts w:ascii="Courier New" w:hAnsi="Courier New" w:cs="Courier New" w:hint="default"/>
+      </w:rPr>
+    </w:lvl>
+    <w:lvl w:ilvl="8" w:tplc="20000005" w:tentative="1">
+      <w:start w:val="1"/>
+      <w:numFmt w:val="bullet"/>
+      <w:lvlText w:val=""/>
+      <w:lvlJc w:val="left"/>
+      <w:pPr>
+        <w:ind w:left="6480" w:hanging="360"/>
+      </w:pPr>
+      <w:rPr>
+        <w:rFonts w:ascii="Wingdings" w:hAnsi="Wingdings" w:hint="default"/>
+      </w:rPr>
+    </w:lvl>
+  </w:abstractNum>
+  <w:abstractNum w:abstractNumId="36" w15:restartNumberingAfterBreak="0">
     <w:nsid w:val="4D737F36"/>
     <w:multiLevelType w:val="hybridMultilevel"/>
     <w:tmpl w:val="2FCADFCC"/>
@@ -19519,7 +21924,7 @@
       </w:rPr>
     </w:lvl>
   </w:abstractNum>
-  <w:abstractNum w:abstractNumId="33" w15:restartNumberingAfterBreak="0">
+  <w:abstractNum w:abstractNumId="37" w15:restartNumberingAfterBreak="0">
     <w:nsid w:val="56210033"/>
     <w:multiLevelType w:val="hybridMultilevel"/>
     <w:tmpl w:val="B834133E"/>
@@ -19632,7 +22037,7 @@
       </w:rPr>
     </w:lvl>
   </w:abstractNum>
-  <w:abstractNum w:abstractNumId="34" w15:restartNumberingAfterBreak="0">
+  <w:abstractNum w:abstractNumId="38" w15:restartNumberingAfterBreak="0">
     <w:nsid w:val="566D6DDD"/>
     <w:multiLevelType w:val="hybridMultilevel"/>
     <w:tmpl w:val="E55A3D24"/>
@@ -19772,7 +22177,7 @@
       </w:rPr>
     </w:lvl>
   </w:abstractNum>
-  <w:abstractNum w:abstractNumId="35" w15:restartNumberingAfterBreak="0">
+  <w:abstractNum w:abstractNumId="39" w15:restartNumberingAfterBreak="0">
     <w:nsid w:val="56C4537D"/>
     <w:multiLevelType w:val="hybridMultilevel"/>
     <w:tmpl w:val="66485F72"/>
@@ -19885,7 +22290,7 @@
       </w:rPr>
     </w:lvl>
   </w:abstractNum>
-  <w:abstractNum w:abstractNumId="36" w15:restartNumberingAfterBreak="0">
+  <w:abstractNum w:abstractNumId="40" w15:restartNumberingAfterBreak="0">
     <w:nsid w:val="574533E9"/>
     <w:multiLevelType w:val="hybridMultilevel"/>
     <w:tmpl w:val="5B146962"/>
@@ -19997,7 +22402,7 @@
       </w:rPr>
     </w:lvl>
   </w:abstractNum>
-  <w:abstractNum w:abstractNumId="37" w15:restartNumberingAfterBreak="0">
+  <w:abstractNum w:abstractNumId="41" w15:restartNumberingAfterBreak="0">
     <w:nsid w:val="58DE7EFA"/>
     <w:multiLevelType w:val="hybridMultilevel"/>
     <w:tmpl w:val="131EA528"/>
@@ -20092,7 +22497,7 @@
       </w:pPr>
     </w:lvl>
   </w:abstractNum>
-  <w:abstractNum w:abstractNumId="38" w15:restartNumberingAfterBreak="0">
+  <w:abstractNum w:abstractNumId="42" w15:restartNumberingAfterBreak="0">
     <w:nsid w:val="5AC4619C"/>
     <w:multiLevelType w:val="hybridMultilevel"/>
     <w:tmpl w:val="DFB60A26"/>
@@ -20204,7 +22609,7 @@
       </w:rPr>
     </w:lvl>
   </w:abstractNum>
-  <w:abstractNum w:abstractNumId="39" w15:restartNumberingAfterBreak="0">
+  <w:abstractNum w:abstractNumId="43" w15:restartNumberingAfterBreak="0">
     <w:nsid w:val="5D205A4D"/>
     <w:multiLevelType w:val="hybridMultilevel"/>
     <w:tmpl w:val="09C642EA"/>
@@ -20317,7 +22722,7 @@
       </w:rPr>
     </w:lvl>
   </w:abstractNum>
-  <w:abstractNum w:abstractNumId="40" w15:restartNumberingAfterBreak="0">
+  <w:abstractNum w:abstractNumId="44" w15:restartNumberingAfterBreak="0">
     <w:nsid w:val="5D4B3E35"/>
     <w:multiLevelType w:val="hybridMultilevel"/>
     <w:tmpl w:val="63006618"/>
@@ -20430,7 +22835,7 @@
       </w:rPr>
     </w:lvl>
   </w:abstractNum>
-  <w:abstractNum w:abstractNumId="41" w15:restartNumberingAfterBreak="0">
+  <w:abstractNum w:abstractNumId="45" w15:restartNumberingAfterBreak="0">
     <w:nsid w:val="5E1C298F"/>
     <w:multiLevelType w:val="hybridMultilevel"/>
     <w:tmpl w:val="7642668E"/>
@@ -20543,7 +22948,7 @@
       </w:rPr>
     </w:lvl>
   </w:abstractNum>
-  <w:abstractNum w:abstractNumId="42" w15:restartNumberingAfterBreak="0">
+  <w:abstractNum w:abstractNumId="46" w15:restartNumberingAfterBreak="0">
     <w:nsid w:val="60CA680F"/>
     <w:multiLevelType w:val="hybridMultilevel"/>
     <w:tmpl w:val="B94AE1E6"/>
@@ -20656,7 +23061,7 @@
       </w:rPr>
     </w:lvl>
   </w:abstractNum>
-  <w:abstractNum w:abstractNumId="43" w15:restartNumberingAfterBreak="0">
+  <w:abstractNum w:abstractNumId="47" w15:restartNumberingAfterBreak="0">
     <w:nsid w:val="6103011A"/>
     <w:multiLevelType w:val="hybridMultilevel"/>
     <w:tmpl w:val="BE52C078"/>
@@ -20769,7 +23174,7 @@
       </w:rPr>
     </w:lvl>
   </w:abstractNum>
-  <w:abstractNum w:abstractNumId="44" w15:restartNumberingAfterBreak="0">
+  <w:abstractNum w:abstractNumId="48" w15:restartNumberingAfterBreak="0">
     <w:nsid w:val="613216BC"/>
     <w:multiLevelType w:val="hybridMultilevel"/>
     <w:tmpl w:val="DCD43D76"/>
@@ -20882,7 +23287,7 @@
       </w:rPr>
     </w:lvl>
   </w:abstractNum>
-  <w:abstractNum w:abstractNumId="45" w15:restartNumberingAfterBreak="0">
+  <w:abstractNum w:abstractNumId="49" w15:restartNumberingAfterBreak="0">
     <w:nsid w:val="62CA2A8F"/>
     <w:multiLevelType w:val="hybridMultilevel"/>
     <w:tmpl w:val="9E62B7C8"/>
@@ -20995,7 +23400,7 @@
       </w:rPr>
     </w:lvl>
   </w:abstractNum>
-  <w:abstractNum w:abstractNumId="46" w15:restartNumberingAfterBreak="0">
+  <w:abstractNum w:abstractNumId="50" w15:restartNumberingAfterBreak="0">
     <w:nsid w:val="642B0707"/>
     <w:multiLevelType w:val="hybridMultilevel"/>
     <w:tmpl w:val="6F824434"/>
@@ -21108,7 +23513,7 @@
       </w:rPr>
     </w:lvl>
   </w:abstractNum>
-  <w:abstractNum w:abstractNumId="47" w15:restartNumberingAfterBreak="0">
+  <w:abstractNum w:abstractNumId="51" w15:restartNumberingAfterBreak="0">
     <w:nsid w:val="657C167B"/>
     <w:multiLevelType w:val="hybridMultilevel"/>
     <w:tmpl w:val="253E1E4A"/>
@@ -21221,7 +23626,7 @@
       </w:rPr>
     </w:lvl>
   </w:abstractNum>
-  <w:abstractNum w:abstractNumId="48" w15:restartNumberingAfterBreak="0">
+  <w:abstractNum w:abstractNumId="52" w15:restartNumberingAfterBreak="0">
     <w:nsid w:val="6F112B8F"/>
     <w:multiLevelType w:val="hybridMultilevel"/>
     <w:tmpl w:val="DD189394"/>
@@ -21334,7 +23739,7 @@
       </w:rPr>
     </w:lvl>
   </w:abstractNum>
-  <w:abstractNum w:abstractNumId="49" w15:restartNumberingAfterBreak="0">
+  <w:abstractNum w:abstractNumId="53" w15:restartNumberingAfterBreak="0">
     <w:nsid w:val="6F7A5BE4"/>
     <w:multiLevelType w:val="hybridMultilevel"/>
     <w:tmpl w:val="1B76D9FC"/>
@@ -21447,7 +23852,7 @@
       </w:rPr>
     </w:lvl>
   </w:abstractNum>
-  <w:abstractNum w:abstractNumId="50" w15:restartNumberingAfterBreak="0">
+  <w:abstractNum w:abstractNumId="54" w15:restartNumberingAfterBreak="0">
     <w:nsid w:val="70624018"/>
     <w:multiLevelType w:val="hybridMultilevel"/>
     <w:tmpl w:val="225C64B6"/>
@@ -21587,7 +23992,7 @@
       </w:rPr>
     </w:lvl>
   </w:abstractNum>
-  <w:abstractNum w:abstractNumId="51" w15:restartNumberingAfterBreak="0">
+  <w:abstractNum w:abstractNumId="55" w15:restartNumberingAfterBreak="0">
     <w:nsid w:val="714F2450"/>
     <w:multiLevelType w:val="hybridMultilevel"/>
     <w:tmpl w:val="B97EC042"/>
@@ -21700,7 +24105,7 @@
       </w:rPr>
     </w:lvl>
   </w:abstractNum>
-  <w:abstractNum w:abstractNumId="52" w15:restartNumberingAfterBreak="0">
+  <w:abstractNum w:abstractNumId="56" w15:restartNumberingAfterBreak="0">
     <w:nsid w:val="74967D99"/>
     <w:multiLevelType w:val="multilevel"/>
     <w:tmpl w:val="6F1612AC"/>
@@ -21840,7 +24245,120 @@
       </w:rPr>
     </w:lvl>
   </w:abstractNum>
-  <w:abstractNum w:abstractNumId="53" w15:restartNumberingAfterBreak="0">
+  <w:abstractNum w:abstractNumId="57" w15:restartNumberingAfterBreak="0">
+    <w:nsid w:val="749723B0"/>
+    <w:multiLevelType w:val="hybridMultilevel"/>
+    <w:tmpl w:val="BD0019CA"/>
+    <w:lvl w:ilvl="0" w:tplc="20000001">
+      <w:start w:val="1"/>
+      <w:numFmt w:val="bullet"/>
+      <w:lvlText w:val=""/>
+      <w:lvlJc w:val="left"/>
+      <w:pPr>
+        <w:ind w:left="720" w:hanging="360"/>
+      </w:pPr>
+      <w:rPr>
+        <w:rFonts w:ascii="Symbol" w:hAnsi="Symbol" w:hint="default"/>
+      </w:rPr>
+    </w:lvl>
+    <w:lvl w:ilvl="1" w:tplc="20000003" w:tentative="1">
+      <w:start w:val="1"/>
+      <w:numFmt w:val="bullet"/>
+      <w:lvlText w:val="o"/>
+      <w:lvlJc w:val="left"/>
+      <w:pPr>
+        <w:ind w:left="1440" w:hanging="360"/>
+      </w:pPr>
+      <w:rPr>
+        <w:rFonts w:ascii="Courier New" w:hAnsi="Courier New" w:cs="Courier New" w:hint="default"/>
+      </w:rPr>
+    </w:lvl>
+    <w:lvl w:ilvl="2" w:tplc="20000005" w:tentative="1">
+      <w:start w:val="1"/>
+      <w:numFmt w:val="bullet"/>
+      <w:lvlText w:val=""/>
+      <w:lvlJc w:val="left"/>
+      <w:pPr>
+        <w:ind w:left="2160" w:hanging="360"/>
+      </w:pPr>
+      <w:rPr>
+        <w:rFonts w:ascii="Wingdings" w:hAnsi="Wingdings" w:hint="default"/>
+      </w:rPr>
+    </w:lvl>
+    <w:lvl w:ilvl="3" w:tplc="20000001" w:tentative="1">
+      <w:start w:val="1"/>
+      <w:numFmt w:val="bullet"/>
+      <w:lvlText w:val=""/>
+      <w:lvlJc w:val="left"/>
+      <w:pPr>
+        <w:ind w:left="2880" w:hanging="360"/>
+      </w:pPr>
+      <w:rPr>
+        <w:rFonts w:ascii="Symbol" w:hAnsi="Symbol" w:hint="default"/>
+      </w:rPr>
+    </w:lvl>
+    <w:lvl w:ilvl="4" w:tplc="20000003" w:tentative="1">
+      <w:start w:val="1"/>
+      <w:numFmt w:val="bullet"/>
+      <w:lvlText w:val="o"/>
+      <w:lvlJc w:val="left"/>
+      <w:pPr>
+        <w:ind w:left="3600" w:hanging="360"/>
+      </w:pPr>
+      <w:rPr>
+        <w:rFonts w:ascii="Courier New" w:hAnsi="Courier New" w:cs="Courier New" w:hint="default"/>
+      </w:rPr>
+    </w:lvl>
+    <w:lvl w:ilvl="5" w:tplc="20000005" w:tentative="1">
+      <w:start w:val="1"/>
+      <w:numFmt w:val="bullet"/>
+      <w:lvlText w:val=""/>
+      <w:lvlJc w:val="left"/>
+      <w:pPr>
+        <w:ind w:left="4320" w:hanging="360"/>
+      </w:pPr>
+      <w:rPr>
+        <w:rFonts w:ascii="Wingdings" w:hAnsi="Wingdings" w:hint="default"/>
+      </w:rPr>
+    </w:lvl>
+    <w:lvl w:ilvl="6" w:tplc="20000001" w:tentative="1">
+      <w:start w:val="1"/>
+      <w:numFmt w:val="bullet"/>
+      <w:lvlText w:val=""/>
+      <w:lvlJc w:val="left"/>
+      <w:pPr>
+        <w:ind w:left="5040" w:hanging="360"/>
+      </w:pPr>
+      <w:rPr>
+        <w:rFonts w:ascii="Symbol" w:hAnsi="Symbol" w:hint="default"/>
+      </w:rPr>
+    </w:lvl>
+    <w:lvl w:ilvl="7" w:tplc="20000003" w:tentative="1">
+      <w:start w:val="1"/>
+      <w:numFmt w:val="bullet"/>
+      <w:lvlText w:val="o"/>
+      <w:lvlJc w:val="left"/>
+      <w:pPr>
+        <w:ind w:left="5760" w:hanging="360"/>
+      </w:pPr>
+      <w:rPr>
+        <w:rFonts w:ascii="Courier New" w:hAnsi="Courier New" w:cs="Courier New" w:hint="default"/>
+      </w:rPr>
+    </w:lvl>
+    <w:lvl w:ilvl="8" w:tplc="20000005" w:tentative="1">
+      <w:start w:val="1"/>
+      <w:numFmt w:val="bullet"/>
+      <w:lvlText w:val=""/>
+      <w:lvlJc w:val="left"/>
+      <w:pPr>
+        <w:ind w:left="6480" w:hanging="360"/>
+      </w:pPr>
+      <w:rPr>
+        <w:rFonts w:ascii="Wingdings" w:hAnsi="Wingdings" w:hint="default"/>
+      </w:rPr>
+    </w:lvl>
+  </w:abstractNum>
+  <w:abstractNum w:abstractNumId="58" w15:restartNumberingAfterBreak="0">
     <w:nsid w:val="780E0E44"/>
     <w:multiLevelType w:val="hybridMultilevel"/>
     <w:tmpl w:val="10468E06"/>
@@ -21953,17 +24471,130 @@
       </w:rPr>
     </w:lvl>
   </w:abstractNum>
+  <w:abstractNum w:abstractNumId="59" w15:restartNumberingAfterBreak="0">
+    <w:nsid w:val="7EBE0D6C"/>
+    <w:multiLevelType w:val="hybridMultilevel"/>
+    <w:tmpl w:val="1EEE1B76"/>
+    <w:lvl w:ilvl="0" w:tplc="20000001">
+      <w:start w:val="1"/>
+      <w:numFmt w:val="bullet"/>
+      <w:lvlText w:val=""/>
+      <w:lvlJc w:val="left"/>
+      <w:pPr>
+        <w:ind w:left="720" w:hanging="360"/>
+      </w:pPr>
+      <w:rPr>
+        <w:rFonts w:ascii="Symbol" w:hAnsi="Symbol" w:hint="default"/>
+      </w:rPr>
+    </w:lvl>
+    <w:lvl w:ilvl="1" w:tplc="20000003" w:tentative="1">
+      <w:start w:val="1"/>
+      <w:numFmt w:val="bullet"/>
+      <w:lvlText w:val="o"/>
+      <w:lvlJc w:val="left"/>
+      <w:pPr>
+        <w:ind w:left="1440" w:hanging="360"/>
+      </w:pPr>
+      <w:rPr>
+        <w:rFonts w:ascii="Courier New" w:hAnsi="Courier New" w:cs="Courier New" w:hint="default"/>
+      </w:rPr>
+    </w:lvl>
+    <w:lvl w:ilvl="2" w:tplc="20000005" w:tentative="1">
+      <w:start w:val="1"/>
+      <w:numFmt w:val="bullet"/>
+      <w:lvlText w:val=""/>
+      <w:lvlJc w:val="left"/>
+      <w:pPr>
+        <w:ind w:left="2160" w:hanging="360"/>
+      </w:pPr>
+      <w:rPr>
+        <w:rFonts w:ascii="Wingdings" w:hAnsi="Wingdings" w:hint="default"/>
+      </w:rPr>
+    </w:lvl>
+    <w:lvl w:ilvl="3" w:tplc="20000001" w:tentative="1">
+      <w:start w:val="1"/>
+      <w:numFmt w:val="bullet"/>
+      <w:lvlText w:val=""/>
+      <w:lvlJc w:val="left"/>
+      <w:pPr>
+        <w:ind w:left="2880" w:hanging="360"/>
+      </w:pPr>
+      <w:rPr>
+        <w:rFonts w:ascii="Symbol" w:hAnsi="Symbol" w:hint="default"/>
+      </w:rPr>
+    </w:lvl>
+    <w:lvl w:ilvl="4" w:tplc="20000003" w:tentative="1">
+      <w:start w:val="1"/>
+      <w:numFmt w:val="bullet"/>
+      <w:lvlText w:val="o"/>
+      <w:lvlJc w:val="left"/>
+      <w:pPr>
+        <w:ind w:left="3600" w:hanging="360"/>
+      </w:pPr>
+      <w:rPr>
+        <w:rFonts w:ascii="Courier New" w:hAnsi="Courier New" w:cs="Courier New" w:hint="default"/>
+      </w:rPr>
+    </w:lvl>
+    <w:lvl w:ilvl="5" w:tplc="20000005" w:tentative="1">
+      <w:start w:val="1"/>
+      <w:numFmt w:val="bullet"/>
+      <w:lvlText w:val=""/>
+      <w:lvlJc w:val="left"/>
+      <w:pPr>
+        <w:ind w:left="4320" w:hanging="360"/>
+      </w:pPr>
+      <w:rPr>
+        <w:rFonts w:ascii="Wingdings" w:hAnsi="Wingdings" w:hint="default"/>
+      </w:rPr>
+    </w:lvl>
+    <w:lvl w:ilvl="6" w:tplc="20000001" w:tentative="1">
+      <w:start w:val="1"/>
+      <w:numFmt w:val="bullet"/>
+      <w:lvlText w:val=""/>
+      <w:lvlJc w:val="left"/>
+      <w:pPr>
+        <w:ind w:left="5040" w:hanging="360"/>
+      </w:pPr>
+      <w:rPr>
+        <w:rFonts w:ascii="Symbol" w:hAnsi="Symbol" w:hint="default"/>
+      </w:rPr>
+    </w:lvl>
+    <w:lvl w:ilvl="7" w:tplc="20000003" w:tentative="1">
+      <w:start w:val="1"/>
+      <w:numFmt w:val="bullet"/>
+      <w:lvlText w:val="o"/>
+      <w:lvlJc w:val="left"/>
+      <w:pPr>
+        <w:ind w:left="5760" w:hanging="360"/>
+      </w:pPr>
+      <w:rPr>
+        <w:rFonts w:ascii="Courier New" w:hAnsi="Courier New" w:cs="Courier New" w:hint="default"/>
+      </w:rPr>
+    </w:lvl>
+    <w:lvl w:ilvl="8" w:tplc="20000005" w:tentative="1">
+      <w:start w:val="1"/>
+      <w:numFmt w:val="bullet"/>
+      <w:lvlText w:val=""/>
+      <w:lvlJc w:val="left"/>
+      <w:pPr>
+        <w:ind w:left="6480" w:hanging="360"/>
+      </w:pPr>
+      <w:rPr>
+        <w:rFonts w:ascii="Wingdings" w:hAnsi="Wingdings" w:hint="default"/>
+      </w:rPr>
+    </w:lvl>
+  </w:abstractNum>
   <w:num w:numId="1" w16cid:durableId="1616982145">
-    <w:abstractNumId w:val="23"/>
+    <w:abstractNumId w:val="26"/>
   </w:num>
   <w:num w:numId="2" w16cid:durableId="1563980195">
-    <w:abstractNumId w:val="18"/>
+    <w:abstractNumId w:val="20"/>
   </w:num>
   <w:num w:numId="3" w16cid:durableId="574165386">
-    <w:abstractNumId w:val="22"/>
+    <w:abstractNumId w:val="25"/>
   </w:num>
   <w:num w:numId="4" w16cid:durableId="1982886481">
-    <w:abstractNumId w:val="34"/>
+    <w:abstractNumId w:val="38"/>
     <w:lvlOverride w:ilvl="0"/>
     <w:lvlOverride w:ilvl="1">
       <w:startOverride w:val="1"/>
@@ -21994,40 +24625,40 @@
     <w:abstractNumId w:val="11"/>
   </w:num>
   <w:num w:numId="6" w16cid:durableId="413548033">
-    <w:abstractNumId w:val="50"/>
+    <w:abstractNumId w:val="54"/>
   </w:num>
   <w:num w:numId="7" w16cid:durableId="2517385">
-    <w:abstractNumId w:val="48"/>
+    <w:abstractNumId w:val="52"/>
   </w:num>
   <w:num w:numId="8" w16cid:durableId="1673027270">
-    <w:abstractNumId w:val="19"/>
+    <w:abstractNumId w:val="21"/>
   </w:num>
   <w:num w:numId="9" w16cid:durableId="310713017">
     <w:abstractNumId w:val="7"/>
   </w:num>
   <w:num w:numId="10" w16cid:durableId="642394832">
-    <w:abstractNumId w:val="33"/>
+    <w:abstractNumId w:val="37"/>
   </w:num>
   <w:num w:numId="11" w16cid:durableId="879364368">
-    <w:abstractNumId w:val="15"/>
+    <w:abstractNumId w:val="17"/>
   </w:num>
   <w:num w:numId="12" w16cid:durableId="1154762435">
-    <w:abstractNumId w:val="41"/>
+    <w:abstractNumId w:val="45"/>
   </w:num>
   <w:num w:numId="13" w16cid:durableId="1050419267">
-    <w:abstractNumId w:val="45"/>
+    <w:abstractNumId w:val="49"/>
   </w:num>
   <w:num w:numId="14" w16cid:durableId="1990405806">
     <w:abstractNumId w:val="12"/>
   </w:num>
   <w:num w:numId="15" w16cid:durableId="1546913352">
-    <w:abstractNumId w:val="46"/>
+    <w:abstractNumId w:val="50"/>
   </w:num>
   <w:num w:numId="16" w16cid:durableId="1318874548">
-    <w:abstractNumId w:val="52"/>
+    <w:abstractNumId w:val="56"/>
   </w:num>
   <w:num w:numId="17" w16cid:durableId="722215861">
-    <w:abstractNumId w:val="52"/>
+    <w:abstractNumId w:val="56"/>
     <w:lvlOverride w:ilvl="0">
       <w:startOverride w:val="1"/>
     </w:lvlOverride>
@@ -22057,7 +24688,7 @@
     </w:lvlOverride>
   </w:num>
   <w:num w:numId="18" w16cid:durableId="415446333">
-    <w:abstractNumId w:val="52"/>
+    <w:abstractNumId w:val="56"/>
     <w:lvlOverride w:ilvl="0">
       <w:startOverride w:val="1"/>
     </w:lvlOverride>
@@ -22087,7 +24718,7 @@
     </w:lvlOverride>
   </w:num>
   <w:num w:numId="19" w16cid:durableId="1966346266">
-    <w:abstractNumId w:val="52"/>
+    <w:abstractNumId w:val="56"/>
     <w:lvlOverride w:ilvl="0">
       <w:startOverride w:val="1"/>
     </w:lvlOverride>
@@ -22117,7 +24748,7 @@
     </w:lvlOverride>
   </w:num>
   <w:num w:numId="20" w16cid:durableId="985356155">
-    <w:abstractNumId w:val="52"/>
+    <w:abstractNumId w:val="56"/>
     <w:lvlOverride w:ilvl="0">
       <w:startOverride w:val="1"/>
     </w:lvlOverride>
@@ -22147,7 +24778,7 @@
     </w:lvlOverride>
   </w:num>
   <w:num w:numId="21" w16cid:durableId="971326932">
-    <w:abstractNumId w:val="52"/>
+    <w:abstractNumId w:val="56"/>
     <w:lvlOverride w:ilvl="0">
       <w:startOverride w:val="1"/>
     </w:lvlOverride>
@@ -22177,7 +24808,7 @@
     </w:lvlOverride>
   </w:num>
   <w:num w:numId="22" w16cid:durableId="874578897">
-    <w:abstractNumId w:val="52"/>
+    <w:abstractNumId w:val="56"/>
     <w:lvlOverride w:ilvl="0">
       <w:startOverride w:val="1"/>
     </w:lvlOverride>
@@ -22207,7 +24838,7 @@
     </w:lvlOverride>
   </w:num>
   <w:num w:numId="23" w16cid:durableId="184097708">
-    <w:abstractNumId w:val="52"/>
+    <w:abstractNumId w:val="56"/>
     <w:lvlOverride w:ilvl="0">
       <w:startOverride w:val="1"/>
     </w:lvlOverride>
@@ -22237,7 +24868,7 @@
     </w:lvlOverride>
   </w:num>
   <w:num w:numId="24" w16cid:durableId="1147547601">
-    <w:abstractNumId w:val="52"/>
+    <w:abstractNumId w:val="56"/>
     <w:lvlOverride w:ilvl="0">
       <w:startOverride w:val="1"/>
     </w:lvlOverride>
@@ -22267,7 +24898,7 @@
     </w:lvlOverride>
   </w:num>
   <w:num w:numId="25" w16cid:durableId="697269251">
-    <w:abstractNumId w:val="52"/>
+    <w:abstractNumId w:val="56"/>
     <w:lvlOverride w:ilvl="0">
       <w:startOverride w:val="1"/>
     </w:lvlOverride>
@@ -22297,7 +24928,7 @@
     </w:lvlOverride>
   </w:num>
   <w:num w:numId="26" w16cid:durableId="623387041">
-    <w:abstractNumId w:val="52"/>
+    <w:abstractNumId w:val="56"/>
     <w:lvlOverride w:ilvl="0">
       <w:startOverride w:val="1"/>
     </w:lvlOverride>
@@ -22327,7 +24958,7 @@
     </w:lvlOverride>
   </w:num>
   <w:num w:numId="27" w16cid:durableId="571545525">
-    <w:abstractNumId w:val="52"/>
+    <w:abstractNumId w:val="56"/>
     <w:lvlOverride w:ilvl="0">
       <w:startOverride w:val="1"/>
     </w:lvlOverride>
@@ -22360,19 +24991,19 @@
     <w:abstractNumId w:val="2"/>
   </w:num>
   <w:num w:numId="29" w16cid:durableId="1318532482">
-    <w:abstractNumId w:val="44"/>
+    <w:abstractNumId w:val="48"/>
   </w:num>
   <w:num w:numId="30" w16cid:durableId="2085495198">
     <w:abstractNumId w:val="5"/>
   </w:num>
   <w:num w:numId="31" w16cid:durableId="1159468039">
-    <w:abstractNumId w:val="33"/>
+    <w:abstractNumId w:val="37"/>
   </w:num>
   <w:num w:numId="32" w16cid:durableId="2134787325">
-    <w:abstractNumId w:val="27"/>
+    <w:abstractNumId w:val="30"/>
   </w:num>
   <w:num w:numId="33" w16cid:durableId="690107431">
-    <w:abstractNumId w:val="34"/>
+    <w:abstractNumId w:val="38"/>
     <w:lvlOverride w:ilvl="0"/>
     <w:lvlOverride w:ilvl="1">
       <w:startOverride w:val="1"/>
@@ -22400,97 +25031,97 @@
     </w:lvlOverride>
   </w:num>
   <w:num w:numId="34" w16cid:durableId="1695031192">
-    <w:abstractNumId w:val="34"/>
+    <w:abstractNumId w:val="38"/>
   </w:num>
   <w:num w:numId="35" w16cid:durableId="1474131380">
-    <w:abstractNumId w:val="34"/>
+    <w:abstractNumId w:val="38"/>
   </w:num>
   <w:num w:numId="36" w16cid:durableId="385646365">
-    <w:abstractNumId w:val="21"/>
+    <w:abstractNumId w:val="23"/>
   </w:num>
   <w:num w:numId="37" w16cid:durableId="774322130">
     <w:abstractNumId w:val="10"/>
   </w:num>
   <w:num w:numId="38" w16cid:durableId="1273244240">
-    <w:abstractNumId w:val="37"/>
+    <w:abstractNumId w:val="41"/>
   </w:num>
   <w:num w:numId="39" w16cid:durableId="1302419245">
-    <w:abstractNumId w:val="47"/>
+    <w:abstractNumId w:val="51"/>
   </w:num>
   <w:num w:numId="40" w16cid:durableId="671757144">
     <w:abstractNumId w:val="6"/>
   </w:num>
   <w:num w:numId="41" w16cid:durableId="1609465245">
-    <w:abstractNumId w:val="30"/>
+    <w:abstractNumId w:val="33"/>
   </w:num>
   <w:num w:numId="42" w16cid:durableId="1924870052">
-    <w:abstractNumId w:val="40"/>
+    <w:abstractNumId w:val="44"/>
   </w:num>
   <w:num w:numId="43" w16cid:durableId="1546983496">
     <w:abstractNumId w:val="1"/>
   </w:num>
   <w:num w:numId="44" w16cid:durableId="1243755491">
-    <w:abstractNumId w:val="24"/>
+    <w:abstractNumId w:val="27"/>
   </w:num>
   <w:num w:numId="45" w16cid:durableId="2112815720">
-    <w:abstractNumId w:val="38"/>
+    <w:abstractNumId w:val="42"/>
   </w:num>
   <w:num w:numId="46" w16cid:durableId="495389479">
-    <w:abstractNumId w:val="53"/>
+    <w:abstractNumId w:val="58"/>
   </w:num>
   <w:num w:numId="47" w16cid:durableId="1000545877">
-    <w:abstractNumId w:val="32"/>
+    <w:abstractNumId w:val="36"/>
   </w:num>
   <w:num w:numId="48" w16cid:durableId="853347394">
     <w:abstractNumId w:val="0"/>
   </w:num>
   <w:num w:numId="49" w16cid:durableId="1105929742">
-    <w:abstractNumId w:val="14"/>
+    <w:abstractNumId w:val="15"/>
   </w:num>
   <w:num w:numId="50" w16cid:durableId="7145556">
-    <w:abstractNumId w:val="26"/>
+    <w:abstractNumId w:val="29"/>
   </w:num>
   <w:num w:numId="51" w16cid:durableId="271405964">
-    <w:abstractNumId w:val="35"/>
+    <w:abstractNumId w:val="39"/>
   </w:num>
   <w:num w:numId="52" w16cid:durableId="1874154734">
-    <w:abstractNumId w:val="36"/>
+    <w:abstractNumId w:val="40"/>
   </w:num>
   <w:num w:numId="53" w16cid:durableId="791943569">
-    <w:abstractNumId w:val="25"/>
+    <w:abstractNumId w:val="28"/>
   </w:num>
   <w:num w:numId="54" w16cid:durableId="1422987211">
     <w:abstractNumId w:val="8"/>
   </w:num>
   <w:num w:numId="55" w16cid:durableId="2036425246">
-    <w:abstractNumId w:val="49"/>
+    <w:abstractNumId w:val="53"/>
   </w:num>
   <w:num w:numId="56" w16cid:durableId="305286039">
-    <w:abstractNumId w:val="20"/>
+    <w:abstractNumId w:val="22"/>
   </w:num>
   <w:num w:numId="57" w16cid:durableId="696470528">
-    <w:abstractNumId w:val="43"/>
+    <w:abstractNumId w:val="47"/>
   </w:num>
   <w:num w:numId="58" w16cid:durableId="83573097">
-    <w:abstractNumId w:val="17"/>
+    <w:abstractNumId w:val="19"/>
   </w:num>
   <w:num w:numId="59" w16cid:durableId="530073107">
     <w:abstractNumId w:val="4"/>
   </w:num>
   <w:num w:numId="60" w16cid:durableId="886841764">
-    <w:abstractNumId w:val="31"/>
+    <w:abstractNumId w:val="34"/>
   </w:num>
   <w:num w:numId="61" w16cid:durableId="415060573">
-    <w:abstractNumId w:val="51"/>
+    <w:abstractNumId w:val="55"/>
   </w:num>
   <w:num w:numId="62" w16cid:durableId="1749376288">
-    <w:abstractNumId w:val="42"/>
+    <w:abstractNumId w:val="46"/>
   </w:num>
   <w:num w:numId="63" w16cid:durableId="1277054457">
-    <w:abstractNumId w:val="16"/>
+    <w:abstractNumId w:val="18"/>
   </w:num>
   <w:num w:numId="64" w16cid:durableId="415248735">
-    <w:abstractNumId w:val="29"/>
+    <w:abstractNumId w:val="32"/>
   </w:num>
   <w:num w:numId="65" w16cid:durableId="1785494309">
     <w:abstractNumId w:val="3"/>
@@ -22499,13 +25130,31 @@
     <w:abstractNumId w:val="9"/>
   </w:num>
   <w:num w:numId="67" w16cid:durableId="1652054133">
-    <w:abstractNumId w:val="28"/>
+    <w:abstractNumId w:val="31"/>
   </w:num>
   <w:num w:numId="68" w16cid:durableId="1083182566">
+    <w:abstractNumId w:val="14"/>
+  </w:num>
+  <w:num w:numId="69" w16cid:durableId="1571232664">
+    <w:abstractNumId w:val="43"/>
+  </w:num>
+  <w:num w:numId="70" w16cid:durableId="1413817063">
+    <w:abstractNumId w:val="24"/>
+  </w:num>
+  <w:num w:numId="71" w16cid:durableId="1411464272">
+    <w:abstractNumId w:val="59"/>
+  </w:num>
+  <w:num w:numId="72" w16cid:durableId="949901106">
+    <w:abstractNumId w:val="57"/>
+  </w:num>
+  <w:num w:numId="73" w16cid:durableId="765269677">
     <w:abstractNumId w:val="13"/>
   </w:num>
-  <w:num w:numId="69" w16cid:durableId="1571232664">
-    <w:abstractNumId w:val="39"/>
+  <w:num w:numId="74" w16cid:durableId="594284264">
+    <w:abstractNumId w:val="16"/>
+  </w:num>
+  <w:num w:numId="75" w16cid:durableId="2092658830">
+    <w:abstractNumId w:val="35"/>
   </w:num>
   <w:numIdMacAtCleanup w:val="15"/>
 </w:numbering>
@@ -22903,7 +25552,7 @@
   <w:style w:type="paragraph" w:default="1" w:styleId="Normal">
     <w:name w:val="Normal"/>
     <w:qFormat/>
-    <w:rsid w:val="00773375"/>
+    <w:rsid w:val="00523588"/>
     <w:pPr>
       <w:spacing w:line="360" w:lineRule="auto"/>
       <w:jc w:val="both"/>
@@ -24314,6 +26963,21 @@
       <w:color w:val="666666"/>
     </w:rPr>
   </w:style>
+  <w:style w:type="paragraph" w:styleId="NoSpacing">
+    <w:name w:val="No Spacing"/>
+    <w:uiPriority w:val="1"/>
+    <w:qFormat/>
+    <w:rsid w:val="00E36F8A"/>
+    <w:pPr>
+      <w:jc w:val="both"/>
+    </w:pPr>
+    <w:rPr>
+      <w:rFonts w:ascii="Calibri" w:hAnsi="Calibri" w:cs="Arial"/>
+      <w:sz w:val="24"/>
+      <w:szCs w:val="22"/>
+      <w:lang w:eastAsia="en-US"/>
+    </w:rPr>
+  </w:style>
 </w:styles>
 </file>
 

</xml_diff>

<commit_message>
feat: finish model learning section
</commit_message>
<xml_diff>
--- a/docs/thesis/magistrsko-delo-jasa-zupancic.docx
+++ b/docs/thesis/magistrsko-delo-jasa-zupancic.docx
@@ -5229,51 +5229,25 @@
       <w:r>
         <w:t xml:space="preserve">Slika </w:t>
       </w:r>
-      <w:r>
-        <w:fldChar w:fldCharType="begin"/>
-      </w:r>
-      <w:r>
-        <w:instrText xml:space="preserve"> STYLEREF 1 \s </w:instrText>
-      </w:r>
-      <w:r>
-        <w:fldChar w:fldCharType="separate"/>
-      </w:r>
-      <w:r>
-        <w:rPr>
-          <w:noProof/>
-        </w:rPr>
-        <w:t>2</w:t>
-      </w:r>
-      <w:r>
-        <w:rPr>
-          <w:noProof/>
-        </w:rPr>
-        <w:fldChar w:fldCharType="end"/>
-      </w:r>
+      <w:fldSimple w:instr=" STYLEREF 1 \s ">
+        <w:r>
+          <w:rPr>
+            <w:noProof/>
+          </w:rPr>
+          <w:t>2</w:t>
+        </w:r>
+      </w:fldSimple>
       <w:r>
         <w:t>.</w:t>
       </w:r>
-      <w:r>
-        <w:fldChar w:fldCharType="begin"/>
-      </w:r>
-      <w:r>
-        <w:instrText xml:space="preserve"> SEQ Slika \* ARABIC \s 1 </w:instrText>
-      </w:r>
-      <w:r>
-        <w:fldChar w:fldCharType="separate"/>
-      </w:r>
-      <w:r>
-        <w:rPr>
-          <w:noProof/>
-        </w:rPr>
-        <w:t>1</w:t>
-      </w:r>
-      <w:r>
-        <w:rPr>
-          <w:noProof/>
-        </w:rPr>
-        <w:fldChar w:fldCharType="end"/>
-      </w:r>
+      <w:fldSimple w:instr=" SEQ Slika \* ARABIC \s 1 ">
+        <w:r>
+          <w:rPr>
+            <w:noProof/>
+          </w:rPr>
+          <w:t>1</w:t>
+        </w:r>
+      </w:fldSimple>
       <w:r>
         <w:t xml:space="preserve">: </w:t>
       </w:r>
@@ -6083,51 +6057,25 @@
       <w:r>
         <w:t xml:space="preserve">Slika </w:t>
       </w:r>
-      <w:r>
-        <w:fldChar w:fldCharType="begin"/>
-      </w:r>
-      <w:r>
-        <w:instrText xml:space="preserve"> STYLEREF 1 \s </w:instrText>
-      </w:r>
-      <w:r>
-        <w:fldChar w:fldCharType="separate"/>
-      </w:r>
-      <w:r>
-        <w:rPr>
-          <w:noProof/>
-        </w:rPr>
-        <w:t>2</w:t>
-      </w:r>
-      <w:r>
-        <w:rPr>
-          <w:noProof/>
-        </w:rPr>
-        <w:fldChar w:fldCharType="end"/>
-      </w:r>
+      <w:fldSimple w:instr=" STYLEREF 1 \s ">
+        <w:r>
+          <w:rPr>
+            <w:noProof/>
+          </w:rPr>
+          <w:t>2</w:t>
+        </w:r>
+      </w:fldSimple>
       <w:r>
         <w:t>.</w:t>
       </w:r>
-      <w:r>
-        <w:fldChar w:fldCharType="begin"/>
-      </w:r>
-      <w:r>
-        <w:instrText xml:space="preserve"> SEQ Slika \* ARABIC \s 1 </w:instrText>
-      </w:r>
-      <w:r>
-        <w:fldChar w:fldCharType="separate"/>
-      </w:r>
-      <w:r>
-        <w:rPr>
-          <w:noProof/>
-        </w:rPr>
-        <w:t>2</w:t>
-      </w:r>
-      <w:r>
-        <w:rPr>
-          <w:noProof/>
-        </w:rPr>
-        <w:fldChar w:fldCharType="end"/>
-      </w:r>
+      <w:fldSimple w:instr=" SEQ Slika \* ARABIC \s 1 ">
+        <w:r>
+          <w:rPr>
+            <w:noProof/>
+          </w:rPr>
+          <w:t>2</w:t>
+        </w:r>
+      </w:fldSimple>
       <w:r>
         <w:t>: Primer COCO-pose učne množice</w:t>
       </w:r>
@@ -6559,51 +6507,25 @@
       <w:r>
         <w:t xml:space="preserve">Slika </w:t>
       </w:r>
-      <w:r>
-        <w:fldChar w:fldCharType="begin"/>
-      </w:r>
-      <w:r>
-        <w:instrText xml:space="preserve"> STYLEREF 1 \s </w:instrText>
-      </w:r>
-      <w:r>
-        <w:fldChar w:fldCharType="separate"/>
-      </w:r>
-      <w:r>
-        <w:rPr>
-          <w:noProof/>
-        </w:rPr>
-        <w:t>2</w:t>
-      </w:r>
-      <w:r>
-        <w:rPr>
-          <w:noProof/>
-        </w:rPr>
-        <w:fldChar w:fldCharType="end"/>
-      </w:r>
+      <w:fldSimple w:instr=" STYLEREF 1 \s ">
+        <w:r>
+          <w:rPr>
+            <w:noProof/>
+          </w:rPr>
+          <w:t>2</w:t>
+        </w:r>
+      </w:fldSimple>
       <w:r>
         <w:t>.</w:t>
       </w:r>
-      <w:r>
-        <w:fldChar w:fldCharType="begin"/>
-      </w:r>
-      <w:r>
-        <w:instrText xml:space="preserve"> SEQ Slika \* ARABIC \s 1 </w:instrText>
-      </w:r>
-      <w:r>
-        <w:fldChar w:fldCharType="separate"/>
-      </w:r>
-      <w:r>
-        <w:rPr>
-          <w:noProof/>
-        </w:rPr>
-        <w:t>3</w:t>
-      </w:r>
-      <w:r>
-        <w:rPr>
-          <w:noProof/>
-        </w:rPr>
-        <w:fldChar w:fldCharType="end"/>
-      </w:r>
+      <w:fldSimple w:instr=" SEQ Slika \* ARABIC \s 1 ">
+        <w:r>
+          <w:rPr>
+            <w:noProof/>
+          </w:rPr>
+          <w:t>3</w:t>
+        </w:r>
+      </w:fldSimple>
       <w:r>
         <w:t xml:space="preserve">: </w:t>
       </w:r>
@@ -8643,27 +8565,14 @@
       <w:r>
         <w:t xml:space="preserve">Tabela </w:t>
       </w:r>
-      <w:r>
-        <w:fldChar w:fldCharType="begin"/>
-      </w:r>
-      <w:r>
-        <w:instrText xml:space="preserve"> SEQ Tabela \* ARABIC </w:instrText>
-      </w:r>
-      <w:r>
-        <w:fldChar w:fldCharType="separate"/>
-      </w:r>
-      <w:r>
-        <w:rPr>
-          <w:noProof/>
-        </w:rPr>
-        <w:t>1</w:t>
-      </w:r>
-      <w:r>
-        <w:rPr>
-          <w:noProof/>
-        </w:rPr>
-        <w:fldChar w:fldCharType="end"/>
-      </w:r>
+      <w:fldSimple w:instr=" SEQ Tabela \* ARABIC ">
+        <w:r>
+          <w:rPr>
+            <w:noProof/>
+          </w:rPr>
+          <w:t>1</w:t>
+        </w:r>
+      </w:fldSimple>
       <w:r>
         <w:t xml:space="preserve">: </w:t>
       </w:r>
@@ -8952,27 +8861,14 @@
       <w:r>
         <w:t xml:space="preserve">Tabela </w:t>
       </w:r>
-      <w:r>
-        <w:fldChar w:fldCharType="begin"/>
-      </w:r>
-      <w:r>
-        <w:instrText xml:space="preserve"> SEQ Tabela \* ARABIC </w:instrText>
-      </w:r>
-      <w:r>
-        <w:fldChar w:fldCharType="separate"/>
-      </w:r>
-      <w:r>
-        <w:rPr>
-          <w:noProof/>
-        </w:rPr>
-        <w:t>2</w:t>
-      </w:r>
-      <w:r>
-        <w:rPr>
-          <w:noProof/>
-        </w:rPr>
-        <w:fldChar w:fldCharType="end"/>
-      </w:r>
+      <w:fldSimple w:instr=" SEQ Tabela \* ARABIC ">
+        <w:r>
+          <w:rPr>
+            <w:noProof/>
+          </w:rPr>
+          <w:t>2</w:t>
+        </w:r>
+      </w:fldSimple>
       <w:r>
         <w:t xml:space="preserve">: </w:t>
       </w:r>
@@ -10284,27 +10180,14 @@
       <w:r>
         <w:t xml:space="preserve">Tabela </w:t>
       </w:r>
-      <w:r>
-        <w:fldChar w:fldCharType="begin"/>
-      </w:r>
-      <w:r>
-        <w:instrText xml:space="preserve"> SEQ Tabela \* ARABIC </w:instrText>
-      </w:r>
-      <w:r>
-        <w:fldChar w:fldCharType="separate"/>
-      </w:r>
-      <w:r>
-        <w:rPr>
-          <w:noProof/>
-        </w:rPr>
-        <w:t>3</w:t>
-      </w:r>
-      <w:r>
-        <w:rPr>
-          <w:noProof/>
-        </w:rPr>
-        <w:fldChar w:fldCharType="end"/>
-      </w:r>
+      <w:fldSimple w:instr=" SEQ Tabela \* ARABIC ">
+        <w:r>
+          <w:rPr>
+            <w:noProof/>
+          </w:rPr>
+          <w:t>3</w:t>
+        </w:r>
+      </w:fldSimple>
       <w:r>
         <w:t xml:space="preserve">: Primerjava povprečnega FPS-a </w:t>
       </w:r>
@@ -11048,27 +10931,14 @@
       <w:r>
         <w:t xml:space="preserve">Enačba </w:t>
       </w:r>
-      <w:r>
-        <w:fldChar w:fldCharType="begin"/>
-      </w:r>
-      <w:r>
-        <w:instrText xml:space="preserve"> SEQ Enačba \* ARABIC </w:instrText>
-      </w:r>
-      <w:r>
-        <w:fldChar w:fldCharType="separate"/>
-      </w:r>
-      <w:r>
-        <w:rPr>
-          <w:noProof/>
-        </w:rPr>
-        <w:t>1</w:t>
-      </w:r>
-      <w:r>
-        <w:rPr>
-          <w:noProof/>
-        </w:rPr>
-        <w:fldChar w:fldCharType="end"/>
-      </w:r>
+      <w:fldSimple w:instr=" SEQ Enačba \* ARABIC ">
+        <w:r>
+          <w:rPr>
+            <w:noProof/>
+          </w:rPr>
+          <w:t>1</w:t>
+        </w:r>
+      </w:fldSimple>
       <w:r>
         <w:t>: Napaka med referenčno in napovedano sklepno točko</w:t>
       </w:r>
@@ -11457,27 +11327,14 @@
       <w:r>
         <w:t xml:space="preserve">Enačba </w:t>
       </w:r>
-      <w:r>
-        <w:fldChar w:fldCharType="begin"/>
-      </w:r>
-      <w:r>
-        <w:instrText xml:space="preserve"> SEQ Enačba \* ARABIC </w:instrText>
-      </w:r>
-      <w:r>
-        <w:fldChar w:fldCharType="separate"/>
-      </w:r>
-      <w:r>
-        <w:rPr>
-          <w:noProof/>
-        </w:rPr>
-        <w:t>2</w:t>
-      </w:r>
-      <w:r>
-        <w:rPr>
-          <w:noProof/>
-        </w:rPr>
-        <w:fldChar w:fldCharType="end"/>
-      </w:r>
+      <w:fldSimple w:instr=" SEQ Enačba \* ARABIC ">
+        <w:r>
+          <w:rPr>
+            <w:noProof/>
+          </w:rPr>
+          <w:t>2</w:t>
+        </w:r>
+      </w:fldSimple>
       <w:r>
         <w:t>: MPJPE</w:t>
       </w:r>
@@ -11834,27 +11691,14 @@
       <w:r>
         <w:t xml:space="preserve">Slika </w:t>
       </w:r>
-      <w:r>
-        <w:fldChar w:fldCharType="begin"/>
-      </w:r>
-      <w:r>
-        <w:instrText xml:space="preserve"> SEQ Slika \* ARABIC </w:instrText>
-      </w:r>
-      <w:r>
-        <w:fldChar w:fldCharType="separate"/>
-      </w:r>
-      <w:r>
-        <w:rPr>
-          <w:noProof/>
-        </w:rPr>
-        <w:t>4</w:t>
-      </w:r>
-      <w:r>
-        <w:rPr>
-          <w:noProof/>
-        </w:rPr>
-        <w:fldChar w:fldCharType="end"/>
-      </w:r>
+      <w:fldSimple w:instr=" SEQ Slika \* ARABIC ">
+        <w:r>
+          <w:rPr>
+            <w:noProof/>
+          </w:rPr>
+          <w:t>4</w:t>
+        </w:r>
+      </w:fldSimple>
       <w:r>
         <w:t>: Rezultati MPJPE nad izbranimi modeli</w:t>
       </w:r>
@@ -11996,27 +11840,14 @@
       <w:r>
         <w:t xml:space="preserve">Enačba </w:t>
       </w:r>
-      <w:r>
-        <w:fldChar w:fldCharType="begin"/>
-      </w:r>
-      <w:r>
-        <w:instrText xml:space="preserve"> SEQ Enačba \* ARABIC </w:instrText>
-      </w:r>
-      <w:r>
-        <w:fldChar w:fldCharType="separate"/>
-      </w:r>
-      <w:r>
-        <w:rPr>
-          <w:noProof/>
-        </w:rPr>
-        <w:t>3</w:t>
-      </w:r>
-      <w:r>
-        <w:rPr>
-          <w:noProof/>
-        </w:rPr>
-        <w:fldChar w:fldCharType="end"/>
-      </w:r>
+      <w:fldSimple w:instr=" SEQ Enačba \* ARABIC ">
+        <w:r>
+          <w:rPr>
+            <w:noProof/>
+          </w:rPr>
+          <w:t>3</w:t>
+        </w:r>
+      </w:fldSimple>
       <w:r>
         <w:t>: Pravilnost sklepne točke za metriko PCK</w:t>
       </w:r>
@@ -12232,27 +12063,14 @@
       <w:r>
         <w:t xml:space="preserve">Enačba </w:t>
       </w:r>
-      <w:r>
-        <w:fldChar w:fldCharType="begin"/>
-      </w:r>
-      <w:r>
-        <w:instrText xml:space="preserve"> SEQ Enačba \* ARABIC </w:instrText>
-      </w:r>
-      <w:r>
-        <w:fldChar w:fldCharType="separate"/>
-      </w:r>
-      <w:r>
-        <w:rPr>
-          <w:noProof/>
-        </w:rPr>
-        <w:t>4</w:t>
-      </w:r>
-      <w:r>
-        <w:rPr>
-          <w:noProof/>
-        </w:rPr>
-        <w:fldChar w:fldCharType="end"/>
-      </w:r>
+      <w:fldSimple w:instr=" SEQ Enačba \* ARABIC ">
+        <w:r>
+          <w:rPr>
+            <w:noProof/>
+          </w:rPr>
+          <w:t>4</w:t>
+        </w:r>
+      </w:fldSimple>
       <w:r>
         <w:t>: Definicija PCK</w:t>
       </w:r>
@@ -12575,27 +12393,14 @@
       <w:r>
         <w:t xml:space="preserve">Slika </w:t>
       </w:r>
-      <w:r>
-        <w:fldChar w:fldCharType="begin"/>
-      </w:r>
-      <w:r>
-        <w:instrText xml:space="preserve"> SEQ Slika \* ARABIC </w:instrText>
-      </w:r>
-      <w:r>
-        <w:fldChar w:fldCharType="separate"/>
-      </w:r>
-      <w:r>
-        <w:rPr>
-          <w:noProof/>
-        </w:rPr>
-        <w:t>5</w:t>
-      </w:r>
-      <w:r>
-        <w:rPr>
-          <w:noProof/>
-        </w:rPr>
-        <w:fldChar w:fldCharType="end"/>
-      </w:r>
+      <w:fldSimple w:instr=" SEQ Slika \* ARABIC ">
+        <w:r>
+          <w:rPr>
+            <w:noProof/>
+          </w:rPr>
+          <w:t>5</w:t>
+        </w:r>
+      </w:fldSimple>
       <w:r>
         <w:t xml:space="preserve">: Rezultati </w:t>
       </w:r>
@@ -12661,27 +12466,14 @@
       <w:r>
         <w:t xml:space="preserve">Slika </w:t>
       </w:r>
-      <w:r>
-        <w:fldChar w:fldCharType="begin"/>
-      </w:r>
-      <w:r>
-        <w:instrText xml:space="preserve"> SEQ Slika \* ARABIC </w:instrText>
-      </w:r>
-      <w:r>
-        <w:fldChar w:fldCharType="separate"/>
-      </w:r>
-      <w:r>
-        <w:rPr>
-          <w:noProof/>
-        </w:rPr>
-        <w:t>6</w:t>
-      </w:r>
-      <w:r>
-        <w:rPr>
-          <w:noProof/>
-        </w:rPr>
-        <w:fldChar w:fldCharType="end"/>
-      </w:r>
+      <w:fldSimple w:instr=" SEQ Slika \* ARABIC ">
+        <w:r>
+          <w:rPr>
+            <w:noProof/>
+          </w:rPr>
+          <w:t>6</w:t>
+        </w:r>
+      </w:fldSimple>
       <w:r>
         <w:t>: Rezultati metrike PCK pri pragu 0.02</w:t>
       </w:r>
@@ -12740,27 +12532,14 @@
       <w:r>
         <w:t xml:space="preserve">Slika </w:t>
       </w:r>
-      <w:r>
-        <w:fldChar w:fldCharType="begin"/>
-      </w:r>
-      <w:r>
-        <w:instrText xml:space="preserve"> SEQ Slika \* ARABIC </w:instrText>
-      </w:r>
-      <w:r>
-        <w:fldChar w:fldCharType="separate"/>
-      </w:r>
-      <w:r>
-        <w:rPr>
-          <w:noProof/>
-        </w:rPr>
-        <w:t>7</w:t>
-      </w:r>
-      <w:r>
-        <w:rPr>
-          <w:noProof/>
-        </w:rPr>
-        <w:fldChar w:fldCharType="end"/>
-      </w:r>
+      <w:fldSimple w:instr=" SEQ Slika \* ARABIC ">
+        <w:r>
+          <w:rPr>
+            <w:noProof/>
+          </w:rPr>
+          <w:t>7</w:t>
+        </w:r>
+      </w:fldSimple>
       <w:r>
         <w:t xml:space="preserve">: </w:t>
       </w:r>
@@ -13030,27 +12809,14 @@
       <w:r>
         <w:t xml:space="preserve">Slika </w:t>
       </w:r>
-      <w:r>
-        <w:fldChar w:fldCharType="begin"/>
-      </w:r>
-      <w:r>
-        <w:instrText xml:space="preserve"> SEQ Slika \* ARABIC </w:instrText>
-      </w:r>
-      <w:r>
-        <w:fldChar w:fldCharType="separate"/>
-      </w:r>
-      <w:r>
-        <w:rPr>
-          <w:noProof/>
-        </w:rPr>
-        <w:t>8</w:t>
-      </w:r>
-      <w:r>
-        <w:rPr>
-          <w:noProof/>
-        </w:rPr>
-        <w:fldChar w:fldCharType="end"/>
-      </w:r>
+      <w:fldSimple w:instr=" SEQ Slika \* ARABIC ">
+        <w:r>
+          <w:rPr>
+            <w:noProof/>
+          </w:rPr>
+          <w:t>8</w:t>
+        </w:r>
+      </w:fldSimple>
       <w:r>
         <w:t xml:space="preserve">: Primerjava med napovedmi sklepnih točk za model </w:t>
       </w:r>
@@ -13128,27 +12894,14 @@
       <w:r>
         <w:t xml:space="preserve">Slika </w:t>
       </w:r>
-      <w:r>
-        <w:fldChar w:fldCharType="begin"/>
-      </w:r>
-      <w:r>
-        <w:instrText xml:space="preserve"> SEQ Slika \* ARABIC </w:instrText>
-      </w:r>
-      <w:r>
-        <w:fldChar w:fldCharType="separate"/>
-      </w:r>
-      <w:r>
-        <w:rPr>
-          <w:noProof/>
-        </w:rPr>
-        <w:t>9</w:t>
-      </w:r>
-      <w:r>
-        <w:rPr>
-          <w:noProof/>
-        </w:rPr>
-        <w:fldChar w:fldCharType="end"/>
-      </w:r>
+      <w:fldSimple w:instr=" SEQ Slika \* ARABIC ">
+        <w:r>
+          <w:rPr>
+            <w:noProof/>
+          </w:rPr>
+          <w:t>9</w:t>
+        </w:r>
+      </w:fldSimple>
       <w:r>
         <w:t xml:space="preserve">: </w:t>
       </w:r>
@@ -13694,6 +13447,9 @@
         <w:pStyle w:val="Images"/>
       </w:pPr>
       <w:r>
+        <w:rPr>
+          <w:noProof/>
+        </w:rPr>
         <w:drawing>
           <wp:inline distT="0" distB="0" distL="0" distR="0" wp14:anchorId="100F35AD" wp14:editId="61203F43">
             <wp:extent cx="5396230" cy="2677795"/>
@@ -13738,24 +13494,14 @@
       <w:r>
         <w:t xml:space="preserve">Slika </w:t>
       </w:r>
-      <w:r>
-        <w:fldChar w:fldCharType="begin"/>
-      </w:r>
-      <w:r>
-        <w:instrText xml:space="preserve"> SEQ Slika \* ARABIC </w:instrText>
-      </w:r>
-      <w:r>
-        <w:fldChar w:fldCharType="separate"/>
-      </w:r>
-      <w:r>
-        <w:rPr>
-          <w:noProof/>
-        </w:rPr>
-        <w:t>10</w:t>
-      </w:r>
-      <w:r>
-        <w:fldChar w:fldCharType="end"/>
-      </w:r>
+      <w:fldSimple w:instr=" SEQ Slika \* ARABIC ">
+        <w:r>
+          <w:rPr>
+            <w:noProof/>
+          </w:rPr>
+          <w:t>10</w:t>
+        </w:r>
+      </w:fldSimple>
       <w:r>
         <w:t>: Histogram zastopanosti vaj v učni množici</w:t>
       </w:r>
@@ -13793,6 +13539,9 @@
         <w:pStyle w:val="Images"/>
       </w:pPr>
       <w:r>
+        <w:rPr>
+          <w:noProof/>
+        </w:rPr>
         <w:lastRenderedPageBreak/>
         <w:drawing>
           <wp:inline distT="0" distB="0" distL="0" distR="0" wp14:anchorId="61C0C3E1" wp14:editId="13C3024A">
@@ -13838,24 +13587,14 @@
       <w:r>
         <w:t xml:space="preserve">Slika </w:t>
       </w:r>
-      <w:r>
-        <w:fldChar w:fldCharType="begin"/>
-      </w:r>
-      <w:r>
-        <w:instrText xml:space="preserve"> SEQ Slika \* ARABIC </w:instrText>
-      </w:r>
-      <w:r>
-        <w:fldChar w:fldCharType="separate"/>
-      </w:r>
-      <w:r>
-        <w:rPr>
-          <w:noProof/>
-        </w:rPr>
-        <w:t>11</w:t>
-      </w:r>
-      <w:r>
-        <w:fldChar w:fldCharType="end"/>
-      </w:r>
+      <w:fldSimple w:instr=" SEQ Slika \* ARABIC ">
+        <w:r>
+          <w:rPr>
+            <w:noProof/>
+          </w:rPr>
+          <w:t>11</w:t>
+        </w:r>
+      </w:fldSimple>
       <w:r>
         <w:t xml:space="preserve">: Histogram zastopanosti </w:t>
       </w:r>
@@ -14085,24 +13824,14 @@
             <w:r>
               <w:t xml:space="preserve">Slika </w:t>
             </w:r>
-            <w:r>
-              <w:fldChar w:fldCharType="begin"/>
-            </w:r>
-            <w:r>
-              <w:instrText xml:space="preserve"> SEQ Slika \* ARABIC </w:instrText>
-            </w:r>
-            <w:r>
-              <w:fldChar w:fldCharType="separate"/>
-            </w:r>
-            <w:r>
-              <w:rPr>
-                <w:noProof/>
-              </w:rPr>
-              <w:t>13</w:t>
-            </w:r>
-            <w:r>
-              <w:fldChar w:fldCharType="end"/>
-            </w:r>
+            <w:fldSimple w:instr=" SEQ Slika \* ARABIC ">
+              <w:r>
+                <w:rPr>
+                  <w:noProof/>
+                </w:rPr>
+                <w:t>13</w:t>
+              </w:r>
+            </w:fldSimple>
             <w:r>
               <w:t>: Primer iz učne množice: biceps pregib s palico</w:t>
             </w:r>
@@ -14210,24 +13939,14 @@
             <w:r>
               <w:t xml:space="preserve">Slika </w:t>
             </w:r>
-            <w:r>
-              <w:fldChar w:fldCharType="begin"/>
-            </w:r>
-            <w:r>
-              <w:instrText xml:space="preserve"> SEQ Slika \* ARABIC </w:instrText>
-            </w:r>
-            <w:r>
-              <w:fldChar w:fldCharType="separate"/>
-            </w:r>
-            <w:r>
-              <w:rPr>
-                <w:noProof/>
-              </w:rPr>
-              <w:t>14</w:t>
-            </w:r>
-            <w:r>
-              <w:fldChar w:fldCharType="end"/>
-            </w:r>
+            <w:fldSimple w:instr=" SEQ Slika \* ARABIC ">
+              <w:r>
+                <w:rPr>
+                  <w:noProof/>
+                </w:rPr>
+                <w:t>14</w:t>
+              </w:r>
+            </w:fldSimple>
             <w:r>
               <w:t>: Primer iz učne množice: veslanje v predklonu s palico</w:t>
             </w:r>
@@ -14306,24 +14025,14 @@
             <w:r>
               <w:t xml:space="preserve">Slika </w:t>
             </w:r>
-            <w:r>
-              <w:fldChar w:fldCharType="begin"/>
-            </w:r>
-            <w:r>
-              <w:instrText xml:space="preserve"> SEQ Slika \* ARABIC </w:instrText>
-            </w:r>
-            <w:r>
-              <w:fldChar w:fldCharType="separate"/>
-            </w:r>
-            <w:r>
-              <w:rPr>
-                <w:noProof/>
-              </w:rPr>
-              <w:t>15</w:t>
-            </w:r>
-            <w:r>
-              <w:fldChar w:fldCharType="end"/>
-            </w:r>
+            <w:fldSimple w:instr=" SEQ Slika \* ARABIC ">
+              <w:r>
+                <w:rPr>
+                  <w:noProof/>
+                </w:rPr>
+                <w:t>15</w:t>
+              </w:r>
+            </w:fldSimple>
             <w:r>
               <w:t>: Primer iz učne množice: potisk z ročkami na poševni klopi</w:t>
             </w:r>
@@ -14427,24 +14136,14 @@
             <w:r>
               <w:t xml:space="preserve">Slika </w:t>
             </w:r>
-            <w:r>
-              <w:fldChar w:fldCharType="begin"/>
-            </w:r>
-            <w:r>
-              <w:instrText xml:space="preserve"> SEQ Slika \* ARABIC </w:instrText>
-            </w:r>
-            <w:r>
-              <w:fldChar w:fldCharType="separate"/>
-            </w:r>
-            <w:r>
-              <w:rPr>
-                <w:noProof/>
-              </w:rPr>
-              <w:t>16</w:t>
-            </w:r>
-            <w:r>
-              <w:fldChar w:fldCharType="end"/>
-            </w:r>
+            <w:fldSimple w:instr=" SEQ Slika \* ARABIC ">
+              <w:r>
+                <w:rPr>
+                  <w:noProof/>
+                </w:rPr>
+                <w:t>16</w:t>
+              </w:r>
+            </w:fldSimple>
             <w:r>
               <w:t>: Primer iz učne množice: biceps pregib na Scott klopi</w:t>
             </w:r>
@@ -14461,6 +14160,7 @@
             </w:pPr>
             <w:r>
               <w:rPr>
+                <w:noProof/>
                 <w:lang w:val="en-SI"/>
               </w:rPr>
               <w:drawing>
@@ -14523,24 +14223,14 @@
             <w:r>
               <w:t xml:space="preserve">Slika </w:t>
             </w:r>
-            <w:r>
-              <w:fldChar w:fldCharType="begin"/>
-            </w:r>
-            <w:r>
-              <w:instrText xml:space="preserve"> SEQ Slika \* ARABIC </w:instrText>
-            </w:r>
-            <w:r>
-              <w:fldChar w:fldCharType="separate"/>
-            </w:r>
-            <w:r>
-              <w:rPr>
-                <w:noProof/>
-              </w:rPr>
-              <w:t>17</w:t>
-            </w:r>
-            <w:r>
-              <w:fldChar w:fldCharType="end"/>
-            </w:r>
+            <w:fldSimple w:instr=" SEQ Slika \* ARABIC ">
+              <w:r>
+                <w:rPr>
+                  <w:noProof/>
+                </w:rPr>
+                <w:t>17</w:t>
+              </w:r>
+            </w:fldSimple>
             <w:r>
               <w:t>: Primer iz učne množice: izteg za triceps</w:t>
             </w:r>
@@ -14871,6 +14561,14 @@
       </w:r>
     </w:p>
     <w:p>
+      <w:pPr>
+        <w:pStyle w:val="Heading3"/>
+      </w:pPr>
+      <w:r>
+        <w:t>Priprava na učenje in nastavitve</w:t>
+      </w:r>
+    </w:p>
+    <w:p>
       <w:r>
         <w:t xml:space="preserve">Učenje je potekalo v okolju </w:t>
       </w:r>
@@ -14894,8 +14592,1302 @@
         <w:t>“</w:t>
       </w:r>
       <w:r>
+        <w:t xml:space="preserve"> in je bilo izvedeno kot prilagajanje pred-naučenega modela z začetnimi utežmi modela </w:t>
+      </w:r>
+      <w:r>
+        <w:t>“</w:t>
+      </w:r>
+      <w:r>
+        <w:t>yolo11n-pose_256.pt</w:t>
+      </w:r>
+      <w:r>
+        <w:t>“</w:t>
+      </w:r>
+      <w:r>
+        <w:t>, ki je bil uporabljen pri primerjavi modelov</w:t>
+      </w:r>
+      <w:r>
+        <w:t xml:space="preserve"> </w:t>
+      </w:r>
+      <w:r>
+        <w:t xml:space="preserve">v prejšnjih poglavjih. </w:t>
+      </w:r>
+      <w:r>
+        <w:t>Nastavitve učenja so slednje:</w:t>
+      </w:r>
+    </w:p>
+    <w:p>
+      <w:pPr>
+        <w:pStyle w:val="ListParagraph"/>
+        <w:numPr>
+          <w:ilvl w:val="0"/>
+          <w:numId w:val="76"/>
+        </w:numPr>
+      </w:pPr>
+      <w:r>
+        <w:t xml:space="preserve">Začetni model (pred-naučene uteži): </w:t>
+      </w:r>
+      <w:r>
+        <w:t>“</w:t>
+      </w:r>
+      <w:r>
+        <w:t>yolo11n-pose_256.pt</w:t>
+      </w:r>
+      <w:r>
+        <w:t>“</w:t>
+      </w:r>
+    </w:p>
+    <w:p>
+      <w:pPr>
+        <w:pStyle w:val="ListParagraph"/>
+        <w:numPr>
+          <w:ilvl w:val="0"/>
+          <w:numId w:val="76"/>
+        </w:numPr>
+      </w:pPr>
+      <w:r>
+        <w:t xml:space="preserve">Datoteka s konfiguracijo učenja: </w:t>
+      </w:r>
+      <w:r>
+        <w:t>“</w:t>
+      </w:r>
+      <w:proofErr w:type="spellStart"/>
+      <w:r>
+        <w:t>data.yaml</w:t>
+      </w:r>
+      <w:proofErr w:type="spellEnd"/>
+      <w:r>
+        <w:t>“</w:t>
+      </w:r>
+      <w:r>
+        <w:t>, opisana v prejšnjem poglavju</w:t>
+      </w:r>
+    </w:p>
+    <w:p>
+      <w:pPr>
+        <w:pStyle w:val="ListParagraph"/>
+        <w:numPr>
+          <w:ilvl w:val="0"/>
+          <w:numId w:val="76"/>
+        </w:numPr>
+      </w:pPr>
+      <w:r>
+        <w:t>Velikost vhodnih slik: 256 – pomeni, da so vsi vhodni primeri bili med učenjem preoblikovani na ločljivost 256x256</w:t>
+      </w:r>
+    </w:p>
+    <w:p>
+      <w:pPr>
+        <w:pStyle w:val="ListParagraph"/>
+        <w:numPr>
+          <w:ilvl w:val="0"/>
+          <w:numId w:val="76"/>
+        </w:numPr>
+      </w:pPr>
+      <w:r>
+        <w:t>Število epoh: 200</w:t>
+      </w:r>
+    </w:p>
+    <w:p>
+      <w:pPr>
+        <w:pStyle w:val="ListParagraph"/>
+        <w:numPr>
+          <w:ilvl w:val="0"/>
+          <w:numId w:val="76"/>
+        </w:numPr>
+      </w:pPr>
+      <w:r>
+        <w:t>Naprava za učenje: grafična kartica</w:t>
+      </w:r>
+    </w:p>
+    <w:p/>
+    <w:p>
+      <w:pPr>
+        <w:pStyle w:val="Heading3"/>
+      </w:pPr>
+      <w:r>
+        <w:t>Metrike in izgube učenja</w:t>
+      </w:r>
+    </w:p>
+    <w:p>
+      <w:r>
+        <w:t xml:space="preserve">Pri učenju modela YOLO11n-pose z uporabo knjižnice </w:t>
+      </w:r>
+      <w:r>
+        <w:t>“</w:t>
+      </w:r>
+      <w:proofErr w:type="spellStart"/>
+      <w:r>
+        <w:t>ultralytics</w:t>
+      </w:r>
+      <w:proofErr w:type="spellEnd"/>
+      <w:r>
+        <w:t>“</w:t>
+      </w:r>
+      <w:r>
+        <w:t xml:space="preserve"> se pri vsaki epohi izpisujejo podatki o izgubah in metrikah. Izgube delimo na izgube na podatkih za učenje in na izgube na podatkih za validacijo.</w:t>
+      </w:r>
+      <w:r>
+        <w:t xml:space="preserve"> Izgube na učnih podatkih so naslednje:</w:t>
+      </w:r>
+    </w:p>
+    <w:p>
+      <w:pPr>
+        <w:pStyle w:val="ListParagraph"/>
+        <w:numPr>
+          <w:ilvl w:val="0"/>
+          <w:numId w:val="77"/>
+        </w:numPr>
+      </w:pPr>
+      <w:proofErr w:type="spellStart"/>
+      <w:r>
+        <w:t>train</w:t>
+      </w:r>
+      <w:proofErr w:type="spellEnd"/>
+      <w:r>
+        <w:t>/</w:t>
+      </w:r>
+      <w:proofErr w:type="spellStart"/>
+      <w:r>
+        <w:t>box_loss</w:t>
+      </w:r>
+      <w:proofErr w:type="spellEnd"/>
+      <w:r>
+        <w:t xml:space="preserve"> – izguba za omejitveni pravokotnik (</w:t>
+      </w:r>
+      <w:r>
+        <w:t>“</w:t>
+      </w:r>
+      <w:proofErr w:type="spellStart"/>
+      <w:r>
+        <w:t>bounding</w:t>
+      </w:r>
+      <w:proofErr w:type="spellEnd"/>
+      <w:r>
+        <w:t xml:space="preserve"> </w:t>
+      </w:r>
+      <w:proofErr w:type="spellStart"/>
+      <w:r>
+        <w:t>box</w:t>
+      </w:r>
+      <w:proofErr w:type="spellEnd"/>
+      <w:r>
+        <w:t>“</w:t>
+      </w:r>
+      <w:r>
+        <w:t>) pri detekciji osebe.</w:t>
+      </w:r>
+    </w:p>
+    <w:p>
+      <w:pPr>
+        <w:pStyle w:val="ListParagraph"/>
+        <w:numPr>
+          <w:ilvl w:val="0"/>
+          <w:numId w:val="77"/>
+        </w:numPr>
+      </w:pPr>
+      <w:proofErr w:type="spellStart"/>
+      <w:r>
+        <w:t>train</w:t>
+      </w:r>
+      <w:proofErr w:type="spellEnd"/>
+      <w:r>
+        <w:t>/</w:t>
+      </w:r>
+      <w:proofErr w:type="spellStart"/>
+      <w:r>
+        <w:t>pose_loss</w:t>
+      </w:r>
+      <w:proofErr w:type="spellEnd"/>
+      <w:r>
+        <w:t xml:space="preserve"> – glavna izguba za sklepne točke, meri kako močno se napovedane sklepne točke razlikujejo od oznak</w:t>
+      </w:r>
+    </w:p>
+    <w:p>
+      <w:pPr>
+        <w:pStyle w:val="ListParagraph"/>
+        <w:numPr>
+          <w:ilvl w:val="0"/>
+          <w:numId w:val="77"/>
+        </w:numPr>
+      </w:pPr>
+      <w:proofErr w:type="spellStart"/>
+      <w:r>
+        <w:t>train</w:t>
+      </w:r>
+      <w:proofErr w:type="spellEnd"/>
+      <w:r>
+        <w:t>/</w:t>
+      </w:r>
+      <w:proofErr w:type="spellStart"/>
+      <w:r>
+        <w:t>cls_loss</w:t>
+      </w:r>
+      <w:proofErr w:type="spellEnd"/>
+      <w:r>
+        <w:t xml:space="preserve"> – izguba za klasifikacijo razreda. Pri učenju pose modelov je razred pogosto samo eden – oseba.</w:t>
+      </w:r>
+    </w:p>
+    <w:p>
+      <w:pPr>
+        <w:pStyle w:val="ListParagraph"/>
+        <w:numPr>
+          <w:ilvl w:val="0"/>
+          <w:numId w:val="77"/>
+        </w:numPr>
+      </w:pPr>
+      <w:proofErr w:type="spellStart"/>
+      <w:r>
+        <w:t>train</w:t>
+      </w:r>
+      <w:proofErr w:type="spellEnd"/>
+      <w:r>
+        <w:t>/</w:t>
+      </w:r>
+      <w:proofErr w:type="spellStart"/>
+      <w:r>
+        <w:t>dfl_loss</w:t>
+      </w:r>
+      <w:proofErr w:type="spellEnd"/>
+      <w:r>
+        <w:t xml:space="preserve"> – </w:t>
+      </w:r>
+      <w:r>
+        <w:t>služi natančnejši in podrobni zaznavi omejitvenega pravokotnika</w:t>
+      </w:r>
+      <w:r>
         <w:t>.</w:t>
       </w:r>
+    </w:p>
+    <w:p/>
+    <w:p>
+      <w:r>
+        <w:lastRenderedPageBreak/>
+        <w:t xml:space="preserve">Izgube na </w:t>
+      </w:r>
+      <w:proofErr w:type="spellStart"/>
+      <w:r>
+        <w:t>validacijskih</w:t>
+      </w:r>
+      <w:proofErr w:type="spellEnd"/>
+      <w:r>
+        <w:t xml:space="preserve"> podatkih imajo enak pomen kot izgube na učnih podatkih:</w:t>
+      </w:r>
+    </w:p>
+    <w:p>
+      <w:pPr>
+        <w:pStyle w:val="ListParagraph"/>
+        <w:numPr>
+          <w:ilvl w:val="0"/>
+          <w:numId w:val="78"/>
+        </w:numPr>
+      </w:pPr>
+      <w:r>
+        <w:t>val/</w:t>
+      </w:r>
+      <w:proofErr w:type="spellStart"/>
+      <w:r>
+        <w:t>box_loss</w:t>
+      </w:r>
+      <w:proofErr w:type="spellEnd"/>
+      <w:r>
+        <w:t>,</w:t>
+      </w:r>
+    </w:p>
+    <w:p>
+      <w:pPr>
+        <w:pStyle w:val="ListParagraph"/>
+        <w:numPr>
+          <w:ilvl w:val="0"/>
+          <w:numId w:val="78"/>
+        </w:numPr>
+      </w:pPr>
+      <w:r>
+        <w:t>val/</w:t>
+      </w:r>
+      <w:proofErr w:type="spellStart"/>
+      <w:r>
+        <w:t>pose_loss</w:t>
+      </w:r>
+      <w:proofErr w:type="spellEnd"/>
+      <w:r>
+        <w:t>,</w:t>
+      </w:r>
+    </w:p>
+    <w:p>
+      <w:pPr>
+        <w:pStyle w:val="ListParagraph"/>
+        <w:numPr>
+          <w:ilvl w:val="0"/>
+          <w:numId w:val="78"/>
+        </w:numPr>
+      </w:pPr>
+      <w:r>
+        <w:t>val/</w:t>
+      </w:r>
+      <w:proofErr w:type="spellStart"/>
+      <w:r>
+        <w:t>cls_loss</w:t>
+      </w:r>
+      <w:proofErr w:type="spellEnd"/>
+      <w:r>
+        <w:t>,</w:t>
+      </w:r>
+    </w:p>
+    <w:p>
+      <w:pPr>
+        <w:pStyle w:val="ListParagraph"/>
+        <w:numPr>
+          <w:ilvl w:val="0"/>
+          <w:numId w:val="78"/>
+        </w:numPr>
+      </w:pPr>
+      <w:r>
+        <w:t>val/</w:t>
+      </w:r>
+      <w:proofErr w:type="spellStart"/>
+      <w:r>
+        <w:t>dfl_loss</w:t>
+      </w:r>
+      <w:proofErr w:type="spellEnd"/>
+    </w:p>
+    <w:p/>
+    <w:p>
+      <w:r>
+        <w:t xml:space="preserve">Metrike učenja se uporabljajo le na </w:t>
+      </w:r>
+      <w:proofErr w:type="spellStart"/>
+      <w:r>
+        <w:t>validacijski</w:t>
+      </w:r>
+      <w:proofErr w:type="spellEnd"/>
+      <w:r>
+        <w:t xml:space="preserve"> množici in se delijo na dva sklopa – detekcija omejitvenih pravokotnikov (B) in detekcija sklepnih točk (P)</w:t>
+      </w:r>
+      <w:r>
+        <w:t>.</w:t>
+      </w:r>
+      <w:r>
+        <w:t xml:space="preserve"> Te metrike so naslednje:</w:t>
+      </w:r>
+    </w:p>
+    <w:p>
+      <w:pPr>
+        <w:pStyle w:val="ListParagraph"/>
+        <w:numPr>
+          <w:ilvl w:val="0"/>
+          <w:numId w:val="79"/>
+        </w:numPr>
+      </w:pPr>
+      <w:proofErr w:type="spellStart"/>
+      <w:r>
+        <w:t>metrics</w:t>
+      </w:r>
+      <w:proofErr w:type="spellEnd"/>
+      <w:r>
+        <w:t>/</w:t>
+      </w:r>
+      <w:proofErr w:type="spellStart"/>
+      <w:r>
+        <w:t>precision</w:t>
+      </w:r>
+      <w:proofErr w:type="spellEnd"/>
+      <w:r>
+        <w:t xml:space="preserve">(B) – natančnost detekcije oseb (med vsemi detekcijami </w:t>
+      </w:r>
+      <w:r>
+        <w:t xml:space="preserve">oseb </w:t>
+      </w:r>
+      <w:r>
+        <w:t>pove, koliko jih je pravilnih)</w:t>
+      </w:r>
+      <w:r>
+        <w:t>.</w:t>
+      </w:r>
+    </w:p>
+    <w:p>
+      <w:pPr>
+        <w:pStyle w:val="ListParagraph"/>
+        <w:numPr>
+          <w:ilvl w:val="0"/>
+          <w:numId w:val="79"/>
+        </w:numPr>
+      </w:pPr>
+      <w:proofErr w:type="spellStart"/>
+      <w:r>
+        <w:t>metrics</w:t>
+      </w:r>
+      <w:proofErr w:type="spellEnd"/>
+      <w:r>
+        <w:t>/</w:t>
+      </w:r>
+      <w:proofErr w:type="spellStart"/>
+      <w:r>
+        <w:t>recall</w:t>
+      </w:r>
+      <w:proofErr w:type="spellEnd"/>
+      <w:r>
+        <w:t>(B) – priklic (med vsemi pravimi osebami</w:t>
+      </w:r>
+      <w:r>
+        <w:t xml:space="preserve"> pove</w:t>
+      </w:r>
+      <w:r>
+        <w:t>, koliko jih je model našel)</w:t>
+      </w:r>
+      <w:r>
+        <w:t>.</w:t>
+      </w:r>
+    </w:p>
+    <w:p>
+      <w:pPr>
+        <w:pStyle w:val="ListParagraph"/>
+        <w:numPr>
+          <w:ilvl w:val="0"/>
+          <w:numId w:val="79"/>
+        </w:numPr>
+      </w:pPr>
+      <w:proofErr w:type="spellStart"/>
+      <w:r>
+        <w:t>metrics</w:t>
+      </w:r>
+      <w:proofErr w:type="spellEnd"/>
+      <w:r>
+        <w:t xml:space="preserve">/mAP50(B) – </w:t>
+      </w:r>
+      <w:r>
+        <w:t xml:space="preserve">metrika, ki </w:t>
+      </w:r>
+      <w:r>
+        <w:t>o</w:t>
+      </w:r>
+      <w:r>
+        <w:t>značuje površino pod krivuljo natančnost-</w:t>
+      </w:r>
+      <w:r>
+        <w:t xml:space="preserve">priklic </w:t>
+      </w:r>
+      <w:r>
+        <w:t xml:space="preserve">za detekcijo oseb </w:t>
+      </w:r>
+      <w:r>
+        <w:t xml:space="preserve">pri pragu </w:t>
+      </w:r>
+      <w:proofErr w:type="spellStart"/>
+      <w:r>
+        <w:t>IoU</w:t>
+      </w:r>
+      <w:proofErr w:type="spellEnd"/>
+      <w:r>
+        <w:t xml:space="preserve"> 0.5</w:t>
+      </w:r>
+      <w:r>
+        <w:t xml:space="preserve">, </w:t>
+      </w:r>
+      <w:r>
+        <w:t>“</w:t>
+      </w:r>
+      <w:r>
+        <w:t>m</w:t>
+      </w:r>
+      <w:r>
+        <w:t>“</w:t>
+      </w:r>
+      <w:r>
+        <w:t xml:space="preserve"> pa označuje povprečje vseh razredov, ki </w:t>
+      </w:r>
+      <w:r>
+        <w:t>v tem primeru nima praktičnega</w:t>
+      </w:r>
+      <w:r>
+        <w:t xml:space="preserve"> pomena, </w:t>
+      </w:r>
+      <w:r>
+        <w:t xml:space="preserve">ker imamo le en razred </w:t>
+      </w:r>
+      <w:r>
+        <w:t>– oseba.</w:t>
+      </w:r>
+      <w:r>
+        <w:t xml:space="preserve"> Prag </w:t>
+      </w:r>
+      <w:proofErr w:type="spellStart"/>
+      <w:r>
+        <w:t>IoU</w:t>
+      </w:r>
+      <w:proofErr w:type="spellEnd"/>
+      <w:r>
+        <w:t xml:space="preserve"> </w:t>
+      </w:r>
+      <w:r>
+        <w:t>predstavlja</w:t>
+      </w:r>
+      <w:r>
+        <w:t xml:space="preserve"> prekrivanje med napovedanim in dejanskim omejitvenim pravokotnikom. </w:t>
+      </w:r>
+      <w:r>
+        <w:t xml:space="preserve">Vrednost </w:t>
+      </w:r>
+      <w:proofErr w:type="spellStart"/>
+      <w:r>
+        <w:t>IoU</w:t>
+      </w:r>
+      <w:proofErr w:type="spellEnd"/>
+      <w:r>
+        <w:t xml:space="preserve"> 1 pomeni</w:t>
+      </w:r>
+      <w:r>
+        <w:t xml:space="preserve"> popolno prekrivanje pravokotnikov, </w:t>
+      </w:r>
+      <w:r>
+        <w:t>vrednost 0 pa pomeni, da se pravokotnika sploh ne prekrivata.</w:t>
+      </w:r>
+      <w:r>
+        <w:t xml:space="preserve"> Metrika mAP50 napoved označi kot pravilno, če je </w:t>
+      </w:r>
+      <w:proofErr w:type="spellStart"/>
+      <w:r>
+        <w:t>IoU</w:t>
+      </w:r>
+      <w:proofErr w:type="spellEnd"/>
+      <w:r>
+        <w:t xml:space="preserve"> </w:t>
+      </w:r>
+      <m:oMath>
+        <m:r>
+          <w:rPr>
+            <w:rFonts w:ascii="Cambria Math" w:hAnsi="Cambria Math"/>
+          </w:rPr>
+          <m:t>≥</m:t>
+        </m:r>
+      </m:oMath>
+      <w:r>
+        <w:t xml:space="preserve"> </w:t>
+      </w:r>
+      <w:r>
+        <w:t>0.5</w:t>
+      </w:r>
+      <w:r>
+        <w:t>, torej ko pravokotnik</w:t>
+      </w:r>
+      <w:r>
+        <w:t>a</w:t>
+      </w:r>
+      <w:r>
+        <w:t xml:space="preserve"> prekrivata vsaj 50%.</w:t>
+      </w:r>
+    </w:p>
+    <w:p>
+      <w:pPr>
+        <w:pStyle w:val="ListParagraph"/>
+        <w:numPr>
+          <w:ilvl w:val="0"/>
+          <w:numId w:val="79"/>
+        </w:numPr>
+      </w:pPr>
+      <w:proofErr w:type="spellStart"/>
+      <w:r>
+        <w:t>metrics</w:t>
+      </w:r>
+      <w:proofErr w:type="spellEnd"/>
+      <w:r>
+        <w:t>/mAP50-95(B)</w:t>
+      </w:r>
+      <w:r>
+        <w:t xml:space="preserve"> – razširjena metrika mAP50, ki uporablja več različnih pragov </w:t>
+      </w:r>
+      <w:proofErr w:type="spellStart"/>
+      <w:r>
+        <w:t>IoU</w:t>
+      </w:r>
+      <w:proofErr w:type="spellEnd"/>
+      <w:r>
+        <w:t xml:space="preserve">, in sicer od 0.50 do 0.95 s korakom 0.05. Ta metrika je strožja od mAP50, saj upošteva tudi višje vrednosti </w:t>
+      </w:r>
+      <w:proofErr w:type="spellStart"/>
+      <w:r>
+        <w:t>IoU</w:t>
+      </w:r>
+      <w:proofErr w:type="spellEnd"/>
+      <w:r>
+        <w:t xml:space="preserve">, </w:t>
+      </w:r>
+      <w:r>
+        <w:t>kjer mora biti napovedani pravokotnik zelo natančen, da se šteje kot pravilen.</w:t>
+      </w:r>
+    </w:p>
+    <w:p>
+      <w:pPr>
+        <w:pStyle w:val="ListParagraph"/>
+        <w:numPr>
+          <w:ilvl w:val="0"/>
+          <w:numId w:val="79"/>
+        </w:numPr>
+      </w:pPr>
+      <w:proofErr w:type="spellStart"/>
+      <w:r>
+        <w:t>metrics</w:t>
+      </w:r>
+      <w:proofErr w:type="spellEnd"/>
+      <w:r>
+        <w:t>/</w:t>
+      </w:r>
+      <w:proofErr w:type="spellStart"/>
+      <w:r>
+        <w:t>precision</w:t>
+      </w:r>
+      <w:proofErr w:type="spellEnd"/>
+      <w:r>
+        <w:t>(P) – natančnost detekcije sklepnih točk (med vsemi detekcijami sklepnih točk pove, koliko je pravilnih)</w:t>
+      </w:r>
+      <w:r>
+        <w:t>.</w:t>
+      </w:r>
+    </w:p>
+    <w:p>
+      <w:pPr>
+        <w:pStyle w:val="ListParagraph"/>
+        <w:numPr>
+          <w:ilvl w:val="0"/>
+          <w:numId w:val="79"/>
+        </w:numPr>
+      </w:pPr>
+      <w:proofErr w:type="spellStart"/>
+      <w:r>
+        <w:t>metrics</w:t>
+      </w:r>
+      <w:proofErr w:type="spellEnd"/>
+      <w:r>
+        <w:t>/</w:t>
+      </w:r>
+      <w:proofErr w:type="spellStart"/>
+      <w:r>
+        <w:t>recall</w:t>
+      </w:r>
+      <w:proofErr w:type="spellEnd"/>
+      <w:r>
+        <w:t>(P) – priklic (med vsemi pravimi sklepnimi točkami pove, koliko jih je model našel)</w:t>
+      </w:r>
+      <w:r>
+        <w:t>.</w:t>
+      </w:r>
+    </w:p>
+    <w:p>
+      <w:pPr>
+        <w:pStyle w:val="ListParagraph"/>
+        <w:numPr>
+          <w:ilvl w:val="0"/>
+          <w:numId w:val="79"/>
+        </w:numPr>
+      </w:pPr>
+      <w:proofErr w:type="spellStart"/>
+      <w:r>
+        <w:t>metrics</w:t>
+      </w:r>
+      <w:proofErr w:type="spellEnd"/>
+      <w:r>
+        <w:t>/mAP50(P) – enako kot pri detekciji za omejitveni pravokotnik osebe, le da so v tem primeru pomembni pravokotniki sklepnih točk</w:t>
+      </w:r>
+      <w:r>
+        <w:t>.</w:t>
+      </w:r>
+    </w:p>
+    <w:p>
+      <w:pPr>
+        <w:pStyle w:val="ListParagraph"/>
+        <w:numPr>
+          <w:ilvl w:val="0"/>
+          <w:numId w:val="79"/>
+        </w:numPr>
+      </w:pPr>
+      <w:proofErr w:type="spellStart"/>
+      <w:r>
+        <w:t>metrics</w:t>
+      </w:r>
+      <w:proofErr w:type="spellEnd"/>
+      <w:r>
+        <w:t>/mAP50-95(P) - enako kot pri detekciji za omejitveni pravokotnik osebe, le da so v tem primeru pomembni pravokotniki sklepnih točk</w:t>
+      </w:r>
+      <w:r>
+        <w:t>.</w:t>
+      </w:r>
+    </w:p>
+    <w:p/>
+    <w:p>
+      <w:pPr>
+        <w:pStyle w:val="Heading3"/>
+      </w:pPr>
+      <w:r>
+        <w:lastRenderedPageBreak/>
+        <w:t>Potek učenja</w:t>
+      </w:r>
+    </w:p>
+    <w:p>
+      <w:r>
+        <w:t xml:space="preserve">Na grafu </w:t>
+      </w:r>
+      <w:r>
+        <w:fldChar w:fldCharType="begin"/>
+      </w:r>
+      <w:r>
+        <w:instrText xml:space="preserve"> REF _Ref228369727 \h </w:instrText>
+      </w:r>
+      <w:r>
+        <w:fldChar w:fldCharType="separate"/>
+      </w:r>
+      <w:r>
+        <w:t xml:space="preserve">Slika </w:t>
+      </w:r>
+      <w:r>
+        <w:rPr>
+          <w:noProof/>
+        </w:rPr>
+        <w:t>18</w:t>
+      </w:r>
+      <w:r>
+        <w:t>: Graf "pose" izgube</w:t>
+      </w:r>
+      <w:r>
+        <w:fldChar w:fldCharType="end"/>
+      </w:r>
+      <w:r>
+        <w:t xml:space="preserve"> je prikaza potek vrednosti pose izgube na učni in </w:t>
+      </w:r>
+      <w:proofErr w:type="spellStart"/>
+      <w:r>
+        <w:t>validacijski</w:t>
+      </w:r>
+      <w:proofErr w:type="spellEnd"/>
+      <w:r>
+        <w:t xml:space="preserve"> množici skozi epohe učenja. Po hitrem izboljšanju v prvih parih epohah, se hitrost padanja izgube postopoma zmanjšuje. </w:t>
+      </w:r>
+      <w:proofErr w:type="spellStart"/>
+      <w:r>
+        <w:t>Validacijska</w:t>
+      </w:r>
+      <w:proofErr w:type="spellEnd"/>
+      <w:r>
+        <w:t xml:space="preserve"> izguba je skozi celoten potek učenja nižja od učne izgube, ključno pa je to, da </w:t>
+      </w:r>
+      <w:proofErr w:type="spellStart"/>
+      <w:r>
+        <w:t>validacijska</w:t>
+      </w:r>
+      <w:proofErr w:type="spellEnd"/>
+      <w:r>
+        <w:t xml:space="preserve"> izguba ne kaže naraščanja proti koncu učenja, zato iz grafa ni razvidnega tipičnega znaka za prekomerno prileganje.</w:t>
+      </w:r>
+    </w:p>
+    <w:p>
+      <w:pPr>
+        <w:pStyle w:val="Images"/>
+      </w:pPr>
+      <w:r>
+        <w:drawing>
+          <wp:inline distT="0" distB="0" distL="0" distR="0" wp14:anchorId="6F41183B" wp14:editId="7A9D58CE">
+            <wp:extent cx="4383635" cy="2171700"/>
+            <wp:effectExtent l="0" t="0" r="0" b="0"/>
+            <wp:docPr id="1791098004" name="Picture 1"/>
+            <wp:cNvGraphicFramePr>
+              <a:graphicFrameLocks xmlns:a="http://schemas.openxmlformats.org/drawingml/2006/main" noChangeAspect="1"/>
+            </wp:cNvGraphicFramePr>
+            <a:graphic xmlns:a="http://schemas.openxmlformats.org/drawingml/2006/main">
+              <a:graphicData uri="http://schemas.openxmlformats.org/drawingml/2006/picture">
+                <pic:pic xmlns:pic="http://schemas.openxmlformats.org/drawingml/2006/picture">
+                  <pic:nvPicPr>
+                    <pic:cNvPr id="1791098004" name=""/>
+                    <pic:cNvPicPr/>
+                  </pic:nvPicPr>
+                  <pic:blipFill>
+                    <a:blip r:embed="rId41"/>
+                    <a:stretch>
+                      <a:fillRect/>
+                    </a:stretch>
+                  </pic:blipFill>
+                  <pic:spPr>
+                    <a:xfrm>
+                      <a:off x="0" y="0"/>
+                      <a:ext cx="4387159" cy="2173446"/>
+                    </a:xfrm>
+                    <a:prstGeom prst="rect">
+                      <a:avLst/>
+                    </a:prstGeom>
+                  </pic:spPr>
+                </pic:pic>
+              </a:graphicData>
+            </a:graphic>
+          </wp:inline>
+        </w:drawing>
+      </w:r>
+    </w:p>
+    <w:p>
+      <w:pPr>
+        <w:pStyle w:val="Caption"/>
+      </w:pPr>
+      <w:bookmarkStart w:id="47" w:name="_Ref228369727"/>
+      <w:r>
+        <w:t xml:space="preserve">Slika </w:t>
+      </w:r>
+      <w:fldSimple w:instr=" SEQ Slika \* ARABIC ">
+        <w:r>
+          <w:rPr>
+            <w:noProof/>
+          </w:rPr>
+          <w:t>18</w:t>
+        </w:r>
+      </w:fldSimple>
+      <w:r>
+        <w:t>: Graf "pose" izgube</w:t>
+      </w:r>
+      <w:bookmarkEnd w:id="47"/>
+    </w:p>
+    <w:p>
+      <w:r>
+        <w:t xml:space="preserve">Graf </w:t>
+      </w:r>
+      <w:r>
+        <w:fldChar w:fldCharType="begin"/>
+      </w:r>
+      <w:r>
+        <w:instrText xml:space="preserve"> REF _Ref228369886 \h </w:instrText>
+      </w:r>
+      <w:r>
+        <w:fldChar w:fldCharType="separate"/>
+      </w:r>
+      <w:r>
+        <w:t xml:space="preserve">Slika </w:t>
+      </w:r>
+      <w:r>
+        <w:rPr>
+          <w:noProof/>
+        </w:rPr>
+        <w:t>19</w:t>
+      </w:r>
+      <w:r>
+        <w:t>: Graf mAP50(P) in mAP50-95(P) metrik</w:t>
+      </w:r>
+      <w:r>
+        <w:fldChar w:fldCharType="end"/>
+      </w:r>
+      <w:r>
+        <w:t xml:space="preserve"> prikazuje razvoj metrik mAP50(P) in mAP50-95(P) na </w:t>
+      </w:r>
+      <w:proofErr w:type="spellStart"/>
+      <w:r>
+        <w:t>validacijski</w:t>
+      </w:r>
+      <w:proofErr w:type="spellEnd"/>
+      <w:r>
+        <w:t xml:space="preserve"> množici.</w:t>
+      </w:r>
+      <w:r>
+        <w:t xml:space="preserve"> Obe krivulji zelo hitro narasteta v začetnem delu učenja, kar nakazuje, da se je model že v prvih epohah naučil osnovnih vzorcev.</w:t>
+      </w:r>
+      <w:r>
+        <w:t xml:space="preserve"> Pričakovano je mAP50(P) višji od mAP50-95(P), saj ima mAP50(P) manj strogi prag. Stabilno naraščanje obeh metrik in odsotnost poslabšanja proti koncu učenja dodatno potrjujeta, da učenje ni bilo nestabilno.</w:t>
+      </w:r>
+    </w:p>
+    <w:p>
+      <w:pPr>
+        <w:pStyle w:val="Images"/>
+      </w:pPr>
+      <w:r>
+        <w:drawing>
+          <wp:inline distT="0" distB="0" distL="0" distR="0" wp14:anchorId="1E6E06FE" wp14:editId="20E9ED76">
+            <wp:extent cx="4320540" cy="2138406"/>
+            <wp:effectExtent l="0" t="0" r="3810" b="0"/>
+            <wp:docPr id="1825303787" name="Picture 1"/>
+            <wp:cNvGraphicFramePr>
+              <a:graphicFrameLocks xmlns:a="http://schemas.openxmlformats.org/drawingml/2006/main" noChangeAspect="1"/>
+            </wp:cNvGraphicFramePr>
+            <a:graphic xmlns:a="http://schemas.openxmlformats.org/drawingml/2006/main">
+              <a:graphicData uri="http://schemas.openxmlformats.org/drawingml/2006/picture">
+                <pic:pic xmlns:pic="http://schemas.openxmlformats.org/drawingml/2006/picture">
+                  <pic:nvPicPr>
+                    <pic:cNvPr id="1825303787" name=""/>
+                    <pic:cNvPicPr/>
+                  </pic:nvPicPr>
+                  <pic:blipFill>
+                    <a:blip r:embed="rId42"/>
+                    <a:stretch>
+                      <a:fillRect/>
+                    </a:stretch>
+                  </pic:blipFill>
+                  <pic:spPr>
+                    <a:xfrm>
+                      <a:off x="0" y="0"/>
+                      <a:ext cx="4343052" cy="2149548"/>
+                    </a:xfrm>
+                    <a:prstGeom prst="rect">
+                      <a:avLst/>
+                    </a:prstGeom>
+                  </pic:spPr>
+                </pic:pic>
+              </a:graphicData>
+            </a:graphic>
+          </wp:inline>
+        </w:drawing>
+      </w:r>
+    </w:p>
+    <w:p>
+      <w:pPr>
+        <w:pStyle w:val="Caption"/>
+      </w:pPr>
+      <w:bookmarkStart w:id="48" w:name="_Ref228369886"/>
+      <w:r>
+        <w:t xml:space="preserve">Slika </w:t>
+      </w:r>
+      <w:fldSimple w:instr=" SEQ Slika \* ARABIC ">
+        <w:r>
+          <w:rPr>
+            <w:noProof/>
+          </w:rPr>
+          <w:t>19</w:t>
+        </w:r>
+      </w:fldSimple>
+      <w:r>
+        <w:t>: Graf mAP50(P) in mAP50-95(P) metrik</w:t>
+      </w:r>
+      <w:bookmarkEnd w:id="48"/>
+    </w:p>
+    <w:p>
+      <w:pPr>
+        <w:pStyle w:val="Heading3"/>
+      </w:pPr>
+      <w:r>
+        <w:lastRenderedPageBreak/>
+        <w:t>Učinkovitost delovanja po učenju</w:t>
+      </w:r>
+    </w:p>
+    <w:p>
+      <w:r>
+        <w:t>Glavni cilj učenja modela je ugotoviti, ali se je po učenju model bolj približal referenčni resnici (napovedim RTMO-X) in kako se nov model umešča v primerjavo z ostalimi modeli.</w:t>
+      </w:r>
+    </w:p>
+    <w:p>
+      <w:pPr>
+        <w:pStyle w:val="Images"/>
+      </w:pPr>
+      <w:r>
+        <w:drawing>
+          <wp:inline distT="0" distB="0" distL="0" distR="0" wp14:anchorId="2EFACA4F" wp14:editId="75BFAFB4">
+            <wp:extent cx="5396230" cy="2684780"/>
+            <wp:effectExtent l="0" t="0" r="0" b="1270"/>
+            <wp:docPr id="829808596" name="Picture 1"/>
+            <wp:cNvGraphicFramePr>
+              <a:graphicFrameLocks xmlns:a="http://schemas.openxmlformats.org/drawingml/2006/main" noChangeAspect="1"/>
+            </wp:cNvGraphicFramePr>
+            <a:graphic xmlns:a="http://schemas.openxmlformats.org/drawingml/2006/main">
+              <a:graphicData uri="http://schemas.openxmlformats.org/drawingml/2006/picture">
+                <pic:pic xmlns:pic="http://schemas.openxmlformats.org/drawingml/2006/picture">
+                  <pic:nvPicPr>
+                    <pic:cNvPr id="829808596" name=""/>
+                    <pic:cNvPicPr/>
+                  </pic:nvPicPr>
+                  <pic:blipFill>
+                    <a:blip r:embed="rId43"/>
+                    <a:stretch>
+                      <a:fillRect/>
+                    </a:stretch>
+                  </pic:blipFill>
+                  <pic:spPr>
+                    <a:xfrm>
+                      <a:off x="0" y="0"/>
+                      <a:ext cx="5396230" cy="2684780"/>
+                    </a:xfrm>
+                    <a:prstGeom prst="rect">
+                      <a:avLst/>
+                    </a:prstGeom>
+                  </pic:spPr>
+                </pic:pic>
+              </a:graphicData>
+            </a:graphic>
+          </wp:inline>
+        </w:drawing>
+      </w:r>
+    </w:p>
+    <w:p>
+      <w:pPr>
+        <w:pStyle w:val="Caption"/>
+      </w:pPr>
+      <w:r>
+        <w:t xml:space="preserve">Slika </w:t>
+      </w:r>
+      <w:fldSimple w:instr=" SEQ Slika \* ARABIC ">
+        <w:r>
+          <w:rPr>
+            <w:noProof/>
+          </w:rPr>
+          <w:t>20</w:t>
+        </w:r>
+      </w:fldSimple>
+      <w:r>
+        <w:t>: Primerjava metrike MPJPE med modeli po učenju</w:t>
+      </w:r>
+    </w:p>
+    <w:p>
+      <w:r>
+        <w:t xml:space="preserve">Za ocenjevanje je uporabljena enaka metrika kot na sliki </w:t>
+      </w:r>
+      <w:r>
+        <w:fldChar w:fldCharType="begin"/>
+      </w:r>
+      <w:r>
+        <w:instrText xml:space="preserve"> REF _Ref226964904 \h </w:instrText>
+      </w:r>
+      <w:r>
+        <w:fldChar w:fldCharType="separate"/>
+      </w:r>
+      <w:r>
+        <w:t xml:space="preserve">Slika </w:t>
+      </w:r>
+      <w:r>
+        <w:rPr>
+          <w:noProof/>
+        </w:rPr>
+        <w:t>4</w:t>
+      </w:r>
+      <w:r>
+        <w:t>: Rezultati MPJPE nad izbranimi modeli</w:t>
+      </w:r>
+      <w:r>
+        <w:fldChar w:fldCharType="end"/>
+      </w:r>
+      <w:r>
+        <w:t xml:space="preserve">. </w:t>
+      </w:r>
+      <w:r>
+        <w:t>Naučena različica modela YOLO11n-pose</w:t>
+      </w:r>
+      <w:r>
+        <w:t xml:space="preserve"> je dosegla MPJPE 0.016, kar predstavlja izrazito izboljšanje v primerjavi z izhodiščno različico YOLO11n-pose modela, ki znaša 0.036</w:t>
+      </w:r>
+      <w:r>
+        <w:t>, kar potrjuje, da je prilagoditev modela na lastno domeno bistveni povečala natančnost napovedi.</w:t>
+      </w:r>
+      <w:r>
+        <w:t xml:space="preserve"> </w:t>
+      </w:r>
+    </w:p>
+    <w:p/>
+    <w:p>
+      <w:r>
+        <w:t>Naučeni YOLO11n-pose model po MPJPE preseže tudi ostale primerjane modele, ne let lastne izhodiščne različice.</w:t>
+      </w:r>
+      <w:r>
+        <w:t xml:space="preserve"> Takšni rezultati so pričakovani, saj je model naučen na učni množici, zbrani v zelo podobnih pogojih kot testni scenarij uporabe.</w:t>
+      </w:r>
+    </w:p>
+    <w:p/>
+    <w:p>
+      <w:r>
+        <w:t xml:space="preserve">Oceno vpliva učenja na kakovost lokalizacije sklepnih točk prikazujeta sliki </w:t>
+      </w:r>
+      <w:r>
+        <w:fldChar w:fldCharType="begin"/>
+      </w:r>
+      <w:r>
+        <w:instrText xml:space="preserve"> REF _Ref228370902 \h </w:instrText>
+      </w:r>
+      <w:r>
+        <w:fldChar w:fldCharType="separate"/>
+      </w:r>
+      <w:r>
+        <w:t xml:space="preserve">Slika </w:t>
+      </w:r>
+      <w:r>
+        <w:rPr>
+          <w:noProof/>
+        </w:rPr>
+        <w:t>21</w:t>
+      </w:r>
+      <w:r>
+        <w:t>: Primerjava metrike PCK s pragom 0.01 med modeli po učenju</w:t>
+      </w:r>
+      <w:r>
+        <w:fldChar w:fldCharType="end"/>
+      </w:r>
+      <w:r>
+        <w:t xml:space="preserve"> in </w:t>
+      </w:r>
+      <w:r>
+        <w:fldChar w:fldCharType="begin"/>
+      </w:r>
+      <w:r>
+        <w:instrText xml:space="preserve"> REF _Ref228370909 \h </w:instrText>
+      </w:r>
+      <w:r>
+        <w:fldChar w:fldCharType="separate"/>
+      </w:r>
+      <w:r>
+        <w:t xml:space="preserve">Slika </w:t>
+      </w:r>
+      <w:r>
+        <w:rPr>
+          <w:noProof/>
+        </w:rPr>
+        <w:t>22</w:t>
+      </w:r>
+      <w:r>
+        <w:t xml:space="preserve">: </w:t>
+      </w:r>
+      <w:r>
+        <w:t>Primerjava metrike PCK s pra</w:t>
+      </w:r>
+      <w:r>
+        <w:t>gom 0.02 med modeli po učenju</w:t>
+      </w:r>
+      <w:r>
+        <w:fldChar w:fldCharType="end"/>
+      </w:r>
+      <w:r>
+        <w:t xml:space="preserve">. </w:t>
+      </w:r>
+      <w:r>
+        <w:t xml:space="preserve">Pri obeh pragih naučeni model doseže najvišjo vrednost in predstavlja izrazito izboljšanje v kakovosti, saj se je naučeni </w:t>
+      </w:r>
+      <w:r>
+        <w:lastRenderedPageBreak/>
+        <w:t>model v metriki PCK s pragom 0.01 izboljšal za več kot enkrat</w:t>
+      </w:r>
+      <w:r>
+        <w:t xml:space="preserve"> v primerjavi z izhodiščno različico</w:t>
+      </w:r>
+      <w:r>
+        <w:t>.</w:t>
+      </w:r>
+    </w:p>
+    <w:p/>
+    <w:p>
+      <w:pPr>
+        <w:pStyle w:val="Images"/>
+      </w:pPr>
+      <w:r>
+        <w:drawing>
+          <wp:inline distT="0" distB="0" distL="0" distR="0" wp14:anchorId="06C28451" wp14:editId="0866AD90">
+            <wp:extent cx="5813211" cy="2407920"/>
+            <wp:effectExtent l="0" t="0" r="0" b="0"/>
+            <wp:docPr id="1274640967" name="Picture 1"/>
+            <wp:cNvGraphicFramePr>
+              <a:graphicFrameLocks xmlns:a="http://schemas.openxmlformats.org/drawingml/2006/main" noChangeAspect="1"/>
+            </wp:cNvGraphicFramePr>
+            <a:graphic xmlns:a="http://schemas.openxmlformats.org/drawingml/2006/main">
+              <a:graphicData uri="http://schemas.openxmlformats.org/drawingml/2006/picture">
+                <pic:pic xmlns:pic="http://schemas.openxmlformats.org/drawingml/2006/picture">
+                  <pic:nvPicPr>
+                    <pic:cNvPr id="1274640967" name=""/>
+                    <pic:cNvPicPr/>
+                  </pic:nvPicPr>
+                  <pic:blipFill>
+                    <a:blip r:embed="rId44"/>
+                    <a:stretch>
+                      <a:fillRect/>
+                    </a:stretch>
+                  </pic:blipFill>
+                  <pic:spPr>
+                    <a:xfrm>
+                      <a:off x="0" y="0"/>
+                      <a:ext cx="5814650" cy="2408516"/>
+                    </a:xfrm>
+                    <a:prstGeom prst="rect">
+                      <a:avLst/>
+                    </a:prstGeom>
+                  </pic:spPr>
+                </pic:pic>
+              </a:graphicData>
+            </a:graphic>
+          </wp:inline>
+        </w:drawing>
+      </w:r>
+    </w:p>
+    <w:p>
+      <w:pPr>
+        <w:pStyle w:val="Caption"/>
+      </w:pPr>
+      <w:bookmarkStart w:id="49" w:name="_Ref228370902"/>
+      <w:r>
+        <w:t xml:space="preserve">Slika </w:t>
+      </w:r>
+      <w:fldSimple w:instr=" SEQ Slika \* ARABIC ">
+        <w:r>
+          <w:rPr>
+            <w:noProof/>
+          </w:rPr>
+          <w:t>21</w:t>
+        </w:r>
+      </w:fldSimple>
+      <w:r>
+        <w:t>: Primerjava metrike PCK s pragom 0.01 med modeli po učenju</w:t>
+      </w:r>
+      <w:bookmarkEnd w:id="49"/>
+    </w:p>
+    <w:p>
+      <w:pPr>
+        <w:pStyle w:val="Images"/>
+      </w:pPr>
+      <w:r>
+        <w:drawing>
+          <wp:inline distT="0" distB="0" distL="0" distR="0" wp14:anchorId="3102CB84" wp14:editId="4DB80D5E">
+            <wp:extent cx="5831608" cy="2415540"/>
+            <wp:effectExtent l="0" t="0" r="0" b="3810"/>
+            <wp:docPr id="1489467611" name="Picture 1"/>
+            <wp:cNvGraphicFramePr>
+              <a:graphicFrameLocks xmlns:a="http://schemas.openxmlformats.org/drawingml/2006/main" noChangeAspect="1"/>
+            </wp:cNvGraphicFramePr>
+            <a:graphic xmlns:a="http://schemas.openxmlformats.org/drawingml/2006/main">
+              <a:graphicData uri="http://schemas.openxmlformats.org/drawingml/2006/picture">
+                <pic:pic xmlns:pic="http://schemas.openxmlformats.org/drawingml/2006/picture">
+                  <pic:nvPicPr>
+                    <pic:cNvPr id="1489467611" name=""/>
+                    <pic:cNvPicPr/>
+                  </pic:nvPicPr>
+                  <pic:blipFill>
+                    <a:blip r:embed="rId45"/>
+                    <a:stretch>
+                      <a:fillRect/>
+                    </a:stretch>
+                  </pic:blipFill>
+                  <pic:spPr>
+                    <a:xfrm>
+                      <a:off x="0" y="0"/>
+                      <a:ext cx="5835953" cy="2417340"/>
+                    </a:xfrm>
+                    <a:prstGeom prst="rect">
+                      <a:avLst/>
+                    </a:prstGeom>
+                  </pic:spPr>
+                </pic:pic>
+              </a:graphicData>
+            </a:graphic>
+          </wp:inline>
+        </w:drawing>
+      </w:r>
+    </w:p>
+    <w:p>
+      <w:pPr>
+        <w:pStyle w:val="Caption"/>
+      </w:pPr>
+      <w:bookmarkStart w:id="50" w:name="_Ref228370909"/>
+      <w:r>
+        <w:t xml:space="preserve">Slika </w:t>
+      </w:r>
+      <w:fldSimple w:instr=" SEQ Slika \* ARABIC ">
+        <w:r>
+          <w:rPr>
+            <w:noProof/>
+          </w:rPr>
+          <w:t>22</w:t>
+        </w:r>
+      </w:fldSimple>
+      <w:r>
+        <w:t xml:space="preserve">: </w:t>
+      </w:r>
+      <w:r>
+        <w:t>Primerjava metrike PCK s pra</w:t>
+      </w:r>
+      <w:r>
+        <w:t>gom 0.02 med modeli po učenju</w:t>
+      </w:r>
+      <w:bookmarkEnd w:id="50"/>
     </w:p>
     <w:p>
       <w:r>
@@ -14996,11 +15988,11 @@
           <w:tab w:val="num" w:pos="567"/>
         </w:tabs>
       </w:pPr>
-      <w:bookmarkStart w:id="47" w:name="_Toc225593982"/>
+      <w:bookmarkStart w:id="51" w:name="_Toc225593982"/>
       <w:r>
         <w:t>Mehanizem stanj</w:t>
       </w:r>
-      <w:bookmarkEnd w:id="47"/>
+      <w:bookmarkEnd w:id="51"/>
     </w:p>
     <w:p>
       <w:r>
@@ -15173,12 +16165,12 @@
       <w:pPr>
         <w:pStyle w:val="Heading3"/>
       </w:pPr>
-      <w:bookmarkStart w:id="48" w:name="_Toc225593983"/>
+      <w:bookmarkStart w:id="52" w:name="_Toc225593983"/>
       <w:r>
         <w:lastRenderedPageBreak/>
         <w:t>Stanje NI_V_KADRU</w:t>
       </w:r>
-      <w:bookmarkEnd w:id="48"/>
+      <w:bookmarkEnd w:id="52"/>
     </w:p>
     <w:p>
       <w:r>
@@ -15226,11 +16218,11 @@
       <w:pPr>
         <w:pStyle w:val="Heading3"/>
       </w:pPr>
-      <w:bookmarkStart w:id="49" w:name="_Toc225593984"/>
+      <w:bookmarkStart w:id="53" w:name="_Toc225593984"/>
       <w:r>
         <w:t>Stanje NI_OBRNJEN_PROTI_KAMERI</w:t>
       </w:r>
-      <w:bookmarkEnd w:id="49"/>
+      <w:bookmarkEnd w:id="53"/>
     </w:p>
     <w:p>
       <w:r>
@@ -15273,11 +16265,11 @@
       <w:pPr>
         <w:pStyle w:val="Heading3"/>
       </w:pPr>
-      <w:bookmarkStart w:id="50" w:name="_Toc225593985"/>
+      <w:bookmarkStart w:id="54" w:name="_Toc225593985"/>
       <w:r>
         <w:t>Stanje NI_PRI_MIRU</w:t>
       </w:r>
-      <w:bookmarkEnd w:id="50"/>
+      <w:bookmarkEnd w:id="54"/>
     </w:p>
     <w:p>
       <w:r>
@@ -15366,11 +16358,11 @@
       <w:pPr>
         <w:pStyle w:val="Heading3"/>
       </w:pPr>
-      <w:bookmarkStart w:id="51" w:name="_Toc225593986"/>
+      <w:bookmarkStart w:id="55" w:name="_Toc225593986"/>
       <w:r>
         <w:t>Stanje ZAČETNI_POGOJI_DRŽE_NISO_IZPOLNJENI</w:t>
       </w:r>
-      <w:bookmarkEnd w:id="51"/>
+      <w:bookmarkEnd w:id="55"/>
     </w:p>
     <w:p>
       <w:r>
@@ -15504,11 +16496,11 @@
       <w:pPr>
         <w:pStyle w:val="Heading3"/>
       </w:pPr>
-      <w:bookmarkStart w:id="52" w:name="_Toc225593987"/>
+      <w:bookmarkStart w:id="56" w:name="_Toc225593987"/>
       <w:r>
         <w:t>Stanje OPRAVI_SERIJO</w:t>
       </w:r>
-      <w:bookmarkEnd w:id="52"/>
+      <w:bookmarkEnd w:id="56"/>
     </w:p>
     <w:p>
       <w:r>
@@ -15618,11 +16610,11 @@
       <w:pPr>
         <w:pStyle w:val="Heading3"/>
       </w:pPr>
-      <w:bookmarkStart w:id="53" w:name="_Toc225593988"/>
+      <w:bookmarkStart w:id="57" w:name="_Toc225593988"/>
       <w:r>
         <w:t>Stanje USTAVLJENO</w:t>
       </w:r>
-      <w:bookmarkEnd w:id="53"/>
+      <w:bookmarkEnd w:id="57"/>
     </w:p>
     <w:p>
       <w:r>
@@ -15637,11 +16629,11 @@
       <w:pPr>
         <w:pStyle w:val="Heading2"/>
       </w:pPr>
-      <w:bookmarkStart w:id="54" w:name="_Toc225593989"/>
+      <w:bookmarkStart w:id="58" w:name="_Toc225593989"/>
       <w:r>
         <w:t>Predpisi vaj</w:t>
       </w:r>
-      <w:bookmarkEnd w:id="54"/>
+      <w:bookmarkEnd w:id="58"/>
     </w:p>
     <w:p>
       <w:r>
@@ -15820,12 +16812,12 @@
       <w:pPr>
         <w:pStyle w:val="Heading2"/>
       </w:pPr>
-      <w:bookmarkStart w:id="55" w:name="_Toc225593990"/>
+      <w:bookmarkStart w:id="59" w:name="_Toc225593990"/>
       <w:r>
         <w:lastRenderedPageBreak/>
         <w:t>Zajemanje ponovitev</w:t>
       </w:r>
-      <w:bookmarkEnd w:id="55"/>
+      <w:bookmarkEnd w:id="59"/>
     </w:p>
     <w:p>
       <w:r>
@@ -15998,11 +16990,11 @@
       <w:pPr>
         <w:pStyle w:val="Heading3"/>
       </w:pPr>
-      <w:bookmarkStart w:id="56" w:name="_Toc225593991"/>
+      <w:bookmarkStart w:id="60" w:name="_Toc225593991"/>
       <w:r>
         <w:t>Čas koncentrične faze</w:t>
       </w:r>
-      <w:bookmarkEnd w:id="56"/>
+      <w:bookmarkEnd w:id="60"/>
     </w:p>
     <w:p>
       <w:r>
@@ -16040,12 +17032,12 @@
       <w:pPr>
         <w:pStyle w:val="Heading3"/>
       </w:pPr>
-      <w:bookmarkStart w:id="57" w:name="_Toc225593992"/>
+      <w:bookmarkStart w:id="61" w:name="_Toc225593992"/>
       <w:r>
         <w:lastRenderedPageBreak/>
         <w:t>Čas ekscentrične faze</w:t>
       </w:r>
-      <w:bookmarkEnd w:id="57"/>
+      <w:bookmarkEnd w:id="61"/>
     </w:p>
     <w:p>
       <w:r>
@@ -16062,11 +17054,11 @@
       <w:pPr>
         <w:pStyle w:val="Heading3"/>
       </w:pPr>
-      <w:bookmarkStart w:id="58" w:name="_Toc225593993"/>
+      <w:bookmarkStart w:id="62" w:name="_Toc225593993"/>
       <w:r>
         <w:t>Čas izometrične faze</w:t>
       </w:r>
-      <w:bookmarkEnd w:id="58"/>
+      <w:bookmarkEnd w:id="62"/>
     </w:p>
     <w:p>
       <w:r>
@@ -16123,21 +17115,21 @@
       <w:pPr>
         <w:pStyle w:val="Heading2"/>
       </w:pPr>
-      <w:bookmarkStart w:id="59" w:name="_Toc225593994"/>
+      <w:bookmarkStart w:id="63" w:name="_Toc225593994"/>
       <w:r>
         <w:t>Povratne informacije</w:t>
       </w:r>
-      <w:bookmarkEnd w:id="59"/>
+      <w:bookmarkEnd w:id="63"/>
     </w:p>
     <w:p>
       <w:pPr>
         <w:pStyle w:val="Heading3"/>
       </w:pPr>
-      <w:bookmarkStart w:id="60" w:name="_Toc225593995"/>
+      <w:bookmarkStart w:id="64" w:name="_Toc225593995"/>
       <w:r>
         <w:t>Grafične povratne informacije</w:t>
       </w:r>
-      <w:bookmarkEnd w:id="60"/>
+      <w:bookmarkEnd w:id="64"/>
     </w:p>
     <w:p>
       <w:r>
@@ -16262,7 +17254,7 @@
                     <pic:cNvPicPr/>
                   </pic:nvPicPr>
                   <pic:blipFill>
-                    <a:blip r:embed="rId41"/>
+                    <a:blip r:embed="rId46"/>
                     <a:stretch>
                       <a:fillRect/>
                     </a:stretch>
@@ -16287,64 +17279,38 @@
       <w:pPr>
         <w:pStyle w:val="Caption"/>
       </w:pPr>
-      <w:bookmarkStart w:id="61" w:name="_Ref221966222"/>
-      <w:bookmarkStart w:id="62" w:name="_Toc225594007"/>
+      <w:bookmarkStart w:id="65" w:name="_Ref221966222"/>
+      <w:bookmarkStart w:id="66" w:name="_Toc225594007"/>
       <w:r>
         <w:t xml:space="preserve">Slika </w:t>
       </w:r>
-      <w:r>
-        <w:fldChar w:fldCharType="begin"/>
-      </w:r>
-      <w:r>
-        <w:instrText xml:space="preserve"> STYLEREF 1 \s </w:instrText>
-      </w:r>
-      <w:r>
-        <w:fldChar w:fldCharType="separate"/>
-      </w:r>
-      <w:r>
-        <w:rPr>
-          <w:noProof/>
-        </w:rPr>
-        <w:t>6</w:t>
-      </w:r>
-      <w:r>
-        <w:rPr>
-          <w:noProof/>
-        </w:rPr>
-        <w:fldChar w:fldCharType="end"/>
-      </w:r>
+      <w:fldSimple w:instr=" STYLEREF 1 \s ">
+        <w:r>
+          <w:rPr>
+            <w:noProof/>
+          </w:rPr>
+          <w:t>6</w:t>
+        </w:r>
+      </w:fldSimple>
       <w:r>
         <w:t>.</w:t>
       </w:r>
-      <w:r>
-        <w:fldChar w:fldCharType="begin"/>
-      </w:r>
-      <w:r>
-        <w:instrText xml:space="preserve"> SEQ Slika \* ARABIC \s 1 </w:instrText>
-      </w:r>
-      <w:r>
-        <w:fldChar w:fldCharType="separate"/>
-      </w:r>
-      <w:r>
-        <w:rPr>
-          <w:noProof/>
-        </w:rPr>
-        <w:t>1</w:t>
-      </w:r>
-      <w:r>
-        <w:rPr>
-          <w:noProof/>
-        </w:rPr>
-        <w:fldChar w:fldCharType="end"/>
-      </w:r>
+      <w:fldSimple w:instr=" SEQ Slika \* ARABIC \s 1 ">
+        <w:r>
+          <w:rPr>
+            <w:noProof/>
+          </w:rPr>
+          <w:t>1</w:t>
+        </w:r>
+      </w:fldSimple>
       <w:r>
         <w:t>: Časovni graf</w:t>
       </w:r>
-      <w:bookmarkEnd w:id="61"/>
+      <w:bookmarkEnd w:id="65"/>
       <w:r>
         <w:t xml:space="preserve"> vsake ponovitve</w:t>
       </w:r>
-      <w:bookmarkEnd w:id="62"/>
+      <w:bookmarkEnd w:id="66"/>
     </w:p>
     <w:p/>
     <w:p>
@@ -16389,7 +17355,7 @@
                     <pic:cNvPicPr/>
                   </pic:nvPicPr>
                   <pic:blipFill>
-                    <a:blip r:embed="rId42"/>
+                    <a:blip r:embed="rId47"/>
                     <a:stretch>
                       <a:fillRect/>
                     </a:stretch>
@@ -16414,67 +17380,41 @@
       <w:pPr>
         <w:pStyle w:val="Caption"/>
       </w:pPr>
-      <w:bookmarkStart w:id="63" w:name="_Ref221966255"/>
-      <w:bookmarkStart w:id="64" w:name="_Toc225594008"/>
+      <w:bookmarkStart w:id="67" w:name="_Ref221966255"/>
+      <w:bookmarkStart w:id="68" w:name="_Toc225594008"/>
       <w:r>
         <w:t xml:space="preserve">Slika </w:t>
       </w:r>
-      <w:r>
-        <w:fldChar w:fldCharType="begin"/>
-      </w:r>
-      <w:r>
-        <w:instrText xml:space="preserve"> STYLEREF 1 \s </w:instrText>
-      </w:r>
-      <w:r>
-        <w:fldChar w:fldCharType="separate"/>
-      </w:r>
-      <w:r>
-        <w:rPr>
-          <w:noProof/>
-        </w:rPr>
-        <w:t>6</w:t>
-      </w:r>
-      <w:r>
-        <w:rPr>
-          <w:noProof/>
-        </w:rPr>
-        <w:fldChar w:fldCharType="end"/>
-      </w:r>
+      <w:fldSimple w:instr=" STYLEREF 1 \s ">
+        <w:r>
+          <w:rPr>
+            <w:noProof/>
+          </w:rPr>
+          <w:t>6</w:t>
+        </w:r>
+      </w:fldSimple>
       <w:r>
         <w:t>.</w:t>
       </w:r>
-      <w:r>
-        <w:fldChar w:fldCharType="begin"/>
-      </w:r>
-      <w:r>
-        <w:instrText xml:space="preserve"> SEQ Slika \* ARABIC \s 1 </w:instrText>
-      </w:r>
-      <w:r>
-        <w:fldChar w:fldCharType="separate"/>
-      </w:r>
-      <w:r>
-        <w:rPr>
-          <w:noProof/>
-        </w:rPr>
-        <w:t>2</w:t>
-      </w:r>
-      <w:r>
-        <w:rPr>
-          <w:noProof/>
-        </w:rPr>
-        <w:fldChar w:fldCharType="end"/>
-      </w:r>
+      <w:fldSimple w:instr=" SEQ Slika \* ARABIC \s 1 ">
+        <w:r>
+          <w:rPr>
+            <w:noProof/>
+          </w:rPr>
+          <w:t>2</w:t>
+        </w:r>
+      </w:fldSimple>
       <w:r>
         <w:t xml:space="preserve">: Graf prepotovane </w:t>
       </w:r>
-      <w:bookmarkEnd w:id="63"/>
+      <w:bookmarkEnd w:id="67"/>
       <w:r>
         <w:t>razdalje</w:t>
       </w:r>
       <w:r>
         <w:t xml:space="preserve"> za vsako ponovitev</w:t>
       </w:r>
-      <w:bookmarkEnd w:id="64"/>
+      <w:bookmarkEnd w:id="68"/>
     </w:p>
     <w:p/>
     <w:p>
@@ -16509,7 +17449,7 @@
                     <pic:cNvPicPr/>
                   </pic:nvPicPr>
                   <pic:blipFill>
-                    <a:blip r:embed="rId43"/>
+                    <a:blip r:embed="rId48"/>
                     <a:stretch>
                       <a:fillRect/>
                     </a:stretch>
@@ -16534,82 +17474,56 @@
       <w:pPr>
         <w:pStyle w:val="Caption"/>
       </w:pPr>
-      <w:bookmarkStart w:id="65" w:name="_Ref221966277"/>
-      <w:bookmarkStart w:id="66" w:name="_Ref221967533"/>
-      <w:bookmarkStart w:id="67" w:name="_Ref221968150"/>
-      <w:bookmarkStart w:id="68" w:name="_Toc225594009"/>
+      <w:bookmarkStart w:id="69" w:name="_Ref221966277"/>
+      <w:bookmarkStart w:id="70" w:name="_Ref221967533"/>
+      <w:bookmarkStart w:id="71" w:name="_Ref221968150"/>
+      <w:bookmarkStart w:id="72" w:name="_Toc225594009"/>
       <w:r>
         <w:t xml:space="preserve">Slika </w:t>
       </w:r>
-      <w:r>
-        <w:fldChar w:fldCharType="begin"/>
-      </w:r>
-      <w:r>
-        <w:instrText xml:space="preserve"> STYLEREF 1 \s </w:instrText>
-      </w:r>
-      <w:r>
-        <w:fldChar w:fldCharType="separate"/>
-      </w:r>
-      <w:r>
-        <w:rPr>
-          <w:noProof/>
-        </w:rPr>
-        <w:t>6</w:t>
-      </w:r>
-      <w:r>
-        <w:rPr>
-          <w:noProof/>
-        </w:rPr>
-        <w:fldChar w:fldCharType="end"/>
-      </w:r>
+      <w:fldSimple w:instr=" STYLEREF 1 \s ">
+        <w:r>
+          <w:rPr>
+            <w:noProof/>
+          </w:rPr>
+          <w:t>6</w:t>
+        </w:r>
+      </w:fldSimple>
       <w:r>
         <w:t>.</w:t>
       </w:r>
-      <w:r>
-        <w:fldChar w:fldCharType="begin"/>
-      </w:r>
-      <w:r>
-        <w:instrText xml:space="preserve"> SEQ Slika \* ARABIC \s 1 </w:instrText>
-      </w:r>
-      <w:r>
-        <w:fldChar w:fldCharType="separate"/>
-      </w:r>
-      <w:r>
-        <w:rPr>
-          <w:noProof/>
-        </w:rPr>
-        <w:t>3</w:t>
-      </w:r>
-      <w:r>
-        <w:rPr>
-          <w:noProof/>
-        </w:rPr>
-        <w:fldChar w:fldCharType="end"/>
-      </w:r>
+      <w:fldSimple w:instr=" SEQ Slika \* ARABIC \s 1 ">
+        <w:r>
+          <w:rPr>
+            <w:noProof/>
+          </w:rPr>
+          <w:t>3</w:t>
+        </w:r>
+      </w:fldSimple>
       <w:r>
         <w:t>: Graf hitrosti</w:t>
       </w:r>
-      <w:bookmarkEnd w:id="65"/>
+      <w:bookmarkEnd w:id="69"/>
       <w:r>
         <w:t xml:space="preserve"> v koncentrični fazi</w:t>
       </w:r>
-      <w:bookmarkEnd w:id="66"/>
-      <w:bookmarkEnd w:id="67"/>
+      <w:bookmarkEnd w:id="70"/>
+      <w:bookmarkEnd w:id="71"/>
       <w:r>
         <w:t xml:space="preserve"> za vsako ponovitev</w:t>
       </w:r>
-      <w:bookmarkEnd w:id="68"/>
+      <w:bookmarkEnd w:id="72"/>
     </w:p>
     <w:p>
       <w:pPr>
         <w:pStyle w:val="Heading3"/>
       </w:pPr>
-      <w:bookmarkStart w:id="69" w:name="_Toc225593996"/>
+      <w:bookmarkStart w:id="73" w:name="_Toc225593996"/>
       <w:r>
         <w:lastRenderedPageBreak/>
         <w:t>Informacije o nepravilni drži telesa</w:t>
       </w:r>
-      <w:bookmarkEnd w:id="69"/>
+      <w:bookmarkEnd w:id="73"/>
     </w:p>
     <w:p>
       <w:r>
@@ -16669,11 +17583,11 @@
       <w:pPr>
         <w:pStyle w:val="Heading2"/>
       </w:pPr>
-      <w:bookmarkStart w:id="70" w:name="_Toc225593997"/>
+      <w:bookmarkStart w:id="74" w:name="_Toc225593997"/>
       <w:r>
         <w:t>Kalibracija uporabnika</w:t>
       </w:r>
-      <w:bookmarkEnd w:id="70"/>
+      <w:bookmarkEnd w:id="74"/>
     </w:p>
     <w:p>
       <w:r>
@@ -16760,24 +17674,24 @@
       <w:pPr>
         <w:pStyle w:val="Heading2"/>
       </w:pPr>
-      <w:bookmarkStart w:id="71" w:name="_Toc225593998"/>
+      <w:bookmarkStart w:id="75" w:name="_Toc225593998"/>
       <w:r>
         <w:t xml:space="preserve">Merjenje </w:t>
       </w:r>
       <w:r>
         <w:t>višine skoka</w:t>
       </w:r>
-      <w:bookmarkEnd w:id="71"/>
+      <w:bookmarkEnd w:id="75"/>
     </w:p>
     <w:p>
       <w:pPr>
         <w:pStyle w:val="Heading2"/>
       </w:pPr>
-      <w:bookmarkStart w:id="72" w:name="_Toc225593999"/>
+      <w:bookmarkStart w:id="76" w:name="_Toc225593999"/>
       <w:r>
         <w:t>Uporaba izmerjenih podatkov med analizo in pomen treninga na podlagi hitrosti</w:t>
       </w:r>
-      <w:bookmarkEnd w:id="72"/>
+      <w:bookmarkEnd w:id="76"/>
     </w:p>
     <w:p>
       <w:r>
@@ -16797,7 +17711,7 @@
       <w:pPr>
         <w:pStyle w:val="Heading3"/>
       </w:pPr>
-      <w:bookmarkStart w:id="73" w:name="_Toc225594000"/>
+      <w:bookmarkStart w:id="77" w:name="_Toc225594000"/>
       <w:r>
         <w:lastRenderedPageBreak/>
         <w:t xml:space="preserve">Primerjava ponovitev znotraj </w:t>
@@ -16808,7 +17722,7 @@
       <w:r>
         <w:t>serije</w:t>
       </w:r>
-      <w:bookmarkEnd w:id="73"/>
+      <w:bookmarkEnd w:id="77"/>
     </w:p>
     <w:p>
       <w:r>
@@ -16947,11 +17861,11 @@
       <w:pPr>
         <w:pStyle w:val="Heading3"/>
       </w:pPr>
-      <w:bookmarkStart w:id="74" w:name="_Toc225594001"/>
+      <w:bookmarkStart w:id="78" w:name="_Toc225594001"/>
       <w:r>
         <w:t>Trening na podlagi hitrosti</w:t>
       </w:r>
-      <w:bookmarkEnd w:id="74"/>
+      <w:bookmarkEnd w:id="78"/>
     </w:p>
     <w:p>
       <w:r>
@@ -17088,7 +18002,7 @@
       <w:pPr>
         <w:pStyle w:val="Heading3"/>
       </w:pPr>
-      <w:bookmarkStart w:id="75" w:name="_Toc225594002"/>
+      <w:bookmarkStart w:id="79" w:name="_Toc225594002"/>
       <w:r>
         <w:lastRenderedPageBreak/>
         <w:t>Primerjava med treningi</w:t>
@@ -17096,7 +18010,7 @@
       <w:r>
         <w:t xml:space="preserve"> skozi čas</w:t>
       </w:r>
-      <w:bookmarkEnd w:id="75"/>
+      <w:bookmarkEnd w:id="79"/>
     </w:p>
     <w:p>
       <w:r>
@@ -17442,7 +18356,7 @@
     </w:p>
     <w:p/>
     <w:sectPr>
-      <w:headerReference w:type="default" r:id="rId44"/>
+      <w:headerReference w:type="default" r:id="rId49"/>
       <w:pgSz w:w="11901" w:h="16834" w:code="9"/>
       <w:pgMar w:top="1701" w:right="1418" w:bottom="1701" w:left="1985" w:header="709" w:footer="709" w:gutter="0"/>
       <w:pgNumType w:start="1"/>
@@ -17503,7 +18417,13 @@
       <w:rPr>
         <w:lang w:val="sl-SI"/>
       </w:rPr>
-      <w:t>18</w:t>
+      <w:t>1</w:t>
+    </w:r>
+    <w:r>
+      <w:rPr>
+        <w:lang w:val="sl-SI"/>
+      </w:rPr>
+      <w:t>8</w:t>
     </w:r>
     <w:r>
       <w:rPr>
@@ -20368,6 +21288,119 @@
     </w:lvl>
   </w:abstractNum>
   <w:abstractNum w:abstractNumId="23" w15:restartNumberingAfterBreak="0">
+    <w:nsid w:val="272457CC"/>
+    <w:multiLevelType w:val="hybridMultilevel"/>
+    <w:tmpl w:val="E61690BE"/>
+    <w:lvl w:ilvl="0" w:tplc="20000001">
+      <w:start w:val="1"/>
+      <w:numFmt w:val="bullet"/>
+      <w:lvlText w:val=""/>
+      <w:lvlJc w:val="left"/>
+      <w:pPr>
+        <w:ind w:left="720" w:hanging="360"/>
+      </w:pPr>
+      <w:rPr>
+        <w:rFonts w:ascii="Symbol" w:hAnsi="Symbol" w:hint="default"/>
+      </w:rPr>
+    </w:lvl>
+    <w:lvl w:ilvl="1" w:tplc="20000003" w:tentative="1">
+      <w:start w:val="1"/>
+      <w:numFmt w:val="bullet"/>
+      <w:lvlText w:val="o"/>
+      <w:lvlJc w:val="left"/>
+      <w:pPr>
+        <w:ind w:left="1440" w:hanging="360"/>
+      </w:pPr>
+      <w:rPr>
+        <w:rFonts w:ascii="Courier New" w:hAnsi="Courier New" w:cs="Courier New" w:hint="default"/>
+      </w:rPr>
+    </w:lvl>
+    <w:lvl w:ilvl="2" w:tplc="20000005" w:tentative="1">
+      <w:start w:val="1"/>
+      <w:numFmt w:val="bullet"/>
+      <w:lvlText w:val=""/>
+      <w:lvlJc w:val="left"/>
+      <w:pPr>
+        <w:ind w:left="2160" w:hanging="360"/>
+      </w:pPr>
+      <w:rPr>
+        <w:rFonts w:ascii="Wingdings" w:hAnsi="Wingdings" w:hint="default"/>
+      </w:rPr>
+    </w:lvl>
+    <w:lvl w:ilvl="3" w:tplc="20000001" w:tentative="1">
+      <w:start w:val="1"/>
+      <w:numFmt w:val="bullet"/>
+      <w:lvlText w:val=""/>
+      <w:lvlJc w:val="left"/>
+      <w:pPr>
+        <w:ind w:left="2880" w:hanging="360"/>
+      </w:pPr>
+      <w:rPr>
+        <w:rFonts w:ascii="Symbol" w:hAnsi="Symbol" w:hint="default"/>
+      </w:rPr>
+    </w:lvl>
+    <w:lvl w:ilvl="4" w:tplc="20000003" w:tentative="1">
+      <w:start w:val="1"/>
+      <w:numFmt w:val="bullet"/>
+      <w:lvlText w:val="o"/>
+      <w:lvlJc w:val="left"/>
+      <w:pPr>
+        <w:ind w:left="3600" w:hanging="360"/>
+      </w:pPr>
+      <w:rPr>
+        <w:rFonts w:ascii="Courier New" w:hAnsi="Courier New" w:cs="Courier New" w:hint="default"/>
+      </w:rPr>
+    </w:lvl>
+    <w:lvl w:ilvl="5" w:tplc="20000005" w:tentative="1">
+      <w:start w:val="1"/>
+      <w:numFmt w:val="bullet"/>
+      <w:lvlText w:val=""/>
+      <w:lvlJc w:val="left"/>
+      <w:pPr>
+        <w:ind w:left="4320" w:hanging="360"/>
+      </w:pPr>
+      <w:rPr>
+        <w:rFonts w:ascii="Wingdings" w:hAnsi="Wingdings" w:hint="default"/>
+      </w:rPr>
+    </w:lvl>
+    <w:lvl w:ilvl="6" w:tplc="20000001" w:tentative="1">
+      <w:start w:val="1"/>
+      <w:numFmt w:val="bullet"/>
+      <w:lvlText w:val=""/>
+      <w:lvlJc w:val="left"/>
+      <w:pPr>
+        <w:ind w:left="5040" w:hanging="360"/>
+      </w:pPr>
+      <w:rPr>
+        <w:rFonts w:ascii="Symbol" w:hAnsi="Symbol" w:hint="default"/>
+      </w:rPr>
+    </w:lvl>
+    <w:lvl w:ilvl="7" w:tplc="20000003" w:tentative="1">
+      <w:start w:val="1"/>
+      <w:numFmt w:val="bullet"/>
+      <w:lvlText w:val="o"/>
+      <w:lvlJc w:val="left"/>
+      <w:pPr>
+        <w:ind w:left="5760" w:hanging="360"/>
+      </w:pPr>
+      <w:rPr>
+        <w:rFonts w:ascii="Courier New" w:hAnsi="Courier New" w:cs="Courier New" w:hint="default"/>
+      </w:rPr>
+    </w:lvl>
+    <w:lvl w:ilvl="8" w:tplc="20000005" w:tentative="1">
+      <w:start w:val="1"/>
+      <w:numFmt w:val="bullet"/>
+      <w:lvlText w:val=""/>
+      <w:lvlJc w:val="left"/>
+      <w:pPr>
+        <w:ind w:left="6480" w:hanging="360"/>
+      </w:pPr>
+      <w:rPr>
+        <w:rFonts w:ascii="Wingdings" w:hAnsi="Wingdings" w:hint="default"/>
+      </w:rPr>
+    </w:lvl>
+  </w:abstractNum>
+  <w:abstractNum w:abstractNumId="24" w15:restartNumberingAfterBreak="0">
     <w:nsid w:val="2A2506EB"/>
     <w:multiLevelType w:val="hybridMultilevel"/>
     <w:tmpl w:val="31C47450"/>
@@ -20484,7 +21517,7 @@
       </w:rPr>
     </w:lvl>
   </w:abstractNum>
-  <w:abstractNum w:abstractNumId="24" w15:restartNumberingAfterBreak="0">
+  <w:abstractNum w:abstractNumId="25" w15:restartNumberingAfterBreak="0">
     <w:nsid w:val="2FFA4276"/>
     <w:multiLevelType w:val="hybridMultilevel"/>
     <w:tmpl w:val="AD9CC612"/>
@@ -20597,7 +21630,233 @@
       </w:rPr>
     </w:lvl>
   </w:abstractNum>
-  <w:abstractNum w:abstractNumId="25" w15:restartNumberingAfterBreak="0">
+  <w:abstractNum w:abstractNumId="26" w15:restartNumberingAfterBreak="0">
+    <w:nsid w:val="321F7E4C"/>
+    <w:multiLevelType w:val="hybridMultilevel"/>
+    <w:tmpl w:val="0B1A4100"/>
+    <w:lvl w:ilvl="0" w:tplc="20000001">
+      <w:start w:val="1"/>
+      <w:numFmt w:val="bullet"/>
+      <w:lvlText w:val=""/>
+      <w:lvlJc w:val="left"/>
+      <w:pPr>
+        <w:ind w:left="720" w:hanging="360"/>
+      </w:pPr>
+      <w:rPr>
+        <w:rFonts w:ascii="Symbol" w:hAnsi="Symbol" w:hint="default"/>
+      </w:rPr>
+    </w:lvl>
+    <w:lvl w:ilvl="1" w:tplc="20000003" w:tentative="1">
+      <w:start w:val="1"/>
+      <w:numFmt w:val="bullet"/>
+      <w:lvlText w:val="o"/>
+      <w:lvlJc w:val="left"/>
+      <w:pPr>
+        <w:ind w:left="1440" w:hanging="360"/>
+      </w:pPr>
+      <w:rPr>
+        <w:rFonts w:ascii="Courier New" w:hAnsi="Courier New" w:cs="Courier New" w:hint="default"/>
+      </w:rPr>
+    </w:lvl>
+    <w:lvl w:ilvl="2" w:tplc="20000005" w:tentative="1">
+      <w:start w:val="1"/>
+      <w:numFmt w:val="bullet"/>
+      <w:lvlText w:val=""/>
+      <w:lvlJc w:val="left"/>
+      <w:pPr>
+        <w:ind w:left="2160" w:hanging="360"/>
+      </w:pPr>
+      <w:rPr>
+        <w:rFonts w:ascii="Wingdings" w:hAnsi="Wingdings" w:hint="default"/>
+      </w:rPr>
+    </w:lvl>
+    <w:lvl w:ilvl="3" w:tplc="20000001" w:tentative="1">
+      <w:start w:val="1"/>
+      <w:numFmt w:val="bullet"/>
+      <w:lvlText w:val=""/>
+      <w:lvlJc w:val="left"/>
+      <w:pPr>
+        <w:ind w:left="2880" w:hanging="360"/>
+      </w:pPr>
+      <w:rPr>
+        <w:rFonts w:ascii="Symbol" w:hAnsi="Symbol" w:hint="default"/>
+      </w:rPr>
+    </w:lvl>
+    <w:lvl w:ilvl="4" w:tplc="20000003" w:tentative="1">
+      <w:start w:val="1"/>
+      <w:numFmt w:val="bullet"/>
+      <w:lvlText w:val="o"/>
+      <w:lvlJc w:val="left"/>
+      <w:pPr>
+        <w:ind w:left="3600" w:hanging="360"/>
+      </w:pPr>
+      <w:rPr>
+        <w:rFonts w:ascii="Courier New" w:hAnsi="Courier New" w:cs="Courier New" w:hint="default"/>
+      </w:rPr>
+    </w:lvl>
+    <w:lvl w:ilvl="5" w:tplc="20000005" w:tentative="1">
+      <w:start w:val="1"/>
+      <w:numFmt w:val="bullet"/>
+      <w:lvlText w:val=""/>
+      <w:lvlJc w:val="left"/>
+      <w:pPr>
+        <w:ind w:left="4320" w:hanging="360"/>
+      </w:pPr>
+      <w:rPr>
+        <w:rFonts w:ascii="Wingdings" w:hAnsi="Wingdings" w:hint="default"/>
+      </w:rPr>
+    </w:lvl>
+    <w:lvl w:ilvl="6" w:tplc="20000001" w:tentative="1">
+      <w:start w:val="1"/>
+      <w:numFmt w:val="bullet"/>
+      <w:lvlText w:val=""/>
+      <w:lvlJc w:val="left"/>
+      <w:pPr>
+        <w:ind w:left="5040" w:hanging="360"/>
+      </w:pPr>
+      <w:rPr>
+        <w:rFonts w:ascii="Symbol" w:hAnsi="Symbol" w:hint="default"/>
+      </w:rPr>
+    </w:lvl>
+    <w:lvl w:ilvl="7" w:tplc="20000003" w:tentative="1">
+      <w:start w:val="1"/>
+      <w:numFmt w:val="bullet"/>
+      <w:lvlText w:val="o"/>
+      <w:lvlJc w:val="left"/>
+      <w:pPr>
+        <w:ind w:left="5760" w:hanging="360"/>
+      </w:pPr>
+      <w:rPr>
+        <w:rFonts w:ascii="Courier New" w:hAnsi="Courier New" w:cs="Courier New" w:hint="default"/>
+      </w:rPr>
+    </w:lvl>
+    <w:lvl w:ilvl="8" w:tplc="20000005" w:tentative="1">
+      <w:start w:val="1"/>
+      <w:numFmt w:val="bullet"/>
+      <w:lvlText w:val=""/>
+      <w:lvlJc w:val="left"/>
+      <w:pPr>
+        <w:ind w:left="6480" w:hanging="360"/>
+      </w:pPr>
+      <w:rPr>
+        <w:rFonts w:ascii="Wingdings" w:hAnsi="Wingdings" w:hint="default"/>
+      </w:rPr>
+    </w:lvl>
+  </w:abstractNum>
+  <w:abstractNum w:abstractNumId="27" w15:restartNumberingAfterBreak="0">
+    <w:nsid w:val="3322599A"/>
+    <w:multiLevelType w:val="hybridMultilevel"/>
+    <w:tmpl w:val="E46452AA"/>
+    <w:lvl w:ilvl="0" w:tplc="20000001">
+      <w:start w:val="1"/>
+      <w:numFmt w:val="bullet"/>
+      <w:lvlText w:val=""/>
+      <w:lvlJc w:val="left"/>
+      <w:pPr>
+        <w:ind w:left="720" w:hanging="360"/>
+      </w:pPr>
+      <w:rPr>
+        <w:rFonts w:ascii="Symbol" w:hAnsi="Symbol" w:hint="default"/>
+      </w:rPr>
+    </w:lvl>
+    <w:lvl w:ilvl="1" w:tplc="20000003" w:tentative="1">
+      <w:start w:val="1"/>
+      <w:numFmt w:val="bullet"/>
+      <w:lvlText w:val="o"/>
+      <w:lvlJc w:val="left"/>
+      <w:pPr>
+        <w:ind w:left="1440" w:hanging="360"/>
+      </w:pPr>
+      <w:rPr>
+        <w:rFonts w:ascii="Courier New" w:hAnsi="Courier New" w:cs="Courier New" w:hint="default"/>
+      </w:rPr>
+    </w:lvl>
+    <w:lvl w:ilvl="2" w:tplc="20000005" w:tentative="1">
+      <w:start w:val="1"/>
+      <w:numFmt w:val="bullet"/>
+      <w:lvlText w:val=""/>
+      <w:lvlJc w:val="left"/>
+      <w:pPr>
+        <w:ind w:left="2160" w:hanging="360"/>
+      </w:pPr>
+      <w:rPr>
+        <w:rFonts w:ascii="Wingdings" w:hAnsi="Wingdings" w:hint="default"/>
+      </w:rPr>
+    </w:lvl>
+    <w:lvl w:ilvl="3" w:tplc="20000001" w:tentative="1">
+      <w:start w:val="1"/>
+      <w:numFmt w:val="bullet"/>
+      <w:lvlText w:val=""/>
+      <w:lvlJc w:val="left"/>
+      <w:pPr>
+        <w:ind w:left="2880" w:hanging="360"/>
+      </w:pPr>
+      <w:rPr>
+        <w:rFonts w:ascii="Symbol" w:hAnsi="Symbol" w:hint="default"/>
+      </w:rPr>
+    </w:lvl>
+    <w:lvl w:ilvl="4" w:tplc="20000003" w:tentative="1">
+      <w:start w:val="1"/>
+      <w:numFmt w:val="bullet"/>
+      <w:lvlText w:val="o"/>
+      <w:lvlJc w:val="left"/>
+      <w:pPr>
+        <w:ind w:left="3600" w:hanging="360"/>
+      </w:pPr>
+      <w:rPr>
+        <w:rFonts w:ascii="Courier New" w:hAnsi="Courier New" w:cs="Courier New" w:hint="default"/>
+      </w:rPr>
+    </w:lvl>
+    <w:lvl w:ilvl="5" w:tplc="20000005" w:tentative="1">
+      <w:start w:val="1"/>
+      <w:numFmt w:val="bullet"/>
+      <w:lvlText w:val=""/>
+      <w:lvlJc w:val="left"/>
+      <w:pPr>
+        <w:ind w:left="4320" w:hanging="360"/>
+      </w:pPr>
+      <w:rPr>
+        <w:rFonts w:ascii="Wingdings" w:hAnsi="Wingdings" w:hint="default"/>
+      </w:rPr>
+    </w:lvl>
+    <w:lvl w:ilvl="6" w:tplc="20000001" w:tentative="1">
+      <w:start w:val="1"/>
+      <w:numFmt w:val="bullet"/>
+      <w:lvlText w:val=""/>
+      <w:lvlJc w:val="left"/>
+      <w:pPr>
+        <w:ind w:left="5040" w:hanging="360"/>
+      </w:pPr>
+      <w:rPr>
+        <w:rFonts w:ascii="Symbol" w:hAnsi="Symbol" w:hint="default"/>
+      </w:rPr>
+    </w:lvl>
+    <w:lvl w:ilvl="7" w:tplc="20000003" w:tentative="1">
+      <w:start w:val="1"/>
+      <w:numFmt w:val="bullet"/>
+      <w:lvlText w:val="o"/>
+      <w:lvlJc w:val="left"/>
+      <w:pPr>
+        <w:ind w:left="5760" w:hanging="360"/>
+      </w:pPr>
+      <w:rPr>
+        <w:rFonts w:ascii="Courier New" w:hAnsi="Courier New" w:cs="Courier New" w:hint="default"/>
+      </w:rPr>
+    </w:lvl>
+    <w:lvl w:ilvl="8" w:tplc="20000005" w:tentative="1">
+      <w:start w:val="1"/>
+      <w:numFmt w:val="bullet"/>
+      <w:lvlText w:val=""/>
+      <w:lvlJc w:val="left"/>
+      <w:pPr>
+        <w:ind w:left="6480" w:hanging="360"/>
+      </w:pPr>
+      <w:rPr>
+        <w:rFonts w:ascii="Wingdings" w:hAnsi="Wingdings" w:hint="default"/>
+      </w:rPr>
+    </w:lvl>
+  </w:abstractNum>
+  <w:abstractNum w:abstractNumId="28" w15:restartNumberingAfterBreak="0">
     <w:nsid w:val="33BE4792"/>
     <w:multiLevelType w:val="hybridMultilevel"/>
     <w:tmpl w:val="0368EF64"/>
@@ -20737,7 +21996,7 @@
       </w:rPr>
     </w:lvl>
   </w:abstractNum>
-  <w:abstractNum w:abstractNumId="26" w15:restartNumberingAfterBreak="0">
+  <w:abstractNum w:abstractNumId="29" w15:restartNumberingAfterBreak="0">
     <w:nsid w:val="367C600F"/>
     <w:multiLevelType w:val="multilevel"/>
     <w:tmpl w:val="66F66ADC"/>
@@ -20888,7 +22147,7 @@
       </w:rPr>
     </w:lvl>
   </w:abstractNum>
-  <w:abstractNum w:abstractNumId="27" w15:restartNumberingAfterBreak="0">
+  <w:abstractNum w:abstractNumId="30" w15:restartNumberingAfterBreak="0">
     <w:nsid w:val="3D081AB8"/>
     <w:multiLevelType w:val="hybridMultilevel"/>
     <w:tmpl w:val="12163E56"/>
@@ -21001,7 +22260,7 @@
       </w:rPr>
     </w:lvl>
   </w:abstractNum>
-  <w:abstractNum w:abstractNumId="28" w15:restartNumberingAfterBreak="0">
+  <w:abstractNum w:abstractNumId="31" w15:restartNumberingAfterBreak="0">
     <w:nsid w:val="3E754FB9"/>
     <w:multiLevelType w:val="hybridMultilevel"/>
     <w:tmpl w:val="5B2E8608"/>
@@ -21113,7 +22372,7 @@
       </w:rPr>
     </w:lvl>
   </w:abstractNum>
-  <w:abstractNum w:abstractNumId="29" w15:restartNumberingAfterBreak="0">
+  <w:abstractNum w:abstractNumId="32" w15:restartNumberingAfterBreak="0">
     <w:nsid w:val="3E7F57E5"/>
     <w:multiLevelType w:val="hybridMultilevel"/>
     <w:tmpl w:val="515A5522"/>
@@ -21226,7 +22485,7 @@
       </w:rPr>
     </w:lvl>
   </w:abstractNum>
-  <w:abstractNum w:abstractNumId="30" w15:restartNumberingAfterBreak="0">
+  <w:abstractNum w:abstractNumId="33" w15:restartNumberingAfterBreak="0">
     <w:nsid w:val="40117AB4"/>
     <w:multiLevelType w:val="singleLevel"/>
     <w:tmpl w:val="0424000F"/>
@@ -21246,7 +22505,7 @@
       </w:rPr>
     </w:lvl>
   </w:abstractNum>
-  <w:abstractNum w:abstractNumId="31" w15:restartNumberingAfterBreak="0">
+  <w:abstractNum w:abstractNumId="34" w15:restartNumberingAfterBreak="0">
     <w:nsid w:val="44386100"/>
     <w:multiLevelType w:val="hybridMultilevel"/>
     <w:tmpl w:val="15BAF672"/>
@@ -21359,7 +22618,7 @@
       </w:rPr>
     </w:lvl>
   </w:abstractNum>
-  <w:abstractNum w:abstractNumId="32" w15:restartNumberingAfterBreak="0">
+  <w:abstractNum w:abstractNumId="35" w15:restartNumberingAfterBreak="0">
     <w:nsid w:val="44CD2EE9"/>
     <w:multiLevelType w:val="hybridMultilevel"/>
     <w:tmpl w:val="AD32F244"/>
@@ -21472,7 +22731,7 @@
       </w:rPr>
     </w:lvl>
   </w:abstractNum>
-  <w:abstractNum w:abstractNumId="33" w15:restartNumberingAfterBreak="0">
+  <w:abstractNum w:abstractNumId="36" w15:restartNumberingAfterBreak="0">
     <w:nsid w:val="45F04156"/>
     <w:multiLevelType w:val="hybridMultilevel"/>
     <w:tmpl w:val="8648D69E"/>
@@ -21585,7 +22844,7 @@
       </w:rPr>
     </w:lvl>
   </w:abstractNum>
-  <w:abstractNum w:abstractNumId="34" w15:restartNumberingAfterBreak="0">
+  <w:abstractNum w:abstractNumId="37" w15:restartNumberingAfterBreak="0">
     <w:nsid w:val="489362F3"/>
     <w:multiLevelType w:val="hybridMultilevel"/>
     <w:tmpl w:val="A8EE65A4"/>
@@ -21698,7 +22957,7 @@
       </w:rPr>
     </w:lvl>
   </w:abstractNum>
-  <w:abstractNum w:abstractNumId="35" w15:restartNumberingAfterBreak="0">
+  <w:abstractNum w:abstractNumId="38" w15:restartNumberingAfterBreak="0">
     <w:nsid w:val="4B221AD8"/>
     <w:multiLevelType w:val="hybridMultilevel"/>
     <w:tmpl w:val="FB58206E"/>
@@ -21811,7 +23070,7 @@
       </w:rPr>
     </w:lvl>
   </w:abstractNum>
-  <w:abstractNum w:abstractNumId="36" w15:restartNumberingAfterBreak="0">
+  <w:abstractNum w:abstractNumId="39" w15:restartNumberingAfterBreak="0">
     <w:nsid w:val="4D737F36"/>
     <w:multiLevelType w:val="hybridMultilevel"/>
     <w:tmpl w:val="2FCADFCC"/>
@@ -21924,7 +23183,7 @@
       </w:rPr>
     </w:lvl>
   </w:abstractNum>
-  <w:abstractNum w:abstractNumId="37" w15:restartNumberingAfterBreak="0">
+  <w:abstractNum w:abstractNumId="40" w15:restartNumberingAfterBreak="0">
     <w:nsid w:val="56210033"/>
     <w:multiLevelType w:val="hybridMultilevel"/>
     <w:tmpl w:val="B834133E"/>
@@ -22037,7 +23296,7 @@
       </w:rPr>
     </w:lvl>
   </w:abstractNum>
-  <w:abstractNum w:abstractNumId="38" w15:restartNumberingAfterBreak="0">
+  <w:abstractNum w:abstractNumId="41" w15:restartNumberingAfterBreak="0">
     <w:nsid w:val="566D6DDD"/>
     <w:multiLevelType w:val="hybridMultilevel"/>
     <w:tmpl w:val="E55A3D24"/>
@@ -22177,7 +23436,7 @@
       </w:rPr>
     </w:lvl>
   </w:abstractNum>
-  <w:abstractNum w:abstractNumId="39" w15:restartNumberingAfterBreak="0">
+  <w:abstractNum w:abstractNumId="42" w15:restartNumberingAfterBreak="0">
     <w:nsid w:val="56C4537D"/>
     <w:multiLevelType w:val="hybridMultilevel"/>
     <w:tmpl w:val="66485F72"/>
@@ -22290,7 +23549,7 @@
       </w:rPr>
     </w:lvl>
   </w:abstractNum>
-  <w:abstractNum w:abstractNumId="40" w15:restartNumberingAfterBreak="0">
+  <w:abstractNum w:abstractNumId="43" w15:restartNumberingAfterBreak="0">
     <w:nsid w:val="574533E9"/>
     <w:multiLevelType w:val="hybridMultilevel"/>
     <w:tmpl w:val="5B146962"/>
@@ -22402,7 +23661,7 @@
       </w:rPr>
     </w:lvl>
   </w:abstractNum>
-  <w:abstractNum w:abstractNumId="41" w15:restartNumberingAfterBreak="0">
+  <w:abstractNum w:abstractNumId="44" w15:restartNumberingAfterBreak="0">
     <w:nsid w:val="58DE7EFA"/>
     <w:multiLevelType w:val="hybridMultilevel"/>
     <w:tmpl w:val="131EA528"/>
@@ -22497,7 +23756,7 @@
       </w:pPr>
     </w:lvl>
   </w:abstractNum>
-  <w:abstractNum w:abstractNumId="42" w15:restartNumberingAfterBreak="0">
+  <w:abstractNum w:abstractNumId="45" w15:restartNumberingAfterBreak="0">
     <w:nsid w:val="5AC4619C"/>
     <w:multiLevelType w:val="hybridMultilevel"/>
     <w:tmpl w:val="DFB60A26"/>
@@ -22609,7 +23868,7 @@
       </w:rPr>
     </w:lvl>
   </w:abstractNum>
-  <w:abstractNum w:abstractNumId="43" w15:restartNumberingAfterBreak="0">
+  <w:abstractNum w:abstractNumId="46" w15:restartNumberingAfterBreak="0">
     <w:nsid w:val="5D205A4D"/>
     <w:multiLevelType w:val="hybridMultilevel"/>
     <w:tmpl w:val="09C642EA"/>
@@ -22722,7 +23981,7 @@
       </w:rPr>
     </w:lvl>
   </w:abstractNum>
-  <w:abstractNum w:abstractNumId="44" w15:restartNumberingAfterBreak="0">
+  <w:abstractNum w:abstractNumId="47" w15:restartNumberingAfterBreak="0">
     <w:nsid w:val="5D4B3E35"/>
     <w:multiLevelType w:val="hybridMultilevel"/>
     <w:tmpl w:val="63006618"/>
@@ -22835,7 +24094,7 @@
       </w:rPr>
     </w:lvl>
   </w:abstractNum>
-  <w:abstractNum w:abstractNumId="45" w15:restartNumberingAfterBreak="0">
+  <w:abstractNum w:abstractNumId="48" w15:restartNumberingAfterBreak="0">
     <w:nsid w:val="5E1C298F"/>
     <w:multiLevelType w:val="hybridMultilevel"/>
     <w:tmpl w:val="7642668E"/>
@@ -22948,7 +24207,7 @@
       </w:rPr>
     </w:lvl>
   </w:abstractNum>
-  <w:abstractNum w:abstractNumId="46" w15:restartNumberingAfterBreak="0">
+  <w:abstractNum w:abstractNumId="49" w15:restartNumberingAfterBreak="0">
     <w:nsid w:val="60CA680F"/>
     <w:multiLevelType w:val="hybridMultilevel"/>
     <w:tmpl w:val="B94AE1E6"/>
@@ -23061,7 +24320,7 @@
       </w:rPr>
     </w:lvl>
   </w:abstractNum>
-  <w:abstractNum w:abstractNumId="47" w15:restartNumberingAfterBreak="0">
+  <w:abstractNum w:abstractNumId="50" w15:restartNumberingAfterBreak="0">
     <w:nsid w:val="6103011A"/>
     <w:multiLevelType w:val="hybridMultilevel"/>
     <w:tmpl w:val="BE52C078"/>
@@ -23174,7 +24433,7 @@
       </w:rPr>
     </w:lvl>
   </w:abstractNum>
-  <w:abstractNum w:abstractNumId="48" w15:restartNumberingAfterBreak="0">
+  <w:abstractNum w:abstractNumId="51" w15:restartNumberingAfterBreak="0">
     <w:nsid w:val="613216BC"/>
     <w:multiLevelType w:val="hybridMultilevel"/>
     <w:tmpl w:val="DCD43D76"/>
@@ -23287,7 +24546,7 @@
       </w:rPr>
     </w:lvl>
   </w:abstractNum>
-  <w:abstractNum w:abstractNumId="49" w15:restartNumberingAfterBreak="0">
+  <w:abstractNum w:abstractNumId="52" w15:restartNumberingAfterBreak="0">
     <w:nsid w:val="62CA2A8F"/>
     <w:multiLevelType w:val="hybridMultilevel"/>
     <w:tmpl w:val="9E62B7C8"/>
@@ -23400,7 +24659,7 @@
       </w:rPr>
     </w:lvl>
   </w:abstractNum>
-  <w:abstractNum w:abstractNumId="50" w15:restartNumberingAfterBreak="0">
+  <w:abstractNum w:abstractNumId="53" w15:restartNumberingAfterBreak="0">
     <w:nsid w:val="642B0707"/>
     <w:multiLevelType w:val="hybridMultilevel"/>
     <w:tmpl w:val="6F824434"/>
@@ -23513,7 +24772,7 @@
       </w:rPr>
     </w:lvl>
   </w:abstractNum>
-  <w:abstractNum w:abstractNumId="51" w15:restartNumberingAfterBreak="0">
+  <w:abstractNum w:abstractNumId="54" w15:restartNumberingAfterBreak="0">
     <w:nsid w:val="657C167B"/>
     <w:multiLevelType w:val="hybridMultilevel"/>
     <w:tmpl w:val="253E1E4A"/>
@@ -23626,7 +24885,7 @@
       </w:rPr>
     </w:lvl>
   </w:abstractNum>
-  <w:abstractNum w:abstractNumId="52" w15:restartNumberingAfterBreak="0">
+  <w:abstractNum w:abstractNumId="55" w15:restartNumberingAfterBreak="0">
     <w:nsid w:val="6F112B8F"/>
     <w:multiLevelType w:val="hybridMultilevel"/>
     <w:tmpl w:val="DD189394"/>
@@ -23739,7 +24998,7 @@
       </w:rPr>
     </w:lvl>
   </w:abstractNum>
-  <w:abstractNum w:abstractNumId="53" w15:restartNumberingAfterBreak="0">
+  <w:abstractNum w:abstractNumId="56" w15:restartNumberingAfterBreak="0">
     <w:nsid w:val="6F7A5BE4"/>
     <w:multiLevelType w:val="hybridMultilevel"/>
     <w:tmpl w:val="1B76D9FC"/>
@@ -23852,7 +25111,7 @@
       </w:rPr>
     </w:lvl>
   </w:abstractNum>
-  <w:abstractNum w:abstractNumId="54" w15:restartNumberingAfterBreak="0">
+  <w:abstractNum w:abstractNumId="57" w15:restartNumberingAfterBreak="0">
     <w:nsid w:val="70624018"/>
     <w:multiLevelType w:val="hybridMultilevel"/>
     <w:tmpl w:val="225C64B6"/>
@@ -23992,7 +25251,7 @@
       </w:rPr>
     </w:lvl>
   </w:abstractNum>
-  <w:abstractNum w:abstractNumId="55" w15:restartNumberingAfterBreak="0">
+  <w:abstractNum w:abstractNumId="58" w15:restartNumberingAfterBreak="0">
     <w:nsid w:val="714F2450"/>
     <w:multiLevelType w:val="hybridMultilevel"/>
     <w:tmpl w:val="B97EC042"/>
@@ -24105,7 +25364,7 @@
       </w:rPr>
     </w:lvl>
   </w:abstractNum>
-  <w:abstractNum w:abstractNumId="56" w15:restartNumberingAfterBreak="0">
+  <w:abstractNum w:abstractNumId="59" w15:restartNumberingAfterBreak="0">
     <w:nsid w:val="74967D99"/>
     <w:multiLevelType w:val="multilevel"/>
     <w:tmpl w:val="6F1612AC"/>
@@ -24245,7 +25504,7 @@
       </w:rPr>
     </w:lvl>
   </w:abstractNum>
-  <w:abstractNum w:abstractNumId="57" w15:restartNumberingAfterBreak="0">
+  <w:abstractNum w:abstractNumId="60" w15:restartNumberingAfterBreak="0">
     <w:nsid w:val="749723B0"/>
     <w:multiLevelType w:val="hybridMultilevel"/>
     <w:tmpl w:val="BD0019CA"/>
@@ -24358,7 +25617,7 @@
       </w:rPr>
     </w:lvl>
   </w:abstractNum>
-  <w:abstractNum w:abstractNumId="58" w15:restartNumberingAfterBreak="0">
+  <w:abstractNum w:abstractNumId="61" w15:restartNumberingAfterBreak="0">
     <w:nsid w:val="780E0E44"/>
     <w:multiLevelType w:val="hybridMultilevel"/>
     <w:tmpl w:val="10468E06"/>
@@ -24471,7 +25730,120 @@
       </w:rPr>
     </w:lvl>
   </w:abstractNum>
-  <w:abstractNum w:abstractNumId="59" w15:restartNumberingAfterBreak="0">
+  <w:abstractNum w:abstractNumId="62" w15:restartNumberingAfterBreak="0">
+    <w:nsid w:val="7BAE0C3C"/>
+    <w:multiLevelType w:val="hybridMultilevel"/>
+    <w:tmpl w:val="FEB6559E"/>
+    <w:lvl w:ilvl="0" w:tplc="20000001">
+      <w:start w:val="1"/>
+      <w:numFmt w:val="bullet"/>
+      <w:lvlText w:val=""/>
+      <w:lvlJc w:val="left"/>
+      <w:pPr>
+        <w:ind w:left="720" w:hanging="360"/>
+      </w:pPr>
+      <w:rPr>
+        <w:rFonts w:ascii="Symbol" w:hAnsi="Symbol" w:hint="default"/>
+      </w:rPr>
+    </w:lvl>
+    <w:lvl w:ilvl="1" w:tplc="20000003" w:tentative="1">
+      <w:start w:val="1"/>
+      <w:numFmt w:val="bullet"/>
+      <w:lvlText w:val="o"/>
+      <w:lvlJc w:val="left"/>
+      <w:pPr>
+        <w:ind w:left="1440" w:hanging="360"/>
+      </w:pPr>
+      <w:rPr>
+        <w:rFonts w:ascii="Courier New" w:hAnsi="Courier New" w:cs="Courier New" w:hint="default"/>
+      </w:rPr>
+    </w:lvl>
+    <w:lvl w:ilvl="2" w:tplc="20000005" w:tentative="1">
+      <w:start w:val="1"/>
+      <w:numFmt w:val="bullet"/>
+      <w:lvlText w:val=""/>
+      <w:lvlJc w:val="left"/>
+      <w:pPr>
+        <w:ind w:left="2160" w:hanging="360"/>
+      </w:pPr>
+      <w:rPr>
+        <w:rFonts w:ascii="Wingdings" w:hAnsi="Wingdings" w:hint="default"/>
+      </w:rPr>
+    </w:lvl>
+    <w:lvl w:ilvl="3" w:tplc="20000001" w:tentative="1">
+      <w:start w:val="1"/>
+      <w:numFmt w:val="bullet"/>
+      <w:lvlText w:val=""/>
+      <w:lvlJc w:val="left"/>
+      <w:pPr>
+        <w:ind w:left="2880" w:hanging="360"/>
+      </w:pPr>
+      <w:rPr>
+        <w:rFonts w:ascii="Symbol" w:hAnsi="Symbol" w:hint="default"/>
+      </w:rPr>
+    </w:lvl>
+    <w:lvl w:ilvl="4" w:tplc="20000003" w:tentative="1">
+      <w:start w:val="1"/>
+      <w:numFmt w:val="bullet"/>
+      <w:lvlText w:val="o"/>
+      <w:lvlJc w:val="left"/>
+      <w:pPr>
+        <w:ind w:left="3600" w:hanging="360"/>
+      </w:pPr>
+      <w:rPr>
+        <w:rFonts w:ascii="Courier New" w:hAnsi="Courier New" w:cs="Courier New" w:hint="default"/>
+      </w:rPr>
+    </w:lvl>
+    <w:lvl w:ilvl="5" w:tplc="20000005" w:tentative="1">
+      <w:start w:val="1"/>
+      <w:numFmt w:val="bullet"/>
+      <w:lvlText w:val=""/>
+      <w:lvlJc w:val="left"/>
+      <w:pPr>
+        <w:ind w:left="4320" w:hanging="360"/>
+      </w:pPr>
+      <w:rPr>
+        <w:rFonts w:ascii="Wingdings" w:hAnsi="Wingdings" w:hint="default"/>
+      </w:rPr>
+    </w:lvl>
+    <w:lvl w:ilvl="6" w:tplc="20000001" w:tentative="1">
+      <w:start w:val="1"/>
+      <w:numFmt w:val="bullet"/>
+      <w:lvlText w:val=""/>
+      <w:lvlJc w:val="left"/>
+      <w:pPr>
+        <w:ind w:left="5040" w:hanging="360"/>
+      </w:pPr>
+      <w:rPr>
+        <w:rFonts w:ascii="Symbol" w:hAnsi="Symbol" w:hint="default"/>
+      </w:rPr>
+    </w:lvl>
+    <w:lvl w:ilvl="7" w:tplc="20000003" w:tentative="1">
+      <w:start w:val="1"/>
+      <w:numFmt w:val="bullet"/>
+      <w:lvlText w:val="o"/>
+      <w:lvlJc w:val="left"/>
+      <w:pPr>
+        <w:ind w:left="5760" w:hanging="360"/>
+      </w:pPr>
+      <w:rPr>
+        <w:rFonts w:ascii="Courier New" w:hAnsi="Courier New" w:cs="Courier New" w:hint="default"/>
+      </w:rPr>
+    </w:lvl>
+    <w:lvl w:ilvl="8" w:tplc="20000005" w:tentative="1">
+      <w:start w:val="1"/>
+      <w:numFmt w:val="bullet"/>
+      <w:lvlText w:val=""/>
+      <w:lvlJc w:val="left"/>
+      <w:pPr>
+        <w:ind w:left="6480" w:hanging="360"/>
+      </w:pPr>
+      <w:rPr>
+        <w:rFonts w:ascii="Wingdings" w:hAnsi="Wingdings" w:hint="default"/>
+      </w:rPr>
+    </w:lvl>
+  </w:abstractNum>
+  <w:abstractNum w:abstractNumId="63" w15:restartNumberingAfterBreak="0">
     <w:nsid w:val="7EBE0D6C"/>
     <w:multiLevelType w:val="hybridMultilevel"/>
     <w:tmpl w:val="1EEE1B76"/>
@@ -24585,16 +25957,16 @@
     </w:lvl>
   </w:abstractNum>
   <w:num w:numId="1" w16cid:durableId="1616982145">
-    <w:abstractNumId w:val="26"/>
+    <w:abstractNumId w:val="29"/>
   </w:num>
   <w:num w:numId="2" w16cid:durableId="1563980195">
     <w:abstractNumId w:val="20"/>
   </w:num>
   <w:num w:numId="3" w16cid:durableId="574165386">
-    <w:abstractNumId w:val="25"/>
+    <w:abstractNumId w:val="28"/>
   </w:num>
   <w:num w:numId="4" w16cid:durableId="1982886481">
-    <w:abstractNumId w:val="38"/>
+    <w:abstractNumId w:val="41"/>
     <w:lvlOverride w:ilvl="0"/>
     <w:lvlOverride w:ilvl="1">
       <w:startOverride w:val="1"/>
@@ -24625,10 +25997,10 @@
     <w:abstractNumId w:val="11"/>
   </w:num>
   <w:num w:numId="6" w16cid:durableId="413548033">
-    <w:abstractNumId w:val="54"/>
+    <w:abstractNumId w:val="57"/>
   </w:num>
   <w:num w:numId="7" w16cid:durableId="2517385">
-    <w:abstractNumId w:val="52"/>
+    <w:abstractNumId w:val="55"/>
   </w:num>
   <w:num w:numId="8" w16cid:durableId="1673027270">
     <w:abstractNumId w:val="21"/>
@@ -24637,28 +26009,28 @@
     <w:abstractNumId w:val="7"/>
   </w:num>
   <w:num w:numId="10" w16cid:durableId="642394832">
-    <w:abstractNumId w:val="37"/>
+    <w:abstractNumId w:val="40"/>
   </w:num>
   <w:num w:numId="11" w16cid:durableId="879364368">
     <w:abstractNumId w:val="17"/>
   </w:num>
   <w:num w:numId="12" w16cid:durableId="1154762435">
-    <w:abstractNumId w:val="45"/>
+    <w:abstractNumId w:val="48"/>
   </w:num>
   <w:num w:numId="13" w16cid:durableId="1050419267">
-    <w:abstractNumId w:val="49"/>
+    <w:abstractNumId w:val="52"/>
   </w:num>
   <w:num w:numId="14" w16cid:durableId="1990405806">
     <w:abstractNumId w:val="12"/>
   </w:num>
   <w:num w:numId="15" w16cid:durableId="1546913352">
-    <w:abstractNumId w:val="50"/>
+    <w:abstractNumId w:val="53"/>
   </w:num>
   <w:num w:numId="16" w16cid:durableId="1318874548">
-    <w:abstractNumId w:val="56"/>
+    <w:abstractNumId w:val="59"/>
   </w:num>
   <w:num w:numId="17" w16cid:durableId="722215861">
-    <w:abstractNumId w:val="56"/>
+    <w:abstractNumId w:val="59"/>
     <w:lvlOverride w:ilvl="0">
       <w:startOverride w:val="1"/>
     </w:lvlOverride>
@@ -24688,7 +26060,7 @@
     </w:lvlOverride>
   </w:num>
   <w:num w:numId="18" w16cid:durableId="415446333">
-    <w:abstractNumId w:val="56"/>
+    <w:abstractNumId w:val="59"/>
     <w:lvlOverride w:ilvl="0">
       <w:startOverride w:val="1"/>
     </w:lvlOverride>
@@ -24718,7 +26090,7 @@
     </w:lvlOverride>
   </w:num>
   <w:num w:numId="19" w16cid:durableId="1966346266">
-    <w:abstractNumId w:val="56"/>
+    <w:abstractNumId w:val="59"/>
     <w:lvlOverride w:ilvl="0">
       <w:startOverride w:val="1"/>
     </w:lvlOverride>
@@ -24748,7 +26120,7 @@
     </w:lvlOverride>
   </w:num>
   <w:num w:numId="20" w16cid:durableId="985356155">
-    <w:abstractNumId w:val="56"/>
+    <w:abstractNumId w:val="59"/>
     <w:lvlOverride w:ilvl="0">
       <w:startOverride w:val="1"/>
     </w:lvlOverride>
@@ -24778,7 +26150,7 @@
     </w:lvlOverride>
   </w:num>
   <w:num w:numId="21" w16cid:durableId="971326932">
-    <w:abstractNumId w:val="56"/>
+    <w:abstractNumId w:val="59"/>
     <w:lvlOverride w:ilvl="0">
       <w:startOverride w:val="1"/>
     </w:lvlOverride>
@@ -24808,7 +26180,7 @@
     </w:lvlOverride>
   </w:num>
   <w:num w:numId="22" w16cid:durableId="874578897">
-    <w:abstractNumId w:val="56"/>
+    <w:abstractNumId w:val="59"/>
     <w:lvlOverride w:ilvl="0">
       <w:startOverride w:val="1"/>
     </w:lvlOverride>
@@ -24838,7 +26210,7 @@
     </w:lvlOverride>
   </w:num>
   <w:num w:numId="23" w16cid:durableId="184097708">
-    <w:abstractNumId w:val="56"/>
+    <w:abstractNumId w:val="59"/>
     <w:lvlOverride w:ilvl="0">
       <w:startOverride w:val="1"/>
     </w:lvlOverride>
@@ -24868,7 +26240,7 @@
     </w:lvlOverride>
   </w:num>
   <w:num w:numId="24" w16cid:durableId="1147547601">
-    <w:abstractNumId w:val="56"/>
+    <w:abstractNumId w:val="59"/>
     <w:lvlOverride w:ilvl="0">
       <w:startOverride w:val="1"/>
     </w:lvlOverride>
@@ -24898,7 +26270,7 @@
     </w:lvlOverride>
   </w:num>
   <w:num w:numId="25" w16cid:durableId="697269251">
-    <w:abstractNumId w:val="56"/>
+    <w:abstractNumId w:val="59"/>
     <w:lvlOverride w:ilvl="0">
       <w:startOverride w:val="1"/>
     </w:lvlOverride>
@@ -24928,7 +26300,7 @@
     </w:lvlOverride>
   </w:num>
   <w:num w:numId="26" w16cid:durableId="623387041">
-    <w:abstractNumId w:val="56"/>
+    <w:abstractNumId w:val="59"/>
     <w:lvlOverride w:ilvl="0">
       <w:startOverride w:val="1"/>
     </w:lvlOverride>
@@ -24958,7 +26330,7 @@
     </w:lvlOverride>
   </w:num>
   <w:num w:numId="27" w16cid:durableId="571545525">
-    <w:abstractNumId w:val="56"/>
+    <w:abstractNumId w:val="59"/>
     <w:lvlOverride w:ilvl="0">
       <w:startOverride w:val="1"/>
     </w:lvlOverride>
@@ -24991,19 +26363,19 @@
     <w:abstractNumId w:val="2"/>
   </w:num>
   <w:num w:numId="29" w16cid:durableId="1318532482">
-    <w:abstractNumId w:val="48"/>
+    <w:abstractNumId w:val="51"/>
   </w:num>
   <w:num w:numId="30" w16cid:durableId="2085495198">
     <w:abstractNumId w:val="5"/>
   </w:num>
   <w:num w:numId="31" w16cid:durableId="1159468039">
-    <w:abstractNumId w:val="37"/>
+    <w:abstractNumId w:val="40"/>
   </w:num>
   <w:num w:numId="32" w16cid:durableId="2134787325">
-    <w:abstractNumId w:val="30"/>
+    <w:abstractNumId w:val="33"/>
   </w:num>
   <w:num w:numId="33" w16cid:durableId="690107431">
-    <w:abstractNumId w:val="38"/>
+    <w:abstractNumId w:val="41"/>
     <w:lvlOverride w:ilvl="0"/>
     <w:lvlOverride w:ilvl="1">
       <w:startOverride w:val="1"/>
@@ -25031,46 +26403,46 @@
     </w:lvlOverride>
   </w:num>
   <w:num w:numId="34" w16cid:durableId="1695031192">
-    <w:abstractNumId w:val="38"/>
+    <w:abstractNumId w:val="41"/>
   </w:num>
   <w:num w:numId="35" w16cid:durableId="1474131380">
-    <w:abstractNumId w:val="38"/>
+    <w:abstractNumId w:val="41"/>
   </w:num>
   <w:num w:numId="36" w16cid:durableId="385646365">
-    <w:abstractNumId w:val="23"/>
+    <w:abstractNumId w:val="24"/>
   </w:num>
   <w:num w:numId="37" w16cid:durableId="774322130">
     <w:abstractNumId w:val="10"/>
   </w:num>
   <w:num w:numId="38" w16cid:durableId="1273244240">
-    <w:abstractNumId w:val="41"/>
+    <w:abstractNumId w:val="44"/>
   </w:num>
   <w:num w:numId="39" w16cid:durableId="1302419245">
-    <w:abstractNumId w:val="51"/>
+    <w:abstractNumId w:val="54"/>
   </w:num>
   <w:num w:numId="40" w16cid:durableId="671757144">
     <w:abstractNumId w:val="6"/>
   </w:num>
   <w:num w:numId="41" w16cid:durableId="1609465245">
-    <w:abstractNumId w:val="33"/>
+    <w:abstractNumId w:val="36"/>
   </w:num>
   <w:num w:numId="42" w16cid:durableId="1924870052">
-    <w:abstractNumId w:val="44"/>
+    <w:abstractNumId w:val="47"/>
   </w:num>
   <w:num w:numId="43" w16cid:durableId="1546983496">
     <w:abstractNumId w:val="1"/>
   </w:num>
   <w:num w:numId="44" w16cid:durableId="1243755491">
-    <w:abstractNumId w:val="27"/>
+    <w:abstractNumId w:val="30"/>
   </w:num>
   <w:num w:numId="45" w16cid:durableId="2112815720">
-    <w:abstractNumId w:val="42"/>
+    <w:abstractNumId w:val="45"/>
   </w:num>
   <w:num w:numId="46" w16cid:durableId="495389479">
-    <w:abstractNumId w:val="58"/>
+    <w:abstractNumId w:val="61"/>
   </w:num>
   <w:num w:numId="47" w16cid:durableId="1000545877">
-    <w:abstractNumId w:val="36"/>
+    <w:abstractNumId w:val="39"/>
   </w:num>
   <w:num w:numId="48" w16cid:durableId="853347394">
     <w:abstractNumId w:val="0"/>
@@ -25079,28 +26451,28 @@
     <w:abstractNumId w:val="15"/>
   </w:num>
   <w:num w:numId="50" w16cid:durableId="7145556">
-    <w:abstractNumId w:val="29"/>
+    <w:abstractNumId w:val="32"/>
   </w:num>
   <w:num w:numId="51" w16cid:durableId="271405964">
-    <w:abstractNumId w:val="39"/>
+    <w:abstractNumId w:val="42"/>
   </w:num>
   <w:num w:numId="52" w16cid:durableId="1874154734">
-    <w:abstractNumId w:val="40"/>
+    <w:abstractNumId w:val="43"/>
   </w:num>
   <w:num w:numId="53" w16cid:durableId="791943569">
-    <w:abstractNumId w:val="28"/>
+    <w:abstractNumId w:val="31"/>
   </w:num>
   <w:num w:numId="54" w16cid:durableId="1422987211">
     <w:abstractNumId w:val="8"/>
   </w:num>
   <w:num w:numId="55" w16cid:durableId="2036425246">
-    <w:abstractNumId w:val="53"/>
+    <w:abstractNumId w:val="56"/>
   </w:num>
   <w:num w:numId="56" w16cid:durableId="305286039">
     <w:abstractNumId w:val="22"/>
   </w:num>
   <w:num w:numId="57" w16cid:durableId="696470528">
-    <w:abstractNumId w:val="47"/>
+    <w:abstractNumId w:val="50"/>
   </w:num>
   <w:num w:numId="58" w16cid:durableId="83573097">
     <w:abstractNumId w:val="19"/>
@@ -25109,19 +26481,19 @@
     <w:abstractNumId w:val="4"/>
   </w:num>
   <w:num w:numId="60" w16cid:durableId="886841764">
-    <w:abstractNumId w:val="34"/>
+    <w:abstractNumId w:val="37"/>
   </w:num>
   <w:num w:numId="61" w16cid:durableId="415060573">
-    <w:abstractNumId w:val="55"/>
+    <w:abstractNumId w:val="58"/>
   </w:num>
   <w:num w:numId="62" w16cid:durableId="1749376288">
-    <w:abstractNumId w:val="46"/>
+    <w:abstractNumId w:val="49"/>
   </w:num>
   <w:num w:numId="63" w16cid:durableId="1277054457">
     <w:abstractNumId w:val="18"/>
   </w:num>
   <w:num w:numId="64" w16cid:durableId="415248735">
-    <w:abstractNumId w:val="32"/>
+    <w:abstractNumId w:val="35"/>
   </w:num>
   <w:num w:numId="65" w16cid:durableId="1785494309">
     <w:abstractNumId w:val="3"/>
@@ -25130,22 +26502,22 @@
     <w:abstractNumId w:val="9"/>
   </w:num>
   <w:num w:numId="67" w16cid:durableId="1652054133">
-    <w:abstractNumId w:val="31"/>
+    <w:abstractNumId w:val="34"/>
   </w:num>
   <w:num w:numId="68" w16cid:durableId="1083182566">
     <w:abstractNumId w:val="14"/>
   </w:num>
   <w:num w:numId="69" w16cid:durableId="1571232664">
-    <w:abstractNumId w:val="43"/>
+    <w:abstractNumId w:val="46"/>
   </w:num>
   <w:num w:numId="70" w16cid:durableId="1413817063">
-    <w:abstractNumId w:val="24"/>
+    <w:abstractNumId w:val="25"/>
   </w:num>
   <w:num w:numId="71" w16cid:durableId="1411464272">
-    <w:abstractNumId w:val="59"/>
+    <w:abstractNumId w:val="63"/>
   </w:num>
   <w:num w:numId="72" w16cid:durableId="949901106">
-    <w:abstractNumId w:val="57"/>
+    <w:abstractNumId w:val="60"/>
   </w:num>
   <w:num w:numId="73" w16cid:durableId="765269677">
     <w:abstractNumId w:val="13"/>
@@ -25154,7 +26526,19 @@
     <w:abstractNumId w:val="16"/>
   </w:num>
   <w:num w:numId="75" w16cid:durableId="2092658830">
-    <w:abstractNumId w:val="35"/>
+    <w:abstractNumId w:val="38"/>
+  </w:num>
+  <w:num w:numId="76" w16cid:durableId="619265551">
+    <w:abstractNumId w:val="62"/>
+  </w:num>
+  <w:num w:numId="77" w16cid:durableId="526600124">
+    <w:abstractNumId w:val="27"/>
+  </w:num>
+  <w:num w:numId="78" w16cid:durableId="1481724553">
+    <w:abstractNumId w:val="23"/>
+  </w:num>
+  <w:num w:numId="79" w16cid:durableId="633366322">
+    <w:abstractNumId w:val="26"/>
   </w:num>
   <w:numIdMacAtCleanup w:val="15"/>
 </w:numbering>

</xml_diff>